<commit_message>
Core Slide 2: nhắc lại nội dung khi dẫn chiếu, thêm kế hoạch 8 tuần và tiêu chí tự kiểm tra, tăng cỡ chữ
Co-Authored-By: Claude Opus 5.5 <noreply@anthropic.com>
Claude-Session: https://claude.ai/code/session_018fvDs5YVdMu929akP2CKw7
</commit_message>
<xml_diff>
--- a/Core_Slide_2_HD2_bai_noi_chi_tiet.docx
+++ b/Core_Slide_2_HD2_bai_noi_chi_tiet.docx
@@ -237,7 +237,7 @@
         <w:rPr>
           <w:b/>
         </w:rPr>
-        <w:t>Tổng khoảng 205 phút: nên chia hai buổi, buổi 1 từ phần 01 đến 03, buổi 2 từ phần 04 đến 07.</w:t>
+        <w:t>Tổng khoảng 215 phút: nên chia hai buổi, buổi 1 từ phần 01 đến 03, buổi 2 từ phần 04 đến 07.</w:t>
       </w:r>
     </w:p>
     <w:p>
@@ -264,7 +264,7 @@
         <w:pStyle w:val="Heading1"/>
       </w:pPr>
       <w:r>
-        <w:t>PHẦN 01. NỐI TIẾP CORE SLIDE 1 VÀ BỨC TRANH CHUNG (thời lượng ước tính 15 phút, 7 slide)</w:t>
+        <w:t>PHẦN 01. NỐI TIẾP CORE SLIDE 1 VÀ BỨC TRANH CHUNG (thời lượng ước tính 25 phút, 11 slide)</w:t>
       </w:r>
     </w:p>
     <w:p>
@@ -344,7 +344,7 @@
         <w:rPr>
           <w:b w:val="0"/>
         </w:rPr>
-        <w:t>Ở slide cuối Core Slide 1, thầy đã nói một câu: hôm nay các em biết cần làm gì và vì sao phải làm như vậy, còn Core Slide 2 sẽ dạy các em làm thế nào. Core Slide 2 giữ đúng lời hứa đó. Công cụ chính của buổi này là cuốn sách hướng dẫn: mỗi slide đều ghi rõ mục, hình, bảng trong sách để các em mở ra đọc tiếp.</w:t>
+        <w:t>Ở Slide 94 của Core Slide 1, slide "Năm kỹ năng thực hành sẽ học ở Core Slide 2", thầy đã nói một câu: hôm nay các em biết cần làm gì và vì sao phải làm như vậy, còn Core Slide 2 sẽ dạy các em làm thế nào. Core Slide 2 giữ đúng lời hứa đó. Công cụ chính của buổi này là cuốn sách hướng dẫn: mỗi slide đều ghi rõ mục, hình, bảng trong sách để các em mở ra đọc tiếp.</w:t>
       </w:r>
     </w:p>
     <w:p>
@@ -427,7 +427,7 @@
         <w:rPr>
           <w:b w:val="0"/>
         </w:rPr>
-        <w:t>Ở Slide 93 và 94 của Core Slide 1, thầy đã hẹn mười nội dung chuyên sâu và năm kỹ năng thực hành. Slide này là bảng đối chiếu: mỗi lời hẹn nằm ở đâu trong sách và được dạy ở phần nào hôm nay. Thầy đọc nhanh từng dòng để các em đánh dấu. Công thức thống kê và kiểm định độ tin cậy nằm ở Chương 3 mục 3.6.2 và Chương 4 mục 4.2.1. Thao tác phần mềm và hồi quy nằm ở Chương 3 mục 3.5 và 3.6.4, kèm hai sheet giải thích công thức và cách đọc hồi quy. Thiết kế bảng hỏi nằm ở mục 3.4.2 và 3.4.3.</w:t>
+        <w:t>Ở cuối Core Slide 1 có hai slide vạch ranh giới giữa hai buổi. Slide 93 có tên "Mười nội dung chuyên sâu chưa học ở Core Slide 1". Slide 94 có tên "Năm kỹ năng thực hành sẽ học ở Core Slide 2". Thầy đọc lại để các em khỏi phải mở file cũ. Mười nội dung là: công thức thống kê; thao tác phần mềm xử lý số liệu; hồi quy; kiểm định độ tin cậy thang đo; thiết kế bảng hỏi chi tiết; cách đọc bài báo khoa học; bảng tra APA theo từng loại tài liệu; quy định trình bày bảng, hình, công thức; mười tiêu chí chấm chi tiết; kế hoạch chi tiết từng tuần trong tám tuần. Năm kỹ năng là: viết đoạn văn học thuật; làm sạch dữ liệu; diễn giải bảng kết quả; tìm kiếm tài liệu; trình bày và bảo vệ. Slide này là bảng đối chiếu: mỗi lời hẹn nằm ở đâu trong sách và được dạy ở phần nào hôm nay. Thầy đọc nhanh từng dòng để các em đánh dấu. Công thức thống kê và kiểm định độ tin cậy nằm ở Chương 3 mục 3.6.2 và Chương 4 mục 4.2.1. Thao tác phần mềm và hồi quy nằm ở Chương 3 mục 3.5 và 3.6.4, kèm hai sheet giải thích công thức và cách đọc hồi quy. Thiết kế bảng hỏi nằm ở mục 3.4.2 và 3.4.3.</w:t>
       </w:r>
     </w:p>
     <w:p>
@@ -449,13 +449,13 @@
         <w:rPr>
           <w:b w:val="0"/>
         </w:rPr>
-        <w:t xml:space="preserve">Dòng tô hồng là chỗ thầy nói thẳng với các em: sách không có một bảng mười tiêu chí chấm chi tiết, cũng không có kế hoạch theo từng tuần. Gần nhất với tiêu chí chấm là Bảng 26, mười câu tự kiểm tra có cách kiểm tra cụ thể. Gần nhất với kế hoạch là dòng "Thời gian gợi ý" ở đầu mỗi mục. Vì vậy ở đầu mỗi phần hôm nay, thầy đặt một slide bản đồ có cột thời gian gợi ý, để các em tự ghép vào timeline tám tuần của Core Slide 1. </w:t>
-      </w:r>
-      <w:r>
-        <w:rPr>
-          <w:b/>
-        </w:rPr>
-        <w:t>Hai nội dung cuối sách không có bảng riêng: thầy ghép "Thời gian gợi ý" của từng mục với timeline 8 tuần của Core Slide 1.</w:t>
+        <w:t xml:space="preserve">Dòng tô hồng là chỗ thầy nói thẳng với các em: sách không có một bảng tiêu chí chấm chi tiết, cũng không có kế hoạch theo từng tuần. Nhưng sách có hai nguyên liệu: dòng "Thế nào là đủ" ở cuối mỗi mục và dòng "Thời gian gợi ý" ở đầu mỗi mục. Vì vậy bốn slide ngay sau đây ghép khung của Core Slide 1 với hai nguyên liệu đó: hai slide kế hoạch từng tuần và hai slide tiêu chí tự kiểm tra chi tiết. </w:t>
+      </w:r>
+      <w:r>
+        <w:rPr>
+          <w:b/>
+        </w:rPr>
+        <w:t>Hai nội dung sách không có bảng riêng: bốn slide ngay sau ghép khung của Core Slide 1 với "Thời gian gợi ý" và "Thế nào là đủ" của sách.</w:t>
       </w:r>
     </w:p>
     <w:p>
@@ -487,7 +487,7 @@
           <w:b/>
           <w:color w:val="CC0000"/>
         </w:rPr>
-        <w:t>(Slide 6: Mỗi mục trong sách có cùng một khuôn, nên các em đọc sách như tra một bảng kiểm, không đọc như tiểu thuyết)</w:t>
+        <w:t>(Slide 6: Tuần 1 đến 4 làm việc với ý tưởng: mỗi tuần có việc chính, việc phải xong trước, việc làm song song và rủi ro nếu chậm)</w:t>
       </w:r>
     </w:p>
     <w:p>
@@ -510,7 +510,7 @@
           <w:color w:val="595959"/>
           <w:sz w:val="22"/>
         </w:rPr>
-        <w:t>Hướng dẫn Chuyên đề và Khóa luận tốt nghiệp, Lời nói đầu (Cách đọc và cách dùng sách; Quy ước đánh số)</w:t>
+        <w:t>Core Slide 1, Phần XIII (Slide 88 đến 91); Hướng dẫn Chuyên đề và Khóa luận tốt nghiệp, dòng "Thời gian gợi ý" của từng mục</w:t>
       </w:r>
     </w:p>
     <w:p>
@@ -521,7 +521,7 @@
         <w:rPr>
           <w:b w:val="0"/>
         </w:rPr>
-        <w:t>Trước khi dùng sách, các em cần biết sách được viết theo một khuôn cố định. Lời nói đầu mô tả khuôn này: mỗi mục mở bằng Câu chốt và Thời gian gợi ý; tiếp theo là mục đích, bản chất, cách viết, ví dụ minh họa gồm ví dụ chưa đạt và ví dụ đạt kèm phân tích vì sao, lỗi thường gặp và cách tránh; mục kết thúc bằng "Thế nào là đủ" và "Tóm tắt 1 câu".</w:t>
+        <w:t>Ở Slide 89 của Core Slide 1, bảng "sản phẩm bắt buộc theo từng cặp tuần" có một dòng ghi chú: mỗi tuần còn có việc phải làm trước, việc có thể làm song song và rủi ro nếu chậm; bảng chi tiết theo từng tuần sẽ có ở Core Slide 2. Slide này và slide sau là bảng đó. Thầy nhắc lại khung tám tuần của Core Slide 1 để các em khỏi phải mở lại: tuần 1 nhận diện vấn đề và sàng lọc đề tài; tuần 2 chốt đề tài và proposal; tuần 3 hoàn thiện Chương 1; tuần 4 hoàn thiện Chương 2 và xây mô hình; tuần 5 chốt Chương 3 và hoàn thiện công cụ; tuần 6 thu dữ liệu thật và làm sạch; tuần 7 xử lý dữ liệu và viết Chương 4; tuần 8 viết Chương 5, rà soát và bản thảo cuối.</w:t>
       </w:r>
     </w:p>
     <w:p>
@@ -532,7 +532,7 @@
         <w:rPr>
           <w:b w:val="0"/>
         </w:rPr>
-        <w:t>Thầy tô đỏ hai thành phần mà thầy muốn các em dùng nhiều nhất. Thành phần thứ tư, ví dụ chưa đạt và đạt, là chỗ các em học nhanh nhất: đặt đoạn mình viết cạnh hai ví dụ, xem nó giống bên nào. Thành phần thứ sáu, "Thế nào là đủ", là tiêu chí để các em biết khi nào dừng viết. Rất nhiều sinh viên viết dài vì không biết thế nào là đủ.</w:t>
+        <w:t>Bảng này ghép khung đó với dòng "Thời gian gợi ý" của từng mục trong sách. [Suy luận] Đây là cách ghép của thầy, sách không có bảng theo tuần. Thầy đọc tuần 2 làm ví dụ: việc chính là chốt đề tài và viết mục tiêu, câu hỏi trước, đúng lời khuyên ở mục 2.5 phần mở đầu của sách; phải xong trước là đề tài được giảng viên xác nhận; việc song song là tìm số liệu bối cảnh có nguồn; rủi ro nếu chậm là mọi chương sau không có lõi để bám.</w:t>
       </w:r>
     </w:p>
     <w:p>
@@ -543,13 +543,13 @@
         <w:rPr>
           <w:b w:val="0"/>
         </w:rPr>
-        <w:t xml:space="preserve">Hai quy ước nữa trong lời nói đầu. Một là cách đánh số: hình và bảng của sách đánh số liên tục như Hình 12, Bảng 30; hình và bảng trong ví dụ khóa luận đánh số theo chương như Bảng 4.3. Hai là tên mục trong phần hướng dẫn trùng với số mục trong khóa luận: "Mục 3.3.2. Phương pháp chọn mẫu" hướng dẫn viết đúng mục 3.3.2 của khóa luận. </w:t>
-      </w:r>
-      <w:r>
-        <w:rPr>
-          <w:b/>
-        </w:rPr>
-        <w:t>Quy định của trường là căn cứ cuối cùng: khi khác với sách, các em theo quy định của trường.</w:t>
+        <w:t xml:space="preserve">Cột "Làm song song" nhắc lại ý của Core Slide 1 về đường găng, critical path, ở Slide 90: đường găng là chuỗi việc mà việc sau chỉ bắt đầu được khi việc trước thật sự xong, ví dụ không thể làm bảng hỏi khi Chương 3 chưa chốt. Việc nằm ngoài chuỗi như điền ma trận tài liệu, dựng file khung format thì làm trong lúc chờ. </w:t>
+      </w:r>
+      <w:r>
+        <w:rPr>
+          <w:b/>
+        </w:rPr>
+        <w:t>Ô "■" là tuần có mốc kiểm soát trong Core Slide 1: tuần 2 phải chốt đề tài và proposal.</w:t>
       </w:r>
     </w:p>
     <w:p>
@@ -568,7 +568,7 @@
         <w:rPr>
           <w:i/>
         </w:rPr>
-        <w:t>[Suy luận, gợi ý cách dùng] Thầy khuyên các em làm một việc đơn giản: mỗi khi viết xong một mục, mở đúng mục cùng số trong sách, đọc riêng dòng "Thế nào là đủ" và đánh dấu từng ý. Mười phút tự soát như vậy thường tiết kiệm được một vòng sửa với giảng viên hướng dẫn.</w:t>
+        <w:t>Thử hình dung hết tuần 4 một bạn có Chương 2 dài 20 trang nhưng chưa có sơ đồ mô hình, vì nghĩ "vẽ sau cũng được". Sang tuần 5 bạn ấy ngồi soạn bảng hỏi và không biết đo những biến nào. Core Slide 1 đã dùng đúng ví dụ này: sản phẩm của cặp tuần trước là nguyên liệu của cặp tuần sau.</w:t>
       </w:r>
     </w:p>
     <w:p>
@@ -581,7 +581,7 @@
           <w:b/>
           <w:color w:val="CC0000"/>
         </w:rPr>
-        <w:t>(Slide 7: Mỗi chương sách mang đúng tên một phần của khóa luận: viết đến phần nào thì mở chương cùng tên)</w:t>
+        <w:t>(Slide 7: Tuần 5 đến 8 làm việc với dữ liệu thật: ba trong sáu mốc kiểm soát nằm ở khâu dữ liệu, khâu các em ít kiểm soát nhất)</w:t>
       </w:r>
     </w:p>
     <w:p>
@@ -604,7 +604,7 @@
           <w:color w:val="595959"/>
           <w:sz w:val="22"/>
         </w:rPr>
-        <w:t>Hướng dẫn Chuyên đề và Khóa luận tốt nghiệp, Lời nói đầu, Hình 1 và Bảng 1</w:t>
+        <w:t>Core Slide 1, Phần XIII (Slide 88 đến 91); Hướng dẫn Chuyên đề và Khóa luận tốt nghiệp, dòng "Thời gian gợi ý" của từng mục; Chương 3 mục 3.5.1 (2 đến 3 tuần thu thập)</w:t>
       </w:r>
     </w:p>
     <w:p>
@@ -615,7 +615,7 @@
         <w:rPr>
           <w:b w:val="0"/>
         </w:rPr>
-        <w:t>Hình 1 là bản đồ của cuốn sách. Mỗi hàng là một chương, ghi câu hỏi mà chương trả lời, sản phẩm sinh viên hoàn thành và file Excel dùng kèm. Sách nói rõ: sinh viên viết đến phần nào của khóa luận thì mở chương cùng tên trong sách và sản phẩm của chương trước là đầu vào của chương sau.</w:t>
+        <w:t>Nửa sau của tám tuần làm việc với dữ liệu thật. Ở Slide 91 của Core Slide 1, thầy đã chọn sáu mốc kiểm soát; thầy đọc lại cả sáu: chốt đề tài; hoàn thiện proposal; hoàn thiện công cụ thu thập dữ liệu; bắt đầu thu thập dữ liệu; hoàn tất dữ liệu hợp lệ; hoàn thiện bản thảo cuối. Ba mốc ở giữa đều xoay quanh dữ liệu, vì đó là khâu các em ít kiểm soát nhất: viết chương thì các em tự quyết, còn dữ liệu phụ thuộc người trả lời.</w:t>
       </w:r>
     </w:p>
     <w:p>
@@ -626,7 +626,7 @@
         <w:rPr>
           <w:b w:val="0"/>
         </w:rPr>
-        <w:t>Các em để ý ba điểm. Thứ nhất, chuỗi sản phẩm: Phần mở đầu và Chương 1 cho ra bộ câu hỏi; Chương 2 cho ra mô hình và giả thuyết; Chương 3 cho ra kế hoạch thu thập và phân tích; Chương 4 cho ra bảng kết quả kiểm định; Chương 5 cho ra câu trả lời và hàm ý. Thứ hai, ba file Excel: file 2 dùng cho Chương 3, hai file 3 dùng cho Chương 4, Chương 5 và phần hoàn thiện. Thứ ba, bốn chương cuối của sách không ứng với chương nào của khóa luận mà hướng dẫn những việc làm sau khi viết xong kết luận.</w:t>
+        <w:t>Có một điểm cần nói thật: sách ghi mục 3.5 cần 2 đến 3 tuần thu thập thực tế, trong khi khung tám tuần chỉ dành tuần 6. [Suy luận] Vì vậy muốn giữ được tám tuần, việc xin phép đơn vị khảo sát phải làm song song từ tuần 5 và bảng hỏi phải phát ngay khi đọc thử xong. Nếu khoa cho thời gian dài hơn tám tuần, các em nên dành thêm cho khâu này trước tiên.</w:t>
       </w:r>
     </w:p>
     <w:p>
@@ -635,15 +635,21 @@
       </w:pPr>
       <w:r>
         <w:rPr>
-          <w:b/>
-        </w:rPr>
-        <w:t>Mọi con số minh họa trong sách lấy từ ba file Excel đi kèm: sinh viên mở file, làm lại từng bước và đối chiếu với sách.</w:t>
-      </w:r>
-      <w:r>
-        <w:rPr>
           <w:b w:val="0"/>
         </w:rPr>
-        <w:t xml:space="preserve"> Buổi hôm nay thầy cũng dùng đúng các con số đó.</w:t>
+        <w:t xml:space="preserve">Tuần 8 có ô "■" vì là mốc bản thảo cuối. Việc chính của tuần 8 ngoài Chương 5 là kiểm tra sáu cặp điểm nối ở Bảng 54 của sách, ví dụ con số trong tóm tắt có khớp Chương 4 không. </w:t>
+      </w:r>
+      <w:r>
+        <w:rPr>
+          <w:b/>
+        </w:rPr>
+        <w:t>Thấy một mốc có nguy cơ trễ thì báo giảng viên hướng dẫn ngay, không dồn vào tuần 8.</w:t>
+      </w:r>
+      <w:r>
+        <w:rPr>
+          <w:b w:val="0"/>
+        </w:rPr>
+        <w:t xml:space="preserve"> Đây cũng là lời khuyên ở Slide 91 của Core Slide 1.</w:t>
       </w:r>
     </w:p>
     <w:p>
@@ -662,7 +668,7 @@
         <w:rPr>
           <w:i/>
         </w:rPr>
-        <w:t>Thử hình dung các em đang viết Chương 4 lúc nửa đêm, không nhớ bảng Cronbach cần mấy cột. Các em không cần đọc lại từ đầu sách. Các em mở Hình 1, thấy Chương 4 ứng với chương sách nào, lật đến mục 4.2.1 và Bảng 30 có sẵn năm cột. Bản đồ này là để tra, không phải để đọc một lần rồi bỏ.</w:t>
+        <w:t>Thử hình dung đến giữa tuần 6 một bạn mới thu được 60 phiếu trên mục tiêu 150. Bạn ấy im lặng, hy vọng tuần 7 sẽ đủ. Đến tuần 7 vẫn thiếu, Chương 4 phải viết trên dữ liệu chưa đủ cỡ mẫu. Nếu báo giảng viên ngay giữa tuần 6, hai người có thể bàn thêm kênh phát phiếu hoặc điều chỉnh phạm vi kịp thời.</w:t>
       </w:r>
     </w:p>
     <w:p>
@@ -675,7 +681,7 @@
           <w:b/>
           <w:color w:val="CC0000"/>
         </w:rPr>
-        <w:t>(Slide 8: Ba chữ "khớp" là thước đo mà Hội đồng dùng để đọc cả cuốn khóa luận)</w:t>
+        <w:t>(Slide 8: Bốn nhóm tiêu chí đầu của Core Slide 1, tách thành tiêu chí nhỏ lấy từ dòng "Thế nào là đủ" của sách)</w:t>
       </w:r>
     </w:p>
     <w:p>
@@ -698,7 +704,7 @@
           <w:color w:val="595959"/>
           <w:sz w:val="22"/>
         </w:rPr>
-        <w:t>Hướng dẫn Chuyên đề và Khóa luận tốt nghiệp (Lời nói đầu); mục Kiểm tra trước khi nộp</w:t>
+        <w:t>Core Slide 1, Phần XI (Slide 76, 80, 81); Hướng dẫn Chuyên đề và Khóa luận tốt nghiệp, mục "Thế nào là đủ" các chương, Bảng 26</w:t>
       </w:r>
     </w:p>
     <w:p>
@@ -709,7 +715,7 @@
         <w:rPr>
           <w:b w:val="0"/>
         </w:rPr>
-        <w:t>Trong lời nói đầu, sách nêu một nguyên tắc xuyên suốt. Thầy gọi nó là ba chữ "khớp". Thứ nhất, mọi kết quả ở Chương 4 khớp với giả thuyết ở Chương 2. Thứ hai, mọi kết luận ở Chương 5 khớp với câu hỏi nghiên cứu ở Chương 1. Thứ ba, mọi con số trong bài khớp với file dữ liệu.</w:t>
+        <w:t>Ở Slide 80 và 81 của Core Slide 1, thầy đưa ra tám nhóm tiêu chí tự kiểm tra, đọc theo mạch từ Chương 1 đến Chương 5 và hẹn rằng bảng tiêu chí chi tiết kèm ví dụ đạt và chưa đạt sẽ có ở Core Slide 2. Thầy nhắc lại tám nhóm: một, đề tài, mục tiêu và proposal; hai, cơ sở lý thuyết và mô hình; ba, phương pháp, đối tượng và dữ liệu; bốn, tính trung thực và kết luận; năm, khả năng diễn giải kết quả; sáu, trích dẫn và văn phong; bảy, format và tiến độ; tám, khả năng giải thích quyết định.</w:t>
       </w:r>
     </w:p>
     <w:p>
@@ -720,7 +726,7 @@
         <w:rPr>
           <w:b w:val="0"/>
         </w:rPr>
-        <w:t>Vì sao sách chọn đúng ba điểm này? Vì đây là ba chỗ nối giữa các phần viết vào những thời điểm khác nhau. Các em viết Chương 2 vào tháng thứ nhất, viết Chương 4 vào tháng thứ ba. Trong khoảng thời gian đó các em đổi tên biến, sửa giả thuyết, chạy lại số liệu. Lỗi không nằm trong từng chương mà nằm ở chỗ nối giữa các chương.</w:t>
+        <w:t>Slide này tách bốn nhóm đầu thành tiêu chí nhỏ. Các tiêu chí nhỏ không do thầy tự đặt mà lấy từ dòng "Thế nào là đủ" ở cuối mỗi mục của sách. Ví dụ nhóm 1: câu nêu vấn đề theo khung "Mặc dù, vẫn, Hệ quả là, Hiện chưa rõ" có số liệu có nguồn; đúng một mục tiêu tổng quát và hai đến bốn mục tiêu cụ thể bắt đầu bằng động từ hành động; số câu hỏi bằng số mục tiêu cụ thể. Cột cuối chỉ các em đến slide có ví dụ đạt và chưa đạt tương ứng trong buổi hôm nay.</w:t>
       </w:r>
     </w:p>
     <w:p>
@@ -731,13 +737,13 @@
         <w:rPr>
           <w:b w:val="0"/>
         </w:rPr>
-        <w:t xml:space="preserve">Sách đưa một ví dụ rất đời thường trong mục kiểm tra trước khi nộp: phần tóm tắt ghi 53,5% còn Chương 4 ghi 53,7%. Nguyên nhân là tóm tắt được viết từ bản nháp cũ rồi không sửa lại. Chỉ một con số lệch như vậy là Hội đồng đặt câu hỏi về độ chính xác của cả bài. </w:t>
-      </w:r>
-      <w:r>
-        <w:rPr>
-          <w:b/>
-        </w:rPr>
-        <w:t>Mọi kết quả khớp giả thuyết, mọi kết luận khớp câu hỏi, mọi con số khớp file dữ liệu.</w:t>
+        <w:t xml:space="preserve">Các em nhớ Slide 76 của Core Slide 1, khung điểm theo thang 10: phần phân tích vấn đề thực tiễn có trọng số lớn nhất, 3,5 điểm, còn phần mở đầu 1,5 điểm. </w:t>
+      </w:r>
+      <w:r>
+        <w:rPr>
+          <w:b/>
+        </w:rPr>
+        <w:t>Đây là công cụ tự kiểm tra, không phải thang điểm chính thức: trọng số điểm do khoa quy định.</w:t>
       </w:r>
     </w:p>
     <w:p>
@@ -756,7 +762,7 @@
         <w:rPr>
           <w:i/>
         </w:rPr>
-        <w:t>Thử hình dung Hội đồng mở khóa luận ở ba chỗ cùng lúc: trang câu hỏi nghiên cứu, bảng tổng hợp giả thuyết ở Chương 4 và file Excel trên máy chiếu. Nếu ba chỗ nói cùng một câu chuyện, buổi bảo vệ gần như chỉ còn là trao đổi học thuật. Nếu một chỗ lệch, mọi câu hỏi sau đó sẽ xoáy vào chỗ lệch ấy.</w:t>
+        <w:t>Thử hình dung một bạn tự chấm "nhóm 2 đạt" vì Chương 2 có đủ lý thuyết và mô hình. Đọc tiêu chí chi tiết, bạn ấy thấy khoảng trống chưa có cụm giới hạn phạm vi và giả thuyết H3 chưa có chữ "cùng chiều". Nhóm tiêu chí lớn cho cảm giác đã xong; tiêu chí nhỏ mới chỉ ra đúng câu nào cần sửa.</w:t>
       </w:r>
     </w:p>
     <w:p>
@@ -769,7 +775,7 @@
           <w:b/>
           <w:color w:val="CC0000"/>
         </w:rPr>
-        <w:t>(Slide 9: Mỗi chương nhận một sản phẩm từ chương trước và giao một sản phẩm cho chương sau)</w:t>
+        <w:t>(Slide 9: Bốn nhóm tiêu chí sau của Core Slide 1, từ diễn giải kết quả đến khả năng giải thích quyết định)</w:t>
       </w:r>
     </w:p>
     <w:p>
@@ -792,7 +798,7 @@
           <w:color w:val="595959"/>
           <w:sz w:val="22"/>
         </w:rPr>
-        <w:t>Hướng dẫn Chuyên đề và Khóa luận tốt nghiệp, Hình 24 và phần mở đầu Chương 4</w:t>
+        <w:t>Core Slide 1, Phần XI (Slide 81); Hướng dẫn Chuyên đề và Khóa luận tốt nghiệp, Chương 3 đến Bảo vệ, mục "Thế nào là đủ"</w:t>
       </w:r>
     </w:p>
     <w:p>
@@ -803,7 +809,7 @@
         <w:rPr>
           <w:b w:val="0"/>
         </w:rPr>
-        <w:t>Slide này là bản đồ của cả khóa luận. Sách mô tả năm chương như năm câu hỏi nối tiếp nhau. Chương 1 hỏi: vấn đề gì cần nghiên cứu và vì sao. Chương 2 hỏi: dựa vào lý thuyết nào để dự đoán câu trả lời. Chương 3 hỏi: kiểm tra dự đoán đó bằng cách nào. Chương 4 hỏi: dữ liệu nói gì. Chương 5 hỏi: ta học được gì và nên làm gì.</w:t>
+        <w:t>Slide này là bốn nhóm tiêu chí sau trong tám nhóm của Core Slide 1. Nhóm 5, khả năng diễn giải kết quả: mỗi bảng có đoạn bốn bước; báo cáo không chỉ P-value mà cả B, β, R bình phương và khoảng tin cậy; kết quả bất ngờ có một đến ba cách giải thích có căn cứ. Nhóm 6, trích dẫn và văn phong: trích dẫn khớp hai chiều với danh mục; không dùng "tôi", "em" và từ cảm tính; không dùng "chứng minh" hay "phát hiện mới".</w:t>
       </w:r>
     </w:p>
     <w:p>
@@ -814,7 +820,7 @@
         <w:rPr>
           <w:b w:val="0"/>
         </w:rPr>
-        <w:t>Điểm thầy muốn các em thấy là dòng "Giao". Chương 1 giao cho Chương 2 một bộ câu hỏi. Chương 2 giao cho Chương 3 một mô hình và các giả thuyết. Chương 3 giao cho Chương 4 một kế hoạch: sẽ tính chỉ số gì, bằng công cụ gì. Chương 4 giao cho Chương 5 bảng kết quả kiểm định. Nếu chương trước giao thiếu thì chương sau không có gì để làm. Ví dụ Chương 2 không có giả thuyết rõ chiều thì Chương 4 không biết kết luận thế nào.</w:t>
+        <w:t>Nhóm 7, format và tiến độ: toàn bài dùng Styles, bảng và hình đánh số tự động, kiểm tra trên bản PDF sẽ nộp và đủ báo cáo tiến độ tám tuần như Phần XII của Core Slide 1. Nhóm 8, khả năng giải thích quyết định: mỗi lựa chọn ở Chương 3 có một câu "được chọn vì" và các em chuẩn bị ít nhất mười câu hỏi dự kiến có câu trả lời và số trang căn cứ, đúng như chương Bảo vệ của sách.</w:t>
       </w:r>
     </w:p>
     <w:p>
@@ -825,19 +831,13 @@
         <w:rPr>
           <w:b w:val="0"/>
         </w:rPr>
-        <w:t xml:space="preserve">Sách có một câu thầy rất thích ở đầu Chương 4: ba chương trước là lời hứa, Chương 4 và Chương 5 là phần thực hiện lời hứa đó. </w:t>
-      </w:r>
-      <w:r>
-        <w:rPr>
-          <w:b/>
-        </w:rPr>
-        <w:t>Ba chương đầu là lời hứa; Chương 4 và Chương 5 là phần thực hiện lời hứa đó.</w:t>
-      </w:r>
-      <w:r>
-        <w:rPr>
-          <w:b w:val="0"/>
-        </w:rPr>
-        <w:t xml:space="preserve"> Khi viết một đoạn bất kỳ, các em tự hỏi: đoạn này đang hứa điều gì, hay đang thực hiện điều đã hứa ở đâu?</w:t>
+        <w:t xml:space="preserve">Cách dùng hai slide tiêu chí này rất đơn giản. </w:t>
+      </w:r>
+      <w:r>
+        <w:rPr>
+          <w:b/>
+        </w:rPr>
+        <w:t>Tiêu chí nào chưa đạt thì mở đúng slide ở cột cuối, đặt đoạn mình viết cạnh ví dụ đạt để sửa.</w:t>
       </w:r>
     </w:p>
     <w:p>
@@ -856,7 +856,7 @@
         <w:rPr>
           <w:i/>
         </w:rPr>
-        <w:t>Thử hình dung một bạn viết Chương 3 trước vì "phương pháp thì mẫu nào cũng giống nhau", rồi mới viết Chương 2. Đến khi có mô hình bốn biến, bảng hỏi đã phát xong với ba biến khác. Chương 3 không nhận được sản phẩm từ Chương 2 nên không có gì để thiết kế cho đúng. Thứ tự giao nhận này không phải hình thức mà là điều kiện để dữ liệu dùng được.</w:t>
+        <w:t>Thử hình dung buổi bảo vệ, Hội đồng hỏi "vì sao em dùng Excel mà không dùng SPSS?". Bạn đã làm đủ nhóm 8 có sẵn câu trả lời trong Chương 3: các bước phân tích của khóa luận đại học đều làm được trên Excel và file thực hành cho phép người khác làm lại từng bước. Câu hỏi khó trở thành câu hỏi dễ vì đã được chuẩn bị từ lúc viết.</w:t>
       </w:r>
     </w:p>
     <w:p>
@@ -869,7 +869,7 @@
           <w:b/>
           <w:color w:val="CC0000"/>
         </w:rPr>
-        <w:t>(Slide 10: Hai đề tài giả định đi xuyên suốt sách, mỗi con số đều mở lại được trong file Excel)</w:t>
+        <w:t>(Slide 10: Mỗi mục trong sách có cùng một khuôn, nên các em đọc sách như tra một bảng kiểm, không đọc như tiểu thuyết)</w:t>
       </w:r>
     </w:p>
     <w:p>
@@ -892,6 +892,388 @@
           <w:color w:val="595959"/>
           <w:sz w:val="22"/>
         </w:rPr>
+        <w:t>Hướng dẫn Chuyên đề và Khóa luận tốt nghiệp, Lời nói đầu (Cách đọc và cách dùng sách; Quy ước đánh số)</w:t>
+      </w:r>
+    </w:p>
+    <w:p>
+      <w:pPr>
+        <w:spacing w:after="160" w:line="276" w:lineRule="auto"/>
+      </w:pPr>
+      <w:r>
+        <w:rPr>
+          <w:b w:val="0"/>
+        </w:rPr>
+        <w:t>Trước khi dùng sách, các em cần biết sách được viết theo một khuôn cố định. Lời nói đầu mô tả khuôn này: mỗi mục mở bằng Câu chốt và Thời gian gợi ý; tiếp theo là mục đích, bản chất, cách viết, ví dụ minh họa gồm ví dụ chưa đạt và ví dụ đạt kèm phân tích vì sao, lỗi thường gặp và cách tránh; mục kết thúc bằng "Thế nào là đủ" và "Tóm tắt 1 câu".</w:t>
+      </w:r>
+    </w:p>
+    <w:p>
+      <w:pPr>
+        <w:spacing w:after="160" w:line="276" w:lineRule="auto"/>
+      </w:pPr>
+      <w:r>
+        <w:rPr>
+          <w:b w:val="0"/>
+        </w:rPr>
+        <w:t>Thầy tô đỏ hai thành phần mà thầy muốn các em dùng nhiều nhất. Thành phần thứ tư, ví dụ chưa đạt và đạt, là chỗ các em học nhanh nhất: đặt đoạn mình viết cạnh hai ví dụ, xem nó giống bên nào. Thành phần thứ sáu, "Thế nào là đủ", là tiêu chí để các em biết khi nào dừng viết. Rất nhiều sinh viên viết dài vì không biết thế nào là đủ.</w:t>
+      </w:r>
+    </w:p>
+    <w:p>
+      <w:pPr>
+        <w:spacing w:after="160" w:line="276" w:lineRule="auto"/>
+      </w:pPr>
+      <w:r>
+        <w:rPr>
+          <w:b w:val="0"/>
+        </w:rPr>
+        <w:t xml:space="preserve">Hai quy ước nữa trong lời nói đầu. Một là cách đánh số: hình và bảng của sách đánh số liên tục như Hình 12, Bảng 30; hình và bảng trong ví dụ khóa luận đánh số theo chương như Bảng 4.3. Hai là tên mục trong phần hướng dẫn trùng với số mục trong khóa luận: "Mục 3.3.2. Phương pháp chọn mẫu" hướng dẫn viết đúng mục 3.3.2 của khóa luận. </w:t>
+      </w:r>
+      <w:r>
+        <w:rPr>
+          <w:b/>
+        </w:rPr>
+        <w:t>Quy định của trường là căn cứ cuối cùng: khi khác với sách, các em theo quy định của trường.</w:t>
+      </w:r>
+    </w:p>
+    <w:p>
+      <w:pPr>
+        <w:spacing w:after="160"/>
+        <w:ind w:left="454"/>
+      </w:pPr>
+      <w:r>
+        <w:rPr>
+          <w:b/>
+          <w:color w:val="CC0000"/>
+        </w:rPr>
+        <w:t xml:space="preserve">Câu chuyện ngoài slide: </w:t>
+      </w:r>
+      <w:r>
+        <w:rPr>
+          <w:i/>
+        </w:rPr>
+        <w:t>[Suy luận, gợi ý cách dùng] Thầy khuyên các em làm một việc đơn giản: mỗi khi viết xong một mục, mở đúng mục cùng số trong sách, đọc riêng dòng "Thế nào là đủ" và đánh dấu từng ý. Mười phút tự soát như vậy thường tiết kiệm được một vòng sửa với giảng viên hướng dẫn.</w:t>
+      </w:r>
+    </w:p>
+    <w:p>
+      <w:pPr>
+        <w:keepNext/>
+        <w:spacing w:before="240"/>
+      </w:pPr>
+      <w:r>
+        <w:rPr>
+          <w:b/>
+          <w:color w:val="CC0000"/>
+        </w:rPr>
+        <w:t>(Slide 11: Mỗi chương sách mang đúng tên một phần của khóa luận: viết đến phần nào thì mở chương cùng tên)</w:t>
+      </w:r>
+    </w:p>
+    <w:p>
+      <w:pPr>
+        <w:keepNext/>
+        <w:spacing w:after="80"/>
+      </w:pPr>
+      <w:r>
+        <w:rPr>
+          <w:b/>
+          <w:i/>
+          <w:color w:val="595959"/>
+          <w:sz w:val="22"/>
+        </w:rPr>
+        <w:t xml:space="preserve">Đối chiếu sách: </w:t>
+      </w:r>
+      <w:r>
+        <w:rPr>
+          <w:i/>
+          <w:color w:val="595959"/>
+          <w:sz w:val="22"/>
+        </w:rPr>
+        <w:t>Hướng dẫn Chuyên đề và Khóa luận tốt nghiệp, Lời nói đầu, Hình 1 và Bảng 1</w:t>
+      </w:r>
+    </w:p>
+    <w:p>
+      <w:pPr>
+        <w:spacing w:after="160" w:line="276" w:lineRule="auto"/>
+      </w:pPr>
+      <w:r>
+        <w:rPr>
+          <w:b w:val="0"/>
+        </w:rPr>
+        <w:t>Hình 1 là bản đồ của cuốn sách. Mỗi hàng là một chương, ghi câu hỏi mà chương trả lời, sản phẩm sinh viên hoàn thành và file Excel dùng kèm. Sách nói rõ: sinh viên viết đến phần nào của khóa luận thì mở chương cùng tên trong sách và sản phẩm của chương trước là đầu vào của chương sau.</w:t>
+      </w:r>
+    </w:p>
+    <w:p>
+      <w:pPr>
+        <w:spacing w:after="160" w:line="276" w:lineRule="auto"/>
+      </w:pPr>
+      <w:r>
+        <w:rPr>
+          <w:b w:val="0"/>
+        </w:rPr>
+        <w:t>Các em để ý ba điểm. Thứ nhất, chuỗi sản phẩm: Phần mở đầu và Chương 1 cho ra bộ câu hỏi; Chương 2 cho ra mô hình và giả thuyết; Chương 3 cho ra kế hoạch thu thập và phân tích; Chương 4 cho ra bảng kết quả kiểm định; Chương 5 cho ra câu trả lời và hàm ý. Thứ hai, ba file Excel: file 2 dùng cho Chương 3, hai file 3 dùng cho Chương 4, Chương 5 và phần hoàn thiện. Thứ ba, bốn chương cuối của sách không ứng với chương nào của khóa luận mà hướng dẫn những việc làm sau khi viết xong kết luận.</w:t>
+      </w:r>
+    </w:p>
+    <w:p>
+      <w:pPr>
+        <w:spacing w:after="160" w:line="276" w:lineRule="auto"/>
+      </w:pPr>
+      <w:r>
+        <w:rPr>
+          <w:b/>
+        </w:rPr>
+        <w:t>Mọi con số minh họa trong sách lấy từ ba file Excel đi kèm: sinh viên mở file, làm lại từng bước và đối chiếu với sách.</w:t>
+      </w:r>
+      <w:r>
+        <w:rPr>
+          <w:b w:val="0"/>
+        </w:rPr>
+        <w:t xml:space="preserve"> Buổi hôm nay thầy cũng dùng đúng các con số đó.</w:t>
+      </w:r>
+    </w:p>
+    <w:p>
+      <w:pPr>
+        <w:spacing w:after="160"/>
+        <w:ind w:left="454"/>
+      </w:pPr>
+      <w:r>
+        <w:rPr>
+          <w:b/>
+          <w:color w:val="CC0000"/>
+        </w:rPr>
+        <w:t xml:space="preserve">Câu chuyện ngoài slide: </w:t>
+      </w:r>
+      <w:r>
+        <w:rPr>
+          <w:i/>
+        </w:rPr>
+        <w:t>Thử hình dung các em đang viết Chương 4 lúc nửa đêm, không nhớ bảng Cronbach cần mấy cột. Các em không cần đọc lại từ đầu sách. Các em mở Hình 1, thấy Chương 4 ứng với chương sách nào, lật đến mục 4.2.1 và Bảng 30 có sẵn năm cột. Bản đồ này là để tra, không phải để đọc một lần rồi bỏ.</w:t>
+      </w:r>
+    </w:p>
+    <w:p>
+      <w:pPr>
+        <w:keepNext/>
+        <w:spacing w:before="240"/>
+      </w:pPr>
+      <w:r>
+        <w:rPr>
+          <w:b/>
+          <w:color w:val="CC0000"/>
+        </w:rPr>
+        <w:t>(Slide 12: Ba chữ "khớp" là thước đo mà Hội đồng dùng để đọc cả cuốn khóa luận)</w:t>
+      </w:r>
+    </w:p>
+    <w:p>
+      <w:pPr>
+        <w:keepNext/>
+        <w:spacing w:after="80"/>
+      </w:pPr>
+      <w:r>
+        <w:rPr>
+          <w:b/>
+          <w:i/>
+          <w:color w:val="595959"/>
+          <w:sz w:val="22"/>
+        </w:rPr>
+        <w:t xml:space="preserve">Đối chiếu sách: </w:t>
+      </w:r>
+      <w:r>
+        <w:rPr>
+          <w:i/>
+          <w:color w:val="595959"/>
+          <w:sz w:val="22"/>
+        </w:rPr>
+        <w:t>Hướng dẫn Chuyên đề và Khóa luận tốt nghiệp (Lời nói đầu); mục Kiểm tra trước khi nộp</w:t>
+      </w:r>
+    </w:p>
+    <w:p>
+      <w:pPr>
+        <w:spacing w:after="160" w:line="276" w:lineRule="auto"/>
+      </w:pPr>
+      <w:r>
+        <w:rPr>
+          <w:b w:val="0"/>
+        </w:rPr>
+        <w:t>Trong lời nói đầu, sách nêu một nguyên tắc xuyên suốt. Thầy gọi nó là ba chữ "khớp". Thứ nhất, mọi kết quả ở Chương 4 khớp với giả thuyết ở Chương 2. Thứ hai, mọi kết luận ở Chương 5 khớp với câu hỏi nghiên cứu ở Chương 1. Thứ ba, mọi con số trong bài khớp với file dữ liệu.</w:t>
+      </w:r>
+    </w:p>
+    <w:p>
+      <w:pPr>
+        <w:spacing w:after="160" w:line="276" w:lineRule="auto"/>
+      </w:pPr>
+      <w:r>
+        <w:rPr>
+          <w:b w:val="0"/>
+        </w:rPr>
+        <w:t>Vì sao sách chọn đúng ba điểm này? Vì đây là ba chỗ nối giữa các phần viết vào những thời điểm khác nhau. Các em viết Chương 2 vào tháng thứ nhất, viết Chương 4 vào tháng thứ ba. Trong khoảng thời gian đó các em đổi tên biến, sửa giả thuyết, chạy lại số liệu. Lỗi không nằm trong từng chương mà nằm ở chỗ nối giữa các chương.</w:t>
+      </w:r>
+    </w:p>
+    <w:p>
+      <w:pPr>
+        <w:spacing w:after="160" w:line="276" w:lineRule="auto"/>
+      </w:pPr>
+      <w:r>
+        <w:rPr>
+          <w:b w:val="0"/>
+        </w:rPr>
+        <w:t xml:space="preserve">Sách đưa một ví dụ rất đời thường trong mục kiểm tra trước khi nộp: phần tóm tắt ghi 53,5% còn Chương 4 ghi 53,7%. Nguyên nhân là tóm tắt được viết từ bản nháp cũ rồi không sửa lại. Chỉ một con số lệch như vậy là Hội đồng đặt câu hỏi về độ chính xác của cả bài. </w:t>
+      </w:r>
+      <w:r>
+        <w:rPr>
+          <w:b/>
+        </w:rPr>
+        <w:t>Mọi kết quả khớp giả thuyết, mọi kết luận khớp câu hỏi, mọi con số khớp file dữ liệu.</w:t>
+      </w:r>
+    </w:p>
+    <w:p>
+      <w:pPr>
+        <w:spacing w:after="160"/>
+        <w:ind w:left="454"/>
+      </w:pPr>
+      <w:r>
+        <w:rPr>
+          <w:b/>
+          <w:color w:val="CC0000"/>
+        </w:rPr>
+        <w:t xml:space="preserve">Câu chuyện ngoài slide: </w:t>
+      </w:r>
+      <w:r>
+        <w:rPr>
+          <w:i/>
+        </w:rPr>
+        <w:t>Thử hình dung Hội đồng mở khóa luận ở ba chỗ cùng lúc: trang câu hỏi nghiên cứu, bảng tổng hợp giả thuyết ở Chương 4 và file Excel trên máy chiếu. Nếu ba chỗ nói cùng một câu chuyện, buổi bảo vệ gần như chỉ còn là trao đổi học thuật. Nếu một chỗ lệch, mọi câu hỏi sau đó sẽ xoáy vào chỗ lệch ấy.</w:t>
+      </w:r>
+    </w:p>
+    <w:p>
+      <w:pPr>
+        <w:keepNext/>
+        <w:spacing w:before="240"/>
+      </w:pPr>
+      <w:r>
+        <w:rPr>
+          <w:b/>
+          <w:color w:val="CC0000"/>
+        </w:rPr>
+        <w:t>(Slide 13: Mỗi chương nhận một sản phẩm từ chương trước và giao một sản phẩm cho chương sau)</w:t>
+      </w:r>
+    </w:p>
+    <w:p>
+      <w:pPr>
+        <w:keepNext/>
+        <w:spacing w:after="80"/>
+      </w:pPr>
+      <w:r>
+        <w:rPr>
+          <w:b/>
+          <w:i/>
+          <w:color w:val="595959"/>
+          <w:sz w:val="22"/>
+        </w:rPr>
+        <w:t xml:space="preserve">Đối chiếu sách: </w:t>
+      </w:r>
+      <w:r>
+        <w:rPr>
+          <w:i/>
+          <w:color w:val="595959"/>
+          <w:sz w:val="22"/>
+        </w:rPr>
+        <w:t>Hướng dẫn Chuyên đề và Khóa luận tốt nghiệp, Hình 24 và phần mở đầu Chương 4</w:t>
+      </w:r>
+    </w:p>
+    <w:p>
+      <w:pPr>
+        <w:spacing w:after="160" w:line="276" w:lineRule="auto"/>
+      </w:pPr>
+      <w:r>
+        <w:rPr>
+          <w:b w:val="0"/>
+        </w:rPr>
+        <w:t>Slide này là bản đồ của cả khóa luận. Sách mô tả năm chương như năm câu hỏi nối tiếp nhau. Chương 1 hỏi: vấn đề gì cần nghiên cứu và vì sao. Chương 2 hỏi: dựa vào lý thuyết nào để dự đoán câu trả lời. Chương 3 hỏi: kiểm tra dự đoán đó bằng cách nào. Chương 4 hỏi: dữ liệu nói gì. Chương 5 hỏi: ta học được gì và nên làm gì.</w:t>
+      </w:r>
+    </w:p>
+    <w:p>
+      <w:pPr>
+        <w:spacing w:after="160" w:line="276" w:lineRule="auto"/>
+      </w:pPr>
+      <w:r>
+        <w:rPr>
+          <w:b w:val="0"/>
+        </w:rPr>
+        <w:t>Điểm thầy muốn các em thấy là dòng "Giao". Chương 1 giao cho Chương 2 một bộ câu hỏi. Chương 2 giao cho Chương 3 một mô hình và các giả thuyết. Chương 3 giao cho Chương 4 một kế hoạch: sẽ tính chỉ số gì, bằng công cụ gì. Chương 4 giao cho Chương 5 bảng kết quả kiểm định. Nếu chương trước giao thiếu thì chương sau không có gì để làm. Ví dụ Chương 2 không có giả thuyết rõ chiều thì Chương 4 không biết kết luận thế nào.</w:t>
+      </w:r>
+    </w:p>
+    <w:p>
+      <w:pPr>
+        <w:spacing w:after="160" w:line="276" w:lineRule="auto"/>
+      </w:pPr>
+      <w:r>
+        <w:rPr>
+          <w:b w:val="0"/>
+        </w:rPr>
+        <w:t xml:space="preserve">Sách có một câu thầy rất thích ở đầu Chương 4: ba chương trước là lời hứa, Chương 4 và Chương 5 là phần thực hiện lời hứa đó. </w:t>
+      </w:r>
+      <w:r>
+        <w:rPr>
+          <w:b/>
+        </w:rPr>
+        <w:t>Ba chương đầu là lời hứa; Chương 4 và Chương 5 là phần thực hiện lời hứa đó.</w:t>
+      </w:r>
+      <w:r>
+        <w:rPr>
+          <w:b w:val="0"/>
+        </w:rPr>
+        <w:t xml:space="preserve"> Khi viết một đoạn bất kỳ, các em tự hỏi: đoạn này đang hứa điều gì, hay đang thực hiện điều đã hứa ở đâu?</w:t>
+      </w:r>
+    </w:p>
+    <w:p>
+      <w:pPr>
+        <w:spacing w:after="160"/>
+        <w:ind w:left="454"/>
+      </w:pPr>
+      <w:r>
+        <w:rPr>
+          <w:b/>
+          <w:color w:val="CC0000"/>
+        </w:rPr>
+        <w:t xml:space="preserve">Câu chuyện ngoài slide: </w:t>
+      </w:r>
+      <w:r>
+        <w:rPr>
+          <w:i/>
+        </w:rPr>
+        <w:t>Thử hình dung một bạn viết Chương 3 trước vì "phương pháp thì mẫu nào cũng giống nhau", rồi mới viết Chương 2. Đến khi có mô hình bốn biến, bảng hỏi đã phát xong với ba biến khác. Chương 3 không nhận được sản phẩm từ Chương 2 nên không có gì để thiết kế cho đúng. Thứ tự giao nhận này không phải hình thức mà là điều kiện để dữ liệu dùng được.</w:t>
+      </w:r>
+    </w:p>
+    <w:p>
+      <w:pPr>
+        <w:keepNext/>
+        <w:spacing w:before="240"/>
+      </w:pPr>
+      <w:r>
+        <w:rPr>
+          <w:b/>
+          <w:color w:val="CC0000"/>
+        </w:rPr>
+        <w:t>(Slide 14: Hai đề tài giả định đi xuyên suốt sách, mỗi con số đều mở lại được trong file Excel)</w:t>
+      </w:r>
+    </w:p>
+    <w:p>
+      <w:pPr>
+        <w:keepNext/>
+        <w:spacing w:after="80"/>
+      </w:pPr>
+      <w:r>
+        <w:rPr>
+          <w:b/>
+          <w:i/>
+          <w:color w:val="595959"/>
+          <w:sz w:val="22"/>
+        </w:rPr>
+        <w:t xml:space="preserve">Đối chiếu sách: </w:t>
+      </w:r>
+      <w:r>
+        <w:rPr>
+          <w:i/>
+          <w:color w:val="595959"/>
+          <w:sz w:val="22"/>
+        </w:rPr>
         <w:t>Hướng dẫn Chuyên đề và Khóa luận tốt nghiệp (Lời nói đầu); Bảng 1</w:t>
       </w:r>
     </w:p>
@@ -998,7 +1380,7 @@
           <w:b/>
           <w:color w:val="CC0000"/>
         </w:rPr>
-        <w:t>(Slide 12: Bản đồ đọc sách cho Phần mở đầu và Chương 1: mục tiêu và câu hỏi viết trước, lý do chọn đề tài viết sau)</w:t>
+        <w:t>(Slide 16: Bản đồ đọc sách cho Phần mở đầu và Chương 1: mục tiêu và câu hỏi viết trước, lý do chọn đề tài viết sau)</w:t>
       </w:r>
     </w:p>
     <w:p>
@@ -1092,7 +1474,7 @@
           <w:b/>
           <w:color w:val="CC0000"/>
         </w:rPr>
-        <w:t>(Slide 13: Người chấm đọc phần mở đầu để kiểm tra vấn đề có thật và các mục có khớp nhau)</w:t>
+        <w:t>(Slide 17: Người chấm đọc phần mở đầu để kiểm tra vấn đề có thật và các mục có khớp nhau)</w:t>
       </w:r>
     </w:p>
     <w:p>
@@ -1186,7 +1568,7 @@
           <w:b/>
           <w:color w:val="CC0000"/>
         </w:rPr>
-        <w:t>(Slide 14: Thứ tự bảy mục phản ánh logic nhân quả: vấn đề quyết định mục tiêu, mục tiêu quyết định câu hỏi)</w:t>
+        <w:t>(Slide 18: Thứ tự bảy mục phản ánh logic nhân quả: vấn đề quyết định mục tiêu, mục tiêu quyết định câu hỏi)</w:t>
       </w:r>
     </w:p>
     <w:p>
@@ -1280,7 +1662,7 @@
           <w:b/>
           <w:color w:val="CC0000"/>
         </w:rPr>
-        <w:t>(Slide 15: Sáu mối nối giữa các mục là cách tự kiểm tra phần mở đầu trước khi đưa cho giảng viên hướng dẫn)</w:t>
+        <w:t>(Slide 19: Sáu mối nối giữa các mục là cách tự kiểm tra phần mở đầu trước khi đưa cho giảng viên hướng dẫn)</w:t>
       </w:r>
     </w:p>
     <w:p>
@@ -1314,7 +1696,7 @@
         <w:rPr>
           <w:b w:val="0"/>
         </w:rPr>
-        <w:t>Ở slide trước, các em thấy thứ tự các mục. Slide này đi thêm một bước: mỗi mục phải khớp với mục trước và mục sau. Sách đưa ra sáu mối nối để các em tự kiểm tra và nói rõ sáu mối nối này áp dụng nguyên cho Chương 1.</w:t>
+        <w:t>Ở slide trước, các em thấy bảy mục đi theo chuỗi nhân quả: vấn đề, mục tiêu, câu hỏi, phạm vi, phương pháp, ý nghĩa và kết cấu. Slide này đi thêm một bước: mỗi mục phải khớp với mục trước và mục sau. Sách đưa ra sáu mối nối để các em tự kiểm tra và nói rõ sáu mối nối này áp dụng nguyên cho Chương 1.</w:t>
       </w:r>
     </w:p>
     <w:p>
@@ -1374,7 +1756,7 @@
           <w:b/>
           <w:color w:val="CC0000"/>
         </w:rPr>
-        <w:t>(Slide 16: Lý do chọn đề tài là một lập luận hình phễu, không phải bài giới thiệu ngành)</w:t>
+        <w:t>(Slide 20: Lý do chọn đề tài là một lập luận hình phễu, không phải bài giới thiệu ngành)</w:t>
       </w:r>
     </w:p>
     <w:p>
@@ -1479,7 +1861,7 @@
           <w:b/>
           <w:color w:val="CC0000"/>
         </w:rPr>
-        <w:t>(Slide 17: Câu nêu vấn đề đạt phải có đối tượng, số liệu có nguồn, hệ quả và điều còn chưa rõ)</w:t>
+        <w:t>(Slide 21: Câu nêu vấn đề đạt phải có đối tượng, số liệu có nguồn, hệ quả và điều còn chưa rõ)</w:t>
       </w:r>
     </w:p>
     <w:p>
@@ -1584,7 +1966,7 @@
           <w:b/>
           <w:color w:val="CC0000"/>
         </w:rPr>
-        <w:t>(Slide 18: Mỗi mục tiêu cụ thể bắt đầu bằng một động từ hành động và ghép đúng một câu hỏi)</w:t>
+        <w:t>(Slide 22: Mỗi mục tiêu cụ thể bắt đầu bằng một động từ hành động và ghép đúng một câu hỏi)</w:t>
       </w:r>
     </w:p>
     <w:p>
@@ -1689,7 +2071,7 @@
           <w:b/>
           <w:color w:val="CC0000"/>
         </w:rPr>
-        <w:t>(Slide 19: Đối tượng nghiên cứu là điều cần tìm hiểu; đối tượng khảo sát là người cung cấp dữ liệu)</w:t>
+        <w:t>(Slide 23: Đối tượng nghiên cứu là điều cần tìm hiểu; đối tượng khảo sát là người cung cấp dữ liệu)</w:t>
       </w:r>
     </w:p>
     <w:p>
@@ -1783,7 +2165,7 @@
           <w:b/>
           <w:color w:val="CC0000"/>
         </w:rPr>
-        <w:t>(Slide 20: Ba mục cuối đều bị trừ điểm vì cùng một lỗi: viết chung chung, đúng với mọi đề tài)</w:t>
+        <w:t>(Slide 24: Ba mục cuối đều bị trừ điểm vì cùng một lỗi: viết chung chung, đúng với mọi đề tài)</w:t>
       </w:r>
     </w:p>
     <w:p>
@@ -1888,7 +2270,7 @@
           <w:b/>
           <w:color w:val="CC0000"/>
         </w:rPr>
-        <w:t>(Slide 21: Chương 1 không chép lại phần mở đầu mà bổ sung số liệu, lý do lựa chọn và tiểu mục)</w:t>
+        <w:t>(Slide 25: Chương 1 không chép lại phần mở đầu mà bổ sung số liệu, lý do lựa chọn và tiểu mục)</w:t>
       </w:r>
     </w:p>
     <w:p>
@@ -1993,7 +2375,7 @@
           <w:b/>
           <w:color w:val="CC0000"/>
         </w:rPr>
-        <w:t>(Slide 22: Không tìm thấy nghiên cứu đúng đề tài thì mở rộng dần phạm vi tìm kiếm theo tam giác ngược, không kết luận "chưa ai nghiên cứu")</w:t>
+        <w:t>(Slide 26: Không tìm thấy nghiên cứu đúng đề tài thì mở rộng dần phạm vi tìm kiếm theo tam giác ngược, không kết luận "chưa ai nghiên cứu")</w:t>
       </w:r>
     </w:p>
     <w:p>
@@ -2087,7 +2469,7 @@
           <w:b/>
           <w:color w:val="CC0000"/>
         </w:rPr>
-        <w:t>(Slide 23: Đọc Chương 1 mẫu theo từng đoạn: mỗi đoạn làm đúng một nhiệm vụ và nối sang đoạn sau)</w:t>
+        <w:t>(Slide 27: Đọc Chương 1 mẫu theo từng đoạn: mỗi đoạn làm đúng một nhiệm vụ và nối sang đoạn sau)</w:t>
       </w:r>
     </w:p>
     <w:p>
@@ -2181,7 +2563,7 @@
           <w:b/>
           <w:color w:val="CC0000"/>
         </w:rPr>
-        <w:t>(Slide 24: Mỗi từ cảm tính hoặc mơ hồ được thay bằng một con số có nguồn hoặc một việc cụ thể)</w:t>
+        <w:t>(Slide 28: Mỗi từ cảm tính hoặc mơ hồ được thay bằng một con số có nguồn hoặc một việc cụ thể)</w:t>
       </w:r>
     </w:p>
     <w:p>
@@ -2275,7 +2657,7 @@
           <w:b/>
           <w:color w:val="CC0000"/>
         </w:rPr>
-        <w:t>(Slide 25: Bảy lỗi của phần mở đầu và bảy lỗi của Chương 1 đều có cách khắc phục chỉ về đúng mục trong sách)</w:t>
+        <w:t>(Slide 29: Bảy lỗi của phần mở đầu và bảy lỗi của Chương 1 đều có cách khắc phục chỉ về đúng mục trong sách)</w:t>
       </w:r>
     </w:p>
     <w:p>
@@ -2404,7 +2786,7 @@
           <w:b/>
           <w:color w:val="CC0000"/>
         </w:rPr>
-        <w:t>(Slide 27: Bản đồ đọc sách cho Chương 2: phần lớn thời gian nằm ở đọc tài liệu, không nằm ở viết)</w:t>
+        <w:t>(Slide 31: Bản đồ đọc sách cho Chương 2: phần lớn thời gian nằm ở đọc tài liệu, không nằm ở viết)</w:t>
       </w:r>
     </w:p>
     <w:p>
@@ -2492,7 +2874,7 @@
           <w:b/>
           <w:color w:val="CC0000"/>
         </w:rPr>
-        <w:t>(Slide 28: Chương 2 đi theo một chiều duy nhất: từ khái niệm đến giả thuyết)</w:t>
+        <w:t>(Slide 32: Chương 2 đi theo một chiều duy nhất: từ khái niệm đến giả thuyết)</w:t>
       </w:r>
     </w:p>
     <w:p>
@@ -2592,7 +2974,7 @@
           <w:b/>
           <w:color w:val="CC0000"/>
         </w:rPr>
-        <w:t>(Slide 29: Định nghĩa khái niệm quyết định câu hỏi khảo sát ở Chương 3, nên không được tự đặt theo cảm nhận)</w:t>
+        <w:t>(Slide 33: Định nghĩa khái niệm quyết định câu hỏi khảo sát ở Chương 3, nên không được tự đặt theo cảm nhận)</w:t>
       </w:r>
     </w:p>
     <w:p>
@@ -2697,7 +3079,7 @@
           <w:b/>
           <w:color w:val="CC0000"/>
         </w:rPr>
-        <w:t>(Slide 30: Tổng hợp khác liệt kê ở chủ ngữ: chủ ngữ là ý tưởng, tên tác giả nằm trong ngoặc cuối câu)</w:t>
+        <w:t>(Slide 34: Tổng hợp khác liệt kê ở chủ ngữ: chủ ngữ là ý tưởng, tên tác giả nằm trong ngoặc cuối câu)</w:t>
       </w:r>
     </w:p>
     <w:p>
@@ -2802,7 +3184,7 @@
           <w:b/>
           <w:color w:val="CC0000"/>
         </w:rPr>
-        <w:t>(Slide 31: Mỗi câu trong đoạn tổng quan mẫu làm đúng một nhiệm vụ: gom nhóm, trình bày, so sánh, đối chiếu, chỉ khoảng trống)</w:t>
+        <w:t>(Slide 35: Mỗi câu trong đoạn tổng quan mẫu làm đúng một nhiệm vụ: gom nhóm, trình bày, so sánh, đối chiếu, chỉ khoảng trống)</w:t>
       </w:r>
     </w:p>
     <w:p>
@@ -2896,7 +3278,7 @@
           <w:b/>
           <w:color w:val="CC0000"/>
         </w:rPr>
-        <w:t>(Slide 32: Ma trận tổng hợp trên Excel biến 20 bài báo rời rạc thành các nhóm chủ đề nhìn thấy được)</w:t>
+        <w:t>(Slide 36: Ma trận tổng hợp trên Excel biến 20 bài báo rời rạc thành các nhóm chủ đề nhìn thấy được)</w:t>
       </w:r>
     </w:p>
     <w:p>
@@ -3001,7 +3383,7 @@
           <w:b/>
           <w:color w:val="CC0000"/>
         </w:rPr>
-        <w:t>(Slide 33: Khoảng trống nghiên cứu phải được chứng minh bằng chính các nghiên cứu vừa tổng hợp)</w:t>
+        <w:t>(Slide 37: Khoảng trống nghiên cứu phải được chứng minh bằng chính các nghiên cứu vừa tổng hợp)</w:t>
       </w:r>
     </w:p>
     <w:p>
@@ -3106,7 +3488,7 @@
           <w:b/>
           <w:color w:val="CC0000"/>
         </w:rPr>
-        <w:t>(Slide 34: Mỗi biến trong mô hình phải truy ngược được về một lý thuyết gốc có tác giả và năm)</w:t>
+        <w:t>(Slide 38: Mỗi biến trong mô hình phải truy ngược được về một lý thuyết gốc có tác giả và năm)</w:t>
       </w:r>
     </w:p>
     <w:p>
@@ -3211,7 +3593,7 @@
           <w:b/>
           <w:color w:val="CC0000"/>
         </w:rPr>
-        <w:t>(Slide 35: Mô hình giữ 3 đến 5 biến độc lập vì mỗi biến thêm vào làm tăng câu hỏi, cỡ mẫu và thời gian)</w:t>
+        <w:t>(Slide 39: Mô hình giữ 3 đến 5 biến độc lập vì mỗi biến thêm vào làm tăng câu hỏi, cỡ mẫu và thời gian)</w:t>
       </w:r>
     </w:p>
     <w:p>
@@ -3316,7 +3698,7 @@
           <w:b/>
           <w:color w:val="CC0000"/>
         </w:rPr>
-        <w:t>(Slide 36: Bảng tổng hợp giả thuyết là công cụ kiểm tra: số dòng bằng số mũi tên, nội dung trùng từng chữ với mục 2.3.1)</w:t>
+        <w:t>(Slide 40: Bảng tổng hợp giả thuyết là công cụ kiểm tra: số dòng bằng số mũi tên, nội dung trùng từng chữ với mục 2.3.1)</w:t>
       </w:r>
     </w:p>
     <w:p>
@@ -3410,7 +3792,7 @@
           <w:b/>
           <w:color w:val="CC0000"/>
         </w:rPr>
-        <w:t>(Slide 37: Giả thuyết có chiều thì kiểm định được, vì người đọc biết trước kết quả nào là trái với dự đoán)</w:t>
+        <w:t>(Slide 41: Giả thuyết có chiều thì kiểm định được, vì người đọc biết trước kết quả nào là trái với dự đoán)</w:t>
       </w:r>
     </w:p>
     <w:p>
@@ -3515,7 +3897,7 @@
           <w:b/>
           <w:color w:val="CC0000"/>
         </w:rPr>
-        <w:t>(Slide 38: Học tư duy và cách viết từ luận án tiến sĩ; không sao chép mô hình, kỹ thuật và cỡ mẫu của nó)</w:t>
+        <w:t>(Slide 42: Học tư duy và cách viết từ luận án tiến sĩ; không sao chép mô hình, kỹ thuật và cỡ mẫu của nó)</w:t>
       </w:r>
     </w:p>
     <w:p>
@@ -3609,7 +3991,7 @@
           <w:b/>
           <w:color w:val="CC0000"/>
         </w:rPr>
-        <w:t>(Slide 39: Bốn lỗi phổ biến nhất của Chương 2 đều làm mô hình mất cơ sở hoặc giả thuyết không kiểm định được)</w:t>
+        <w:t>(Slide 43: Bốn lỗi phổ biến nhất của Chương 2 đều làm mô hình mất cơ sở hoặc giả thuyết không kiểm định được)</w:t>
       </w:r>
     </w:p>
     <w:p>
@@ -3654,7 +4036,7 @@
         <w:rPr>
           <w:b w:val="0"/>
         </w:rPr>
-        <w:t>Checklist Chương 2 có 13 câu, trong đó có ba câu thầy muốn các em để ý: khoảng trống có khớp với mô hình không; bảng tổng hợp giả thuyết có khớp từng chữ với mục 2.3.1 không; tên biến và ký hiệu biến có thống nhất trong toàn chương không. Ba câu này đều kiểm tra mối nối, đúng tinh thần ba chữ "khớp" ở đầu buổi.</w:t>
+        <w:t>Checklist Chương 2 có 13 câu, trong đó có ba câu thầy muốn các em để ý: khoảng trống có khớp với mô hình không; bảng tổng hợp giả thuyết có khớp từng chữ với mục 2.3.1 không; tên biến và ký hiệu biến có thống nhất trong toàn chương không. Ba câu này đều kiểm tra mối nối, đúng tinh thần ba chữ "khớp" ở đầu buổi: kết quả khớp giả thuyết, kết luận khớp câu hỏi, con số khớp file dữ liệu.</w:t>
       </w:r>
     </w:p>
     <w:p>
@@ -3738,7 +4120,7 @@
           <w:b/>
           <w:color w:val="CC0000"/>
         </w:rPr>
-        <w:t>(Slide 41: Bản đồ đọc sách cho Chương 3: mỗi mục gắn với một sheet Excel và phải có một câu "vì sao")</w:t>
+        <w:t>(Slide 45: Bản đồ đọc sách cho Chương 3: mỗi mục gắn với một sheet Excel và phải có một câu "vì sao")</w:t>
       </w:r>
     </w:p>
     <w:p>
@@ -3783,7 +4165,7 @@
         <w:rPr>
           <w:b w:val="0"/>
         </w:rPr>
-        <w:t>Cột thời gian cho thấy mục 3.5 có con số lớn nhất: 2 đến 3 tuần thu thập thực tế. Ở Core Slide 1, thầy đã nói về đường găng, critical path, trong timeline tám tuần. Thu thập dữ liệu là mốc nằm trên đường găng: chậm một tuần ở đây là Chương 4 và Chương 5 chậm theo một tuần.</w:t>
+        <w:t>Cột thời gian cho thấy mục 3.5 có con số lớn nhất: 2 đến 3 tuần thu thập thực tế. Ở Slide 90 của Core Slide 1, thầy đã nói về đường găng, critical path: chuỗi việc mà việc sau chỉ bắt đầu được khi việc trước thật sự xong và trễ một mắt xích thì mọi mắt xích phía sau trễ theo. Thu thập dữ liệu là mốc nằm trên đường găng: chậm một tuần ở đây là Chương 4 và Chương 5 chậm theo một tuần.</w:t>
       </w:r>
     </w:p>
     <w:p>
@@ -3826,7 +4208,7 @@
           <w:b/>
           <w:color w:val="CC0000"/>
         </w:rPr>
-        <w:t>(Slide 42: Mỗi biến trong mô hình trở thành một nhóm câu hỏi, một biến đại diện và một hệ số được kiểm định)</w:t>
+        <w:t>(Slide 46: Mỗi biến trong mô hình trở thành một nhóm câu hỏi, một biến đại diện và một hệ số được kiểm định)</w:t>
       </w:r>
     </w:p>
     <w:p>
@@ -3931,7 +4313,7 @@
           <w:b/>
           <w:color w:val="CC0000"/>
         </w:rPr>
-        <w:t>(Slide 43: Triết lý, cách tiếp cận và phương pháp phải nằm trên cùng một cột, nếu không Chương 3 tự mâu thuẫn)</w:t>
+        <w:t>(Slide 47: Triết lý, cách tiếp cận và phương pháp phải nằm trên cùng một cột, nếu không Chương 3 tự mâu thuẫn)</w:t>
       </w:r>
     </w:p>
     <w:p>
@@ -4036,7 +4418,7 @@
           <w:b/>
           <w:color w:val="CC0000"/>
         </w:rPr>
-        <w:t>(Slide 44: Đề tài định tính vẫn trả lời cùng câu hỏi "dữ liệu từ ai, bằng công cụ gì, phân tích ra sao" nhưng khác ở bốn điểm)</w:t>
+        <w:t>(Slide 48: Đề tài định tính vẫn trả lời cùng câu hỏi "dữ liệu từ ai, bằng công cụ gì, phân tích ra sao" nhưng khác ở bốn điểm)</w:t>
       </w:r>
     </w:p>
     <w:p>
@@ -4130,7 +4512,7 @@
           <w:b/>
           <w:color w:val="CC0000"/>
         </w:rPr>
-        <w:t>(Slide 45: Khảo sát cắt ngang năm bước, mỗi bước có một sản phẩm và một con số cụ thể)</w:t>
+        <w:t>(Slide 49: Khảo sát cắt ngang năm bước, mỗi bước có một sản phẩm và một con số cụ thể)</w:t>
       </w:r>
     </w:p>
     <w:p>
@@ -4235,7 +4617,7 @@
           <w:b/>
           <w:color w:val="CC0000"/>
         </w:rPr>
-        <w:t>(Slide 46: Không có khung mẫu thì không chọn mẫu xác suất được và kết luận chỉ gợi ý xu hướng cho tổng thể)</w:t>
+        <w:t>(Slide 50: Không có khung mẫu thì không chọn mẫu xác suất được và kết luận chỉ gợi ý xu hướng cho tổng thể)</w:t>
       </w:r>
     </w:p>
     <w:p>
@@ -4340,7 +4722,7 @@
           <w:b/>
           <w:color w:val="CC0000"/>
         </w:rPr>
-        <w:t>(Slide 47: Cỡ mẫu được tính bằng hai quy tắc có nguồn rồi chọn số lớn hơn, không lấy theo "nhiều khóa luận cũng chọn")</w:t>
+        <w:t>(Slide 51: Cỡ mẫu được tính bằng hai quy tắc có nguồn rồi chọn số lớn hơn, không lấy theo "nhiều khóa luận cũng chọn")</w:t>
       </w:r>
     </w:p>
     <w:p>
@@ -4445,7 +4827,7 @@
           <w:b/>
           <w:color w:val="CC0000"/>
         </w:rPr>
-        <w:t>(Slide 48: Dữ liệu sơ cấp dùng để kiểm định giả thuyết; dữ liệu thứ cấp dùng để mô tả bối cảnh)</w:t>
+        <w:t>(Slide 52: Dữ liệu sơ cấp dùng để kiểm định giả thuyết; dữ liệu thứ cấp dùng để mô tả bối cảnh)</w:t>
       </w:r>
     </w:p>
     <w:p>
@@ -4539,7 +4921,7 @@
           <w:b/>
           <w:color w:val="CC0000"/>
         </w:rPr>
-        <w:t>(Slide 49: Mỗi câu hỏi chỉ đo một ý, viết dạng khẳng định, dùng chung một thang Likert năm mức)</w:t>
+        <w:t>(Slide 53: Mỗi câu hỏi chỉ đo một ý, viết dạng khẳng định, dùng chung một thang Likert năm mức)</w:t>
       </w:r>
     </w:p>
     <w:p>
@@ -4644,7 +5026,7 @@
           <w:b/>
           <w:color w:val="CC0000"/>
         </w:rPr>
-        <w:t>(Slide 50: Người đọc cần thấy con số ở từng bước: bao nhiêu người được mời, trả lời, bị loại và còn hợp lệ)</w:t>
+        <w:t>(Slide 54: Người đọc cần thấy con số ở từng bước: bao nhiêu người được mời, trả lời, bị loại và còn hợp lệ)</w:t>
       </w:r>
     </w:p>
     <w:p>
@@ -4749,7 +5131,7 @@
           <w:b/>
           <w:color w:val="CC0000"/>
         </w:rPr>
-        <w:t>(Slide 51: Quy tắc loại phiếu phải đặt trước khi mở dữ liệu, để quyết định không phụ thuộc kết quả mong muốn)</w:t>
+        <w:t>(Slide 55: Quy tắc loại phiếu phải đặt trước khi mở dữ liệu, để quyết định không phụ thuộc kết quả mong muốn)</w:t>
       </w:r>
     </w:p>
     <w:p>
@@ -4854,7 +5236,7 @@
           <w:b/>
           <w:color w:val="CC0000"/>
         </w:rPr>
-        <w:t>(Slide 52: Bảy chỉ số mô tả tính bằng hàm Excel có sẵn; Chương 3 chỉ nói sẽ tính gì, con số để dành cho Chương 4)</w:t>
+        <w:t>(Slide 56: Bảy chỉ số mô tả tính bằng hàm Excel có sẵn; Chương 3 chỉ nói sẽ tính gì, con số để dành cho Chương 4)</w:t>
       </w:r>
     </w:p>
     <w:p>
@@ -4948,7 +5330,7 @@
           <w:b/>
           <w:color w:val="CC0000"/>
         </w:rPr>
-        <w:t>(Slide 53: Cronbach Alpha kiểm tra các câu hỏi có "cùng lên cùng xuống" không, trước khi được gộp thành một biến)</w:t>
+        <w:t>(Slide 57: Cronbach Alpha kiểm tra các câu hỏi có "cùng lên cùng xuống" không, trước khi được gộp thành một biến)</w:t>
       </w:r>
     </w:p>
     <w:p>
@@ -5053,7 +5435,7 @@
           <w:b/>
           <w:color w:val="CC0000"/>
         </w:rPr>
-        <w:t>(Slide 54: Alpha không phải càng cao càng tốt: dưới 0,6 là kém, trên 0,95 có thể là các câu hỏi lặp nhau)</w:t>
+        <w:t>(Slide 58: Alpha không phải càng cao càng tốt: dưới 0,6 là kém, trên 0,95 có thể là các câu hỏi lặp nhau)</w:t>
       </w:r>
     </w:p>
     <w:p>
@@ -5087,7 +5469,7 @@
         <w:rPr>
           <w:b w:val="0"/>
         </w:rPr>
-        <w:t>Slide trước các em đã hiểu Alpha đo điều gì. Slide này là Bảng 18, cách đọc các mức của Alpha, một bảng thầy rất muốn các em thuộc. Có bốn mức. Dưới 0,6: thang đo kém nhất quán; xem lại từng câu, không dùng nếu không cải thiện được. Từ 0,6 đến dưới 0,7: có thể chấp nhận nhưng phải chỉ ra được một trong hai lý do, là khái niệm còn mới với người trả lời hoặc thang đo mới được xây dựng và ghi lý do đó vào bài. Từ 0,7 đến 0,9: tốt, là khoảng tối ưu. Trên 0,95: không phải tốt hơn.</w:t>
+        <w:t>Slide trước các em đã thấy Alpha đo mức các câu hỏi trong một thang đo "cùng lên cùng xuống", tức cùng đo một khái niệm. Slide này là Bảng 18, cách đọc các mức của Alpha, một bảng thầy rất muốn các em thuộc. Có bốn mức. Dưới 0,6: thang đo kém nhất quán; xem lại từng câu, không dùng nếu không cải thiện được. Từ 0,6 đến dưới 0,7: có thể chấp nhận nhưng phải chỉ ra được một trong hai lý do, là khái niệm còn mới với người trả lời hoặc thang đo mới được xây dựng và ghi lý do đó vào bài. Từ 0,7 đến 0,9: tốt, là khoảng tối ưu. Trên 0,95: không phải tốt hơn.</w:t>
       </w:r>
     </w:p>
     <w:p>
@@ -5147,7 +5529,7 @@
           <w:b/>
           <w:color w:val="CC0000"/>
         </w:rPr>
-        <w:t>(Slide 55: EFA là mục tùy chọn; ba câu hỏi giúp các em tự quyết định có làm hay không)</w:t>
+        <w:t>(Slide 59: EFA là mục tùy chọn; ba câu hỏi giúp các em tự quyết định có làm hay không)</w:t>
       </w:r>
     </w:p>
     <w:p>
@@ -5252,7 +5634,7 @@
           <w:b/>
           <w:color w:val="CC0000"/>
         </w:rPr>
-        <w:t>(Slide 56: Hồi quy đa biến kiểm định mỗi giả thuyết qua dấu và P-value của đúng một hệ số)</w:t>
+        <w:t>(Slide 60: Hồi quy đa biến kiểm định mỗi giả thuyết qua dấu và P-value của đúng một hệ số)</w:t>
       </w:r>
     </w:p>
     <w:p>
@@ -5357,7 +5739,7 @@
           <w:b/>
           <w:color w:val="CC0000"/>
         </w:rPr>
-        <w:t>(Slide 57: Hệ số và P-value chỉ đáng tin khi dữ liệu thỏa bốn giả định và cả bốn đều kiểm tra được ngay trên Excel)</w:t>
+        <w:t>(Slide 61: Hệ số và P-value chỉ đáng tin khi dữ liệu thỏa bốn giả định và cả bốn đều kiểm tra được ngay trên Excel)</w:t>
       </w:r>
     </w:p>
     <w:p>
@@ -5451,7 +5833,7 @@
           <w:b/>
           <w:color w:val="CC0000"/>
         </w:rPr>
-        <w:t>(Slide 58: Đo ổn định chưa đủ, phải đo đúng và người tham gia phải được thông tin, tự nguyện, bảo vệ)</w:t>
+        <w:t>(Slide 62: Đo ổn định chưa đủ, phải đo đúng và người tham gia phải được thông tin, tự nguyện, bảo vệ)</w:t>
       </w:r>
     </w:p>
     <w:p>
@@ -5556,7 +5938,7 @@
           <w:b/>
           <w:color w:val="CC0000"/>
         </w:rPr>
-        <w:t>(Slide 59: Mười câu tự chấm, mỗi câu có một cách kiểm tra không dựa vào cảm giác; dưới 8 câu "có" thì sửa trước khi sang Chương 4)</w:t>
+        <w:t>(Slide 63: Mười câu tự chấm, mỗi câu có một cách kiểm tra không dựa vào cảm giác; dưới 8 câu "có" thì sửa trước khi sang Chương 4)</w:t>
       </w:r>
     </w:p>
     <w:p>
@@ -5590,7 +5972,7 @@
         <w:rPr>
           <w:b w:val="0"/>
         </w:rPr>
-        <w:t>Bảng 26 là công cụ tự chấm mà thầy đã nhắc ở slide đối chiếu với Core Slide 1. Điều đặc biệt là mỗi câu hỏi đi kèm một cách kiểm tra cụ thể, để câu trả lời không dựa vào cảm giác. Ví dụ câu 1, đoạn văn gom nhóm hay liệt kê: tô đậm chủ ngữ của từng câu, nếu phần lớn là tên tác giả thì đang liệt kê. Câu 5, mô hình có đơn giản không: đếm biến độc lập, phải từ 3 đến 5 và đếm số mũi tên với số giả thuyết, phải bằng nhau. Câu 9, quy trình thu thập: đủ bốn con số mời, thu về, loại, hợp lệ.</w:t>
+        <w:t>Bảng 26 là công cụ tự chấm mà thầy đã nhắc ở đầu buổi, khi đối chiếu những gì Core Slide 1 đã hẹn: đây là công cụ gần nhất với tiêu chí chấm có trong sách. Điều đặc biệt là mỗi câu hỏi đi kèm một cách kiểm tra cụ thể, để câu trả lời không dựa vào cảm giác. Ví dụ câu 1, đoạn văn gom nhóm hay liệt kê: tô đậm chủ ngữ của từng câu, nếu phần lớn là tên tác giả thì đang liệt kê. Câu 5, mô hình có đơn giản không: đếm biến độc lập, phải từ 3 đến 5 và đếm số mũi tên với số giả thuyết, phải bằng nhau. Câu 9, quy trình thu thập: đủ bốn con số mời, thu về, loại, hợp lệ.</w:t>
       </w:r>
     </w:p>
     <w:p>
@@ -5685,7 +6067,7 @@
           <w:b/>
           <w:color w:val="CC0000"/>
         </w:rPr>
-        <w:t>(Slide 61: Bản đồ đọc sách cho Chương 4: mỗi mục thực hiện đúng một bước đã hứa ở Chương 3)</w:t>
+        <w:t>(Slide 65: Bản đồ đọc sách cho Chương 4: mỗi mục thực hiện đúng một bước đã hứa ở Chương 3)</w:t>
       </w:r>
     </w:p>
     <w:p>
@@ -5779,7 +6161,7 @@
           <w:b/>
           <w:color w:val="CC0000"/>
         </w:rPr>
-        <w:t>(Slide 62: Chương 4 kiểm tra từng lớp; lớp sau chỉ có giá trị khi lớp trước đạt)</w:t>
+        <w:t>(Slide 66: Chương 4 kiểm tra từng lớp; lớp sau chỉ có giá trị khi lớp trước đạt)</w:t>
       </w:r>
     </w:p>
     <w:p>
@@ -5873,7 +6255,7 @@
           <w:b/>
           <w:color w:val="CC0000"/>
         </w:rPr>
-        <w:t>(Slide 63: Một bảng số chưa phải là kết quả; kết quả là đoạn văn đi qua bốn bước Đọc, So sánh, Ý nghĩa, Liên hệ)</w:t>
+        <w:t>(Slide 67: Một bảng số chưa phải là kết quả; kết quả là đoạn văn đi qua bốn bước Đọc, So sánh, Ý nghĩa, Liên hệ)</w:t>
       </w:r>
     </w:p>
     <w:p>
@@ -5967,7 +6349,7 @@
           <w:b/>
           <w:color w:val="CC0000"/>
         </w:rPr>
-        <w:t>(Slide 64: Khách hàng thấy rõ lợi ích nhưng còn dè dặt về an toàn: niềm tin và ảnh hưởng xã hội chỉ nhỉnh hơn mức trung lập)</w:t>
+        <w:t>(Slide 68: Khách hàng thấy rõ lợi ích nhưng còn dè dặt về an toàn: niềm tin và ảnh hưởng xã hội chỉ nhỉnh hơn mức trung lập)</w:t>
       </w:r>
     </w:p>
     <w:p>
@@ -6072,7 +6454,7 @@
           <w:b/>
           <w:color w:val="CC0000"/>
         </w:rPr>
-        <w:t>(Slide 65: Cả chín thang đo của hai đề tài đạt ngưỡng 0,7, nên toàn bộ câu hỏi được giữ lại)</w:t>
+        <w:t>(Slide 69: Cả chín thang đo của hai đề tài đạt ngưỡng 0,7, nên toàn bộ câu hỏi được giữ lại)</w:t>
       </w:r>
     </w:p>
     <w:p>
@@ -6177,7 +6559,7 @@
           <w:b/>
           <w:color w:val="CC0000"/>
         </w:rPr>
-        <w:t>(Slide 66: Cả bốn biến tương quan cùng chiều với ý định sử dụng nhưng tương quan chưa phải là tác động)</w:t>
+        <w:t>(Slide 70: Cả bốn biến tương quan cùng chiều với ý định sử dụng nhưng tương quan chưa phải là tác động)</w:t>
       </w:r>
     </w:p>
     <w:p>
@@ -6282,7 +6664,7 @@
           <w:b/>
           <w:color w:val="CC0000"/>
         </w:rPr>
-        <w:t>(Slide 67: Bốn biến giải thích 53,7% khác biệt về ý định sử dụng; sự hữu ích mạnh nhất, sự dễ sử dụng không có ý nghĩa)</w:t>
+        <w:t>(Slide 71: Bốn biến giải thích 53,7% khác biệt về ý định sử dụng; sự hữu ích mạnh nhất, sự dễ sử dụng không có ý nghĩa)</w:t>
       </w:r>
     </w:p>
     <w:p>
@@ -6387,7 +6769,7 @@
           <w:b/>
           <w:color w:val="CC0000"/>
         </w:rPr>
-        <w:t>(Slide 68: Báo cáo ba loại bằng chứng: P-value nói có ngẫu nhiên hay không, khoảng tin cậy và độ lớn tác động nói mạnh đến đâu)</w:t>
+        <w:t>(Slide 72: Báo cáo ba loại bằng chứng: P-value nói có ngẫu nhiên hay không, khoảng tin cậy và độ lớn tác động nói mạnh đến đâu)</w:t>
       </w:r>
     </w:p>
     <w:p>
@@ -6481,7 +6863,7 @@
           <w:b/>
           <w:color w:val="CC0000"/>
         </w:rPr>
-        <w:t>(Slide 69: Giả thuyết được ủng hộ khi thỏa đồng thời hai điều kiện: đúng dấu dự đoán và P-value nhỏ hơn 0,05)</w:t>
+        <w:t>(Slide 73: Giả thuyết được ủng hộ khi thỏa đồng thời hai điều kiện: đúng dấu dự đoán và P-value nhỏ hơn 0,05)</w:t>
       </w:r>
     </w:p>
     <w:p>
@@ -6586,7 +6968,7 @@
           <w:b/>
           <w:color w:val="CC0000"/>
         </w:rPr>
-        <w:t>(Slide 70: Điểm thái độ nhân viên toàn mẫu cao nhất nhưng 25 phụ huynh nêu chủ đề thái độ chỉ chấm 3,28)</w:t>
+        <w:t>(Slide 74: Điểm thái độ nhân viên toàn mẫu cao nhất nhưng 25 phụ huynh nêu chủ đề thái độ chỉ chấm 3,28)</w:t>
       </w:r>
     </w:p>
     <w:p>
@@ -6691,7 +7073,7 @@
           <w:b/>
           <w:color w:val="CC0000"/>
         </w:rPr>
-        <w:t>(Slide 71: Thảo luận đặt kết quả cạnh lý thuyết gốc và cạnh nghiên cứu trước, rồi giải thích vì sao giống hoặc khác)</w:t>
+        <w:t>(Slide 75: Thảo luận đặt kết quả cạnh lý thuyết gốc và cạnh nghiên cứu trước, rồi giải thích vì sao giống hoặc khác)</w:t>
       </w:r>
     </w:p>
     <w:p>
@@ -6796,7 +7178,7 @@
           <w:b/>
           <w:color w:val="CC0000"/>
         </w:rPr>
-        <w:t>(Slide 72: Đoạn thảo luận mẫu đi theo trình tự: kết quả khớp, kết quả khác, giải thích, củng cố, đóng góp, hướng tiếp theo)</w:t>
+        <w:t>(Slide 76: Đoạn thảo luận mẫu đi theo trình tự: kết quả khớp, kết quả khác, giải thích, củng cố, đóng góp, hướng tiếp theo)</w:t>
       </w:r>
     </w:p>
     <w:p>
@@ -6890,7 +7272,7 @@
           <w:b/>
           <w:color w:val="CC0000"/>
         </w:rPr>
-        <w:t>(Slide 73: H2 không được ủng hộ là phần thảo luận có giá trị nhất nếu được giải thích bằng số liệu và lý thuyết)</w:t>
+        <w:t>(Slide 77: H2 không được ủng hộ là phần thảo luận có giá trị nhất nếu được giải thích bằng số liệu và lý thuyết)</w:t>
       </w:r>
     </w:p>
     <w:p>
@@ -6995,7 +7377,7 @@
           <w:b/>
           <w:color w:val="CC0000"/>
         </w:rPr>
-        <w:t>(Slide 74: Kết quả khác dự đoán không phải lỗi; lỗi chỉ xuất hiện khi giấu kết quả, sửa dữ liệu hoặc thêm bớt biến cho "đẹp")</w:t>
+        <w:t>(Slide 78: Kết quả khác dự đoán không phải lỗi; lỗi chỉ xuất hiện khi giấu kết quả, sửa dữ liệu hoặc thêm bớt biến cho "đẹp")</w:t>
       </w:r>
     </w:p>
     <w:p>
@@ -7100,7 +7482,7 @@
           <w:b/>
           <w:color w:val="CC0000"/>
         </w:rPr>
-        <w:t>(Slide 75: Cả hai loại nghiên cứu đều quay về câu hỏi ở Chương 1; khác nhau ở loại bằng chứng được trình bày)</w:t>
+        <w:t>(Slide 79: Cả hai loại nghiên cứu đều quay về câu hỏi ở Chương 1; khác nhau ở loại bằng chứng được trình bày)</w:t>
       </w:r>
     </w:p>
     <w:p>
@@ -7194,7 +7576,7 @@
           <w:b/>
           <w:color w:val="CC0000"/>
         </w:rPr>
-        <w:t>(Slide 76: Đoạn giới thiệu nói chương sẽ trình bày gì và không nêu kết quả; đoạn kết luận nói giả thuyết nào được trả lời và dẫn sang Chương 5)</w:t>
+        <w:t>(Slide 80: Đoạn giới thiệu nói chương sẽ trình bày gì và không nêu kết quả; đoạn kết luận nói giả thuyết nào được trả lời và dẫn sang Chương 5)</w:t>
       </w:r>
     </w:p>
     <w:p>
@@ -7288,7 +7670,7 @@
           <w:b/>
           <w:color w:val="CC0000"/>
         </w:rPr>
-        <w:t>(Slide 77: Bảy lỗi của Chương 4, trong đó nhầm B với β và kết luận "ủng hộ" khi hệ số ngược dấu là hai lỗi sai về phương pháp)</w:t>
+        <w:t>(Slide 81: Bảy lỗi của Chương 4, trong đó nhầm B với β và kết luận "ủng hộ" khi hệ số ngược dấu là hai lỗi sai về phương pháp)</w:t>
       </w:r>
     </w:p>
     <w:p>
@@ -7423,7 +7805,7 @@
           <w:b/>
           <w:color w:val="CC0000"/>
         </w:rPr>
-        <w:t>(Slide 79: Bản đồ đọc sách cho Chương 5 và Kết luận: không có con số mới, chỉ có câu trả lời và quyết định)</w:t>
+        <w:t>(Slide 83: Bản đồ đọc sách cho Chương 5 và Kết luận: không có con số mới, chỉ có câu trả lời và quyết định)</w:t>
       </w:r>
     </w:p>
     <w:p>
@@ -7511,7 +7893,7 @@
           <w:b/>
           <w:color w:val="CC0000"/>
         </w:rPr>
-        <w:t>(Slide 80: Chương 5 đi từ điều đã biết chắc, đến điều nên làm, đến điều còn chưa biết)</w:t>
+        <w:t>(Slide 84: Chương 5 đi từ điều đã biết chắc, đến điều nên làm, đến điều còn chưa biết)</w:t>
       </w:r>
     </w:p>
     <w:p>
@@ -7605,7 +7987,7 @@
           <w:b/>
           <w:color w:val="CC0000"/>
         </w:rPr>
-        <w:t>(Slide 81: Mỗi câu hỏi ở Chương 1 được chép nguyên văn và trả lời thẳng ngay ở câu đầu tiên)</w:t>
+        <w:t>(Slide 85: Mỗi câu hỏi ở Chương 1 được chép nguyên văn và trả lời thẳng ngay ở câu đầu tiên)</w:t>
       </w:r>
     </w:p>
     <w:p>
@@ -7710,7 +8092,7 @@
           <w:b/>
           <w:color w:val="CC0000"/>
         </w:rPr>
-        <w:t>(Slide 82: Niềm tin quan trọng nhưng bị đánh giá thấp, nên là ưu tiên số một của Ngân hàng X)</w:t>
+        <w:t>(Slide 86: Niềm tin quan trọng nhưng bị đánh giá thấp, nên là ưu tiên số một của Ngân hàng X)</w:t>
       </w:r>
     </w:p>
     <w:p>
@@ -7804,7 +8186,7 @@
           <w:b/>
           <w:color w:val="CC0000"/>
         </w:rPr>
-        <w:t>(Slide 83: Ma trận xếp quy trình hành chính vào ưu tiên thấp nhưng phán đoán có căn cứ kéo nó lên)</w:t>
+        <w:t>(Slide 87: Ma trận xếp quy trình hành chính vào ưu tiên thấp nhưng phán đoán có căn cứ kéo nó lên)</w:t>
       </w:r>
     </w:p>
     <w:p>
@@ -7898,7 +8280,7 @@
           <w:b/>
           <w:color w:val="CC0000"/>
         </w:rPr>
-        <w:t>(Slide 84: Hàm ý đạt có năm phần: kết quả, hàm ý, hành động cụ thể, tác động mong đợi, điều kiện thực hiện)</w:t>
+        <w:t>(Slide 88: Hàm ý đạt có năm phần: kết quả, hàm ý, hành động cụ thể, tác động mong đợi, điều kiện thực hiện)</w:t>
       </w:r>
     </w:p>
     <w:p>
@@ -8003,7 +8385,7 @@
           <w:b/>
           <w:color w:val="CC0000"/>
         </w:rPr>
-        <w:t>(Slide 85: Mỗi hạn chế nêu rõ ảnh hưởng đến cách hiểu kết quả và sinh ra đúng một hướng nghiên cứu tiếp theo)</w:t>
+        <w:t>(Slide 89: Mỗi hạn chế nêu rõ ảnh hưởng đến cách hiểu kết quả và sinh ra đúng một hướng nghiên cứu tiếp theo)</w:t>
       </w:r>
     </w:p>
     <w:p>
@@ -8108,7 +8490,7 @@
           <w:b/>
           <w:color w:val="CC0000"/>
         </w:rPr>
-        <w:t>(Slide 86: Kết luận, đóng góp, hàm ý, kiến nghị và hạn chế trả lời năm câu hỏi khác nhau)</w:t>
+        <w:t>(Slide 90: Kết luận, đóng góp, hàm ý, kiến nghị và hạn chế trả lời năm câu hỏi khác nhau)</w:t>
       </w:r>
     </w:p>
     <w:p>
@@ -8213,7 +8595,7 @@
           <w:b/>
           <w:color w:val="CC0000"/>
         </w:rPr>
-        <w:t>(Slide 87: Tóm tắt là cả khóa luận trong một đoạn sáu phần, có con số chủ chốt, viết sau cùng)</w:t>
+        <w:t>(Slide 91: Tóm tắt là cả khóa luận trong một đoạn sáu phần, có con số chủ chốt, viết sau cùng)</w:t>
       </w:r>
     </w:p>
     <w:p>
@@ -8269,7 +8651,7 @@
         <w:rPr>
           <w:b w:val="0"/>
         </w:rPr>
-        <w:t xml:space="preserve">Các em để ý cụm "mô hình bốn yếu tố giải thích 53,7%", không phải "ba yếu tố". Đó chính là lỗi hay gặp nhất mà thầy đã nhắc. </w:t>
+        <w:t xml:space="preserve">Các em để ý cụm "mô hình bốn yếu tố giải thích 53,7%", không phải "ba yếu tố". Đó chính là lỗi hay gặp nhất mà sách chỉ ra ở mục tóm tắt khóa luận: 53,7% là R bình phương của cả mô hình bốn yếu tố, gồm cả sự dễ sử dụng, không thuộc riêng ba yếu tố có ý nghĩa. </w:t>
       </w:r>
       <w:r>
         <w:rPr>
@@ -8307,7 +8689,7 @@
           <w:b/>
           <w:color w:val="CC0000"/>
         </w:rPr>
-        <w:t>(Slide 88: Kết luận chung khép vòng trong năm đoạn ngắn: vấn đề, cách làm, phát hiện, đóng góp, hạn chế)</w:t>
+        <w:t>(Slide 92: Kết luận chung khép vòng trong năm đoạn ngắn: vấn đề, cách làm, phát hiện, đóng góp, hạn chế)</w:t>
       </w:r>
     </w:p>
     <w:p>
@@ -8401,7 +8783,7 @@
           <w:b/>
           <w:color w:val="CC0000"/>
         </w:rPr>
-        <w:t>(Slide 89: Năm lỗi của Chương 5 đều có cùng gốc: Chương 5 không thêm được gì so với Chương 4)</w:t>
+        <w:t>(Slide 93: Năm lỗi của Chương 5 đều có cùng gốc: Chương 5 không thêm được gì so với Chương 4)</w:t>
       </w:r>
     </w:p>
     <w:p>
@@ -8530,7 +8912,7 @@
           <w:b/>
           <w:color w:val="CC0000"/>
         </w:rPr>
-        <w:t>(Slide 91: Bản đồ đọc sách cho phần hoàn thiện: bốn chương cuối của sách không tạo kết quả mới nhưng quyết định kết quả có được tin)</w:t>
+        <w:t>(Slide 95: Bản đồ đọc sách cho phần hoàn thiện: bốn chương cuối của sách không tạo kết quả mới nhưng quyết định kết quả có được tin)</w:t>
       </w:r>
     </w:p>
     <w:p>
@@ -8624,7 +9006,7 @@
           <w:b/>
           <w:color w:val="CC0000"/>
         </w:rPr>
-        <w:t>(Slide 92: Trích dẫn và danh mục đi thành cặp; trình bày thống nhất đến từ Styles, không từ chỉnh tay)</w:t>
+        <w:t>(Slide 96: Trích dẫn và danh mục đi thành cặp; trình bày thống nhất đến từ Styles, không từ chỉnh tay)</w:t>
       </w:r>
     </w:p>
     <w:p>
@@ -8718,7 +9100,7 @@
           <w:b/>
           <w:color w:val="CC0000"/>
         </w:rPr>
-        <w:t>(Slide 93: Mỗi loại nguồn có một khuôn mẫu APA 7; danh mục và trích dẫn trong bài phải khớp hai chiều)</w:t>
+        <w:t>(Slide 97: Mỗi loại nguồn có một khuôn mẫu APA 7; danh mục và trích dẫn trong bài phải khớp hai chiều)</w:t>
       </w:r>
     </w:p>
     <w:p>
@@ -8812,7 +9194,7 @@
           <w:b/>
           <w:color w:val="CC0000"/>
         </w:rPr>
-        <w:t>(Slide 94: Phần đầu theo mẫu của trường; định dạng cài một lần bằng Styles; mọi số liệu định dạng phải đối chiếu quy định của trường)</w:t>
+        <w:t>(Slide 98: Phần đầu theo mẫu của trường; định dạng cài một lần bằng Styles; mọi số liệu định dạng phải đối chiếu quy định của trường)</w:t>
       </w:r>
     </w:p>
     <w:p>
@@ -8906,7 +9288,7 @@
           <w:b/>
           <w:color w:val="CC0000"/>
         </w:rPr>
-        <w:t>(Slide 95: Tỷ lệ trùng lặp là con số cần đọc và giải thích; nó không tự chứng minh có hay không có đạo văn)</w:t>
+        <w:t>(Slide 99: Tỷ lệ trùng lặp là con số cần đọc và giải thích; nó không tự chứng minh có hay không có đạo văn)</w:t>
       </w:r>
     </w:p>
     <w:p>
@@ -9000,7 +9382,7 @@
           <w:b/>
           <w:color w:val="CC0000"/>
         </w:rPr>
-        <w:t>(Slide 96: Kiểm tra theo sáu cặp điểm nối, vì lỗi mâu thuẫn nằm ở chỗ nối giữa các chương chứ không nằm trong từng chương)</w:t>
+        <w:t>(Slide 100: Kiểm tra theo sáu cặp điểm nối, vì lỗi mâu thuẫn nằm ở chỗ nối giữa các chương chứ không nằm trong từng chương)</w:t>
       </w:r>
     </w:p>
     <w:p>
@@ -9034,7 +9416,7 @@
         <w:rPr>
           <w:b w:val="0"/>
         </w:rPr>
-        <w:t>Đây là Bảng 54, sáu cặp điểm nối mà sách yêu cầu đối chiếu trước khi nộp. Các em nhớ đầu buổi thầy nói về ba chữ "khớp"; sáu cặp này là phiên bản chi tiết của ba chữ đó. Cặp một: câu hỏi ở Chương 1 và mục 5.1, mỗi câu hỏi có đúng một câu trả lời. Cặp hai: giả thuyết ở Chương 2 và bảng tổng hợp ở Chương 4, giống từng chữ. Cặp ba: kế hoạch ở Chương 3 và kết quả ở Chương 4, mọi bước đã hứa đều có kết quả. Cặp bốn: con số trong bài và file Excel. Cặp năm: tóm tắt, kết luận chung và Chương 4. Cặp sáu: trích dẫn và danh mục, khớp hai chiều.</w:t>
+        <w:t>Đây là Bảng 54, sáu cặp điểm nối mà sách yêu cầu đối chiếu trước khi nộp. Đầu buổi thầy nói về ba chữ "khớp": mọi kết quả ở Chương 4 khớp giả thuyết ở Chương 2; mọi kết luận ở Chương 5 khớp câu hỏi ở Chương 1; mọi con số khớp file dữ liệu. Sáu cặp này là phiên bản chi tiết của ba chữ đó. Cặp một: câu hỏi ở Chương 1 và mục 5.1, mỗi câu hỏi có đúng một câu trả lời. Cặp hai: giả thuyết ở Chương 2 và bảng tổng hợp ở Chương 4, giống từng chữ. Cặp ba: kế hoạch ở Chương 3 và kết quả ở Chương 4, mọi bước đã hứa đều có kết quả. Cặp bốn: con số trong bài và file Excel. Cặp năm: tóm tắt, kết luận chung và Chương 4. Cặp sáu: trích dẫn và danh mục, khớp hai chiều.</w:t>
       </w:r>
     </w:p>
     <w:p>
@@ -9094,7 +9476,7 @@
           <w:b/>
           <w:color w:val="CC0000"/>
         </w:rPr>
-        <w:t>(Slide 97: Các lỗi nghiêm trọng có thể làm khóa luận không đạt dù phần khác làm tốt; hai lỗi đầu là vi phạm đạo đức)</w:t>
+        <w:t>(Slide 101: Các lỗi nghiêm trọng có thể làm khóa luận không đạt dù phần khác làm tốt; hai lỗi đầu là vi phạm đạo đức)</w:t>
       </w:r>
     </w:p>
     <w:p>
@@ -9188,7 +9570,7 @@
           <w:b/>
           <w:color w:val="CC0000"/>
         </w:rPr>
-        <w:t>(Slide 98: Tiêu đề slide là một câu kết luận, thân slide là bằng chứng: người nghe hiểu tốt hơn và nhớ lâu hơn)</w:t>
+        <w:t>(Slide 102: Tiêu đề slide là một câu kết luận, thân slide là bằng chứng: người nghe hiểu tốt hơn và nhớ lâu hơn)</w:t>
       </w:r>
     </w:p>
     <w:p>
@@ -9293,7 +9675,7 @@
           <w:b/>
           <w:color w:val="CC0000"/>
         </w:rPr>
-        <w:t>(Slide 99: Mười hai phút, mười hai slide: phần lớn thời gian dành cho kết quả, thảo luận và hàm ý)</w:t>
+        <w:t>(Slide 103: Mười hai phút, mười hai slide: phần lớn thời gian dành cho kết quả, thảo luận và hàm ý)</w:t>
       </w:r>
     </w:p>
     <w:p>
@@ -9387,7 +9769,7 @@
           <w:b/>
           <w:color w:val="CC0000"/>
         </w:rPr>
-        <w:t>(Slide 100: Trả lời bằng bốn bước và phân biệt ba loại chất vấn: lựa chọn phương pháp, lỗi thật, điều chưa biết)</w:t>
+        <w:t>(Slide 104: Trả lời bằng bốn bước và phân biệt ba loại chất vấn: lựa chọn phương pháp, lỗi thật, điều chưa biết)</w:t>
       </w:r>
     </w:p>
     <w:p>
@@ -9486,7 +9868,7 @@
           <w:b/>
           <w:color w:val="CC0000"/>
         </w:rPr>
-        <w:t>(Slide 101: Phần lớn câu hỏi của Hội đồng rơi vào năm nhóm và căn cứ trả lời nằm sẵn ở một chương cụ thể)</w:t>
+        <w:t>(Slide 105: Phần lớn câu hỏi của Hội đồng rơi vào năm nhóm và căn cứ trả lời nằm sẵn ở một chương cụ thể)</w:t>
       </w:r>
     </w:p>
     <w:p>
@@ -9580,7 +9962,7 @@
           <w:b/>
           <w:color w:val="CC0000"/>
         </w:rPr>
-        <w:t>(Slide 102: Khóa luận đạt là khóa luận khép vòng: câu hỏi ở trang đầu được trả lời ở trang cuối bằng dữ liệu đáng tin)</w:t>
+        <w:t>(Slide 106: Khóa luận đạt là khóa luận khép vòng: câu hỏi ở trang đầu được trả lời ở trang cuối bằng dữ liệu đáng tin)</w:t>
       </w:r>
     </w:p>
     <w:p>
@@ -9667,7 +10049,7 @@
         <w:rPr>
           <w:i/>
         </w:rPr>
-        <w:t>Thử hình dung ngày bảo vệ, một thành viên Hội đồng lật trang câu hỏi nghiên cứu, rồi lật thẳng đến mục trả lời ở Chương 5, rồi nhìn bảng hệ số ở Chương 4. Ba trang, ba phút. Nếu ba trang khớp nhau, các em đã làm được điều quan trọng nhất của một khóa luận, như Core Slide 1 đã nói: kết luận có căn cứ.</w:t>
+        <w:t>Thử hình dung ngày bảo vệ, một thành viên Hội đồng lật trang câu hỏi nghiên cứu, rồi lật thẳng đến mục trả lời ở Chương 5, rồi nhìn bảng hệ số ở Chương 4. Ba trang, ba phút. Nếu ba trang khớp nhau, các em đã làm được điều quan trọng nhất của một khóa luận, như sơ đồ tổng kết ở Slide 98 của Core Slide 1 đã nhấn mạnh: hành trình bắt đầu từ vấn đề thực tế và kết thúc ở kết luận có căn cứ, tức kết luận dựa trên bằng chứng chứ không phải kết luận nghe hay.</w:t>
       </w:r>
     </w:p>
     <w:sectPr>

</xml_diff>

<commit_message>
Bổ sung hướng dẫn tìm dữ liệu và đi khảo sát vào sách, slide, bài nói, Excel
- Sách: thêm Mục 2.1.3A, 3.4.1A, 3.5.1A, 3.5.1B, 3.5.1C và Bảng BS1 đến BS13;
  cập nhật mục lục, danh mục bảng, checklist Chương 3, tài liệu tham khảo
- Excel 2b: nhật ký tìm tài liệu, bảng đếm khoảng trống, kế hoạch mẫu, lịch tiếp xúc,
  nhật ký thu thập đếm từ 165 phiếu thô, nhóm sớm và muộn, sai lệch, điểm bão hòa
- Core Slide 2: thêm 12 slide và bài nói; lộ trình 245 phút

Co-Authored-By: Claude Opus 5.5 <noreply@anthropic.com>
Claude-Session: https://claude.ai/code/session_018fvDs5YVdMu929akP2CKw7
</commit_message>
<xml_diff>
--- a/Core_Slide_2_HD2_bai_noi_chi_tiet.docx
+++ b/Core_Slide_2_HD2_bai_noi_chi_tiet.docx
@@ -231,13 +231,13 @@
         <w:rPr>
           <w:b w:val="0"/>
         </w:rPr>
-        <w:t xml:space="preserve">Thời lượng ghi bên phải là ước tính của thầy. Chương 3 và Chương 4 chiếm nhiều thời gian nhất vì có nhiều thao tác trên Excel nhất và cũng là chỗ sinh viên mất điểm nhiều nhất. </w:t>
-      </w:r>
-      <w:r>
-        <w:rPr>
-          <w:b/>
-        </w:rPr>
-        <w:t>Tổng khoảng 215 phút: nên chia hai buổi, buổi 1 từ phần 01 đến 03, buổi 2 từ phần 04 đến 07.</w:t>
+        <w:t xml:space="preserve">Thời lượng ghi bên phải là ước tính của thầy. Chương 3 và Chương 4 chiếm nhiều thời gian nhất vì có nhiều thao tác trên Excel nhất và cũng là chỗ sinh viên mất điểm nhiều nhất. Riêng Chương 3 hôm nay có thêm phần đi thực địa: cách tìm dữ liệu, cách đi khảo sát, cách phỏng vấn và cách chặn sai lệch. </w:t>
+      </w:r>
+      <w:r>
+        <w:rPr>
+          <w:b/>
+        </w:rPr>
+        <w:t>Tổng khoảng 245 phút: nên chia hai buổi, buổi 1 từ phần 01 đến 03, buổi 2 từ phần 04 đến 07.</w:t>
       </w:r>
     </w:p>
     <w:p>
@@ -626,7 +626,7 @@
         <w:rPr>
           <w:b w:val="0"/>
         </w:rPr>
-        <w:t>Có một điểm cần nói thật: sách ghi mục 3.5 cần 2 đến 3 tuần thu thập thực tế, trong khi khung tám tuần chỉ dành tuần 6. [Suy luận] Vì vậy muốn giữ được tám tuần, việc xin phép đơn vị khảo sát phải làm song song từ tuần 5 và bảng hỏi phải phát ngay khi đọc thử xong. Nếu khoa cho thời gian dài hơn tám tuần, các em nên dành thêm cho khâu này trước tiên.</w:t>
+        <w:t>Có một điểm cần nói thật: sách ghi mục 3.5 cần 2 đến 3 tuần thu thập thực tế, trong khi khung tám tuần chỉ dành tuần 6. [Suy luận] Vì vậy muốn giữ được tám tuần, việc xin phép đơn vị khảo sát phải làm song song từ tuần 5 và bảng hỏi phải phát ngay khi đọc thử xong. Nếu khoa cho thời gian dài hơn tám tuần, các em nên dành thêm cho khâu này trước tiên. Phần 04 hôm nay có mười việc đi khảo sát; ba việc phải xong trước tuần phát phiếu là tính số người cần mời, xin giấy giới thiệu của Khoa và gặp người có quyền cho phép.</w:t>
       </w:r>
     </w:p>
     <w:p>
@@ -2751,7 +2751,7 @@
         <w:pStyle w:val="Heading1"/>
       </w:pPr>
       <w:r>
-        <w:t>PHẦN 03. CHƯƠNG 2: CƠ SỞ LÝ THUYẾT VÀ MÔ HÌNH (thời lượng ước tính 28 phút, 13 slide)</w:t>
+        <w:t>PHẦN 03. CHƯƠNG 2: CƠ SỞ LÝ THUYẾT VÀ MÔ HÌNH (thời lượng ước tính 33 phút, 15 slide)</w:t>
       </w:r>
     </w:p>
     <w:p>
@@ -2773,7 +2773,7 @@
           <w:color w:val="595959"/>
           <w:sz w:val="24"/>
         </w:rPr>
-        <w:t>Chương 2 (mục 1 đến 10); Hình 23 đến 34; Bảng 4 đến 9</w:t>
+        <w:t>Chương 2 (mục 1 đến 10, Mục 2.1.3A bổ sung); Hình 23 đến 34; Bảng 4 đến 9, BS1 đến BS3</w:t>
       </w:r>
     </w:p>
     <w:p>
@@ -3488,7 +3488,7 @@
           <w:b/>
           <w:color w:val="CC0000"/>
         </w:rPr>
-        <w:t>(Slide 38: Mỗi biến trong mô hình phải truy ngược được về một lý thuyết gốc có tác giả và năm)</w:t>
+        <w:t>(Slide 38: Tìm tài liệu theo năm bước có nhật ký thì câu "trong các tài liệu tác giả tiếp cận được" trở thành một phạm vi kiểm tra được)</w:t>
       </w:r>
     </w:p>
     <w:p>
@@ -3511,57 +3511,46 @@
           <w:color w:val="595959"/>
           <w:sz w:val="22"/>
         </w:rPr>
-        <w:t>Hướng dẫn Chuyên đề và Khóa luận tốt nghiệp, Chương 2, mục 2.2.1 và Hình 27</w:t>
-      </w:r>
-    </w:p>
-    <w:p>
-      <w:pPr>
-        <w:spacing w:after="160" w:line="276" w:lineRule="auto"/>
-      </w:pPr>
-      <w:r>
-        <w:rPr>
-          <w:b w:val="0"/>
-        </w:rPr>
-        <w:t>Lý thuyết nền là phần giải thích vì sao các biến có quan hệ với nhau. Sách nói thẳng: không có lý thuyết nền thì mô hình chỉ là suy đoán. Trong nghiên cứu định lượng, lý thuyết được dùng theo lối diễn dịch: đưa lý thuyết ra trước, rồi thu dữ liệu để kiểm định lý thuyết đó.</w:t>
-      </w:r>
-    </w:p>
-    <w:p>
-      <w:pPr>
-        <w:spacing w:after="160" w:line="276" w:lineRule="auto"/>
-      </w:pPr>
-      <w:r>
-        <w:rPr>
-          <w:b w:val="0"/>
-        </w:rPr>
-        <w:t>Sơ đồ này vẽ lại Hình 27 trong sách. Bốn biến của Ngân hàng X đến từ ba lý thuyết. Sự hữu ích và sự dễ sử dụng đến từ Mô hình chấp nhận công nghệ TAM của Davis năm 1989: hai niềm tin của người dùng quyết định việc chấp nhận một công nghệ. Niềm tin đến từ lý thuyết cam kết và niềm tin của Morgan và Hunt năm 1994. Ảnh hưởng xã hội đến từ khái niệm chuẩn chủ quan trong Thuyết hành vi có kế hoạch của Ajzen năm 1991. Với Trường Tiểu học Y, lý thuyết nền là SERVQUAL của Parasuraman và cộng sự năm 1988.</w:t>
-      </w:r>
-    </w:p>
-    <w:p>
-      <w:pPr>
-        <w:spacing w:after="160" w:line="276" w:lineRule="auto"/>
-      </w:pPr>
-      <w:r>
-        <w:rPr>
-          <w:b w:val="0"/>
-        </w:rPr>
-        <w:t>Câu thầy muốn các em học thuộc cách lập luận nằm trong ví dụ đạt: TAM phù hợp vì ngân hàng số là dịch vụ công nghệ và khách hàng tự thao tác trên ứng dụng nhưng TAM tập trung vào đặc điểm công nghệ nên chưa giải thích vai trò của rủi ro và của người xung quanh; vì vậy nghiên cứu bổ sung hai biến từ hai lý thuyết khác. Đó là cách nêu lý thuyết, nêu hạn chế của lý thuyết rồi bù hạn chế.</w:t>
-      </w:r>
-    </w:p>
-    <w:p>
-      <w:pPr>
-        <w:spacing w:after="160" w:line="276" w:lineRule="auto"/>
-      </w:pPr>
-      <w:r>
-        <w:rPr>
-          <w:b w:val="0"/>
-        </w:rPr>
-        <w:t xml:space="preserve">Ngược lại, câu "Em sử dụng mô hình TAM vì mô hình này rất phổ biến" bị trừ điểm vì "phổ biến" không liên quan gì đến đặc điểm của đề tài. Khi Hội đồng hỏi "Vì sao niềm tin có trong mô hình?", các em phải trả lời bằng lý thuyết. </w:t>
-      </w:r>
-      <w:r>
-        <w:rPr>
-          <w:b/>
-        </w:rPr>
-        <w:t>TAM giải thích đặc điểm công nghệ nhưng chưa giải thích rủi ro và người xung quanh, nên mô hình bổ sung NT và XH từ hai lý thuyết khác.</w:t>
+        <w:t>Hướng dẫn Chuyên đề và Khóa luận tốt nghiệp, Mục 2.1.3A (bổ sung) và Bảng BS1; Webster và Watson (2002); Wohlin (2014); file 2b.Chapter_2_and_Chapter_3_Data_Collection_Practice.xlsx (dữ liệu giả định), sheet 1_NhatKyTimTaiLieu</w:t>
+      </w:r>
+    </w:p>
+    <w:p>
+      <w:pPr>
+        <w:spacing w:after="160" w:line="276" w:lineRule="auto"/>
+      </w:pPr>
+      <w:r>
+        <w:rPr>
+          <w:b w:val="0"/>
+        </w:rPr>
+        <w:t>Các em nhớ mục 2.1.3 về khoảng trống nghiên cứu: sách dặn giới hạn câu khoảng trống bằng cụm "trong các tài liệu mà tác giả tiếp cận được". Câu hỏi là: tiếp cận bằng cách nào? Phần bổ sung 2.1.3A trả lời bằng năm bước trên slide. Bước một, tách câu hỏi nghiên cứu thành ba khối từ khóa: khái niệm, lý thuyết, bối cảnh. Bước hai, ghép chuỗi tìm kiếm: chữ OR nối các từ đồng nghĩa trong một khối, chữ AND nối các khối với nhau. Bước ba, tìm ở ít nhất hai nguồn.</w:t>
+      </w:r>
+    </w:p>
+    <w:p>
+      <w:pPr>
+        <w:spacing w:after="160" w:line="276" w:lineRule="auto"/>
+      </w:pPr>
+      <w:r>
+        <w:rPr>
+          <w:b w:val="0"/>
+        </w:rPr>
+        <w:t>Thầy tô đỏ bước bốn vì đây là kỹ thuật ít em biết. Webster và Watson năm 2002 khuyên mở rộng tìm kiếm theo hai chiều. Lần ngược là đọc danh mục tài liệu tham khảo của bài mình đã có để tìm bài gốc. Lần xuôi là bấm nút "Cited by" trên Google Scholar để tìm những bài mới hơn đã trích dẫn bài đó. Wohlin năm 2014 gọi cách này là lăn cầu tuyết và đưa ra tiêu chí dừng rất rõ: dừng khi một vòng không thêm bài mới phù hợp.</w:t>
+      </w:r>
+    </w:p>
+    <w:p>
+      <w:pPr>
+        <w:spacing w:after="160" w:line="276" w:lineRule="auto"/>
+      </w:pPr>
+      <w:r>
+        <w:rPr>
+          <w:b w:val="0"/>
+        </w:rPr>
+        <w:t xml:space="preserve">Bước năm là nhật ký. Với Ngân hàng X, Bảng BS1 ghi sáu lần tìm qua ba vòng: xem tổng cộng 620 bản ghi, giữ 63 bài sau khi đọc tên và tóm tắt, giữ 21 bài sau khi đọc toàn văn. Vòng ba không thêm bài nào nên dừng. Vì sao phải ghi? Vì con số này biến lời hứa "tác giả đã tìm kỹ" thành bằng chứng. </w:t>
+      </w:r>
+      <w:r>
+        <w:rPr>
+          <w:b/>
+        </w:rPr>
+        <w:t>Không có nhật ký tìm kiếm thì câu "chưa có nghiên cứu nào" không kiểm tra được và Hội đồng chỉ cần nêu một bài là bác bỏ.</w:t>
       </w:r>
     </w:p>
     <w:p>
@@ -3580,7 +3569,7 @@
         <w:rPr>
           <w:i/>
         </w:rPr>
-        <w:t>Thử hình dung câu hỏi phản biện kinh điển: "Vì sao niềm tin có trong mô hình?" Bạn thứ nhất trả lời "vì em thấy quan trọng". Bạn thứ hai trả lời "vì TAM chưa giải thích vai trò của rủi ro, nên em bổ sung niềm tin từ lý thuyết cam kết và niềm tin của Morgan và Hunt (1994)". Câu thứ hai kết thúc cuộc trao đổi, câu thứ nhất mở ra năm câu hỏi mới.</w:t>
+        <w:t>Thử hình dung một bạn viết "chưa có nghiên cứu nào về ngân hàng số ở tỉnh này". Một thành viên Hội đồng mở điện thoại, gõ ba từ khóa và đọc to tên một bài báo năm ngoái. Bạn ấy không có nhật ký nên không biết mình đã bỏ sót ở đâu. Nếu có nhật ký, bạn ấy ít nhất trả lời được: "Em tìm trên hai nguồn này, bằng chuỗi này; bài thầy nêu thuộc nguồn em chưa tìm, em xin bổ sung."</w:t>
       </w:r>
     </w:p>
     <w:p>
@@ -3593,7 +3582,7 @@
           <w:b/>
           <w:color w:val="CC0000"/>
         </w:rPr>
-        <w:t>(Slide 39: Mô hình giữ 3 đến 5 biến độc lập vì mỗi biến thêm vào làm tăng câu hỏi, cỡ mẫu và thời gian)</w:t>
+        <w:t>(Slide 39: Điểm mới có bốn mức; khóa luận đại học an toàn ở mức 1 và 2, mức 3 là sản phẩm có chất lượng thạc sĩ)</w:t>
       </w:r>
     </w:p>
     <w:p>
@@ -3616,57 +3605,46 @@
           <w:color w:val="595959"/>
           <w:sz w:val="22"/>
         </w:rPr>
-        <w:t>Hướng dẫn Chuyên đề và Khóa luận tốt nghiệp, Chương 2, mục 2.2.2, mục 5, Hình 28; Creswell và Creswell (2018, tr. 97 đến 98)</w:t>
-      </w:r>
-    </w:p>
-    <w:p>
-      <w:pPr>
-        <w:spacing w:after="160" w:line="276" w:lineRule="auto"/>
-      </w:pPr>
-      <w:r>
-        <w:rPr>
-          <w:b w:val="0"/>
-        </w:rPr>
-        <w:t>Mô hình nghiên cứu là sơ đồ thể hiện quan hệ giữa các biến và mỗi mũi tên là một giả thuyết cần kiểm định. Hình 28 là mô hình đề xuất của Ngân hàng X: bốn biến độc lập bên trái, ý định sử dụng bên phải, bốn mũi tên mang mã H1 đến H4.</w:t>
-      </w:r>
-    </w:p>
-    <w:p>
-      <w:pPr>
-        <w:spacing w:after="160" w:line="276" w:lineRule="auto"/>
-      </w:pPr>
-      <w:r>
-        <w:rPr>
-          <w:b w:val="0"/>
-        </w:rPr>
-        <w:t>Creswell và Creswell dẫn quy ước vẽ: biến phụ thuộc đặt bên phải; biến độc lập đặt bên trái; mũi tên một chiều từ biến tác động sang biến chịu tác động; có thể ghi dấu cộng hoặc trừ để chỉ chiều. Hình phải đánh số và có nguồn; mô hình tự đề xuất ghi "Nguồn: Tác giả đề xuất".</w:t>
-      </w:r>
-    </w:p>
-    <w:p>
-      <w:pPr>
-        <w:spacing w:after="160" w:line="276" w:lineRule="auto"/>
-      </w:pPr>
-      <w:r>
-        <w:rPr>
-          <w:b w:val="0"/>
-        </w:rPr>
-        <w:t>Vì sao sách khuyên giữ 3 đến 5 biến độc lập? Sách tính cho các em thấy: mười biến cần khoảng 40 câu hỏi; theo quy tắc 5 quan sát cho mỗi câu hỏi, cỡ mẫu tối thiểu tăng lên khoảng 200 phiếu. Bảng hỏi dài làm người trả lời mệt. Nhiều biến không có lý thuyết hỗ trợ nên không viết được giả thuyết có căn cứ. Kết quả hồi quy nhiều biến cũng khó diễn giải.</w:t>
-      </w:r>
-    </w:p>
-    <w:p>
-      <w:pPr>
-        <w:spacing w:after="160" w:line="276" w:lineRule="auto"/>
-      </w:pPr>
-      <w:r>
-        <w:rPr>
-          <w:b w:val="0"/>
-        </w:rPr>
-        <w:t xml:space="preserve">Ví dụ đạt trong sách cho thấy quá trình lọc: từ TAM và hai lý thuyết bổ sung, nghiên cứu xác định sáu biến có thể đưa vào, giữ bốn biến, loại chi phí vì Ngân hàng X miễn phí giao dịch trên ứng dụng và loại thói quen vì phần lớn khách hàng mới dùng dịch vụ. Sách cũng dặn không chép nguyên mô hình nhiều tầng của luận án tiến sĩ. </w:t>
-      </w:r>
-      <w:r>
-        <w:rPr>
-          <w:b/>
-        </w:rPr>
-        <w:t>Quy ước vẽ: biến độc lập bên trái, biến phụ thuộc bên phải, mũi tên một chiều có ghi mã giả thuyết.</w:t>
+        <w:t>Hướng dẫn Chuyên đề và Khóa luận tốt nghiệp, Mục 2.1.3A (bổ sung), Bảng BS2 và BS3; Whetten (1989); Sandberg và Alvesson (2011); Müller-Bloch và Kranz (2015); file 2b.Chapter_2_and_Chapter_3_Data_Collection_Practice.xlsx (dữ liệu giả định), sheet 2 và 12</w:t>
+      </w:r>
+    </w:p>
+    <w:p>
+      <w:pPr>
+        <w:spacing w:after="160" w:line="276" w:lineRule="auto"/>
+      </w:pPr>
+      <w:r>
+        <w:rPr>
+          <w:b w:val="0"/>
+        </w:rPr>
+        <w:t>Câu hỏi thầy nhận nhiều nhất là: "Thưa thầy, đề tài em có điểm mới không?" Slide này trả lời bằng con số. Bước đầu là nhập 21 bài vào ma trận tổng hợp của mục 2.1.2, mỗi biến một cột ghi 1 hoặc 0, rồi đếm bằng hàm COUNTIFS. Khung bên phải là Bảng BS2: 8 bài đã xét đủ ba biến sự hữu ích, niềm tin và ảnh hưởng xã hội; chỉ 1 trong 8 bài đó khảo sát ngoài thành phố lớn; 0 bài khảo sát tại Ngân hàng X.</w:t>
+      </w:r>
+    </w:p>
+    <w:p>
+      <w:pPr>
+        <w:spacing w:after="160" w:line="276" w:lineRule="auto"/>
+      </w:pPr>
+      <w:r>
+        <w:rPr>
+          <w:b w:val="0"/>
+        </w:rPr>
+        <w:t>Bảng giữa chia điểm mới thành bốn mức. Mức một là bối cảnh mới, với câu hỏi kiểm tra: bối cảnh này có lý do gì làm quan hệ giữa các biến khác đi không? Mức hai là giải quyết kết quả trái chiều: sự dễ sử dụng có 7 bài cho kết quả có ý nghĩa và 4 bài cho kết quả không có ý nghĩa. Mức ba là mở rộng mô hình có căn cứ, ví dụ chủ đề "thông tin và thông báo" xuất hiện khi phỏng vấn phụ huynh Trường Y nhưng chưa có thang đo. Mức bốn là thách thức một giả định, theo cách đặt câu hỏi của Sandberg và Alvesson năm 2011, thường dành cho nghiên cứu sinh.</w:t>
+      </w:r>
+    </w:p>
+    <w:p>
+      <w:pPr>
+        <w:spacing w:after="160" w:line="276" w:lineRule="auto"/>
+      </w:pPr>
+      <w:r>
+        <w:rPr>
+          <w:b w:val="0"/>
+        </w:rPr>
+        <w:t xml:space="preserve">Mục 2.1.3 của sách đã nói loại khoảng trống về bối cảnh và loại kết quả mâu thuẫn là hai loại an toàn nhất cho khóa luận đại học. Thầy tô hai dòng giữa vì đó là chỗ các em làm ở sức sinh viên nhưng ra sản phẩm gần chất lượng thạc sĩ. Whetten năm 1989 nhắc một điều quan trọng: đem mô hình cũ áp vào bối cảnh mới thì chưa đủ thành đóng góp. </w:t>
+      </w:r>
+      <w:r>
+        <w:rPr>
+          <w:b/>
+        </w:rPr>
+        <w:t>"Chưa ai nghiên cứu ở đơn vị của em" chỉ là một ô bằng 0; điểm mới cần thêm một câu giải thích vì sao bối cảnh đó làm kết quả khác đi.</w:t>
       </w:r>
     </w:p>
     <w:p>
@@ -3685,7 +3663,7 @@
         <w:rPr>
           <w:i/>
         </w:rPr>
-        <w:t>Thử hình dung một bảng hỏi 40 câu phát tại quầy ngân hàng. Khách hàng đang chờ đến lượt, trả lời mười câu đầu rất kỹ, ba mươi câu sau chọn đại mức 3 cho xong. Dữ liệu 30 câu cuối gần như vô dụng. Giữ mô hình gọn không phải để lười mà để mỗi câu trả lời đều thật.</w:t>
+        <w:t>Giả sử hai bạn cùng làm mô hình ngân hàng số ở hai ngân hàng khác nhau. Bạn thứ nhất viết "đề tài mới vì chưa ai làm ở ngân hàng này". Bạn thứ hai viết "khách hàng ở địa bàn này dùng tiền mặt nhiều hơn nên sự dễ sử dụng có thể quan trọng hơn so với khách hàng thành phố; trong khi đó 11 nghiên cứu trước cho kết quả trái chiều về biến này". Cùng một mô hình nhưng chỉ bạn thứ hai có điểm mới để bảo vệ.</w:t>
       </w:r>
     </w:p>
     <w:p>
@@ -3698,7 +3676,7 @@
           <w:b/>
           <w:color w:val="CC0000"/>
         </w:rPr>
-        <w:t>(Slide 40: Bảng tổng hợp giả thuyết là công cụ kiểm tra: số dòng bằng số mũi tên, nội dung trùng từng chữ với mục 2.3.1)</w:t>
+        <w:t>(Slide 40: Mỗi biến trong mô hình phải truy ngược được về một lý thuyết gốc có tác giả và năm)</w:t>
       </w:r>
     </w:p>
     <w:p>
@@ -3721,46 +3699,57 @@
           <w:color w:val="595959"/>
           <w:sz w:val="22"/>
         </w:rPr>
-        <w:t>Hướng dẫn Chuyên đề và Khóa luận tốt nghiệp, Chương 2, mục 2.2.3, 2.3.2, Hình 30 và Bảng 5; Creswell và Creswell (2018, tr. 93 đến 94)</w:t>
-      </w:r>
-    </w:p>
-    <w:p>
-      <w:pPr>
-        <w:spacing w:after="160" w:line="276" w:lineRule="auto"/>
-      </w:pPr>
-      <w:r>
-        <w:rPr>
-          <w:b w:val="0"/>
-        </w:rPr>
-        <w:t>Hai mục ngắn nhưng rất quan trọng của Chương 2 là mục 2.2.3 giải thích biến và mục 2.3.2 bảng tổng hợp giả thuyết. Mục 2.2.3 viết mỗi biến trong một đoạn 3 đến 4 câu gồm bốn ý: vai trò của biến, định nghĩa ngắn nhắc lại từ mục 2.1.1, số câu hỏi dự kiến và nguồn thang đo sẽ kế thừa. Ví dụ đạt: "Sự hữu ích, ký hiệu HI, là biến độc lập thứ nhất... được đo bằng bốn câu hỏi kế thừa từ thang đo của Davis (1989)." Sách gọi mục này là cầu nối giữa mô hình ở Chương 2 và bảng hỏi ở Chương 3.</w:t>
-      </w:r>
-    </w:p>
-    <w:p>
-      <w:pPr>
-        <w:spacing w:after="160" w:line="276" w:lineRule="auto"/>
-      </w:pPr>
-      <w:r>
-        <w:rPr>
-          <w:b w:val="0"/>
-        </w:rPr>
-        <w:t>Hình 30 trong sách vẽ bốn loại biến theo Creswell và Creswell: biến độc lập tác động đến kết quả; biến phụ thuộc là kết quả chịu tác động; biến trung gian đứng giữa; biến điều tiết làm thay đổi độ mạnh hoặc chiều của một quan hệ. Ở cấp đại học, sách khuyên chỉ dùng biến độc lập và phụ thuộc.</w:t>
-      </w:r>
-    </w:p>
-    <w:p>
-      <w:pPr>
-        <w:spacing w:after="160" w:line="276" w:lineRule="auto"/>
-      </w:pPr>
-      <w:r>
-        <w:rPr>
-          <w:b w:val="0"/>
-        </w:rPr>
-        <w:t xml:space="preserve">Bảng bên trái là Bảng 5, bảng tổng hợp giả thuyết có năm cột: số thứ tự, mã, nội dung, chiều kỳ vọng và nguồn. Sách dặn lập bảng sau cùng bằng cách sao chép nguyên văn từng câu giả thuyết, rồi đặt mô hình và bảng cạnh nhau để đếm. </w:t>
-      </w:r>
-      <w:r>
-        <w:rPr>
-          <w:b/>
-        </w:rPr>
-        <w:t>Ở Chương 4, các em dùng lại chính bảng này và thêm cột "Kết quả kiểm định": giả thuyết không được viết lại cho khớp kết quả.</w:t>
+        <w:t>Hướng dẫn Chuyên đề và Khóa luận tốt nghiệp, Chương 2, mục 2.2.1 và Hình 27</w:t>
+      </w:r>
+    </w:p>
+    <w:p>
+      <w:pPr>
+        <w:spacing w:after="160" w:line="276" w:lineRule="auto"/>
+      </w:pPr>
+      <w:r>
+        <w:rPr>
+          <w:b w:val="0"/>
+        </w:rPr>
+        <w:t>Lý thuyết nền là phần giải thích vì sao các biến có quan hệ với nhau. Sách nói thẳng: không có lý thuyết nền thì mô hình chỉ là suy đoán. Trong nghiên cứu định lượng, lý thuyết được dùng theo lối diễn dịch: đưa lý thuyết ra trước, rồi thu dữ liệu để kiểm định lý thuyết đó.</w:t>
+      </w:r>
+    </w:p>
+    <w:p>
+      <w:pPr>
+        <w:spacing w:after="160" w:line="276" w:lineRule="auto"/>
+      </w:pPr>
+      <w:r>
+        <w:rPr>
+          <w:b w:val="0"/>
+        </w:rPr>
+        <w:t>Sơ đồ này vẽ lại Hình 27 trong sách. Bốn biến của Ngân hàng X đến từ ba lý thuyết. Sự hữu ích và sự dễ sử dụng đến từ Mô hình chấp nhận công nghệ TAM của Davis năm 1989: hai niềm tin của người dùng quyết định việc chấp nhận một công nghệ. Niềm tin đến từ lý thuyết cam kết và niềm tin của Morgan và Hunt năm 1994. Ảnh hưởng xã hội đến từ khái niệm chuẩn chủ quan trong Thuyết hành vi có kế hoạch của Ajzen năm 1991. Với Trường Tiểu học Y, lý thuyết nền là SERVQUAL của Parasuraman và cộng sự năm 1988.</w:t>
+      </w:r>
+    </w:p>
+    <w:p>
+      <w:pPr>
+        <w:spacing w:after="160" w:line="276" w:lineRule="auto"/>
+      </w:pPr>
+      <w:r>
+        <w:rPr>
+          <w:b w:val="0"/>
+        </w:rPr>
+        <w:t>Câu thầy muốn các em học thuộc cách lập luận nằm trong ví dụ đạt: TAM phù hợp vì ngân hàng số là dịch vụ công nghệ và khách hàng tự thao tác trên ứng dụng nhưng TAM tập trung vào đặc điểm công nghệ nên chưa giải thích vai trò của rủi ro và của người xung quanh; vì vậy nghiên cứu bổ sung hai biến từ hai lý thuyết khác. Đó là cách nêu lý thuyết, nêu hạn chế của lý thuyết rồi bù hạn chế.</w:t>
+      </w:r>
+    </w:p>
+    <w:p>
+      <w:pPr>
+        <w:spacing w:after="160" w:line="276" w:lineRule="auto"/>
+      </w:pPr>
+      <w:r>
+        <w:rPr>
+          <w:b w:val="0"/>
+        </w:rPr>
+        <w:t xml:space="preserve">Ngược lại, câu "Em sử dụng mô hình TAM vì mô hình này rất phổ biến" bị trừ điểm vì "phổ biến" không liên quan gì đến đặc điểm của đề tài. Khi Hội đồng hỏi "Vì sao niềm tin có trong mô hình?", các em phải trả lời bằng lý thuyết. </w:t>
+      </w:r>
+      <w:r>
+        <w:rPr>
+          <w:b/>
+        </w:rPr>
+        <w:t>TAM giải thích đặc điểm công nghệ nhưng chưa giải thích rủi ro và người xung quanh, nên mô hình bổ sung NT và XH từ hai lý thuyết khác.</w:t>
       </w:r>
     </w:p>
     <w:p>
@@ -3779,7 +3768,7 @@
         <w:rPr>
           <w:i/>
         </w:rPr>
-        <w:t>Thử hình dung một bạn có mô hình bốn mũi tên nhưng bảng tổng hợp ghi năm giả thuyết, vì lúc đầu có thêm biến "chi phí" rồi bỏ ra khỏi hình mà quên bỏ khỏi bảng. Đến Chương 4, H5 không có hệ số nào để kiểm định. Việc đặt mô hình cạnh bảng và đếm chỉ mất một phút nhưng tránh được một câu hỏi rất khó chịu từ Hội đồng.</w:t>
+        <w:t>Thử hình dung câu hỏi phản biện kinh điển: "Vì sao niềm tin có trong mô hình?" Bạn thứ nhất trả lời "vì em thấy quan trọng". Bạn thứ hai trả lời "vì TAM chưa giải thích vai trò của rủi ro, nên em bổ sung niềm tin từ lý thuyết cam kết và niềm tin của Morgan và Hunt (1994)". Câu thứ hai kết thúc cuộc trao đổi, câu thứ nhất mở ra năm câu hỏi mới.</w:t>
       </w:r>
     </w:p>
     <w:p>
@@ -3792,7 +3781,7 @@
           <w:b/>
           <w:color w:val="CC0000"/>
         </w:rPr>
-        <w:t>(Slide 41: Giả thuyết có chiều thì kiểm định được, vì người đọc biết trước kết quả nào là trái với dự đoán)</w:t>
+        <w:t>(Slide 41: Mô hình giữ 3 đến 5 biến độc lập vì mỗi biến thêm vào làm tăng câu hỏi, cỡ mẫu và thời gian)</w:t>
       </w:r>
     </w:p>
     <w:p>
@@ -3815,57 +3804,57 @@
           <w:color w:val="595959"/>
           <w:sz w:val="22"/>
         </w:rPr>
-        <w:t>Hướng dẫn Chuyên đề và Khóa luận tốt nghiệp, Chương 2, mục 2.3.1, mục 6 và Hình 34</w:t>
-      </w:r>
-    </w:p>
-    <w:p>
-      <w:pPr>
-        <w:spacing w:after="160" w:line="276" w:lineRule="auto"/>
-      </w:pPr>
-      <w:r>
-        <w:rPr>
-          <w:b w:val="0"/>
-        </w:rPr>
-        <w:t>Giả thuyết là lời dự đoán có cơ sở khoa học về quan hệ giữa hai biến. Sách nêu bốn thành phần của một giả thuyết đúng cấu trúc: mã hiệu; biến độc lập; chiều tác động; biến phụ thuộc. Đi kèm là một đoạn căn cứ.</w:t>
-      </w:r>
-    </w:p>
-    <w:p>
-      <w:pPr>
-        <w:spacing w:after="160" w:line="276" w:lineRule="auto"/>
-      </w:pPr>
-      <w:r>
-        <w:rPr>
-          <w:b w:val="0"/>
-        </w:rPr>
-        <w:t>Nhìn ví dụ Trường Tiểu học Y. Ba giả thuyết bên trái đều viết "ảnh hưởng đến sự hài lòng", không nói chiều. Sách phân tích: kết quả nào cũng có thể được xem là "ảnh hưởng"; ở Chương 4, hệ số âm cũng có thể bị xem là có ảnh hưởng; sinh viên không có tiêu chí để kết luận. Ví dụ tệ hơn nữa là "H1: Sự hữu ích có thể ảnh hưởng hoặc không ảnh hưởng tùy theo từng khách hàng". Câu này đúng với mọi kết quả nên không bao giờ bị bác bỏ và việc kiểm định trở nên vô nghĩa.</w:t>
-      </w:r>
-    </w:p>
-    <w:p>
-      <w:pPr>
-        <w:spacing w:after="160" w:line="276" w:lineRule="auto"/>
-      </w:pPr>
-      <w:r>
-        <w:rPr>
-          <w:b w:val="0"/>
-        </w:rPr>
-        <w:t>Bên phải là giả thuyết đạt. Đoạn căn cứ đi qua ba lớp: lý thuyết SERVQUAL nói phương tiện hữu hình tạo nên chất lượng cảm nhận; bối cảnh trường tiểu học có phòng tiếp phụ huynh, chỗ ngồi chờ, bảng hướng dẫn; nghiên cứu thực nghiệm để trong ngoặc vuông cho các em điền; rồi mới đến câu giả thuyết có chiều "tác động cùng chiều".</w:t>
-      </w:r>
-    </w:p>
-    <w:p>
-      <w:pPr>
-        <w:spacing w:after="160" w:line="276" w:lineRule="auto"/>
-      </w:pPr>
-      <w:r>
-        <w:rPr>
-          <w:b w:val="0"/>
-        </w:rPr>
-        <w:t xml:space="preserve">Hai lưu ý cuối. Mỗi giả thuyết chỉ có một biến độc lập và một biến phụ thuộc, không gộp "sự hữu ích và sự dễ sử dụng" vào một câu. Và giả thuyết viết trong Chương 2 là giả thuyết đối; mã H1, H2 chỉ là số thứ tự, không phải ký hiệu thống kê. Các em đếm số mũi tên và số giả thuyết, hai con số phải bằng nhau. </w:t>
-      </w:r>
-      <w:r>
-        <w:rPr>
-          <w:b/>
-        </w:rPr>
-        <w:t>Bốn thành phần: mã hiệu, biến độc lập, chiều tác động, biến phụ thuộc; đi kèm đoạn căn cứ gồm lý thuyết, nghiên cứu thực nghiệm và bối cảnh.</w:t>
+        <w:t>Hướng dẫn Chuyên đề và Khóa luận tốt nghiệp, Chương 2, mục 2.2.2, mục 5, Hình 28; Creswell và Creswell (2018, tr. 97 đến 98)</w:t>
+      </w:r>
+    </w:p>
+    <w:p>
+      <w:pPr>
+        <w:spacing w:after="160" w:line="276" w:lineRule="auto"/>
+      </w:pPr>
+      <w:r>
+        <w:rPr>
+          <w:b w:val="0"/>
+        </w:rPr>
+        <w:t>Mô hình nghiên cứu là sơ đồ thể hiện quan hệ giữa các biến và mỗi mũi tên là một giả thuyết cần kiểm định. Hình 28 là mô hình đề xuất của Ngân hàng X: bốn biến độc lập bên trái, ý định sử dụng bên phải, bốn mũi tên mang mã H1 đến H4.</w:t>
+      </w:r>
+    </w:p>
+    <w:p>
+      <w:pPr>
+        <w:spacing w:after="160" w:line="276" w:lineRule="auto"/>
+      </w:pPr>
+      <w:r>
+        <w:rPr>
+          <w:b w:val="0"/>
+        </w:rPr>
+        <w:t>Creswell và Creswell dẫn quy ước vẽ: biến phụ thuộc đặt bên phải; biến độc lập đặt bên trái; mũi tên một chiều từ biến tác động sang biến chịu tác động; có thể ghi dấu cộng hoặc trừ để chỉ chiều. Hình phải đánh số và có nguồn; mô hình tự đề xuất ghi "Nguồn: Tác giả đề xuất".</w:t>
+      </w:r>
+    </w:p>
+    <w:p>
+      <w:pPr>
+        <w:spacing w:after="160" w:line="276" w:lineRule="auto"/>
+      </w:pPr>
+      <w:r>
+        <w:rPr>
+          <w:b w:val="0"/>
+        </w:rPr>
+        <w:t>Vì sao sách khuyên giữ 3 đến 5 biến độc lập? Sách tính cho các em thấy: mười biến cần khoảng 40 câu hỏi; theo quy tắc 5 quan sát cho mỗi câu hỏi, cỡ mẫu tối thiểu tăng lên khoảng 200 phiếu. Bảng hỏi dài làm người trả lời mệt. Nhiều biến không có lý thuyết hỗ trợ nên không viết được giả thuyết có căn cứ. Kết quả hồi quy nhiều biến cũng khó diễn giải.</w:t>
+      </w:r>
+    </w:p>
+    <w:p>
+      <w:pPr>
+        <w:spacing w:after="160" w:line="276" w:lineRule="auto"/>
+      </w:pPr>
+      <w:r>
+        <w:rPr>
+          <w:b w:val="0"/>
+        </w:rPr>
+        <w:t xml:space="preserve">Ví dụ đạt trong sách cho thấy quá trình lọc: từ TAM và hai lý thuyết bổ sung, nghiên cứu xác định sáu biến có thể đưa vào, giữ bốn biến, loại chi phí vì Ngân hàng X miễn phí giao dịch trên ứng dụng và loại thói quen vì phần lớn khách hàng mới dùng dịch vụ. Sách cũng dặn không chép nguyên mô hình nhiều tầng của luận án tiến sĩ. </w:t>
+      </w:r>
+      <w:r>
+        <w:rPr>
+          <w:b/>
+        </w:rPr>
+        <w:t>Quy ước vẽ: biến độc lập bên trái, biến phụ thuộc bên phải, mũi tên một chiều có ghi mã giả thuyết.</w:t>
       </w:r>
     </w:p>
     <w:p>
@@ -3884,7 +3873,7 @@
         <w:rPr>
           <w:i/>
         </w:rPr>
-        <w:t>Thử hình dung dự báo thời tiết "ngày mai có thể mưa hoặc không mưa". Câu này không bao giờ sai, nên cũng không bao giờ có ích. Giả thuyết "có thể ảnh hưởng hoặc không ảnh hưởng" giống hệt câu dự báo đó. Giả thuyết có ích là giả thuyết dám nói trước một chiều để dữ liệu có thể chứng minh nó sai.</w:t>
+        <w:t>Thử hình dung một bảng hỏi 40 câu phát tại quầy ngân hàng. Khách hàng đang chờ đến lượt, trả lời mười câu đầu rất kỹ, ba mươi câu sau chọn đại mức 3 cho xong. Dữ liệu 30 câu cuối gần như vô dụng. Giữ mô hình gọn không phải để lười mà để mỗi câu trả lời đều thật.</w:t>
       </w:r>
     </w:p>
     <w:p>
@@ -3897,7 +3886,7 @@
           <w:b/>
           <w:color w:val="CC0000"/>
         </w:rPr>
-        <w:t>(Slide 42: Học tư duy và cách viết từ luận án tiến sĩ; không sao chép mô hình, kỹ thuật và cỡ mẫu của nó)</w:t>
+        <w:t>(Slide 42: Bảng tổng hợp giả thuyết là công cụ kiểm tra: số dòng bằng số mũi tên, nội dung trùng từng chữ với mục 2.3.1)</w:t>
       </w:r>
     </w:p>
     <w:p>
@@ -3920,46 +3909,46 @@
           <w:color w:val="595959"/>
           <w:sz w:val="22"/>
         </w:rPr>
-        <w:t>Hướng dẫn Chuyên đề và Khóa luận tốt nghiệp, Chương 2, mục 7, Bảng 6 và 7</w:t>
-      </w:r>
-    </w:p>
-    <w:p>
-      <w:pPr>
-        <w:spacing w:after="160" w:line="276" w:lineRule="auto"/>
-      </w:pPr>
-      <w:r>
-        <w:rPr>
-          <w:b w:val="0"/>
-        </w:rPr>
-        <w:t>Rất nhiều em lấy một luận án tiến sĩ làm mẫu rồi chép gần như nguyên mô hình. Mục 7 của Chương 2 vạch ranh giới rõ ràng bằng Bảng 6. Nên học năm điều: cách gom nhóm nghiên cứu theo chủ đề; cách so sánh, đối chiếu kết quả; cách viết giả thuyết có đoạn lập luận đi trước; cách trình bày mô hình có mã giả thuyết và cách dẫn dắt từ lý thuyết đến mô hình. Không sao chép năm điều: mô hình 10 đến 20 biến; SEM, CFA, Bootstrap; cỡ mẫu hàng nghìn người; phân tích nhân tố khẳng định và biến trung gian, điều tiết khi chưa có lý thuyết rõ.</w:t>
-      </w:r>
-    </w:p>
-    <w:p>
-      <w:pPr>
-        <w:spacing w:after="160" w:line="276" w:lineRule="auto"/>
-      </w:pPr>
-      <w:r>
-        <w:rPr>
-          <w:b w:val="0"/>
-        </w:rPr>
-        <w:t>Sách tóm lại bốn điều nên học khi đọc luận án: tư duy logic từ vấn đề đến lý thuyết đến mô hình; hành văn câu ngắn với động từ học thuật như "chỉ ra", "ghi nhận", "kiểm định", "đề xuất"; cách tổng hợp và cách viết giả thuyết.</w:t>
-      </w:r>
-    </w:p>
-    <w:p>
-      <w:pPr>
-        <w:spacing w:after="160" w:line="276" w:lineRule="auto"/>
-      </w:pPr>
-      <w:r>
-        <w:rPr>
-          <w:b w:val="0"/>
-        </w:rPr>
-        <w:t xml:space="preserve">Bên phải là Bảng 7, quy tắc trích dẫn trong bài theo APA viết bằng tiếng Việt. Có hai dạng: dạng tường thuật đặt tên tác giả trong câu, như "Davis (1989) cho rằng..."; dạng trong ngoặc đặt tên và năm cuối câu. Thứ tự các nguồn trong ngoặc và việc dùng "và cộng sự" hay "et al." do khoa quy định, các em dùng thống nhất một cách. </w:t>
-      </w:r>
-      <w:r>
-        <w:rPr>
-          <w:b/>
-        </w:rPr>
-        <w:t>Một luận án tham khảo khảo sát hơn một nghìn người và dùng SEM; một khóa luận đại học chỉ cần khoảng 150 phiếu hợp lệ và kỹ thuật chạy được trên Excel.</w:t>
+        <w:t>Hướng dẫn Chuyên đề và Khóa luận tốt nghiệp, Chương 2, mục 2.2.3, 2.3.2, Hình 30 và Bảng 5; Creswell và Creswell (2018, tr. 93 đến 94)</w:t>
+      </w:r>
+    </w:p>
+    <w:p>
+      <w:pPr>
+        <w:spacing w:after="160" w:line="276" w:lineRule="auto"/>
+      </w:pPr>
+      <w:r>
+        <w:rPr>
+          <w:b w:val="0"/>
+        </w:rPr>
+        <w:t>Hai mục ngắn nhưng rất quan trọng của Chương 2 là mục 2.2.3 giải thích biến và mục 2.3.2 bảng tổng hợp giả thuyết. Mục 2.2.3 viết mỗi biến trong một đoạn 3 đến 4 câu gồm bốn ý: vai trò của biến, định nghĩa ngắn nhắc lại từ mục 2.1.1, số câu hỏi dự kiến và nguồn thang đo sẽ kế thừa. Ví dụ đạt: "Sự hữu ích, ký hiệu HI, là biến độc lập thứ nhất... được đo bằng bốn câu hỏi kế thừa từ thang đo của Davis (1989)." Sách gọi mục này là cầu nối giữa mô hình ở Chương 2 và bảng hỏi ở Chương 3.</w:t>
+      </w:r>
+    </w:p>
+    <w:p>
+      <w:pPr>
+        <w:spacing w:after="160" w:line="276" w:lineRule="auto"/>
+      </w:pPr>
+      <w:r>
+        <w:rPr>
+          <w:b w:val="0"/>
+        </w:rPr>
+        <w:t>Hình 30 trong sách vẽ bốn loại biến theo Creswell và Creswell: biến độc lập tác động đến kết quả; biến phụ thuộc là kết quả chịu tác động; biến trung gian đứng giữa; biến điều tiết làm thay đổi độ mạnh hoặc chiều của một quan hệ. Ở cấp đại học, sách khuyên chỉ dùng biến độc lập và phụ thuộc.</w:t>
+      </w:r>
+    </w:p>
+    <w:p>
+      <w:pPr>
+        <w:spacing w:after="160" w:line="276" w:lineRule="auto"/>
+      </w:pPr>
+      <w:r>
+        <w:rPr>
+          <w:b w:val="0"/>
+        </w:rPr>
+        <w:t xml:space="preserve">Bảng bên trái là Bảng 5, bảng tổng hợp giả thuyết có năm cột: số thứ tự, mã, nội dung, chiều kỳ vọng và nguồn. Sách dặn lập bảng sau cùng bằng cách sao chép nguyên văn từng câu giả thuyết, rồi đặt mô hình và bảng cạnh nhau để đếm. </w:t>
+      </w:r>
+      <w:r>
+        <w:rPr>
+          <w:b/>
+        </w:rPr>
+        <w:t>Ở Chương 4, các em dùng lại chính bảng này và thêm cột "Kết quả kiểm định": giả thuyết không được viết lại cho khớp kết quả.</w:t>
       </w:r>
     </w:p>
     <w:p>
@@ -3978,7 +3967,7 @@
         <w:rPr>
           <w:i/>
         </w:rPr>
-        <w:t>Thử hình dung một bạn chép mô hình 12 biến kèm hai biến trung gian từ một luận án. Hội đồng hỏi: vì sao biến trung gian này đứng giữa hai biến kia? Bạn ấy trả lời: "Dạ, luận án đó làm vậy ạ." Câu trả lời này cho thấy mô hình không phải của bạn ấy. Học cách luận án lập luận thì câu trả lời sẽ là lý thuyết, không phải tên luận án.</w:t>
+        <w:t>Thử hình dung một bạn có mô hình bốn mũi tên nhưng bảng tổng hợp ghi năm giả thuyết, vì lúc đầu có thêm biến "chi phí" rồi bỏ ra khỏi hình mà quên bỏ khỏi bảng. Đến Chương 4, H5 không có hệ số nào để kiểm định. Việc đặt mô hình cạnh bảng và đếm chỉ mất một phút nhưng tránh được một câu hỏi rất khó chịu từ Hội đồng.</w:t>
       </w:r>
     </w:p>
     <w:p>
@@ -3991,7 +3980,7 @@
           <w:b/>
           <w:color w:val="CC0000"/>
         </w:rPr>
-        <w:t>(Slide 43: Bốn lỗi phổ biến nhất của Chương 2 đều làm mô hình mất cơ sở hoặc giả thuyết không kiểm định được)</w:t>
+        <w:t>(Slide 43: Giả thuyết có chiều thì kiểm định được, vì người đọc biết trước kết quả nào là trái với dự đoán)</w:t>
       </w:r>
     </w:p>
     <w:p>
@@ -4014,46 +4003,57 @@
           <w:color w:val="595959"/>
           <w:sz w:val="22"/>
         </w:rPr>
-        <w:t>Hướng dẫn Chuyên đề và Khóa luận tốt nghiệp, Chương 2, mục 9 và 10, Bảng 9; phần "Điều cần nhớ"</w:t>
-      </w:r>
-    </w:p>
-    <w:p>
-      <w:pPr>
-        <w:spacing w:after="160" w:line="276" w:lineRule="auto"/>
-      </w:pPr>
-      <w:r>
-        <w:rPr>
-          <w:b w:val="0"/>
-        </w:rPr>
-        <w:t>Kết thúc Chương 2 là Bảng 9, bốn lỗi phổ biến nhất, mỗi lỗi chỉ về một mục trong chương. Liệt kê nghiên cứu mà không tổng hợp thì quay lại mục 4. Không trích dẫn hoặc trích dẫn không nhất quán thì quay lại mục 7. Mô hình quá phức tạp thì quay lại mục 5. Giả thuyết không có chiều thì quay lại mục 6.</w:t>
-      </w:r>
-    </w:p>
-    <w:p>
-      <w:pPr>
-        <w:spacing w:after="160" w:line="276" w:lineRule="auto"/>
-      </w:pPr>
-      <w:r>
-        <w:rPr>
-          <w:b w:val="0"/>
-        </w:rPr>
-        <w:t>Checklist Chương 2 có 13 câu, trong đó có ba câu thầy muốn các em để ý: khoảng trống có khớp với mô hình không; bảng tổng hợp giả thuyết có khớp từng chữ với mục 2.3.1 không; tên biến và ký hiệu biến có thống nhất trong toàn chương không. Ba câu này đều kiểm tra mối nối, đúng tinh thần ba chữ "khớp" ở đầu buổi: kết quả khớp giả thuyết, kết luận khớp câu hỏi, con số khớp file dữ liệu.</w:t>
-      </w:r>
-    </w:p>
-    <w:p>
-      <w:pPr>
-        <w:spacing w:after="160" w:line="276" w:lineRule="auto"/>
-      </w:pPr>
-      <w:r>
-        <w:rPr>
-          <w:b w:val="0"/>
-        </w:rPr>
-        <w:t xml:space="preserve">Bên phải là ba điều cần nhớ của Chương 2 mà sách ghi ở cuối chương. </w:t>
-      </w:r>
-      <w:r>
-        <w:rPr>
-          <w:b/>
-        </w:rPr>
-        <w:t>Có mô hình và bảng tổng hợp giả thuyết là đã sẵn sàng thiết kế cách kiểm tra ở Chương 3.</w:t>
+        <w:t>Hướng dẫn Chuyên đề và Khóa luận tốt nghiệp, Chương 2, mục 2.3.1, mục 6 và Hình 34</w:t>
+      </w:r>
+    </w:p>
+    <w:p>
+      <w:pPr>
+        <w:spacing w:after="160" w:line="276" w:lineRule="auto"/>
+      </w:pPr>
+      <w:r>
+        <w:rPr>
+          <w:b w:val="0"/>
+        </w:rPr>
+        <w:t>Giả thuyết là lời dự đoán có cơ sở khoa học về quan hệ giữa hai biến. Sách nêu bốn thành phần của một giả thuyết đúng cấu trúc: mã hiệu; biến độc lập; chiều tác động; biến phụ thuộc. Đi kèm là một đoạn căn cứ.</w:t>
+      </w:r>
+    </w:p>
+    <w:p>
+      <w:pPr>
+        <w:spacing w:after="160" w:line="276" w:lineRule="auto"/>
+      </w:pPr>
+      <w:r>
+        <w:rPr>
+          <w:b w:val="0"/>
+        </w:rPr>
+        <w:t>Nhìn ví dụ Trường Tiểu học Y. Ba giả thuyết bên trái đều viết "ảnh hưởng đến sự hài lòng", không nói chiều. Sách phân tích: kết quả nào cũng có thể được xem là "ảnh hưởng"; ở Chương 4, hệ số âm cũng có thể bị xem là có ảnh hưởng; sinh viên không có tiêu chí để kết luận. Ví dụ tệ hơn nữa là "H1: Sự hữu ích có thể ảnh hưởng hoặc không ảnh hưởng tùy theo từng khách hàng". Câu này đúng với mọi kết quả nên không bao giờ bị bác bỏ và việc kiểm định trở nên vô nghĩa.</w:t>
+      </w:r>
+    </w:p>
+    <w:p>
+      <w:pPr>
+        <w:spacing w:after="160" w:line="276" w:lineRule="auto"/>
+      </w:pPr>
+      <w:r>
+        <w:rPr>
+          <w:b w:val="0"/>
+        </w:rPr>
+        <w:t>Bên phải là giả thuyết đạt. Đoạn căn cứ đi qua ba lớp: lý thuyết SERVQUAL nói phương tiện hữu hình tạo nên chất lượng cảm nhận; bối cảnh trường tiểu học có phòng tiếp phụ huynh, chỗ ngồi chờ, bảng hướng dẫn; nghiên cứu thực nghiệm để trong ngoặc vuông cho các em điền; rồi mới đến câu giả thuyết có chiều "tác động cùng chiều".</w:t>
+      </w:r>
+    </w:p>
+    <w:p>
+      <w:pPr>
+        <w:spacing w:after="160" w:line="276" w:lineRule="auto"/>
+      </w:pPr>
+      <w:r>
+        <w:rPr>
+          <w:b w:val="0"/>
+        </w:rPr>
+        <w:t xml:space="preserve">Hai lưu ý cuối. Mỗi giả thuyết chỉ có một biến độc lập và một biến phụ thuộc, không gộp "sự hữu ích và sự dễ sử dụng" vào một câu. Và giả thuyết viết trong Chương 2 là giả thuyết đối; mã H1, H2 chỉ là số thứ tự, không phải ký hiệu thống kê. Các em đếm số mũi tên và số giả thuyết, hai con số phải bằng nhau. </w:t>
+      </w:r>
+      <w:r>
+        <w:rPr>
+          <w:b/>
+        </w:rPr>
+        <w:t>Bốn thành phần: mã hiệu, biến độc lập, chiều tác động, biến phụ thuộc; đi kèm đoạn căn cứ gồm lý thuyết, nghiên cứu thực nghiệm và bối cảnh.</w:t>
       </w:r>
     </w:p>
     <w:p>
@@ -4072,6 +4072,194 @@
         <w:rPr>
           <w:i/>
         </w:rPr>
+        <w:t>Thử hình dung dự báo thời tiết "ngày mai có thể mưa hoặc không mưa". Câu này không bao giờ sai, nên cũng không bao giờ có ích. Giả thuyết "có thể ảnh hưởng hoặc không ảnh hưởng" giống hệt câu dự báo đó. Giả thuyết có ích là giả thuyết dám nói trước một chiều để dữ liệu có thể chứng minh nó sai.</w:t>
+      </w:r>
+    </w:p>
+    <w:p>
+      <w:pPr>
+        <w:keepNext/>
+        <w:spacing w:before="240"/>
+      </w:pPr>
+      <w:r>
+        <w:rPr>
+          <w:b/>
+          <w:color w:val="CC0000"/>
+        </w:rPr>
+        <w:t>(Slide 44: Học tư duy và cách viết từ luận án tiến sĩ; không sao chép mô hình, kỹ thuật và cỡ mẫu của nó)</w:t>
+      </w:r>
+    </w:p>
+    <w:p>
+      <w:pPr>
+        <w:keepNext/>
+        <w:spacing w:after="80"/>
+      </w:pPr>
+      <w:r>
+        <w:rPr>
+          <w:b/>
+          <w:i/>
+          <w:color w:val="595959"/>
+          <w:sz w:val="22"/>
+        </w:rPr>
+        <w:t xml:space="preserve">Đối chiếu sách: </w:t>
+      </w:r>
+      <w:r>
+        <w:rPr>
+          <w:i/>
+          <w:color w:val="595959"/>
+          <w:sz w:val="22"/>
+        </w:rPr>
+        <w:t>Hướng dẫn Chuyên đề và Khóa luận tốt nghiệp, Chương 2, mục 7, Bảng 6 và 7</w:t>
+      </w:r>
+    </w:p>
+    <w:p>
+      <w:pPr>
+        <w:spacing w:after="160" w:line="276" w:lineRule="auto"/>
+      </w:pPr>
+      <w:r>
+        <w:rPr>
+          <w:b w:val="0"/>
+        </w:rPr>
+        <w:t>Rất nhiều em lấy một luận án tiến sĩ làm mẫu rồi chép gần như nguyên mô hình. Mục 7 của Chương 2 vạch ranh giới rõ ràng bằng Bảng 6. Nên học năm điều: cách gom nhóm nghiên cứu theo chủ đề; cách so sánh, đối chiếu kết quả; cách viết giả thuyết có đoạn lập luận đi trước; cách trình bày mô hình có mã giả thuyết và cách dẫn dắt từ lý thuyết đến mô hình. Không sao chép năm điều: mô hình 10 đến 20 biến; SEM, CFA, Bootstrap; cỡ mẫu hàng nghìn người; phân tích nhân tố khẳng định và biến trung gian, điều tiết khi chưa có lý thuyết rõ.</w:t>
+      </w:r>
+    </w:p>
+    <w:p>
+      <w:pPr>
+        <w:spacing w:after="160" w:line="276" w:lineRule="auto"/>
+      </w:pPr>
+      <w:r>
+        <w:rPr>
+          <w:b w:val="0"/>
+        </w:rPr>
+        <w:t>Sách tóm lại bốn điều nên học khi đọc luận án: tư duy logic từ vấn đề đến lý thuyết đến mô hình; hành văn câu ngắn với động từ học thuật như "chỉ ra", "ghi nhận", "kiểm định", "đề xuất"; cách tổng hợp và cách viết giả thuyết.</w:t>
+      </w:r>
+    </w:p>
+    <w:p>
+      <w:pPr>
+        <w:spacing w:after="160" w:line="276" w:lineRule="auto"/>
+      </w:pPr>
+      <w:r>
+        <w:rPr>
+          <w:b w:val="0"/>
+        </w:rPr>
+        <w:t xml:space="preserve">Bên phải là Bảng 7, quy tắc trích dẫn trong bài theo APA viết bằng tiếng Việt. Có hai dạng: dạng tường thuật đặt tên tác giả trong câu, như "Davis (1989) cho rằng..."; dạng trong ngoặc đặt tên và năm cuối câu. Thứ tự các nguồn trong ngoặc và việc dùng "và cộng sự" hay "et al." do khoa quy định, các em dùng thống nhất một cách. </w:t>
+      </w:r>
+      <w:r>
+        <w:rPr>
+          <w:b/>
+        </w:rPr>
+        <w:t>Một luận án tham khảo khảo sát hơn một nghìn người và dùng SEM; một khóa luận đại học chỉ cần khoảng 150 phiếu hợp lệ và kỹ thuật chạy được trên Excel.</w:t>
+      </w:r>
+    </w:p>
+    <w:p>
+      <w:pPr>
+        <w:spacing w:after="160"/>
+        <w:ind w:left="454"/>
+      </w:pPr>
+      <w:r>
+        <w:rPr>
+          <w:b/>
+          <w:color w:val="CC0000"/>
+        </w:rPr>
+        <w:t xml:space="preserve">Câu chuyện ngoài slide: </w:t>
+      </w:r>
+      <w:r>
+        <w:rPr>
+          <w:i/>
+        </w:rPr>
+        <w:t>Thử hình dung một bạn chép mô hình 12 biến kèm hai biến trung gian từ một luận án. Hội đồng hỏi: vì sao biến trung gian này đứng giữa hai biến kia? Bạn ấy trả lời: "Dạ, luận án đó làm vậy ạ." Câu trả lời này cho thấy mô hình không phải của bạn ấy. Học cách luận án lập luận thì câu trả lời sẽ là lý thuyết, không phải tên luận án.</w:t>
+      </w:r>
+    </w:p>
+    <w:p>
+      <w:pPr>
+        <w:keepNext/>
+        <w:spacing w:before="240"/>
+      </w:pPr>
+      <w:r>
+        <w:rPr>
+          <w:b/>
+          <w:color w:val="CC0000"/>
+        </w:rPr>
+        <w:t>(Slide 45: Bốn lỗi phổ biến nhất của Chương 2 đều làm mô hình mất cơ sở hoặc giả thuyết không kiểm định được)</w:t>
+      </w:r>
+    </w:p>
+    <w:p>
+      <w:pPr>
+        <w:keepNext/>
+        <w:spacing w:after="80"/>
+      </w:pPr>
+      <w:r>
+        <w:rPr>
+          <w:b/>
+          <w:i/>
+          <w:color w:val="595959"/>
+          <w:sz w:val="22"/>
+        </w:rPr>
+        <w:t xml:space="preserve">Đối chiếu sách: </w:t>
+      </w:r>
+      <w:r>
+        <w:rPr>
+          <w:i/>
+          <w:color w:val="595959"/>
+          <w:sz w:val="22"/>
+        </w:rPr>
+        <w:t>Hướng dẫn Chuyên đề và Khóa luận tốt nghiệp, Chương 2, mục 9 và 10, Bảng 9; phần "Điều cần nhớ"</w:t>
+      </w:r>
+    </w:p>
+    <w:p>
+      <w:pPr>
+        <w:spacing w:after="160" w:line="276" w:lineRule="auto"/>
+      </w:pPr>
+      <w:r>
+        <w:rPr>
+          <w:b w:val="0"/>
+        </w:rPr>
+        <w:t>Kết thúc Chương 2 là Bảng 9, bốn lỗi phổ biến nhất, mỗi lỗi chỉ về một mục trong chương. Liệt kê nghiên cứu mà không tổng hợp thì quay lại mục 4. Không trích dẫn hoặc trích dẫn không nhất quán thì quay lại mục 7. Mô hình quá phức tạp thì quay lại mục 5. Giả thuyết không có chiều thì quay lại mục 6.</w:t>
+      </w:r>
+    </w:p>
+    <w:p>
+      <w:pPr>
+        <w:spacing w:after="160" w:line="276" w:lineRule="auto"/>
+      </w:pPr>
+      <w:r>
+        <w:rPr>
+          <w:b w:val="0"/>
+        </w:rPr>
+        <w:t>Checklist Chương 2 có 13 câu, trong đó có ba câu thầy muốn các em để ý: khoảng trống có khớp với mô hình không; bảng tổng hợp giả thuyết có khớp từng chữ với mục 2.3.1 không; tên biến và ký hiệu biến có thống nhất trong toàn chương không. Ba câu này đều kiểm tra mối nối, đúng tinh thần ba chữ "khớp" ở đầu buổi: kết quả khớp giả thuyết, kết luận khớp câu hỏi, con số khớp file dữ liệu.</w:t>
+      </w:r>
+    </w:p>
+    <w:p>
+      <w:pPr>
+        <w:spacing w:after="160" w:line="276" w:lineRule="auto"/>
+      </w:pPr>
+      <w:r>
+        <w:rPr>
+          <w:b w:val="0"/>
+        </w:rPr>
+        <w:t xml:space="preserve">Bên phải là ba điều cần nhớ của Chương 2 mà sách ghi ở cuối chương. </w:t>
+      </w:r>
+      <w:r>
+        <w:rPr>
+          <w:b/>
+        </w:rPr>
+        <w:t>Có mô hình và bảng tổng hợp giả thuyết là đã sẵn sàng thiết kế cách kiểm tra ở Chương 3.</w:t>
+      </w:r>
+    </w:p>
+    <w:p>
+      <w:pPr>
+        <w:spacing w:after="160"/>
+        <w:ind w:left="454"/>
+      </w:pPr>
+      <w:r>
+        <w:rPr>
+          <w:b/>
+          <w:color w:val="CC0000"/>
+        </w:rPr>
+        <w:t xml:space="preserve">Câu chuyện ngoài slide: </w:t>
+      </w:r>
+      <w:r>
+        <w:rPr>
+          <w:i/>
+        </w:rPr>
         <w:t>Thử hình dung một bạn tự tin Chương 2 đã xong vì dài 25 trang. Bạn ấy tô đậm chủ ngữ từng câu theo gợi ý ở Bảng 26 và thấy hai phần ba chủ ngữ là tên tác giả. Chương dài nhưng đang liệt kê. Độ dài không phải là thước đo của Chương 2; khoảng trống được chứng minh và mô hình có lý thuyết gốc mới là thước đo.</w:t>
       </w:r>
     </w:p>
@@ -4085,7 +4273,7 @@
         <w:pStyle w:val="Heading1"/>
       </w:pPr>
       <w:r>
-        <w:t>PHẦN 04. CHƯƠNG 3: PHƯƠNG PHÁP NGHIÊN CỨU (thời lượng ước tính 42 phút, 19 slide)</w:t>
+        <w:t>PHẦN 04. CHƯƠNG 3: PHƯƠNG PHÁP NGHIÊN CỨU (thời lượng ước tính 67 phút, 30 slide)</w:t>
       </w:r>
     </w:p>
     <w:p>
@@ -4107,7 +4295,7 @@
           <w:color w:val="595959"/>
           <w:sz w:val="24"/>
         </w:rPr>
-        <w:t>Chương 3 (mục 1 đến 8); Hình 35 đến 57; Bảng 10 đến 26; file 2.Chapter_2_and_Chapter_3_Practice</w:t>
+        <w:t>Chương 3 (mục 1 đến 8, Mục 3.4.1A, 3.5.1A đến 3.5.1C bổ sung); Hình 35 đến 57; Bảng 10 đến 26, BS4 đến BS13; file 2 và 2b</w:t>
       </w:r>
     </w:p>
     <w:p>
@@ -4120,7 +4308,7 @@
           <w:b/>
           <w:color w:val="CC0000"/>
         </w:rPr>
-        <w:t>(Slide 45: Bản đồ đọc sách cho Chương 3: mỗi mục gắn với một sheet Excel và phải có một câu "vì sao")</w:t>
+        <w:t>(Slide 47: Bản đồ đọc sách cho Chương 3: mỗi mục gắn với một sheet Excel và phải có một câu "vì sao")</w:t>
       </w:r>
     </w:p>
     <w:p>
@@ -4208,7 +4396,7 @@
           <w:b/>
           <w:color w:val="CC0000"/>
         </w:rPr>
-        <w:t>(Slide 46: Mỗi biến trong mô hình trở thành một nhóm câu hỏi, một biến đại diện và một hệ số được kiểm định)</w:t>
+        <w:t>(Slide 48: Mỗi biến trong mô hình trở thành một nhóm câu hỏi, một biến đại diện và một hệ số được kiểm định)</w:t>
       </w:r>
     </w:p>
     <w:p>
@@ -4313,7 +4501,7 @@
           <w:b/>
           <w:color w:val="CC0000"/>
         </w:rPr>
-        <w:t>(Slide 47: Triết lý, cách tiếp cận và phương pháp phải nằm trên cùng một cột, nếu không Chương 3 tự mâu thuẫn)</w:t>
+        <w:t>(Slide 49: Triết lý, cách tiếp cận và phương pháp phải nằm trên cùng một cột, nếu không Chương 3 tự mâu thuẫn)</w:t>
       </w:r>
     </w:p>
     <w:p>
@@ -4418,7 +4606,7 @@
           <w:b/>
           <w:color w:val="CC0000"/>
         </w:rPr>
-        <w:t>(Slide 48: Đề tài định tính vẫn trả lời cùng câu hỏi "dữ liệu từ ai, bằng công cụ gì, phân tích ra sao" nhưng khác ở bốn điểm)</w:t>
+        <w:t>(Slide 50: Đề tài định tính vẫn trả lời cùng câu hỏi "dữ liệu từ ai, bằng công cụ gì, phân tích ra sao" nhưng khác ở bốn điểm)</w:t>
       </w:r>
     </w:p>
     <w:p>
@@ -4512,7 +4700,7 @@
           <w:b/>
           <w:color w:val="CC0000"/>
         </w:rPr>
-        <w:t>(Slide 49: Khảo sát cắt ngang năm bước, mỗi bước có một sản phẩm và một con số cụ thể)</w:t>
+        <w:t>(Slide 51: Buổi phỏng vấn định tính đi theo sáu bước, từ chọn người có chủ đích đến ghi chú phản tỉnh ngay sau buổi)</w:t>
       </w:r>
     </w:p>
     <w:p>
@@ -4535,57 +4723,46 @@
           <w:color w:val="595959"/>
           <w:sz w:val="22"/>
         </w:rPr>
-        <w:t>Hướng dẫn Chuyên đề và Khóa luận tốt nghiệp, Chương 3, mục 3.2.1 và 3.2.2, Hình 38; Creswell và Creswell (2018, tr. 49, 208, 216)</w:t>
-      </w:r>
-    </w:p>
-    <w:p>
-      <w:pPr>
-        <w:spacing w:after="160" w:line="276" w:lineRule="auto"/>
-      </w:pPr>
-      <w:r>
-        <w:rPr>
-          <w:b w:val="0"/>
-        </w:rPr>
-        <w:t>Thiết kế nghiên cứu là kế hoạch tổng thể: dữ liệu thu từ ai, khi nào và bằng cách nào. Trong định lượng có hai thiết kế phổ biến là khảo sát và thực nghiệm. Khảo sát cắt ngang thu dữ liệu tại một thời điểm, khảo sát theo thời gian thu nhiều lần. Khóa luận đại học thường dùng khảo sát cắt ngang. Lý do không chọn thực nghiệm được sách viết rất gọn: nghiên cứu không thể chủ động thay đổi niềm tin hay ảnh hưởng xã hội của khách hàng.</w:t>
-      </w:r>
-    </w:p>
-    <w:p>
-      <w:pPr>
-        <w:spacing w:after="160" w:line="276" w:lineRule="auto"/>
-      </w:pPr>
-      <w:r>
-        <w:rPr>
-          <w:b w:val="0"/>
-        </w:rPr>
-        <w:t>Quy trình của Ngân hàng X có năm bước, thầy nhắc lại từng bước và con số của nó. Bước 1 tổng quan lý thuyết để có mô hình và bốn giả thuyết. Bước 2 xây bảng hỏi 19 câu, kế thừa thang đo đã công bố. Bước 3 đọc thử với 5 khách hàng để sửa câu chữ, rồi khảo sát thử 30 khách hàng để tính Cronbach Alpha sơ bộ. Bước 4 khảo sát chính thức qua Google Form và tại quầy, thu 165 phiếu. Bước 5 làm sạch còn 150 phiếu hợp lệ và phân tích bằng Excel.</w:t>
-      </w:r>
-    </w:p>
-    <w:p>
-      <w:pPr>
-        <w:spacing w:after="160" w:line="276" w:lineRule="auto"/>
-      </w:pPr>
-      <w:r>
-        <w:rPr>
-          <w:b w:val="0"/>
-        </w:rPr>
-        <w:t>Thầy tô đỏ bước 3 vì sinh viên hay bỏ nó. Sách phân biệt hai phần: đọc thử với vài người để sửa câu chữ khó hiểu; khảo sát thử khoảng 30 người để tính độ tin cậy sơ bộ. Creswell và Creswell nhấn mạnh thử bảng hỏi giúp cải thiện câu hỏi, cách trình bày, hướng dẫn và ước lượng thời gian trả lời.</w:t>
-      </w:r>
-    </w:p>
-    <w:p>
-      <w:pPr>
-        <w:spacing w:after="160" w:line="276" w:lineRule="auto"/>
-      </w:pPr>
-      <w:r>
-        <w:rPr>
-          <w:b w:val="0"/>
-        </w:rPr>
-        <w:t xml:space="preserve">Một lỗi nữa sách nhắc là nhầm thiết kế với công cụ, ví dụ viết "thiết kế là bảng hỏi". Thiết kế là kế hoạch tổng thể, bảng hỏi là công cụ. </w:t>
-      </w:r>
-      <w:r>
-        <w:rPr>
-          <w:b/>
-        </w:rPr>
-        <w:t>Thiếu bước thử bảng hỏi thì câu hỏi khó hiểu chỉ lộ ra khi đã thu xong dữ liệu, lúc đó không sửa được nữa.</w:t>
+        <w:t>Hướng dẫn Chuyên đề và Khóa luận tốt nghiệp, mục 5 Chương 3, Hình 57 và Mục 3.5.1B (bổ sung); Trần Phước (n.d., tr. 43 đến 55); Kallio và cộng sự (2016)</w:t>
+      </w:r>
+    </w:p>
+    <w:p>
+      <w:pPr>
+        <w:spacing w:after="160" w:line="276" w:lineRule="auto"/>
+      </w:pPr>
+      <w:r>
+        <w:rPr>
+          <w:b w:val="0"/>
+        </w:rPr>
+        <w:t>Slide trước về định tính có bốn điểm khác định lượng: thiết kế cụ thể, mẫu có chủ đích, dàn bài phỏng vấn, ghi âm khi được đồng ý. Slide này là phần thực địa, lấy từ Trần Phước trang 43 đến 55. Bước một, chọn người đã trải qua hiện tượng và nêu cách mời. Với Trường Y là phụ huynh đã làm thủ tục, mời qua giáo viên chủ nhiệm; phương án dự phòng là mời tại buổi họp phụ huynh. Bước hai, soạn dàn bài khoảng hai trang, 5 đến 10 câu, học thuộc để không đọc như đọc văn bản. Kallio và cộng sự năm 2016 thêm một giai đoạn hay bị bỏ: thử dàn bài trước khi dùng.</w:t>
+      </w:r>
+    </w:p>
+    <w:p>
+      <w:pPr>
+        <w:spacing w:after="160" w:line="276" w:lineRule="auto"/>
+      </w:pPr>
+      <w:r>
+        <w:rPr>
+          <w:b w:val="0"/>
+        </w:rPr>
+        <w:t>Bước ba, mở đầu: giới thiệu bản thân và mục đích, nói số câu hỏi và thời gian, xin phép ghi âm, ký bản đồng ý tham gia. Bước bốn, hỏi theo thứ tự: câu khởi động để người được hỏi thoải mái, không hỏi chuyện riêng như thu nhập; câu nội dung; câu dò xét như "Anh/chị có thể kể chi tiết hơn về trường hợp đó không?". Bước năm, kết thúc bằng câu mà Trần Phước gợi ý: "Tôi nên gặp thêm ai để hiểu rõ hơn về chủ đề này?" Câu này giúp các em tìm người tiếp theo.</w:t>
+      </w:r>
+    </w:p>
+    <w:p>
+      <w:pPr>
+        <w:spacing w:after="160" w:line="276" w:lineRule="auto"/>
+      </w:pPr>
+      <w:r>
+        <w:rPr>
+          <w:b w:val="0"/>
+        </w:rPr>
+        <w:t xml:space="preserve">Bước sáu thầy tô đỏ. Ngay sau buổi, các em ghi hai loại ghi chú tách bạch: ghi chú mô tả là điều đã nghe, đã thấy; ghi chú phản tỉnh là cảm nhận, linh cảm, điều bất ngờ của chính các em, theo Bogdan và Biklen mà Trần Phước dẫn. Rồi chép lời và mã hóa. </w:t>
+      </w:r>
+      <w:r>
+        <w:rPr>
+          <w:b/>
+        </w:rPr>
+        <w:t>Mã hóa ngay sau mỗi buổi chứ không dồn đến cuối đợt: không có mã thì không biết khi nào dữ liệu đã bão hòa.</w:t>
       </w:r>
     </w:p>
     <w:p>
@@ -4604,7 +4781,7 @@
         <w:rPr>
           <w:i/>
         </w:rPr>
-        <w:t>Thử hình dung bảng hỏi có câu "Anh chị đánh giá mức độ tiện ích của tính năng eKYC". Năm khách hàng đọc thử, ba người hỏi lại "eKYC là gì?". Nếu không đọc thử, 150 phiếu sẽ có câu này được trả lời ngẫu nhiên. Năm người đọc thử cứu 150 phiếu thật.</w:t>
+        <w:t>Thử hình dung một bạn phỏng vấn liền 12 phụ huynh trong một tuần, định cuối tuần mới nghe lại băng. Đến khi chép lời, bạn ấy thấy từ buổi thứ 8 trở đi phụ huynh chỉ nhắc lại những ý cũ. Bốn buổi cuối tốn công nhưng không thêm gì. Mã hóa ngay sau mỗi buổi thì bạn ấy đã biết dừng sớm và dành thời gian đó để viết.</w:t>
       </w:r>
     </w:p>
     <w:p>
@@ -4617,7 +4794,7 @@
           <w:b/>
           <w:color w:val="CC0000"/>
         </w:rPr>
-        <w:t>(Slide 50: Không có khung mẫu thì không chọn mẫu xác suất được và kết luận chỉ gợi ý xu hướng cho tổng thể)</w:t>
+        <w:t>(Slide 52: Định tính cũng có con số: đếm mã mới sau mỗi buổi và dừng khi hai buổi liên tiếp không thêm mã)</w:t>
       </w:r>
     </w:p>
     <w:p>
@@ -4640,57 +4817,46 @@
           <w:color w:val="595959"/>
           <w:sz w:val="22"/>
         </w:rPr>
-        <w:t>Hướng dẫn Chuyên đề và Khóa luận tốt nghiệp, Chương 3, mục 3.3.1 và 3.3.2, Hình 39 và 40; Creswell và Creswell (2018, tr. 211 đến 212)</w:t>
-      </w:r>
-    </w:p>
-    <w:p>
-      <w:pPr>
-        <w:spacing w:after="160" w:line="276" w:lineRule="auto"/>
-      </w:pPr>
-      <w:r>
-        <w:rPr>
-          <w:b w:val="0"/>
-        </w:rPr>
-        <w:t>Tổng thể là toàn bộ đối tượng mà nghiên cứu muốn nói tới. Mẫu là phần của tổng thể thực sự cung cấp dữ liệu. Khoảng cách giữa tổng thể và mẫu quyết định kết luận được suy rộng tới đâu. Sách dặn viết tổng thể theo ba ô: ai, ở đâu, điều kiện gì.</w:t>
-      </w:r>
-    </w:p>
-    <w:p>
-      <w:pPr>
-        <w:spacing w:after="160" w:line="276" w:lineRule="auto"/>
-      </w:pPr>
-      <w:r>
-        <w:rPr>
-          <w:b w:val="0"/>
-        </w:rPr>
-        <w:t>Khái niệm giữa là khung mẫu, sampling frame: danh sách các phần tử của tổng thể mà từ đó mẫu được chọn. Sách có một câu so sánh rất dễ nhớ: muốn chọn ngẫu nhiên thì phải có danh sách để chọn, giống như bốc thăm thì phải có đủ tên trong hộp. Ngân hàng X không có danh sách vì dữ liệu khách hàng được ngân hàng bảo mật. Trường Tiểu học Y có danh sách phụ huynh nhưng không cung cấp cho người ngoài. Cả hai đề tài đều phải dùng mẫu phi xác suất.</w:t>
-      </w:r>
-    </w:p>
-    <w:p>
-      <w:pPr>
-        <w:spacing w:after="160" w:line="276" w:lineRule="auto"/>
-      </w:pPr>
-      <w:r>
-        <w:rPr>
-          <w:b w:val="0"/>
-        </w:rPr>
-        <w:t>Hệ quả của lựa chọn là điểm các em cần hiểu thật rõ. Chọn mẫu xác suất cho phép suy rộng từ mẫu cho tổng thể kèm mức sai số tính được. Chọn mẫu phi xác suất không cho phép suy rộng chắc chắn: kết quả có giá trị cho những người đã trả lời và chỉ gợi ý xu hướng cho tổng thể. Creswell và Creswell nói mẫu ngẫu nhiên là lý tưởng; mẫu thuận tiện kém lý tưởng hơn nhưng được dùng phổ biến.</w:t>
-      </w:r>
-    </w:p>
-    <w:p>
-      <w:pPr>
-        <w:spacing w:after="160" w:line="276" w:lineRule="auto"/>
-      </w:pPr>
-      <w:r>
-        <w:rPr>
-          <w:b w:val="0"/>
-        </w:rPr>
-        <w:t xml:space="preserve">Với Trường Y, sách chỉ ra một hạn chế rất cụ thể: phiếu phát tại cổng trường giờ đón con, nên phụ huynh không đón con trực tiếp ít có cơ hội được mời. Viết được câu như vậy là các em hiểu mẫu của mình. </w:t>
-      </w:r>
-      <w:r>
-        <w:rPr>
-          <w:b/>
-        </w:rPr>
-        <w:t>Mô tả đúng cách đã làm: chỉ phát phiếu cho người gặp được thì đó là mẫu thuận tiện, không phải chọn ngẫu nhiên.</w:t>
+        <w:t>Hướng dẫn Chuyên đề và Khóa luận tốt nghiệp, mục 5 Chương 3 và Mục 3.5.1B (bổ sung), Bảng BS11; Hennink và Kaiser (2022); Charmaz (2006, dẫn theo Trần Phước, n.d., tr. 44); file 2b.Chapter_2_and_Chapter_3_Data_Collection_Practice.xlsx (dữ liệu giả định), sheet 10 và 11</w:t>
+      </w:r>
+    </w:p>
+    <w:p>
+      <w:pPr>
+        <w:spacing w:after="160" w:line="276" w:lineRule="auto"/>
+      </w:pPr>
+      <w:r>
+        <w:rPr>
+          <w:b w:val="0"/>
+        </w:rPr>
+        <w:t>Sách đã có quy tắc thực hành ở mục 5 của Chương 3: khi hai đến ba buổi liên tiếp không thêm chủ đề mới, dữ liệu đã gần bão hòa. Bão hòa, theo Charmaz mà Trần Phước dẫn, là lúc thu thêm dữ liệu không còn tạo ra hiểu biết mới. Biểu đồ này cho thấy cách biến quy tắc đó thành con số, với 10 buổi phỏng vấn phụ huynh Trường Y. Mỗi cột là số mã mới xuất hiện lần đầu ở buổi đó.</w:t>
+      </w:r>
+    </w:p>
+    <w:p>
+      <w:pPr>
+        <w:spacing w:after="160" w:line="276" w:lineRule="auto"/>
+      </w:pPr>
+      <w:r>
+        <w:rPr>
+          <w:b w:val="0"/>
+        </w:rPr>
+        <w:t>Buổi một có 5 mã mới, buổi hai 3, buổi ba 2: 10 trên 14 mã xuất hiện ngay trong ba buổi đầu. Cột rỗng là buổi bảy: không có mã mới. Nhưng buổi tám lại thêm một mã, là mong muốn nhận kết quả thủ tục qua tin nhắn. Đây là lý do một buổi bằng 0 chưa đủ để dừng. Hai cột đỏ là buổi chín và buổi mười, liên tiếp bằng 0, nên dừng ở buổi mười. Tổng quan của Hennink và Kaiser năm 2022 ghi nhận 9 đến 17 buổi phỏng vấn thường đủ để bão hòa khi nhóm người tham gia đồng nhất và mục tiêu hẹp.</w:t>
+      </w:r>
+    </w:p>
+    <w:p>
+      <w:pPr>
+        <w:spacing w:after="160" w:line="276" w:lineRule="auto"/>
+      </w:pPr>
+      <w:r>
+        <w:rPr>
+          <w:b w:val="0"/>
+        </w:rPr>
+        <w:t xml:space="preserve">Trong file Excel, các em không đếm tay. Sheet 11 là ma trận người được phỏng vấn nhân mã; hàm MATCH tìm buổi đầu tiên mỗi mã xuất hiện; sheet 10 đếm số mã mới theo buổi. </w:t>
+      </w:r>
+      <w:r>
+        <w:rPr>
+          <w:b/>
+        </w:rPr>
+        <w:t>Dừng phỏng vấn vì nhật ký cho thấy hai đến ba buổi liên tiếp không có mã mới, không dừng vì "thấy đủ".</w:t>
       </w:r>
     </w:p>
     <w:p>
@@ -4709,7 +4875,7 @@
         <w:rPr>
           <w:i/>
         </w:rPr>
-        <w:t>Thử hình dung các em muốn bốc thăm ngẫu nhiên 150 khách hàng nhưng ngân hàng không đưa danh sách. Không có tên trong hộp thì không bốc thăm được. Đó không phải lỗi của các em, mà là điều kiện thực tế. Lỗi chỉ xuất hiện khi các em vẫn viết "chọn ngẫu nhiên" trong khóa luận.</w:t>
+        <w:t>Thử hình dung Hội đồng hỏi: "Vì sao em phỏng vấn 10 người mà không phải 20?" Bạn trả lời "vì em thấy đủ" thì câu hỏi tiếp theo sẽ khó hơn. Bạn mở biểu đồ này và nói "buổi 9 và 10 không thêm mã nào; 10 trên 14 mã đã có từ buổi 3" thì câu hỏi dừng ở đó.</w:t>
       </w:r>
     </w:p>
     <w:p>
@@ -4722,7 +4888,7 @@
           <w:b/>
           <w:color w:val="CC0000"/>
         </w:rPr>
-        <w:t>(Slide 51: Cỡ mẫu được tính bằng hai quy tắc có nguồn rồi chọn số lớn hơn, không lấy theo "nhiều khóa luận cũng chọn")</w:t>
+        <w:t>(Slide 53: Khảo sát cắt ngang năm bước, mỗi bước có một sản phẩm và một con số cụ thể)</w:t>
       </w:r>
     </w:p>
     <w:p>
@@ -4745,57 +4911,57 @@
           <w:color w:val="595959"/>
           <w:sz w:val="22"/>
         </w:rPr>
-        <w:t>Hướng dẫn Chuyên đề và Khóa luận tốt nghiệp, Chương 3, mục 3.3.3 và Bảng 12; Hair và cộng sự (2010); Green (1991)</w:t>
-      </w:r>
-    </w:p>
-    <w:p>
-      <w:pPr>
-        <w:spacing w:after="160" w:line="276" w:lineRule="auto"/>
-      </w:pPr>
-      <w:r>
-        <w:rPr>
-          <w:b w:val="0"/>
-        </w:rPr>
-        <w:t>Cỡ mẫu là câu hội đồng rất hay hỏi. Sách nói cỡ mẫu phải được tính bằng một quy tắc có nguồn, phụ thuộc vào kỹ thuật phân tích và số biến. Với khóa luận dùng Cronbach Alpha, phân tích nhân tố và hồi quy, có hai quy tắc kinh nghiệm.</w:t>
-      </w:r>
-    </w:p>
-    <w:p>
-      <w:pPr>
-        <w:spacing w:after="160" w:line="276" w:lineRule="auto"/>
-      </w:pPr>
-      <w:r>
-        <w:rPr>
-          <w:b w:val="0"/>
-        </w:rPr>
-        <w:t>Quy tắc thứ nhất cho phân tích nhân tố: số quan sát ít nhất gấp 5 lần số biến quan sát, theo Hair và cộng sự năm 2010. Biến quan sát là từng câu hỏi trong bảng hỏi. Ngân hàng X có 19 câu, vậy cần ít nhất 95. Quy tắc thứ hai cho hồi quy: n lớn hơn hoặc bằng 50 cộng 8 nhân m, với m là số biến độc lập, theo Green năm 1991. Bốn biến độc lập thì cần ít nhất 82. Trường Y có ba biến độc lập nên tối thiểu 74.</w:t>
-      </w:r>
-    </w:p>
-    <w:p>
-      <w:pPr>
-        <w:spacing w:after="160" w:line="276" w:lineRule="auto"/>
-      </w:pPr>
-      <w:r>
-        <w:rPr>
-          <w:b w:val="0"/>
-        </w:rPr>
-        <w:t>Vì sao cần hai quy tắc? Sách giải thích: phân tích nhân tố ước lượng quan hệ của từng câu hỏi với các nhân tố, nên câu hỏi càng nhiều càng cần nhiều quan sát. Hồi quy ước lượng một hệ số cho mỗi biến độc lập, nên biến càng nhiều càng cần nhiều quan sát. Khóa luận có thể dùng cả hai kỹ thuật nên cỡ mẫu phải đủ cho kỹ thuật đòi hỏi nhiều hơn. Vì vậy chọn 95, rồi mời 200 người để dự phòng phiếu hỏng.</w:t>
-      </w:r>
-    </w:p>
-    <w:p>
-      <w:pPr>
-        <w:spacing w:after="160" w:line="276" w:lineRule="auto"/>
-      </w:pPr>
-      <w:r>
-        <w:rPr>
-          <w:b w:val="0"/>
-        </w:rPr>
-        <w:t xml:space="preserve">Câu chưa đạt trong sách là: "Tôi chọn 50 mẫu vì đủ để phân tích. Nhiều khóa luận cũng chọn 50 mẫu." Với 19 câu hỏi, 50 phiếu thấp hơn cả hai quy tắc; Cronbach Alpha và hệ số hồi quy kém ổn định; Hội đồng có thể yêu cầu khảo sát bổ sung. </w:t>
-      </w:r>
-      <w:r>
-        <w:rPr>
-          <w:b/>
-        </w:rPr>
-        <w:t>Không đếm câu thông tin chung vào số biến quan sát; số câu trong phép tính phải khớp số câu trong bảng hỏi.</w:t>
+        <w:t>Hướng dẫn Chuyên đề và Khóa luận tốt nghiệp, Chương 3, mục 3.2.1 và 3.2.2, Hình 38; Creswell và Creswell (2018, tr. 49, 208, 216)</w:t>
+      </w:r>
+    </w:p>
+    <w:p>
+      <w:pPr>
+        <w:spacing w:after="160" w:line="276" w:lineRule="auto"/>
+      </w:pPr>
+      <w:r>
+        <w:rPr>
+          <w:b w:val="0"/>
+        </w:rPr>
+        <w:t>Thiết kế nghiên cứu là kế hoạch tổng thể: dữ liệu thu từ ai, khi nào và bằng cách nào. Trong định lượng có hai thiết kế phổ biến là khảo sát và thực nghiệm. Khảo sát cắt ngang thu dữ liệu tại một thời điểm, khảo sát theo thời gian thu nhiều lần. Khóa luận đại học thường dùng khảo sát cắt ngang. Lý do không chọn thực nghiệm được sách viết rất gọn: nghiên cứu không thể chủ động thay đổi niềm tin hay ảnh hưởng xã hội của khách hàng.</w:t>
+      </w:r>
+    </w:p>
+    <w:p>
+      <w:pPr>
+        <w:spacing w:after="160" w:line="276" w:lineRule="auto"/>
+      </w:pPr>
+      <w:r>
+        <w:rPr>
+          <w:b w:val="0"/>
+        </w:rPr>
+        <w:t>Quy trình của Ngân hàng X có năm bước, thầy nhắc lại từng bước và con số của nó. Bước 1 tổng quan lý thuyết để có mô hình và bốn giả thuyết. Bước 2 xây bảng hỏi 19 câu, kế thừa thang đo đã công bố. Bước 3 đọc thử với 5 khách hàng để sửa câu chữ, rồi khảo sát thử 30 khách hàng để tính Cronbach Alpha sơ bộ. Bước 4 khảo sát chính thức qua Google Form và tại quầy, thu 165 phiếu. Bước 5 làm sạch còn 150 phiếu hợp lệ và phân tích bằng Excel.</w:t>
+      </w:r>
+    </w:p>
+    <w:p>
+      <w:pPr>
+        <w:spacing w:after="160" w:line="276" w:lineRule="auto"/>
+      </w:pPr>
+      <w:r>
+        <w:rPr>
+          <w:b w:val="0"/>
+        </w:rPr>
+        <w:t>Thầy tô đỏ bước 3 vì sinh viên hay bỏ nó. Sách phân biệt hai phần: đọc thử với vài người để sửa câu chữ khó hiểu; khảo sát thử khoảng 30 người để tính độ tin cậy sơ bộ. Creswell và Creswell nhấn mạnh thử bảng hỏi giúp cải thiện câu hỏi, cách trình bày, hướng dẫn và ước lượng thời gian trả lời.</w:t>
+      </w:r>
+    </w:p>
+    <w:p>
+      <w:pPr>
+        <w:spacing w:after="160" w:line="276" w:lineRule="auto"/>
+      </w:pPr>
+      <w:r>
+        <w:rPr>
+          <w:b w:val="0"/>
+        </w:rPr>
+        <w:t xml:space="preserve">Một lỗi nữa sách nhắc là nhầm thiết kế với công cụ, ví dụ viết "thiết kế là bảng hỏi". Thiết kế là kế hoạch tổng thể, bảng hỏi là công cụ. </w:t>
+      </w:r>
+      <w:r>
+        <w:rPr>
+          <w:b/>
+        </w:rPr>
+        <w:t>Thiếu bước thử bảng hỏi thì câu hỏi khó hiểu chỉ lộ ra khi đã thu xong dữ liệu, lúc đó không sửa được nữa.</w:t>
       </w:r>
     </w:p>
     <w:p>
@@ -4814,7 +4980,7 @@
         <w:rPr>
           <w:i/>
         </w:rPr>
-        <w:t>Thử hình dung Hội đồng hỏi "Vì sao 150 mà không phải 100 hay 300?". Câu trả lời đạt chỉ cần ba câu: 19 câu hỏi nhân 5 bằng 95 theo Hair; 50 cộng 8 nhân 4 bằng 82 theo Green; chọn số lớn hơn là 95, mời 200 để dự phòng, thu được 150 phiếu hợp lệ. Ba câu, hai nguồn, không còn chỗ để hỏi tiếp.</w:t>
+        <w:t>Thử hình dung bảng hỏi có câu "Anh chị đánh giá mức độ tiện ích của tính năng eKYC". Năm khách hàng đọc thử, ba người hỏi lại "eKYC là gì?". Nếu không đọc thử, 150 phiếu sẽ có câu này được trả lời ngẫu nhiên. Năm người đọc thử cứu 150 phiếu thật.</w:t>
       </w:r>
     </w:p>
     <w:p>
@@ -4827,7 +4993,7 @@
           <w:b/>
           <w:color w:val="CC0000"/>
         </w:rPr>
-        <w:t>(Slide 52: Dữ liệu sơ cấp dùng để kiểm định giả thuyết; dữ liệu thứ cấp dùng để mô tả bối cảnh)</w:t>
+        <w:t>(Slide 54: Không có khung mẫu thì không chọn mẫu xác suất được và kết luận chỉ gợi ý xu hướng cho tổng thể)</w:t>
       </w:r>
     </w:p>
     <w:p>
@@ -4850,46 +5016,57 @@
           <w:color w:val="595959"/>
           <w:sz w:val="22"/>
         </w:rPr>
-        <w:t>Hướng dẫn Chuyên đề và Khóa luận tốt nghiệp, Chương 3, mục 3.4.1</w:t>
-      </w:r>
-    </w:p>
-    <w:p>
-      <w:pPr>
-        <w:spacing w:after="160" w:line="276" w:lineRule="auto"/>
-      </w:pPr>
-      <w:r>
-        <w:rPr>
-          <w:b w:val="0"/>
-        </w:rPr>
-        <w:t>Mục 3.4.1 ngắn nhưng hay bị viết sai. Dữ liệu sơ cấp là dữ liệu sinh viên tự thu thập cho đề tài, ví dụ phiếu khảo sát. Dữ liệu thứ cấp là dữ liệu có sẵn do người khác thu thập, ví dụ báo cáo thường niên của ngân hàng hay số liệu của cơ quan thống kê. Trong khóa luận khảo sát, hai loại dữ liệu làm hai việc khác nhau: sơ cấp để kiểm định giả thuyết, thứ cấp để mô tả bối cảnh.</w:t>
-      </w:r>
-    </w:p>
-    <w:p>
-      <w:pPr>
-        <w:spacing w:after="160" w:line="276" w:lineRule="auto"/>
-      </w:pPr>
-      <w:r>
-        <w:rPr>
-          <w:b w:val="0"/>
-        </w:rPr>
-        <w:t>Câu chưa đạt bên trái định nghĩa được hai loại nhưng không nói mỗi loại dùng để làm gì và "dữ liệu trên mạng" không phải một nguồn. Câu đạt bên phải nói rõ: dữ liệu sơ cấp từ bảng hỏi dùng để kiểm định H1 đến H4; dữ liệu thứ cấp từ báo cáo thường niên và số liệu thanh toán không dùng tiền mặt dùng cho bối cảnh ở Chương 1 và giải thích kết quả ở Chương 4.</w:t>
-      </w:r>
-    </w:p>
-    <w:p>
-      <w:pPr>
-        <w:spacing w:after="160" w:line="276" w:lineRule="auto"/>
-      </w:pPr>
-      <w:r>
-        <w:rPr>
-          <w:b w:val="0"/>
-        </w:rPr>
-        <w:t xml:space="preserve">Mục 1.4 của Chương 1 cũng yêu cầu tách hai loại thời gian: giai đoạn của dữ liệu thứ cấp và thời gian thu dữ liệu sơ cấp. Hai mục này phải khớp nhau. </w:t>
-      </w:r>
-      <w:r>
-        <w:rPr>
-          <w:b/>
-        </w:rPr>
-        <w:t>Mỗi con số thứ cấp trong khóa luận phải có nguồn và năm.</w:t>
+        <w:t>Hướng dẫn Chuyên đề và Khóa luận tốt nghiệp, Chương 3, mục 3.3.1 và 3.3.2, Hình 39 và 40; Creswell và Creswell (2018, tr. 211 đến 212)</w:t>
+      </w:r>
+    </w:p>
+    <w:p>
+      <w:pPr>
+        <w:spacing w:after="160" w:line="276" w:lineRule="auto"/>
+      </w:pPr>
+      <w:r>
+        <w:rPr>
+          <w:b w:val="0"/>
+        </w:rPr>
+        <w:t>Tổng thể là toàn bộ đối tượng mà nghiên cứu muốn nói tới. Mẫu là phần của tổng thể thực sự cung cấp dữ liệu. Khoảng cách giữa tổng thể và mẫu quyết định kết luận được suy rộng tới đâu. Sách dặn viết tổng thể theo ba ô: ai, ở đâu, điều kiện gì.</w:t>
+      </w:r>
+    </w:p>
+    <w:p>
+      <w:pPr>
+        <w:spacing w:after="160" w:line="276" w:lineRule="auto"/>
+      </w:pPr>
+      <w:r>
+        <w:rPr>
+          <w:b w:val="0"/>
+        </w:rPr>
+        <w:t>Khái niệm giữa là khung mẫu, sampling frame: danh sách các phần tử của tổng thể mà từ đó mẫu được chọn. Sách có một câu so sánh rất dễ nhớ: muốn chọn ngẫu nhiên thì phải có danh sách để chọn, giống như bốc thăm thì phải có đủ tên trong hộp. Ngân hàng X không có danh sách vì dữ liệu khách hàng được ngân hàng bảo mật. Trường Tiểu học Y có danh sách phụ huynh nhưng không cung cấp cho người ngoài. Cả hai đề tài đều phải dùng mẫu phi xác suất.</w:t>
+      </w:r>
+    </w:p>
+    <w:p>
+      <w:pPr>
+        <w:spacing w:after="160" w:line="276" w:lineRule="auto"/>
+      </w:pPr>
+      <w:r>
+        <w:rPr>
+          <w:b w:val="0"/>
+        </w:rPr>
+        <w:t>Hệ quả của lựa chọn là điểm các em cần hiểu thật rõ. Chọn mẫu xác suất cho phép suy rộng từ mẫu cho tổng thể kèm mức sai số tính được. Chọn mẫu phi xác suất không cho phép suy rộng chắc chắn: kết quả có giá trị cho những người đã trả lời và chỉ gợi ý xu hướng cho tổng thể. Creswell và Creswell nói mẫu ngẫu nhiên là lý tưởng; mẫu thuận tiện kém lý tưởng hơn nhưng được dùng phổ biến.</w:t>
+      </w:r>
+    </w:p>
+    <w:p>
+      <w:pPr>
+        <w:spacing w:after="160" w:line="276" w:lineRule="auto"/>
+      </w:pPr>
+      <w:r>
+        <w:rPr>
+          <w:b w:val="0"/>
+        </w:rPr>
+        <w:t xml:space="preserve">Với Trường Y, sách chỉ ra một hạn chế rất cụ thể: phiếu phát tại cổng trường giờ đón con, nên phụ huynh không đón con trực tiếp ít có cơ hội được mời. Viết được câu như vậy là các em hiểu mẫu của mình. </w:t>
+      </w:r>
+      <w:r>
+        <w:rPr>
+          <w:b/>
+        </w:rPr>
+        <w:t>Mô tả đúng cách đã làm: chỉ phát phiếu cho người gặp được thì đó là mẫu thuận tiện, không phải chọn ngẫu nhiên.</w:t>
       </w:r>
     </w:p>
     <w:p>
@@ -4908,7 +5085,7 @@
         <w:rPr>
           <w:i/>
         </w:rPr>
-        <w:t>Thử hình dung một bạn ghi "tỷ lệ người dân dùng ngân hàng số là 87%" với nguồn là "trên mạng". Hội đồng hỏi: của cơ quan nào, năm nào, khảo sát ai? Bạn ấy tìm lại không ra trang đã đọc. Một con số không kiểm chứng được sẽ kéo theo nghi ngờ với cả đoạn bối cảnh. Ghi nguồn ngay lúc chép số là thói quen rẻ nhất để tránh chuyện này.</w:t>
+        <w:t>Thử hình dung các em muốn bốc thăm ngẫu nhiên 150 khách hàng nhưng ngân hàng không đưa danh sách. Không có tên trong hộp thì không bốc thăm được. Đó không phải lỗi của các em, mà là điều kiện thực tế. Lỗi chỉ xuất hiện khi các em vẫn viết "chọn ngẫu nhiên" trong khóa luận.</w:t>
       </w:r>
     </w:p>
     <w:p>
@@ -4921,7 +5098,7 @@
           <w:b/>
           <w:color w:val="CC0000"/>
         </w:rPr>
-        <w:t>(Slide 53: Mỗi câu hỏi chỉ đo một ý, viết dạng khẳng định, dùng chung một thang Likert năm mức)</w:t>
+        <w:t>(Slide 55: Cỡ mẫu được tính bằng hai quy tắc có nguồn rồi chọn số lớn hơn, không lấy theo "nhiều khóa luận cũng chọn")</w:t>
       </w:r>
     </w:p>
     <w:p>
@@ -4944,57 +5121,57 @@
           <w:color w:val="595959"/>
           <w:sz w:val="22"/>
         </w:rPr>
-        <w:t>Hướng dẫn Chuyên đề và Khóa luận tốt nghiệp, Chương 3, mục 3.4.2 và 3.4.3; file 2.Chapter_2_and_Chapter_3_Practice.xlsx (dữ liệu giả định), sheet 1_BangMa</w:t>
-      </w:r>
-    </w:p>
-    <w:p>
-      <w:pPr>
-        <w:spacing w:after="160" w:line="276" w:lineRule="auto"/>
-      </w:pPr>
-      <w:r>
-        <w:rPr>
-          <w:b w:val="0"/>
-        </w:rPr>
-        <w:t>Bảng hỏi là công cụ thu dữ liệu chính. Sách mô tả ba phần của bảng hỏi: phần mở đầu gồm giới thiệu, cam kết bảo mật và xin đồng ý; phần thông tin chung như giới tính, độ tuổi, thu nhập; phần nội dung chính gồm các câu hỏi đo từng biến. Ngân hàng X có 19 biến quan sát ở phần nội dung chính, Trường Y có 16. Trong file Excel, sheet 1_BangMa ghi tên biến, nội dung câu hỏi và quy ước mã số cho từng câu.</w:t>
-      </w:r>
-    </w:p>
-    <w:p>
-      <w:pPr>
-        <w:spacing w:after="160" w:line="276" w:lineRule="auto"/>
-      </w:pPr>
-      <w:r>
-        <w:rPr>
-          <w:b w:val="0"/>
-        </w:rPr>
-        <w:t>Hai câu bên trái là ví dụ chưa đạt. Câu thứ nhất hỏi bốn ý trong một câu: nhanh, rẻ, an toàn, dễ dùng. Người trả lời đồng ý ý này nhưng không đồng ý ý kia thì không biết chọn mức nào. Câu thứ hai dùng phủ định kép. Cụm "đúng không" còn gợi ý câu trả lời. Sách nói hậu quả: thang đo có thể có Alpha thấp và kết quả hồi quy không diễn giải được.</w:t>
-      </w:r>
-    </w:p>
-    <w:p>
-      <w:pPr>
-        <w:spacing w:after="160" w:line="276" w:lineRule="auto"/>
-      </w:pPr>
-      <w:r>
-        <w:rPr>
-          <w:b w:val="0"/>
-        </w:rPr>
-        <w:t>Bên phải là các câu đạt: mỗi câu một ý, dạng khẳng định để người trả lời chọn mức đồng ý, có mã gắn với biến và dùng ngôi "tôi" để người trả lời tự đánh giá. Tất cả dùng thang Likert 5 mức: 1 là hoàn toàn không đồng ý, 2 là không đồng ý, 3 là trung lập, 4 là đồng ý, 5 là hoàn toàn đồng ý. Mọi câu dùng cùng một chiều; nếu có câu đảo chiều thì đổi điểm bằng công thức bằng 6 trừ ô đó trước khi phân tích.</w:t>
-      </w:r>
-    </w:p>
-    <w:p>
-      <w:pPr>
-        <w:spacing w:after="160" w:line="276" w:lineRule="auto"/>
-      </w:pPr>
-      <w:r>
-        <w:rPr>
-          <w:b w:val="0"/>
-        </w:rPr>
-        <w:t xml:space="preserve">Sách khuyên mỗi khái niệm có từ 3 đến 5 câu và câu dưới 20 chữ nếu có thể. </w:t>
-      </w:r>
-      <w:r>
-        <w:rPr>
-          <w:b/>
-        </w:rPr>
-        <w:t>Kiểm tra từng câu bằng ba câu hỏi: đo một ý hay nhiều ý; có gợi ý câu trả lời không; có khớp với định nghĩa ở Chương 2 không.</w:t>
+        <w:t>Hướng dẫn Chuyên đề và Khóa luận tốt nghiệp, Chương 3, mục 3.3.3 và Bảng 12; Hair và cộng sự (2010); Green (1991)</w:t>
+      </w:r>
+    </w:p>
+    <w:p>
+      <w:pPr>
+        <w:spacing w:after="160" w:line="276" w:lineRule="auto"/>
+      </w:pPr>
+      <w:r>
+        <w:rPr>
+          <w:b w:val="0"/>
+        </w:rPr>
+        <w:t>Cỡ mẫu là câu hội đồng rất hay hỏi. Sách nói cỡ mẫu phải được tính bằng một quy tắc có nguồn, phụ thuộc vào kỹ thuật phân tích và số biến. Với khóa luận dùng Cronbach Alpha, phân tích nhân tố và hồi quy, có hai quy tắc kinh nghiệm.</w:t>
+      </w:r>
+    </w:p>
+    <w:p>
+      <w:pPr>
+        <w:spacing w:after="160" w:line="276" w:lineRule="auto"/>
+      </w:pPr>
+      <w:r>
+        <w:rPr>
+          <w:b w:val="0"/>
+        </w:rPr>
+        <w:t>Quy tắc thứ nhất cho phân tích nhân tố: số quan sát ít nhất gấp 5 lần số biến quan sát, theo Hair và cộng sự năm 2010. Biến quan sát là từng câu hỏi trong bảng hỏi. Ngân hàng X có 19 câu, vậy cần ít nhất 95. Quy tắc thứ hai cho hồi quy: n lớn hơn hoặc bằng 50 cộng 8 nhân m, với m là số biến độc lập, theo Green năm 1991. Bốn biến độc lập thì cần ít nhất 82. Trường Y có ba biến độc lập nên tối thiểu 74.</w:t>
+      </w:r>
+    </w:p>
+    <w:p>
+      <w:pPr>
+        <w:spacing w:after="160" w:line="276" w:lineRule="auto"/>
+      </w:pPr>
+      <w:r>
+        <w:rPr>
+          <w:b w:val="0"/>
+        </w:rPr>
+        <w:t>Vì sao cần hai quy tắc? Sách giải thích: phân tích nhân tố ước lượng quan hệ của từng câu hỏi với các nhân tố, nên câu hỏi càng nhiều càng cần nhiều quan sát. Hồi quy ước lượng một hệ số cho mỗi biến độc lập, nên biến càng nhiều càng cần nhiều quan sát. Khóa luận có thể dùng cả hai kỹ thuật nên cỡ mẫu phải đủ cho kỹ thuật đòi hỏi nhiều hơn. Vì vậy chọn 95, rồi mời 200 người để dự phòng phiếu hỏng.</w:t>
+      </w:r>
+    </w:p>
+    <w:p>
+      <w:pPr>
+        <w:spacing w:after="160" w:line="276" w:lineRule="auto"/>
+      </w:pPr>
+      <w:r>
+        <w:rPr>
+          <w:b w:val="0"/>
+        </w:rPr>
+        <w:t xml:space="preserve">Câu chưa đạt trong sách là: "Tôi chọn 50 mẫu vì đủ để phân tích. Nhiều khóa luận cũng chọn 50 mẫu." Với 19 câu hỏi, 50 phiếu thấp hơn cả hai quy tắc; Cronbach Alpha và hệ số hồi quy kém ổn định; Hội đồng có thể yêu cầu khảo sát bổ sung. </w:t>
+      </w:r>
+      <w:r>
+        <w:rPr>
+          <w:b/>
+        </w:rPr>
+        <w:t>Không đếm câu thông tin chung vào số biến quan sát; số câu trong phép tính phải khớp số câu trong bảng hỏi.</w:t>
       </w:r>
     </w:p>
     <w:p>
@@ -5013,7 +5190,7 @@
         <w:rPr>
           <w:i/>
         </w:rPr>
-        <w:t>Thử hình dung câu "Ứng dụng nhanh và an toàn". Một khách hàng thấy ứng dụng rất nhanh nhưng lo mất tiền. Họ chọn 3, trung lập. Con số 3 đó không nói lên điều gì: không phải họ thấy bình thường, mà họ thấy một ý tốt và một ý xấu. Tách thành hai câu thì dữ liệu nói đúng điều khách hàng nghĩ.</w:t>
+        <w:t>Thử hình dung Hội đồng hỏi "Vì sao 150 mà không phải 100 hay 300?". Câu trả lời đạt chỉ cần ba câu: 19 câu hỏi nhân 5 bằng 95 theo Hair; 50 cộng 8 nhân 4 bằng 82 theo Green; chọn số lớn hơn là 95, mời 200 để dự phòng, thu được 150 phiếu hợp lệ. Ba câu, hai nguồn, không còn chỗ để hỏi tiếp.</w:t>
       </w:r>
     </w:p>
     <w:p>
@@ -5026,7 +5203,7 @@
           <w:b/>
           <w:color w:val="CC0000"/>
         </w:rPr>
-        <w:t>(Slide 54: Người đọc cần thấy con số ở từng bước: bao nhiêu người được mời, trả lời, bị loại và còn hợp lệ)</w:t>
+        <w:t>(Slide 56: Dữ liệu sơ cấp dùng để kiểm định giả thuyết; dữ liệu thứ cấp dùng để mô tả bối cảnh)</w:t>
       </w:r>
     </w:p>
     <w:p>
@@ -5049,57 +5226,46 @@
           <w:color w:val="595959"/>
           <w:sz w:val="22"/>
         </w:rPr>
-        <w:t>Hướng dẫn Chuyên đề và Khóa luận tốt nghiệp, Chương 3, mục 3.5.1, Hình 45 và 46; file 2.Chapter_2_and_Chapter_3_Practice.xlsx (dữ liệu giả định), sheet 2_DuLieuTho và 3_DuLieuSach</w:t>
-      </w:r>
-    </w:p>
-    <w:p>
-      <w:pPr>
-        <w:spacing w:after="160" w:line="276" w:lineRule="auto"/>
-      </w:pPr>
-      <w:r>
-        <w:rPr>
-          <w:b w:val="0"/>
-        </w:rPr>
-        <w:t>Thu thập dữ liệu gồm năm bước: chuẩn bị, phát hành, thu nhận, lọc, lưu trữ. Sách yêu cầu mỗi bước phải có con số. Creswell và Creswell gợi ý báo cáo số người trả lời và không trả lời bằng số lượng và tỷ lệ phần trăm.</w:t>
-      </w:r>
-    </w:p>
-    <w:p>
-      <w:pPr>
-        <w:spacing w:after="160" w:line="276" w:lineRule="auto"/>
-      </w:pPr>
-      <w:r>
-        <w:rPr>
-          <w:b w:val="0"/>
-        </w:rPr>
-        <w:t>Thanh trên slide đọc từ trên xuống. Ngân hàng X mời 200 khách hàng qua email, Zalo và tại quầy. Sau hai tuần thu về 165 phiếu, tỷ lệ phản hồi 82,5%, tính bằng số phiếu thu về chia số người được mời. Loại 15 phiếu gồm 5 phiếu trùng và 10 phiếu bỏ trống nhiều câu. Còn lại 150 phiếu hợp lệ, lưu trong file riêng, file thô giữ nguyên. Trong file Excel, sheet 2_DuLieuTho là 165 phiếu tải về từ Google Form, sheet 3_DuLieuSach là 150 phiếu sau khi làm sạch.</w:t>
-      </w:r>
-    </w:p>
-    <w:p>
-      <w:pPr>
-        <w:spacing w:after="160" w:line="276" w:lineRule="auto"/>
-      </w:pPr>
-      <w:r>
-        <w:rPr>
-          <w:b w:val="0"/>
-        </w:rPr>
-        <w:t>Trường Tiểu học Y dùng phiếu giấy: in 140 bản, thu về 131, loại 11 phiếu bỏ trống nhiều câu hoặc chọn cùng một mức cho mọi câu, còn 120 phiếu. Với phiếu giấy, sách thêm một lời khuyên: nhập liệu hai lần hoặc nhờ người khác kiểm tra ngẫu nhiên khoảng 10% số phiếu để phát hiện lỗi nhập.</w:t>
-      </w:r>
-    </w:p>
-    <w:p>
-      <w:pPr>
-        <w:spacing w:after="160" w:line="276" w:lineRule="auto"/>
-      </w:pPr>
-      <w:r>
-        <w:rPr>
-          <w:b w:val="0"/>
-        </w:rPr>
-        <w:t xml:space="preserve">Vì sao cần tỷ lệ phản hồi? Sách nói không có tỷ lệ phản hồi thì không đánh giá được sai lệch do người không trả lời. Câu chưa đạt kiểu "Tôi gửi link cho mọi người. Mọi người trả lời. Tôi thu được dữ liệu" không cho người đọc kiểm tra gì cả. </w:t>
-      </w:r>
-      <w:r>
-        <w:rPr>
-          <w:b/>
-        </w:rPr>
-        <w:t>Luôn giữ hai file: file thô và file sạch; ghi nhật ký thu thập mỗi ngày.</w:t>
+        <w:t>Hướng dẫn Chuyên đề và Khóa luận tốt nghiệp, Chương 3, mục 3.4.1</w:t>
+      </w:r>
+    </w:p>
+    <w:p>
+      <w:pPr>
+        <w:spacing w:after="160" w:line="276" w:lineRule="auto"/>
+      </w:pPr>
+      <w:r>
+        <w:rPr>
+          <w:b w:val="0"/>
+        </w:rPr>
+        <w:t>Mục 3.4.1 ngắn nhưng hay bị viết sai. Dữ liệu sơ cấp là dữ liệu sinh viên tự thu thập cho đề tài, ví dụ phiếu khảo sát. Dữ liệu thứ cấp là dữ liệu có sẵn do người khác thu thập, ví dụ báo cáo thường niên của ngân hàng hay số liệu của cơ quan thống kê. Trong khóa luận khảo sát, hai loại dữ liệu làm hai việc khác nhau: sơ cấp để kiểm định giả thuyết, thứ cấp để mô tả bối cảnh.</w:t>
+      </w:r>
+    </w:p>
+    <w:p>
+      <w:pPr>
+        <w:spacing w:after="160" w:line="276" w:lineRule="auto"/>
+      </w:pPr>
+      <w:r>
+        <w:rPr>
+          <w:b w:val="0"/>
+        </w:rPr>
+        <w:t>Câu chưa đạt bên trái định nghĩa được hai loại nhưng không nói mỗi loại dùng để làm gì và "dữ liệu trên mạng" không phải một nguồn. Câu đạt bên phải nói rõ: dữ liệu sơ cấp từ bảng hỏi dùng để kiểm định H1 đến H4; dữ liệu thứ cấp từ báo cáo thường niên và số liệu thanh toán không dùng tiền mặt dùng cho bối cảnh ở Chương 1 và giải thích kết quả ở Chương 4.</w:t>
+      </w:r>
+    </w:p>
+    <w:p>
+      <w:pPr>
+        <w:spacing w:after="160" w:line="276" w:lineRule="auto"/>
+      </w:pPr>
+      <w:r>
+        <w:rPr>
+          <w:b w:val="0"/>
+        </w:rPr>
+        <w:t xml:space="preserve">Mục 1.4 của Chương 1 cũng yêu cầu tách hai loại thời gian: giai đoạn của dữ liệu thứ cấp và thời gian thu dữ liệu sơ cấp. Hai mục này phải khớp nhau. </w:t>
+      </w:r>
+      <w:r>
+        <w:rPr>
+          <w:b/>
+        </w:rPr>
+        <w:t>Mỗi con số thứ cấp trong khóa luận phải có nguồn và năm.</w:t>
       </w:r>
     </w:p>
     <w:p>
@@ -5118,7 +5284,7 @@
         <w:rPr>
           <w:i/>
         </w:rPr>
-        <w:t>Thử hình dung hai khóa luận cùng có 150 phiếu hợp lệ. Khóa luận thứ nhất ghi "thu được 150 phiếu". Khóa luận thứ hai ghi "mời 200, thu 165, tỷ lệ phản hồi 82,5%, loại 15 phiếu gồm 5 trùng và 10 bỏ trống, còn 150". Cùng một con số cuối nhưng chỉ khóa luận thứ hai cho người chấm thấy dữ liệu được kiểm soát.</w:t>
+        <w:t>Thử hình dung một bạn ghi "tỷ lệ người dân dùng ngân hàng số là 87%" với nguồn là "trên mạng". Hội đồng hỏi: của cơ quan nào, năm nào, khảo sát ai? Bạn ấy tìm lại không ra trang đã đọc. Một con số không kiểm chứng được sẽ kéo theo nghi ngờ với cả đoạn bối cảnh. Ghi nguồn ngay lúc chép số là thói quen rẻ nhất để tránh chuyện này.</w:t>
       </w:r>
     </w:p>
     <w:p>
@@ -5131,7 +5297,7 @@
           <w:b/>
           <w:color w:val="CC0000"/>
         </w:rPr>
-        <w:t>(Slide 55: Quy tắc loại phiếu phải đặt trước khi mở dữ liệu, để quyết định không phụ thuộc kết quả mong muốn)</w:t>
+        <w:t>(Slide 57: Dữ liệu sơ cấp do chính sinh viên thu để trả lời câu hỏi của mình; dữ liệu thứ cấp do người khác thu cho mục đích khác)</w:t>
       </w:r>
     </w:p>
     <w:p>
@@ -5154,57 +5320,46 @@
           <w:color w:val="595959"/>
           <w:sz w:val="22"/>
         </w:rPr>
-        <w:t>Hướng dẫn Chuyên đề và Khóa luận tốt nghiệp, Chương 3, mục 3.5.2 và 3.5.3, Hình 47 và 48; file 2.Chapter_2_and_Chapter_3_Practice.xlsx (dữ liệu giả định), sheet 3_DuLieuSach</w:t>
-      </w:r>
-    </w:p>
-    <w:p>
-      <w:pPr>
-        <w:spacing w:after="160" w:line="276" w:lineRule="auto"/>
-      </w:pPr>
-      <w:r>
-        <w:rPr>
-          <w:b w:val="0"/>
-        </w:rPr>
-        <w:t>Sách nói dữ liệu bẩn cho kết quả sai dù phân tích đúng kỹ thuật. Kiểm soát chất lượng gồm ba việc: kiểm tra trùng lặp, tức một người gửi phiếu hai lần; kiểm tra ô trống; kiểm tra giá trị bất thường, ví dụ số 6 trên thang 1 đến 5.</w:t>
-      </w:r>
-    </w:p>
-    <w:p>
-      <w:pPr>
-        <w:spacing w:after="160" w:line="276" w:lineRule="auto"/>
-      </w:pPr>
-      <w:r>
-        <w:rPr>
-          <w:b w:val="0"/>
-        </w:rPr>
-        <w:t>Trên Excel, sách hướng dẫn ba thao tác. Remove Duplicates phát hiện 5 phiếu trùng hoàn toàn, được gửi cách nhau 1 đến 3 phút. Go To Special rồi Blanks phát hiện các phiếu bỏ trống. Bộ lọc số kiểm tra giá trị ngoài thang. Với Ngân hàng X, quy tắc là phiếu bỏ trống từ 3 câu trở lên thì loại, loại được 10 phiếu. Phiếu chỉ thiếu 1 câu thì giữ lại và điền bằng trung bình của câu đó, làm tròn đến số nguyên; có đúng 2 ô được điền, thuộc câu HI3 và NT3. Các em mở sheet 3_DuLieuSach, di chuột vào các ô có ghi chú sẽ thấy hai ô này.</w:t>
-      </w:r>
-    </w:p>
-    <w:p>
-      <w:pPr>
-        <w:spacing w:after="160" w:line="276" w:lineRule="auto"/>
-      </w:pPr>
-      <w:r>
-        <w:rPr>
-          <w:b w:val="0"/>
-        </w:rPr>
-        <w:t>Điểm then chốt là ngưỡng loại phiếu phải đặt trước khi mở dữ liệu, ghi vào mục 3.5.3 và áp dụng như nhau cho mọi phiếu. Sách giải thích ý nghĩa: quyết định loại phiếu không phụ thuộc vào kết quả mà sinh viên mong muốn. Nếu không làm vậy, việc loại 15 phiếu có thể bị nghi là chọn dữ liệu cho kết quả đẹp hơn.</w:t>
-      </w:r>
-    </w:p>
-    <w:p>
-      <w:pPr>
-        <w:spacing w:after="160" w:line="276" w:lineRule="auto"/>
-      </w:pPr>
-      <w:r>
-        <w:rPr>
-          <w:b w:val="0"/>
-        </w:rPr>
-        <w:t xml:space="preserve">Câu chưa đạt trong sách là: "Những ô trống tôi tự điền cho đủ. Phiếu trùng tôi để nguyên vì cũng là ý kiến khách hàng." Sách gọi thẳng "tự điền" là bịa dữ liệu và vi phạm đạo đức nghiên cứu. </w:t>
-      </w:r>
-      <w:r>
-        <w:rPr>
-          <w:b/>
-        </w:rPr>
-        <w:t>"Tự điền cho đủ" là bịa dữ liệu; giữ phiếu trùng là tính một người hai lần; cả hai đều làm sai kết quả.</w:t>
+        <w:t>Hướng dẫn Chuyên đề và Khóa luận tốt nghiệp, mục 3.4.1 và Mục 3.4.1A (bổ sung), Bảng BS4; Hox và Boeije (2005); Johnston (2014); file 2b.Chapter_2_and_Chapter_3_Data_Collection_Practice.xlsx (dữ liệu giả định), sheet 3_SoCapThuCap</w:t>
+      </w:r>
+    </w:p>
+    <w:p>
+      <w:pPr>
+        <w:spacing w:after="160" w:line="276" w:lineRule="auto"/>
+      </w:pPr>
+      <w:r>
+        <w:rPr>
+          <w:b w:val="0"/>
+        </w:rPr>
+        <w:t>Slide trước về mục 3.4.1 nói vai trò: dữ liệu sơ cấp để kiểm định giả thuyết, dữ liệu thứ cấp để mô tả bối cảnh. Slide này đi sâu hơn: phân biệt hai loại bằng tiêu chí nào. Hox và Boeije năm 2005 phân biệt theo mục đích thu. Dữ liệu sơ cấp được thu cho chính vấn đề nghiên cứu. Dữ liệu thứ cấp ban đầu được thu cho một mục đích khác rồi được dùng lại. Cho nên một con số lấy trên mạng không phải dữ liệu thứ cấp chỉ vì nó ở trên mạng; nó là thứ cấp vì người khác thu nó cho việc khác.</w:t>
+      </w:r>
+    </w:p>
+    <w:p>
+      <w:pPr>
+        <w:spacing w:after="160" w:line="276" w:lineRule="auto"/>
+      </w:pPr>
+      <w:r>
+        <w:rPr>
+          <w:b w:val="0"/>
+        </w:rPr>
+        <w:t>Thầy đọc bảng theo hai đề tài. Ngân hàng X có dữ liệu sơ cấp là 165 phiếu Google Form, dữ liệu thứ cấp là báo cáo thường niên và niên giám thống kê. Trường Y có dữ liệu sơ cấp là 131 phiếu giấy và 10 buổi phỏng vấn phụ huynh, dữ liệu thứ cấp là kế hoạch năm học và báo cáo tổng kết khi Ban giám hiệu cho phép. Ưu điểm của sơ cấp là đo đúng biến cần đo; hạn chế là mất 2 đến 3 tuần và dễ sai lệch nếu thu sai cách. Ưu điểm của thứ cấp là có sẵn và nhanh; hạn chế là định nghĩa có thể khác khái niệm của đề tài.</w:t>
+      </w:r>
+    </w:p>
+    <w:p>
+      <w:pPr>
+        <w:spacing w:after="160" w:line="276" w:lineRule="auto"/>
+      </w:pPr>
+      <w:r>
+        <w:rPr>
+          <w:b w:val="0"/>
+        </w:rPr>
+        <w:t xml:space="preserve">Johnston năm 2014 nhắc thứ tự đúng: đặt câu hỏi trước, tìm dữ liệu sau, rồi đánh giá dữ liệu đó có dùng được không. Ý định dùng ngân hàng số không có trong báo cáo nào nên Ngân hàng X bắt buộc phải thu sơ cấp. </w:t>
+      </w:r>
+      <w:r>
+        <w:rPr>
+          <w:b/>
+        </w:rPr>
+        <w:t>Câu hỏi quyết định loại dữ liệu: thái độ và ý định thu sơ cấp; bối cảnh lấy thứ cấp từ nguồn gốc.</w:t>
       </w:r>
     </w:p>
     <w:p>
@@ -5223,7 +5378,7 @@
         <w:rPr>
           <w:i/>
         </w:rPr>
-        <w:t>Thử hình dung một trọng tài thổi phạt đền rồi mới đặt ra luật. Không ai tin kết quả trận đấu. Quy tắc loại phiếu đặt sau khi xem kết quả cũng vậy: dù loại đúng, người đọc vẫn có quyền nghi ngờ. Ghi quy tắc vào file nháp trước khi mở dữ liệu là cách các em tự bảo vệ mình.</w:t>
+        <w:t>Thử hình dung một bạn muốn đo "mức hài lòng của khách hàng" và tìm được báo cáo thường niên ghi "98% khách hàng hài lòng". Bạn ấy định dùng luôn con số này. Đọc kỹ thì đó là khảo sát do chính ngân hàng làm, chỉ hỏi khách hàng vừa giao dịch xong tại quầy, với một câu hỏi duy nhất. Con số đó dùng để kể bối cảnh thì được, dùng để kiểm định giả thuyết thì không.</w:t>
       </w:r>
     </w:p>
     <w:p>
@@ -5236,7 +5391,7 @@
           <w:b/>
           <w:color w:val="CC0000"/>
         </w:rPr>
-        <w:t>(Slide 56: Bảy chỉ số mô tả tính bằng hàm Excel có sẵn; Chương 3 chỉ nói sẽ tính gì, con số để dành cho Chương 4)</w:t>
+        <w:t>(Slide 58: Đi từ câu hỏi nghiên cứu xuống người cầm phiếu qua sáu bậc; nhảy thẳng đến "phát phiếu ở đâu" là bỏ qua năm quyết định)</w:t>
       </w:r>
     </w:p>
     <w:p>
@@ -5259,46 +5414,46 @@
           <w:color w:val="595959"/>
           <w:sz w:val="22"/>
         </w:rPr>
-        <w:t>Hướng dẫn Chuyên đề và Khóa luận tốt nghiệp, Chương 3, mục 3.6.1, Hình 49 đến 51, Bảng 17; file 2.Chapter_2_and_Chapter_3_Practice.xlsx (dữ liệu giả định), sheet 4_NhanKhauHoc và 5_ThongKeMoTa</w:t>
-      </w:r>
-    </w:p>
-    <w:p>
-      <w:pPr>
-        <w:spacing w:after="160" w:line="276" w:lineRule="auto"/>
-      </w:pPr>
-      <w:r>
-        <w:rPr>
-          <w:b w:val="0"/>
-        </w:rPr>
-        <w:t>Trước khi đi vào từng kỹ thuật, Hình 49 trình bày toàn bộ quy trình phân tích bằng Excel như một chuỗi bước. Bước đầu là thống kê mô tả. Bảng 17 liệt kê bảy chỉ số và hàm Excel tương ứng: COUNT để đếm số quan sát; AVERAGE cho trung bình; MEDIAN cho trung vị; MODE cho yếu vị; STDEV cho độ lệch chuẩn; MIN và MAX để kiểm tra giá trị ngoài thang; COUNTIF để đếm tần số cho thông tin chung như giới tính.</w:t>
-      </w:r>
-    </w:p>
-    <w:p>
-      <w:pPr>
-        <w:spacing w:after="160" w:line="276" w:lineRule="auto"/>
-      </w:pPr>
-      <w:r>
-        <w:rPr>
-          <w:b w:val="0"/>
-        </w:rPr>
-        <w:t>Sách giải thích ngắn gọn từng chỉ số. Trung vị là giá trị nằm giữa khi xếp dữ liệu từ nhỏ đến lớn, ít bị ảnh hưởng bởi giá trị cực đoan. Yếu vị là giá trị xuất hiện nhiều nhất. Độ lệch chuẩn cho biết các câu trả lời phân tán quanh trung bình nhiều hay ít. Ví dụ đạt trong sách viết cho Trường Y: điểm trung bình được diễn giải trên thang 1 đến 5, càng gần 5 càng tích cực và các biến được so sánh để tìm khía cạnh cao nhất, thấp nhất.</w:t>
-      </w:r>
-    </w:p>
-    <w:p>
-      <w:pPr>
-        <w:spacing w:after="160" w:line="276" w:lineRule="auto"/>
-      </w:pPr>
-      <w:r>
-        <w:rPr>
-          <w:b w:val="0"/>
-        </w:rPr>
-        <w:t xml:space="preserve">Ranh giới giữa hai chương ở bên phải là điều sách nhắc nhiều lần: Chương 3 chỉ mô tả kế hoạch, mọi con số kết quả thuộc Chương 4. Câu chưa đạt "Tôi tính trung bình. Trung bình càng cao càng tốt" bị trừ điểm vì chỉ có một chỉ số. </w:t>
-      </w:r>
-      <w:r>
-        <w:rPr>
-          <w:b/>
-        </w:rPr>
-        <w:t>Chỉ có trung bình thì không biết ý kiến tập trung hay phân tán; luôn đọc trung bình cùng độ lệch chuẩn.</w:t>
+        <w:t>Hướng dẫn Chuyên đề và Khóa luận tốt nghiệp, Mục 3.4.1A (bổ sung), Bảng BS5; Hulland, Baumgartner và Smith (2018); Trần Phước (n.d., tr. 43); file 2b.Chapter_2_and_Chapter_3_Data_Collection_Practice.xlsx (dữ liệu giả định), sheet 3_SoCapThuCap</w:t>
+      </w:r>
+    </w:p>
+    <w:p>
+      <w:pPr>
+        <w:spacing w:after="160" w:line="276" w:lineRule="auto"/>
+      </w:pPr>
+      <w:r>
+        <w:rPr>
+          <w:b w:val="0"/>
+        </w:rPr>
+        <w:t>Đây là slide thầy muốn các em chụp lại. Sinh viên thường bắt đầu từ câu "em phát phiếu ở đâu", tức bậc năm. Sách bổ sung chuỗi sáu bậc để các em đi từ trên xuống. Bậc một: câu hỏi cần con số hay câu chuyện? Ngân hàng X cần con số, là mức tác động của bốn yếu tố. Bậc hai: con số đó đo khái niệm nào? Là năm biến HI, SD, NT, XH, YD với 19 câu hỏi.</w:t>
+      </w:r>
+    </w:p>
+    <w:p>
+      <w:pPr>
+        <w:spacing w:after="160" w:line="276" w:lineRule="auto"/>
+      </w:pPr>
+      <w:r>
+        <w:rPr>
+          <w:b w:val="0"/>
+        </w:rPr>
+        <w:t>Bậc ba thầy tô đỏ: ai thật sự biết câu trả lời? Hulland, Baumgartner và Smith năm 2018 xem việc chọn đúng người trả lời là một trong hai nhóm vấn đề chính của nghiên cứu khảo sát. Hỏi ý định dùng ngân hàng số thì hỏi khách hàng đã đăng ký, không hỏi nhân viên ngân hàng. Bậc bốn: dữ liệu đã có sẵn chưa? Ý định không có trong báo cáo nào nên phải thu sơ cấp. Bậc năm: thu bằng Google Form, mời qua mã QR tại quầy, email và Zalo, sau khi xin phép Giám đốc phòng giao dịch.</w:t>
+      </w:r>
+    </w:p>
+    <w:p>
+      <w:pPr>
+        <w:spacing w:after="160" w:line="276" w:lineRule="auto"/>
+      </w:pPr>
+      <w:r>
+        <w:rPr>
+          <w:b w:val="0"/>
+        </w:rPr>
+        <w:t xml:space="preserve">Bậc sáu cũng tô đỏ vì sinh viên hay quên. Trần Phước dặn nêu rõ cách mời và cân nhắc phương án dự phòng nếu một cách tuyển chọn không thành công. Với Ngân hàng X, phương án dự phòng là thêm phòng giao dịch thứ hai hoặc kéo dài một tuần. </w:t>
+      </w:r>
+      <w:r>
+        <w:rPr>
+          <w:b/>
+        </w:rPr>
+        <w:t>Mỗi bậc là đầu vào của bậc sau: chọn sai người trả lời ở bậc 3 thì phát phiếu khéo đến đâu ở bậc 5 cũng thu về dữ liệu sai.</w:t>
       </w:r>
     </w:p>
     <w:p>
@@ -5317,7 +5472,7 @@
         <w:rPr>
           <w:i/>
         </w:rPr>
-        <w:t>Thử hình dung hai câu hỏi cùng có trung bình 3,0. Câu thứ nhất, mọi người đều chọn 3. Câu thứ hai, một nửa chọn 1 và một nửa chọn 5. Trung bình giống hệt nhau nhưng câu chuyện hoàn toàn khác: một bên là thờ ơ, một bên là chia rẽ. Độ lệch chuẩn là con số duy nhất phân biệt được hai trường hợp này.</w:t>
+        <w:t>Thử hình dung một bạn làm đề tài sự hài lòng của phụ huynh nhưng phát phiếu cho giáo viên vì "giáo viên dễ gặp hơn". Bạn ấy thu đủ 150 phiếu trong ba ngày, Alpha rất đẹp. Đến buổi bảo vệ, câu hỏi đầu tiên là: giáo viên thì hài lòng về dịch vụ hành chính dành cho phụ huynh thế nào? Sai ở bậc ba thì mọi con số phía sau đều trả lời một câu hỏi khác.</w:t>
       </w:r>
     </w:p>
     <w:p>
@@ -5330,7 +5485,7 @@
           <w:b/>
           <w:color w:val="CC0000"/>
         </w:rPr>
-        <w:t>(Slide 57: Cronbach Alpha kiểm tra các câu hỏi có "cùng lên cùng xuống" không, trước khi được gộp thành một biến)</w:t>
+        <w:t>(Slide 59: Lấy con số thứ cấp từ nguồn gốc thay vì qua bài báo kể lại và hỏi năm câu trước khi dùng)</w:t>
       </w:r>
     </w:p>
     <w:p>
@@ -5353,57 +5508,46 @@
           <w:color w:val="595959"/>
           <w:sz w:val="22"/>
         </w:rPr>
-        <w:t>Hướng dẫn Chuyên đề và Khóa luận tốt nghiệp, Chương 3, mục 3.6.2, Bảng 18, Hình 52 và 53; file 2.Chapter_2_and_Chapter_3_Practice.xlsx (dữ liệu giả định), sheet 6_Cronbach</w:t>
-      </w:r>
-    </w:p>
-    <w:p>
-      <w:pPr>
-        <w:spacing w:after="160" w:line="276" w:lineRule="auto"/>
-      </w:pPr>
-      <w:r>
-        <w:rPr>
-          <w:b w:val="0"/>
-        </w:rPr>
-        <w:t>Cronbach Alpha là chỗ nhiều em chạy được nhưng không giải thích được. Sách giải thích bằng cách đời thường. Bốn câu HI1 đến HI4 cùng hỏi về sự hữu ích. Một khách hàng thấy ngân hàng số rất hữu ích sẽ có xu hướng chọn mức cao ở cả bốn câu. Một khách hàng thấy ít hữu ích sẽ chọn mức thấp ở cả bốn câu. Khi phần lớn người trả lời đều như vậy, bốn câu được xem là nhất quán nội tại: chúng cùng đo một thứ. Alpha là con số tóm tắt mức nhất quán đó, từ 0 đến 1.</w:t>
-      </w:r>
-    </w:p>
-    <w:p>
-      <w:pPr>
-        <w:spacing w:after="160" w:line="276" w:lineRule="auto"/>
-      </w:pPr>
-      <w:r>
-        <w:rPr>
-          <w:b w:val="0"/>
-        </w:rPr>
-        <w:t>Vì sao phải kiểm định trước? Vì ở bước sau, bốn câu HI được gộp thành một biến đại diện bằng trung bình. Phép gộp này chỉ có nghĩa khi bốn câu cùng đo một khái niệm. Sách viết rõ chuỗi hậu quả: thang đo không nhất quán thì điểm trung bình không đại diện cho sự hữu ích; hệ số hồi quy của HI không còn cho biết tác động của sự hữu ích và mọi kết luận về H1 mất ý nghĩa.</w:t>
-      </w:r>
-    </w:p>
-    <w:p>
-      <w:pPr>
-        <w:spacing w:after="160" w:line="276" w:lineRule="auto"/>
-      </w:pPr>
-      <w:r>
-        <w:rPr>
-          <w:b w:val="0"/>
-        </w:rPr>
-        <w:t>Các em đọc ba chỉ số cùng nhau. Một là Alpha, chấp nhận từ 0,7, tối ưu từ 0,7 đến 0,9. Hai là tương quan biến tổng hiệu chỉnh, tức tương quan của một câu với tổng các câu còn lại; chữ "hiệu chỉnh" nghĩa là đã bỏ chính câu đó ra để nó không tự tương quan với chính mình; ngưỡng thường dùng là 0,3. Ba là Alpha nếu loại câu; nếu Alpha tăng rõ khi loại, câu đó có thể nên loại.</w:t>
-      </w:r>
-    </w:p>
-    <w:p>
-      <w:pPr>
-        <w:spacing w:after="160" w:line="276" w:lineRule="auto"/>
-      </w:pPr>
-      <w:r>
-        <w:rPr>
-          <w:b w:val="0"/>
-        </w:rPr>
-        <w:t xml:space="preserve">Nhưng sách dặn một điều rất quan trọng: trước khi loại, đọc lại nội dung câu. Nếu câu mang khía cạnh "tiết kiệm chi phí" của định nghĩa sự hữu ích, loại nó làm thang đo mất giá trị nội dung. Hai lỗi hay gặp là tính Alpha cho cả 19 câu cùng lúc thay vì từng thang đo và loại câu chỉ để Alpha đẹp hơn. </w:t>
-      </w:r>
-      <w:r>
-        <w:rPr>
-          <w:b/>
-        </w:rPr>
-        <w:t>Thang đo không nhất quán thì điểm trung bình không đại diện cho khái niệm và mọi kết luận về giả thuyết mất ý nghĩa.</w:t>
+        <w:t>Hướng dẫn Chuyên đề và Khóa luận tốt nghiệp, Mục 3.4.1A (bổ sung), Bảng BS6; Trần Phước (n.d., tr. 49); Johnston (2014); file 2b.Chapter_2_and_Chapter_3_Data_Collection_Practice.xlsx (dữ liệu giả định), sheet 3_SoCapThuCap</w:t>
+      </w:r>
+    </w:p>
+    <w:p>
+      <w:pPr>
+        <w:spacing w:after="160" w:line="276" w:lineRule="auto"/>
+      </w:pPr>
+      <w:r>
+        <w:rPr>
+          <w:b w:val="0"/>
+        </w:rPr>
+        <w:t>Mục 3.4.1 có lỗi thường gặp là ghi nguồn "trên mạng". Slide này là bảng tra để các em biết lấy từ đâu. Nguyên tắc chung: lấy con số từ nguồn gốc, không lấy qua một bài báo kể lại. Số liệu dân số, kinh tế, doanh nghiệp lấy từ niên giám thống kê của cơ quan thống kê quốc gia, trang nso.gov.vn, trước đây là gso.gov.vn. Số liệu ngành ngân hàng lấy từ trang của Ngân hàng Nhà nước hoặc hiệp hội ngành. Số liệu của một ngân hàng lấy từ báo cáo thường niên và báo cáo tài chính. Số liệu của một trường lấy từ kế hoạch năm học hay báo cáo tổng kết, khi được phép.</w:t>
+      </w:r>
+    </w:p>
+    <w:p>
+      <w:pPr>
+        <w:spacing w:after="160" w:line="276" w:lineRule="auto"/>
+      </w:pPr>
+      <w:r>
+        <w:rPr>
+          <w:b w:val="0"/>
+        </w:rPr>
+        <w:t>Dòng cuối lấy từ Bảng 2.3 của Trần Phước: tài liệu của tổ chức, tài liệu công khai và mạng xã hội như fanpage, Zalo OA cũng là nguồn dữ liệu. Khi dùng, các em chụp màn hình có ngày và ẩn tên người bình luận. Khung bên phải là năm câu hỏi trước khi dùng một con số: ai thu và có uy tín không; thu để làm gì; thu khi nào; định nghĩa có khớp khái niệm của đề tài không; dẫn nguồn đầy đủ được không.</w:t>
+      </w:r>
+    </w:p>
+    <w:p>
+      <w:pPr>
+        <w:spacing w:after="160" w:line="276" w:lineRule="auto"/>
+      </w:pPr>
+      <w:r>
+        <w:rPr>
+          <w:b w:val="0"/>
+        </w:rPr>
+        <w:t xml:space="preserve">Câu hỏi thứ tư hay bị bỏ qua nhất. Ví dụ "tỷ lệ người dùng ngân hàng số" có thể tính trên dân số trưởng thành hoặc trên số người có tài khoản; hai định nghĩa cho hai con số rất khác. </w:t>
+      </w:r>
+      <w:r>
+        <w:rPr>
+          <w:b/>
+        </w:rPr>
+        <w:t>Mỗi con số thứ cấp cần bốn thứ: tổ chức, năm, trang và định nghĩa; thiếu một thứ là chưa dùng được.</w:t>
       </w:r>
     </w:p>
     <w:p>
@@ -5422,7 +5566,7 @@
         <w:rPr>
           <w:i/>
         </w:rPr>
-        <w:t>Thử hình dung bốn giám khảo cùng chấm một bài hát. Nếu cả bốn đều cho điểm cao với ca sĩ hay và điểm thấp với ca sĩ dở, bốn người đang chấm cùng một thứ. Nếu một giám khảo cho điểm lung tung, có thể họ đang chấm trang phục chứ không phải giọng hát. Alpha đo mức "đồng thanh" của bốn câu hỏi giống như vậy.</w:t>
+        <w:t>Thử hình dung một bạn lấy con số tăng trưởng giao dịch không tiền mặt từ một bài báo điện tử. Hội đồng hỏi số này của ai, năm nào. Bạn ấy lần theo đường dẫn trong bài báo thì đến một thông cáo báo chí, rồi từ đó mới đến báo cáo gốc với con số khác một chút vì bài báo đã làm tròn. Mười phút lần theo nguồn gốc lúc viết rẻ hơn nhiều so với một câu hỏi không trả lời được lúc bảo vệ.</w:t>
       </w:r>
     </w:p>
     <w:p>
@@ -5435,7 +5579,7 @@
           <w:b/>
           <w:color w:val="CC0000"/>
         </w:rPr>
-        <w:t>(Slide 58: Alpha không phải càng cao càng tốt: dưới 0,6 là kém, trên 0,95 có thể là các câu hỏi lặp nhau)</w:t>
+        <w:t>(Slide 60: Mỗi câu hỏi chỉ đo một ý, viết dạng khẳng định, dùng chung một thang Likert năm mức)</w:t>
       </w:r>
     </w:p>
     <w:p>
@@ -5458,46 +5602,57 @@
           <w:color w:val="595959"/>
           <w:sz w:val="22"/>
         </w:rPr>
-        <w:t>Hướng dẫn Chuyên đề và Khóa luận tốt nghiệp, Chương 3, mục 3.6.2 và Bảng 18; Hair và cộng sự (2010); Creswell và Creswell (2018, tr. 215)</w:t>
-      </w:r>
-    </w:p>
-    <w:p>
-      <w:pPr>
-        <w:spacing w:after="160" w:line="276" w:lineRule="auto"/>
-      </w:pPr>
-      <w:r>
-        <w:rPr>
-          <w:b w:val="0"/>
-        </w:rPr>
-        <w:t>Slide trước các em đã thấy Alpha đo mức các câu hỏi trong một thang đo "cùng lên cùng xuống", tức cùng đo một khái niệm. Slide này là Bảng 18, cách đọc các mức của Alpha, một bảng thầy rất muốn các em thuộc. Có bốn mức. Dưới 0,6: thang đo kém nhất quán; xem lại từng câu, không dùng nếu không cải thiện được. Từ 0,6 đến dưới 0,7: có thể chấp nhận nhưng phải chỉ ra được một trong hai lý do, là khái niệm còn mới với người trả lời hoặc thang đo mới được xây dựng và ghi lý do đó vào bài. Từ 0,7 đến 0,9: tốt, là khoảng tối ưu. Trên 0,95: không phải tốt hơn.</w:t>
-      </w:r>
-    </w:p>
-    <w:p>
-      <w:pPr>
-        <w:spacing w:after="160" w:line="276" w:lineRule="auto"/>
-      </w:pPr>
-      <w:r>
-        <w:rPr>
-          <w:b w:val="0"/>
-        </w:rPr>
-        <w:t>Mức cuối là điều nhiều em ngạc nhiên. Vì sao Alpha rất cao lại đáng ngờ? Vì có thể các câu hỏi gần như lặp lại cùng một nội dung bằng hai cách nói. Ví dụ "Ngân hàng số giúp tôi giao dịch nhanh" và "Ngân hàng số giúp tôi tiết kiệm thời gian giao dịch" gần như là một câu. Sách dặn đọc lại các câu và bỏ một câu nếu trùng ý. Sách cũng nói thẳng: các nguồn của sách không nêu ngưỡng chung cho mức này, đây là dấu hiệu để đọc lại câu hỏi.</w:t>
-      </w:r>
-    </w:p>
-    <w:p>
-      <w:pPr>
-        <w:spacing w:after="160" w:line="276" w:lineRule="auto"/>
-      </w:pPr>
-      <w:r>
-        <w:rPr>
-          <w:b w:val="0"/>
-        </w:rPr>
-        <w:t xml:space="preserve">Cột nguồn bên phải là thói quen học thuật các em cần có: mỗi ngưỡng có nguồn. Hair và cộng sự năm 2010 nói tối thiểu thường là 0,7 và có thể giảm còn 0,6 trong nghiên cứu khám phá. </w:t>
-      </w:r>
-      <w:r>
-        <w:rPr>
-          <w:b/>
-        </w:rPr>
-        <w:t>Khi α nằm gần ngưỡng: ghi rõ α, ngưỡng đã dùng và nguồn của ngưỡng.</w:t>
+        <w:t>Hướng dẫn Chuyên đề và Khóa luận tốt nghiệp, Chương 3, mục 3.4.2 và 3.4.3; file 2.Chapter_2_and_Chapter_3_Practice.xlsx (dữ liệu giả định), sheet 1_BangMa</w:t>
+      </w:r>
+    </w:p>
+    <w:p>
+      <w:pPr>
+        <w:spacing w:after="160" w:line="276" w:lineRule="auto"/>
+      </w:pPr>
+      <w:r>
+        <w:rPr>
+          <w:b w:val="0"/>
+        </w:rPr>
+        <w:t>Bảng hỏi là công cụ thu dữ liệu chính. Sách mô tả ba phần của bảng hỏi: phần mở đầu gồm giới thiệu, cam kết bảo mật và xin đồng ý; phần thông tin chung như giới tính, độ tuổi, thu nhập; phần nội dung chính gồm các câu hỏi đo từng biến. Ngân hàng X có 19 biến quan sát ở phần nội dung chính, Trường Y có 16. Trong file Excel, sheet 1_BangMa ghi tên biến, nội dung câu hỏi và quy ước mã số cho từng câu.</w:t>
+      </w:r>
+    </w:p>
+    <w:p>
+      <w:pPr>
+        <w:spacing w:after="160" w:line="276" w:lineRule="auto"/>
+      </w:pPr>
+      <w:r>
+        <w:rPr>
+          <w:b w:val="0"/>
+        </w:rPr>
+        <w:t>Hai câu bên trái là ví dụ chưa đạt. Câu thứ nhất hỏi bốn ý trong một câu: nhanh, rẻ, an toàn, dễ dùng. Người trả lời đồng ý ý này nhưng không đồng ý ý kia thì không biết chọn mức nào. Câu thứ hai dùng phủ định kép. Cụm "đúng không" còn gợi ý câu trả lời. Sách nói hậu quả: thang đo có thể có Alpha thấp và kết quả hồi quy không diễn giải được.</w:t>
+      </w:r>
+    </w:p>
+    <w:p>
+      <w:pPr>
+        <w:spacing w:after="160" w:line="276" w:lineRule="auto"/>
+      </w:pPr>
+      <w:r>
+        <w:rPr>
+          <w:b w:val="0"/>
+        </w:rPr>
+        <w:t>Bên phải là các câu đạt: mỗi câu một ý, dạng khẳng định để người trả lời chọn mức đồng ý, có mã gắn với biến và dùng ngôi "tôi" để người trả lời tự đánh giá. Tất cả dùng thang Likert 5 mức: 1 là hoàn toàn không đồng ý, 2 là không đồng ý, 3 là trung lập, 4 là đồng ý, 5 là hoàn toàn đồng ý. Mọi câu dùng cùng một chiều; nếu có câu đảo chiều thì đổi điểm bằng công thức bằng 6 trừ ô đó trước khi phân tích.</w:t>
+      </w:r>
+    </w:p>
+    <w:p>
+      <w:pPr>
+        <w:spacing w:after="160" w:line="276" w:lineRule="auto"/>
+      </w:pPr>
+      <w:r>
+        <w:rPr>
+          <w:b w:val="0"/>
+        </w:rPr>
+        <w:t xml:space="preserve">Sách khuyên mỗi khái niệm có từ 3 đến 5 câu và câu dưới 20 chữ nếu có thể. </w:t>
+      </w:r>
+      <w:r>
+        <w:rPr>
+          <w:b/>
+        </w:rPr>
+        <w:t>Kiểm tra từng câu bằng ba câu hỏi: đo một ý hay nhiều ý; có gợi ý câu trả lời không; có khớp với định nghĩa ở Chương 2 không.</w:t>
       </w:r>
     </w:p>
     <w:p>
@@ -5516,7 +5671,7 @@
         <w:rPr>
           <w:i/>
         </w:rPr>
-        <w:t>Thử hình dung một bạn có Alpha 0,97 và rất vui vì "gần như tuyệt đối". Đọc lại bảng hỏi, bạn ấy thấy bốn câu niềm tin thực ra là một câu viết bốn kiểu: "tôi tin", "tôi tin tưởng", "tôi thấy đáng tin", "tôi có niềm tin". Thang đo này đo rất ổn định một ý duy nhất nhưng không bao quát định nghĩa niềm tin gồm bảo mật, chính xác và giữ cam kết.</w:t>
+        <w:t>Thử hình dung câu "Ứng dụng nhanh và an toàn". Một khách hàng thấy ứng dụng rất nhanh nhưng lo mất tiền. Họ chọn 3, trung lập. Con số 3 đó không nói lên điều gì: không phải họ thấy bình thường, mà họ thấy một ý tốt và một ý xấu. Tách thành hai câu thì dữ liệu nói đúng điều khách hàng nghĩ.</w:t>
       </w:r>
     </w:p>
     <w:p>
@@ -5529,7 +5684,7 @@
           <w:b/>
           <w:color w:val="CC0000"/>
         </w:rPr>
-        <w:t>(Slide 59: EFA là mục tùy chọn; ba câu hỏi giúp các em tự quyết định có làm hay không)</w:t>
+        <w:t>(Slide 61: Người đọc cần thấy con số ở từng bước: bao nhiêu người được mời, trả lời, bị loại và còn hợp lệ)</w:t>
       </w:r>
     </w:p>
     <w:p>
@@ -5552,57 +5707,57 @@
           <w:color w:val="595959"/>
           <w:sz w:val="22"/>
         </w:rPr>
-        <w:t>Hướng dẫn Chuyên đề và Khóa luận tốt nghiệp, Chương 3, mục 3.6.3 (*); Hair và cộng sự (2010)</w:t>
-      </w:r>
-    </w:p>
-    <w:p>
-      <w:pPr>
-        <w:spacing w:after="160" w:line="276" w:lineRule="auto"/>
-      </w:pPr>
-      <w:r>
-        <w:rPr>
-          <w:b w:val="0"/>
-        </w:rPr>
-        <w:t>Phân tích nhân tố khám phá, EFA, là công cụ xem 19 câu hỏi tự nhóm lại thành mấy nhóm dựa trên cách người trả lời chọn đáp án. Người nghiên cứu không báo trước cho phần mềm câu nào thuộc nhóm nào. Nếu bốn câu HI tự nằm chung một nhóm, bốn câu SD tự nằm chung một nhóm khác, thì thang đo có cấu trúc đúng như mô hình dự kiến.</w:t>
-      </w:r>
-    </w:p>
-    <w:p>
-      <w:pPr>
-        <w:spacing w:after="160" w:line="276" w:lineRule="auto"/>
-      </w:pPr>
-      <w:r>
-        <w:rPr>
-          <w:b w:val="0"/>
-        </w:rPr>
-        <w:t>Ở cấp đại học, EFA là mục tùy chọn, đánh dấu sao trong sách. Ba câu hỏi đầu trên slide giúp các em tự quyết. Một: mẫu đề cương của khoa có mục EFA không; có thì làm. Hai: có thang đo nào tự xây, dịch mới hoặc sửa từ ngữ đáng kể không; có thì nên làm, vì chưa có bằng chứng các câu mới nhóm đúng khái niệm. Ba: cỡ mẫu có đạt ít nhất 5 lần số câu hỏi không; không đạt thì không làm, vì kết quả EFA không đáng tin.</w:t>
-      </w:r>
-    </w:p>
-    <w:p>
-      <w:pPr>
-        <w:spacing w:after="160" w:line="276" w:lineRule="auto"/>
-      </w:pPr>
-      <w:r>
-        <w:rPr>
-          <w:b w:val="0"/>
-        </w:rPr>
-        <w:t>Nếu làm, các em dùng phần mềm có chức năng này như SPSS, JASP hoặc R, vì Excel không có sẵn EFA. Bốn tiêu chí đọc kết quả theo Hair và cộng sự năm 2010: KMO từ 0,5 trở lên; kiểm định Bartlett có P-value dưới 0,05; nhân tố giữ lại có eigenvalue lớn hơn 1; hệ số tải của mỗi câu từ 0,5 trở lên. Sách giải thích thêm hai khái niệm: giá trị hội tụ là các câu cùng khái niệm tải mạnh lên một nhân tố; giá trị phân biệt là các câu khác khái niệm không tải chéo.</w:t>
-      </w:r>
-    </w:p>
-    <w:p>
-      <w:pPr>
-        <w:spacing w:after="160" w:line="276" w:lineRule="auto"/>
-      </w:pPr>
-      <w:r>
-        <w:rPr>
-          <w:b w:val="0"/>
-        </w:rPr>
-        <w:t xml:space="preserve">Nếu không làm, các em ghi một câu lý do, ví dụ mọi thang đo kế thừa nguyên văn từ nghiên cứu đã công bố, rồi bỏ mục hoặc ghi "Mục này không áp dụng". </w:t>
-      </w:r>
-      <w:r>
-        <w:rPr>
-          <w:b/>
-        </w:rPr>
-        <w:t>Ghi "làm EFA và CFA bằng Excel" là mô tả sai công cụ; CFA và SEM thuộc cấp sau đại học.</w:t>
+        <w:t>Hướng dẫn Chuyên đề và Khóa luận tốt nghiệp, Chương 3, mục 3.5.1, Hình 45 và 46; file 2.Chapter_2_and_Chapter_3_Practice.xlsx (dữ liệu giả định), sheet 2_DuLieuTho và 3_DuLieuSach</w:t>
+      </w:r>
+    </w:p>
+    <w:p>
+      <w:pPr>
+        <w:spacing w:after="160" w:line="276" w:lineRule="auto"/>
+      </w:pPr>
+      <w:r>
+        <w:rPr>
+          <w:b w:val="0"/>
+        </w:rPr>
+        <w:t>Thu thập dữ liệu gồm năm bước: chuẩn bị, phát hành, thu nhận, lọc, lưu trữ. Sách yêu cầu mỗi bước phải có con số. Creswell và Creswell gợi ý báo cáo số người trả lời và không trả lời bằng số lượng và tỷ lệ phần trăm.</w:t>
+      </w:r>
+    </w:p>
+    <w:p>
+      <w:pPr>
+        <w:spacing w:after="160" w:line="276" w:lineRule="auto"/>
+      </w:pPr>
+      <w:r>
+        <w:rPr>
+          <w:b w:val="0"/>
+        </w:rPr>
+        <w:t>Thanh trên slide đọc từ trên xuống. Ngân hàng X mời 200 khách hàng qua email, Zalo và tại quầy. Sau hai tuần thu về 165 phiếu, tỷ lệ phản hồi 82,5%, tính bằng số phiếu thu về chia số người được mời. Loại 15 phiếu gồm 5 phiếu trùng và 10 phiếu bỏ trống nhiều câu. Còn lại 150 phiếu hợp lệ, lưu trong file riêng, file thô giữ nguyên. Trong file Excel, sheet 2_DuLieuTho là 165 phiếu tải về từ Google Form, sheet 3_DuLieuSach là 150 phiếu sau khi làm sạch.</w:t>
+      </w:r>
+    </w:p>
+    <w:p>
+      <w:pPr>
+        <w:spacing w:after="160" w:line="276" w:lineRule="auto"/>
+      </w:pPr>
+      <w:r>
+        <w:rPr>
+          <w:b w:val="0"/>
+        </w:rPr>
+        <w:t>Trường Tiểu học Y dùng phiếu giấy: in 140 bản, thu về 131, loại 11 phiếu bỏ trống nhiều câu hoặc chọn cùng một mức cho mọi câu, còn 120 phiếu. Với phiếu giấy, sách thêm một lời khuyên: nhập liệu hai lần hoặc nhờ người khác kiểm tra ngẫu nhiên khoảng 10% số phiếu để phát hiện lỗi nhập.</w:t>
+      </w:r>
+    </w:p>
+    <w:p>
+      <w:pPr>
+        <w:spacing w:after="160" w:line="276" w:lineRule="auto"/>
+      </w:pPr>
+      <w:r>
+        <w:rPr>
+          <w:b w:val="0"/>
+        </w:rPr>
+        <w:t xml:space="preserve">Vì sao cần tỷ lệ phản hồi? Sách nói không có tỷ lệ phản hồi thì không đánh giá được sai lệch do người không trả lời. Câu chưa đạt kiểu "Tôi gửi link cho mọi người. Mọi người trả lời. Tôi thu được dữ liệu" không cho người đọc kiểm tra gì cả. </w:t>
+      </w:r>
+      <w:r>
+        <w:rPr>
+          <w:b/>
+        </w:rPr>
+        <w:t>Luôn giữ hai file: file thô và file sạch; ghi nhật ký thu thập mỗi ngày.</w:t>
       </w:r>
     </w:p>
     <w:p>
@@ -5621,7 +5776,7 @@
         <w:rPr>
           <w:i/>
         </w:rPr>
-        <w:t>Thử hình dung một bạn làm EFA vì "thấy khóa luận khác có", với cỡ mẫu 70 cho 19 câu hỏi. Kết quả trích ra bảy nhân tố lộn xộn, bạn ấy không giải thích được. Câu hỏi thứ ba của sách, cỡ mẫu có đạt 5 lần số câu hỏi không, đã trả lời trước: không đạt thì không làm, vì kết quả không đáng tin.</w:t>
+        <w:t>Thử hình dung hai khóa luận cùng có 150 phiếu hợp lệ. Khóa luận thứ nhất ghi "thu được 150 phiếu". Khóa luận thứ hai ghi "mời 200, thu 165, tỷ lệ phản hồi 82,5%, loại 15 phiếu gồm 5 trùng và 10 bỏ trống, còn 150". Cùng một con số cuối nhưng chỉ khóa luận thứ hai cho người chấm thấy dữ liệu được kiểm soát.</w:t>
       </w:r>
     </w:p>
     <w:p>
@@ -5634,7 +5789,7 @@
           <w:b/>
           <w:color w:val="CC0000"/>
         </w:rPr>
-        <w:t>(Slide 60: Hồi quy đa biến kiểm định mỗi giả thuyết qua dấu và P-value của đúng một hệ số)</w:t>
+        <w:t>(Slide 62: Đi khảo sát là mười việc theo thứ tự thời gian; ba việc đầu phải xong trước tuần phát phiếu)</w:t>
       </w:r>
     </w:p>
     <w:p>
@@ -5657,57 +5812,46 @@
           <w:color w:val="595959"/>
           <w:sz w:val="22"/>
         </w:rPr>
-        <w:t>Hướng dẫn Chuyên đề và Khóa luận tốt nghiệp, Chương 3, mục 3.6.4, Hình 54 đến 56, Bảng 19 và 20; file 2.Chapter_2_and_Chapter_3_Practice.xlsx (dữ liệu giả định), sheet 7_BienDaiDien đến 9_HoiQuy</w:t>
-      </w:r>
-    </w:p>
-    <w:p>
-      <w:pPr>
-        <w:spacing w:after="160" w:line="276" w:lineRule="auto"/>
-      </w:pPr>
-      <w:r>
-        <w:rPr>
-          <w:b w:val="0"/>
-        </w:rPr>
-        <w:t>Hồi quy cho biết mỗi biến độc lập tác động đến biến phụ thuộc theo chiều nào, mạnh đến mức nào và có ý nghĩa thống kê không. Mô hình Ngân hàng X có bốn biến độc lập nên dùng hồi quy đa biến với phương trình YD bằng β0 cộng β1 nhân HI cộng β2 nhân SD cộng β3 nhân NT cộng β4 nhân XH cộng sai số. Mỗi giả thuyết ứng với một hệ số: H1 được ủng hộ khi β1 dương và P-value nhỏ hơn 0,05.</w:t>
-      </w:r>
-    </w:p>
-    <w:p>
-      <w:pPr>
-        <w:spacing w:after="160" w:line="276" w:lineRule="auto"/>
-      </w:pPr>
-      <w:r>
-        <w:rPr>
-          <w:b w:val="0"/>
-        </w:rPr>
-        <w:t>Trước hồi quy, các em tạo biến đại diện. Sách giải thích vì sao cần: hồi quy cần đúng một con số cho mỗi khái niệm của mỗi người. Một người trả lời HI1 bằng 4, HI2 bằng 5, HI3 bằng 4, HI4 bằng 5 thì điểm sự hữu ích là 4,5. Trên Excel gõ bằng AVERAGE của F2 đến I2 rồi kéo xuống 150 dòng. Dùng trung bình thay cho tổng vì trung bình giữ nguyên thang 1 đến 5: 4,5 nghĩa là giữa "đồng ý" và "hoàn toàn đồng ý". Tổng bốn câu nằm trên thang 4 đến 20, tổng ba câu YD nằm trên thang 3 đến 15, hai thang khác nhau nên khó so sánh.</w:t>
-      </w:r>
-    </w:p>
-    <w:p>
-      <w:pPr>
-        <w:spacing w:after="160" w:line="276" w:lineRule="auto"/>
-      </w:pPr>
-      <w:r>
-        <w:rPr>
-          <w:b w:val="0"/>
-        </w:rPr>
-        <w:t>Hai khái niệm cần hiểu đúng. R bình phương là tỷ lệ biến động của Y được các biến X giải thích; R bình phương luôn tăng khi thêm biến, kể cả biến không liên quan, nên khi so hai mô hình khác số biến thì dùng R bình phương hiệu chỉnh. P-value không phải xác suất giả thuyết đúng. Sách định nghĩa: P-value là xác suất quan sát được kết quả như trong mẫu, hoặc lớn hơn, nếu thực tế không có quan hệ. P-value cũng không cho biết tác động mạnh hay yếu; độ mạnh đọc từ hệ số.</w:t>
-      </w:r>
-    </w:p>
-    <w:p>
-      <w:pPr>
-        <w:spacing w:after="160" w:line="276" w:lineRule="auto"/>
-      </w:pPr>
-      <w:r>
-        <w:rPr>
-          <w:b w:val="0"/>
-        </w:rPr>
-        <w:t xml:space="preserve">Cách chạy: bật Analysis ToolPak một lần; vào Data, Data Analysis, Regression; chọn vùng Y là cột biến phụ thuộc; vùng X là các cột biến độc lập đứng liền nhau; đánh dấu Labels và các ô phần dư. Các giả định được kiểm tra qua phần dư và VIF; sách dùng ngưỡng VIF 10 theo Hair và cộng sự. </w:t>
-      </w:r>
-      <w:r>
-        <w:rPr>
-          <w:b/>
-        </w:rPr>
-        <w:t>Chạy: Data &gt; Data Analysis &gt; Regression; vùng X là các cột biến độc lập đứng liền nhau; đánh dấu Labels và các ô phần dư.</w:t>
+        <w:t>Hướng dẫn Chuyên đề và Khóa luận tốt nghiệp, Mục 3.5.1A (bổ sung), Bảng BS7; Dillman, Smyth và Christian (2014); Edwards và cộng sự (2009); file 2b.Chapter_2_and_Chapter_3_Data_Collection_Practice.xlsx (dữ liệu giả định), sheet 4 đến 7</w:t>
+      </w:r>
+    </w:p>
+    <w:p>
+      <w:pPr>
+        <w:spacing w:after="160" w:line="276" w:lineRule="auto"/>
+      </w:pPr>
+      <w:r>
+        <w:rPr>
+          <w:b w:val="0"/>
+        </w:rPr>
+        <w:t>Slide năm bước thu thập ở trên, từ chuẩn bị, phát hành, thu nhận, lọc đến lưu trữ, cho các em biết viết mục 3.5.1 thế nào. Slide này trả lời câu hỏi mà sách cũ chưa trả lời: ra hiện trường thì làm gì. Có mười việc theo thứ tự thời gian. Ba việc đầu tô đỏ vì phải xong trước tuần phát phiếu: tính số cần mời; xin giấy giới thiệu của Khoa; gặp người có quyền cho phép, với Ngân hàng X là Giám đốc phòng giao dịch, để thống nhất địa điểm, khung giờ và những việc không được làm.</w:t>
+      </w:r>
+    </w:p>
+    <w:p>
+      <w:pPr>
+        <w:spacing w:after="160" w:line="276" w:lineRule="auto"/>
+      </w:pPr>
+      <w:r>
+        <w:rPr>
+          <w:b w:val="0"/>
+        </w:rPr>
+        <w:t>Việc bốn là chuẩn bị bộ công cụ: phiếu đã đọc thử với 5 người và khảo sát thử 30 người, kịch bản mời, mã QR, 30 phiếu giấy dự phòng. Việc năm là cài đặt Google Form: câu đồng ý tham gia ở đầu, câu sàng lọc, bắt buộc trả lời các câu Likert và một câu kiểm tra sự chú ý. Việc sáu và bảy là mời tại hiện trường và mời trực tuyến. Việc tám là nhắc lại hai lần. Việc chín là ghi nhật ký mỗi ngày. Việc mười là đóng khảo sát, giữ nguyên file thô và cảm ơn đơn vị.</w:t>
+      </w:r>
+    </w:p>
+    <w:p>
+      <w:pPr>
+        <w:spacing w:after="160" w:line="276" w:lineRule="auto"/>
+      </w:pPr>
+      <w:r>
+        <w:rPr>
+          <w:b w:val="0"/>
+        </w:rPr>
+        <w:t xml:space="preserve">Vì sao cần cả chuỗi này? Dillman và cộng sự năm 2014 dựa trên lý thuyết trao đổi xã hội: một người đồng ý trả lời khi thấy lợi ích lớn hơn chi phí và tin người mời. Tổng quan Cochrane của Edwards và cộng sự năm 2009 ghi nhận liên hệ trước, cá nhân hóa thư mời và giữ phiếu ngắn giúp tăng tỷ lệ phản hồi. </w:t>
+      </w:r>
+      <w:r>
+        <w:rPr>
+          <w:b/>
+        </w:rPr>
+        <w:t>Khảo sát là một chuỗi tiếp xúc có kế hoạch, không phải một lần gửi đường liên kết.</w:t>
       </w:r>
     </w:p>
     <w:p>
@@ -5726,7 +5870,7 @@
         <w:rPr>
           <w:i/>
         </w:rPr>
-        <w:t>Thử hình dung một bạn chọn vùng X gồm các cột HI, SD, rồi một cột trống, rồi NT, XH. ToolPak báo lỗi hoặc cho kết quả sai tên biến. Sách dặn các cột biến độc lập phải đứng liền nhau vì đúng lý do rất đời thường này. Chạy thử trên file thực hành trước khi chạy trên dữ liệu thật là cách phát hiện lỗi thao tác sớm nhất.</w:t>
+        <w:t>Thử hình dung một bạn đến phòng giao dịch lúc 9 giờ sáng thứ Hai, cầm 200 phiếu và bắt đầu mời khách. Mười phút sau, bảo vệ mời bạn ấy ra ngoài vì ngân hàng chưa được báo trước. Hôm sau bạn ấy quay lại với giấy giới thiệu, được hẹn gặp Giám đốc vào tuần sau. Một tuần mất đi chỉ vì làm việc số 6 trước việc số 3.</w:t>
       </w:r>
     </w:p>
     <w:p>
@@ -5739,7 +5883,7 @@
           <w:b/>
           <w:color w:val="CC0000"/>
         </w:rPr>
-        <w:t>(Slide 61: Hệ số và P-value chỉ đáng tin khi dữ liệu thỏa bốn giả định và cả bốn đều kiểm tra được ngay trên Excel)</w:t>
+        <w:t>(Slide 63: Cùng mục tiêu 150 phiếu hợp lệ, số người phải mời đi từ 200 đến 589 tùy cách tiếp cận)</w:t>
       </w:r>
     </w:p>
     <w:p>
@@ -5762,46 +5906,46 @@
           <w:color w:val="595959"/>
           <w:sz w:val="22"/>
         </w:rPr>
-        <w:t>Hướng dẫn Chuyên đề và Khóa luận tốt nghiệp, Chương 3, mục 3.6.4 và Bảng 20; Hair và cộng sự (2010)</w:t>
-      </w:r>
-    </w:p>
-    <w:p>
-      <w:pPr>
-        <w:spacing w:after="160" w:line="276" w:lineRule="auto"/>
-      </w:pPr>
-      <w:r>
-        <w:rPr>
-          <w:b w:val="0"/>
-        </w:rPr>
-        <w:t>Phần dư là khoảng chênh giữa giá trị Y thật của một người và giá trị Y mà mô hình dự đoán cho người đó. Sách nói phần lớn các giả định của hồi quy được kiểm tra qua phần dư và Bảng 20 liệt kê bốn giả định kèm cách kiểm tra trên Excel.</w:t>
-      </w:r>
-    </w:p>
-    <w:p>
-      <w:pPr>
-        <w:spacing w:after="160" w:line="276" w:lineRule="auto"/>
-      </w:pPr>
-      <w:r>
-        <w:rPr>
-          <w:b w:val="0"/>
-        </w:rPr>
-        <w:t>Thầy đọc từng dòng. Tuyến tính: quan hệ giữa X và Y có dạng đường thẳng; kiểm tra bằng Residual Plots, các điểm phân tán đều quanh đường 0, không tạo hình cong. Phương sai sai số không đổi: mức phân tán của phần dư giống nhau ở mọi mức; nếu phần dư loe rộng dần thành hình phễu thì P-value có thể sai. Phần dư phân phối chuẩn: biểu đồ tần số có dạng hình chuông, vì kiểm định t và F dựa trên giả định này. Không đa cộng tuyến: các biến độc lập không quá giống nhau, nếu không hồi quy không tách được tác động riêng của từng biến.</w:t>
-      </w:r>
-    </w:p>
-    <w:p>
-      <w:pPr>
-        <w:spacing w:after="160" w:line="276" w:lineRule="auto"/>
-      </w:pPr>
-      <w:r>
-        <w:rPr>
-          <w:b w:val="0"/>
-        </w:rPr>
-        <w:t xml:space="preserve">VIF được tính bằng 1 chia cho 1 trừ R bình phương của hồi quy phụ: chạy Regression với một biến độc lập làm Y và các biến độc lập còn lại làm X. Sách dùng ngưỡng 10 theo Hair và cộng sự. Với file thực hành, tương quan giữa các biến độc lập chỉ 0,25 đến 0,35 và VIF từ 1,19 đến 1,24. </w:t>
-      </w:r>
-      <w:r>
-        <w:rPr>
-          <w:b/>
-        </w:rPr>
-        <w:t>VIF trên 10 là đa cộng tuyến nghiêm trọng; VIF từ 5 đến 10 là dấu hiệu để đọc lại hai biến có tương quan cao nhất.</w:t>
+        <w:t>Hướng dẫn Chuyên đề và Khóa luận tốt nghiệp, Bảng 12, Mục 3.5.1A (bổ sung) và Bảng BS8; Baruch và Holtom (2008); file 2b.Chapter_2_and_Chapter_3_Data_Collection_Practice.xlsx (dữ liệu giả định), sheet 4_KeHoachMau</w:t>
+      </w:r>
+    </w:p>
+    <w:p>
+      <w:pPr>
+        <w:spacing w:after="160" w:line="276" w:lineRule="auto"/>
+      </w:pPr>
+      <w:r>
+        <w:rPr>
+          <w:b w:val="0"/>
+        </w:rPr>
+        <w:t>Bảng 12 của sách tính cỡ mẫu tối thiểu là 95, lấy số lớn hơn giữa 5 lần 19 câu hỏi và 50 cộng 8 lần 4 biến độc lập, rồi chọn mục tiêu 150 phiếu hợp lệ. Câu hỏi tiếp theo là phải mời bao nhiêu người. Công thức rất đơn giản: lấy 150 chia cho tỷ lệ phản hồi dự kiến nhân tỷ lệ phiếu hợp lệ dự kiến. Nếu dự kiến 80% người được mời trả lời và 94% phiếu hợp lệ thì cần mời khoảng 200 người. Ngân hàng X đã mời đúng 200.</w:t>
+      </w:r>
+    </w:p>
+    <w:p>
+      <w:pPr>
+        <w:spacing w:after="160" w:line="276" w:lineRule="auto"/>
+      </w:pPr>
+      <w:r>
+        <w:rPr>
+          <w:b w:val="0"/>
+        </w:rPr>
+        <w:t>Ba con số trên slide là ba tình huống. Con số 200 là thực tế của Ngân hàng X vì phần lớn khách được mời trực tiếp tại quầy. Con số 317 là khi chỉ gửi trực tuyến với tỷ lệ phản hồi 52,7%. Đây không phải con số thầy đặt ra: Baruch và Holtom năm 2008 phân tích 490 nghiên cứu khảo sát trên 17 tạp chí và ghi nhận tỷ lệ phản hồi trung bình 52,7% khi người trả lời là cá nhân. Con số 589 thầy tô đỏ là tình huống giả định: đăng một lần lên mạng xã hội rồi chờ, phản hồi 30%.</w:t>
+      </w:r>
+    </w:p>
+    <w:p>
+      <w:pPr>
+        <w:spacing w:after="160" w:line="276" w:lineRule="auto"/>
+      </w:pPr>
+      <w:r>
+        <w:rPr>
+          <w:b w:val="0"/>
+        </w:rPr>
+        <w:t xml:space="preserve">Sheet 4_KeHoachMau cho các em đổi tỷ lệ ở ô nền vàng và xem số cần mời thay đổi ngay. </w:t>
+      </w:r>
+      <w:r>
+        <w:rPr>
+          <w:b/>
+        </w:rPr>
+        <w:t>Số cần mời = số phiếu hợp lệ mục tiêu chia cho (tỷ lệ phản hồi nhân tỷ lệ hợp lệ); tính trước khi phát phiếu, không tính sau khi thấy thiếu.</w:t>
       </w:r>
     </w:p>
     <w:p>
@@ -5820,7 +5964,7 @@
         <w:rPr>
           <w:i/>
         </w:rPr>
-        <w:t>Thử hình dung một mô hình có cả "sự hữu ích" và "kỳ vọng hiệu quả" làm hai biến riêng. Hai khái niệm này, như các em thấy ở slide khái niệm, có nội dung gần tương tự. Tương quan giữa chúng lên 0,85, VIF vọt lên và cả hai hệ số đều mất ý nghĩa dù từng biến riêng lẻ tương quan rất mạnh với ý định. Đa cộng tuyến thường không phải lỗi dữ liệu mà là lỗi định nghĩa khái niệm ở Chương 2.</w:t>
+        <w:t>Thử hình dung một bạn gửi đường liên kết vào ba nhóm Zalo lớp, mỗi nhóm khoảng 60 người và yên tâm "180 người là đủ". Sau một tuần, bạn ấy nhận 41 phiếu. Bạn ấy đã nhầm số người nhìn thấy đường liên kết với số người sẽ trả lời. Tính trước bằng công thức thì bạn ấy biết ngay cần ít nhất gấp ba số người đó hoặc phải đổi cách mời.</w:t>
       </w:r>
     </w:p>
     <w:p>
@@ -5833,7 +5977,7 @@
           <w:b/>
           <w:color w:val="CC0000"/>
         </w:rPr>
-        <w:t>(Slide 62: Đo ổn định chưa đủ, phải đo đúng và người tham gia phải được thông tin, tự nguyện, bảo vệ)</w:t>
+        <w:t>(Slide 64: Lời mời tốt có năm ý: giới thiệu, câu sàng lọc, thời gian, cam kết bảo mật và quyền từ chối, lời xin giúp đỡ)</w:t>
       </w:r>
     </w:p>
     <w:p>
@@ -5856,57 +6000,46 @@
           <w:color w:val="595959"/>
           <w:sz w:val="22"/>
         </w:rPr>
-        <w:t>Hướng dẫn Chuyên đề và Khóa luận tốt nghiệp, Chương 3, mục 3.7 và 3.8; Creswell và Creswell (2018, tr. 146 đến 153, 215 đến 216)</w:t>
-      </w:r>
-    </w:p>
-    <w:p>
-      <w:pPr>
-        <w:spacing w:after="160" w:line="276" w:lineRule="auto"/>
-      </w:pPr>
-      <w:r>
-        <w:rPr>
-          <w:b w:val="0"/>
-        </w:rPr>
-        <w:t>Hai mục cuối của Chương 3 cho người đọc biết kết quả đáng tin đến mức nào và người tham gia được bảo vệ ra sao. Sách phân biệt: độ tin cậy trả lời câu hỏi "đo có ổn định không"; giá trị trả lời câu hỏi "đo có đúng cái cần đo không".</w:t>
-      </w:r>
-    </w:p>
-    <w:p>
-      <w:pPr>
-        <w:spacing w:after="160" w:line="276" w:lineRule="auto"/>
-      </w:pPr>
-      <w:r>
-        <w:rPr>
-          <w:b w:val="0"/>
-        </w:rPr>
-        <w:t>Ví dụ trong sách rất dễ nhớ: một cái cân luôn chỉ 2 kg cho mọi vật, dù vật nặng 1 kg hay 10 kg. Cân này rất nhất quán vì lần nào cũng chỉ cùng một số nhưng không đo đúng khối lượng. Ngược lại, muốn đo đúng thì trước hết phải đo ổn định. Vì vậy Cronbach Alpha đạt yêu cầu là điều kiện cần, chưa phải điều kiện đủ. Ba dạng giá trị theo Creswell và Creswell là giá trị nội dung, giá trị dự báo hoặc đồng thời và giá trị cấu trúc. Sách cũng dặn không bao giờ viết "kết quả hoàn toàn chính xác".</w:t>
-      </w:r>
-    </w:p>
-    <w:p>
-      <w:pPr>
-        <w:spacing w:after="160" w:line="276" w:lineRule="auto"/>
-      </w:pPr>
-      <w:r>
-        <w:rPr>
-          <w:b w:val="0"/>
-        </w:rPr>
-        <w:t>Về đạo đức, sách liệt kê sáu nguyên tắc: tự nguyện, đồng ý, bảo mật, ẩn danh, không gây hại, trung thực. Lời mời ở đầu bảng hỏi phải nói người thực hiện là ai, trường nào, mục đích gì, mất khoảng 5 phút và có quyền dừng bất cứ lúc nào. Người tham gia bấm "Tôi đồng ý tham gia" trước khi trả lời. Với Google Form ẩn danh, phiếu đã gửi không tìm lại được để xóa, nên lời mời phải nói rõ có thể dừng trước khi bấm gửi.</w:t>
-      </w:r>
-    </w:p>
-    <w:p>
-      <w:pPr>
-        <w:spacing w:after="160" w:line="276" w:lineRule="auto"/>
-      </w:pPr>
-      <w:r>
-        <w:rPr>
-          <w:b w:val="0"/>
-        </w:rPr>
-        <w:t xml:space="preserve">Với Trường Tiểu học Y, người trả lời là phụ huynh; sinh viên xin phép Ban giám hiệu trước khi phát phiếu và không khảo sát học sinh, vì các em là trẻ vị thành niên. </w:t>
-      </w:r>
-      <w:r>
-        <w:rPr>
-          <w:b/>
-        </w:rPr>
-        <w:t>Mọi kết quả, kể cả giả thuyết không được ủng hộ, đều phải được báo cáo đầy đủ.</w:t>
+        <w:t>Hướng dẫn Chuyên đề và Khóa luận tốt nghiệp, mục 3.8 và Mục 3.5.1A (bổ sung); Dillman, Smyth và Christian (2014)</w:t>
+      </w:r>
+    </w:p>
+    <w:p>
+      <w:pPr>
+        <w:spacing w:after="160" w:line="276" w:lineRule="auto"/>
+      </w:pPr>
+      <w:r>
+        <w:rPr>
+          <w:b w:val="0"/>
+        </w:rPr>
+        <w:t>Lời mời quyết định người được mời có dừng lại hay không. Bên trái là câu các em hay nói: "Anh chị làm giúp em cái phiếu này với, em đang cần gấp để nộp bài." Câu này có ba lỗi. Về logic: không có câu sàng lọc nên người chưa dùng ngân hàng số cũng trả lời. Về bằng chứng: người được mời không biết các em là ai, khảo sát gì, mất bao lâu. Về đạo đức: chữ "cần gấp" tạo áp lực, trái với nguyên tắc tự nguyện ở mục 3.8.</w:t>
+      </w:r>
+    </w:p>
+    <w:p>
+      <w:pPr>
+        <w:spacing w:after="160" w:line="276" w:lineRule="auto"/>
+      </w:pPr>
+      <w:r>
+        <w:rPr>
+          <w:b w:val="0"/>
+        </w:rPr>
+        <w:t>Bên phải có đủ năm ý. Một, chào và giới thiệu tên, ngành, trường. Hai, câu sàng lọc: "Anh/chị đã đăng ký ứng dụng ngân hàng số của Ngân hàng X chưa ạ?" Ba, thời gian: 19 câu đánh giá và 4 câu thông tin chung, khoảng 5 phút. Bốn, cam kết bảo mật và quyền từ chối: không hỏi họ tên hay số tài khoản, có thể dừng bất cứ lúc nào. Năm, lời xin giúp đỡ. Theo lý thuyết trao đổi xã hội mà Dillman dùng, ý ba làm giảm chi phí, ý một và ý bốn làm tăng lòng tin.</w:t>
+      </w:r>
+    </w:p>
+    <w:p>
+      <w:pPr>
+        <w:spacing w:after="160" w:line="276" w:lineRule="auto"/>
+      </w:pPr>
+      <w:r>
+        <w:rPr>
+          <w:b w:val="0"/>
+        </w:rPr>
+        <w:t xml:space="preserve">Các em dùng đúng một kịch bản cho mọi người được mời, kể cả khi mời qua Zalo. Mời mỗi người một kiểu thì câu trả lời có thể khác nhau chỉ vì cách mời. </w:t>
+      </w:r>
+      <w:r>
+        <w:rPr>
+          <w:b/>
+        </w:rPr>
+        <w:t>Câu sàng lọc phải đứng trước lời mời: hỏi đúng người quan trọng hơn hỏi nhiều người.</w:t>
       </w:r>
     </w:p>
     <w:p>
@@ -5925,7 +6058,7 @@
         <w:rPr>
           <w:i/>
         </w:rPr>
-        <w:t>Thử hình dung bảng hỏi phát cho phụ huynh có dòng "Họ tên" và "Số điện thoại" ở đầu. Phụ huynh e ngại, trả lời toàn mức 4 và 5 để "khỏi phiền". Dữ liệu vừa vi phạm cam kết ẩn danh vừa mất trung thực. Bỏ hai dòng đó đi là cách bảo vệ cả người tham gia lẫn chất lượng dữ liệu.</w:t>
+        <w:t>Thử hình dung hai bạn cùng đứng ở một phòng giao dịch trong hai giờ. Bạn thứ nhất mời ai đi ngang qua cũng mời và thu 25 phiếu, trong đó 7 người chưa từng dùng ứng dụng. Bạn thứ hai hỏi câu sàng lọc trước, thu 19 phiếu, đều đúng đối tượng. Đến lúc làm sạch, bạn thứ nhất còn 18 phiếu dùng được và phải giải thích vì sao loại 7 phiếu.</w:t>
       </w:r>
     </w:p>
     <w:p>
@@ -5938,7 +6071,7 @@
           <w:b/>
           <w:color w:val="CC0000"/>
         </w:rPr>
-        <w:t>(Slide 63: Mười câu tự chấm, mỗi câu có một cách kiểm tra không dựa vào cảm giác; dưới 8 câu "có" thì sửa trước khi sang Chương 4)</w:t>
+        <w:t>(Slide 65: Nhật ký từng ngày cho thấy mỗi lần nhắc kéo theo một đợt phiếu mới; nhật ký phải khớp tuyệt đối với file dữ liệu)</w:t>
       </w:r>
     </w:p>
     <w:p>
@@ -5961,6 +6094,1095 @@
           <w:color w:val="595959"/>
           <w:sz w:val="22"/>
         </w:rPr>
+        <w:t>Hướng dẫn Chuyên đề và Khóa luận tốt nghiệp, mục 3.5.1 và Mục 3.5.1A (bổ sung), Bảng BS9 và BS10; file 2b.Chapter_2_and_Chapter_3_Data_Collection_Practice.xlsx (dữ liệu giả định), sheet 5, 6 và 7</w:t>
+      </w:r>
+    </w:p>
+    <w:p>
+      <w:pPr>
+        <w:spacing w:after="160" w:line="276" w:lineRule="auto"/>
+      </w:pPr>
+      <w:r>
+        <w:rPr>
+          <w:b w:val="0"/>
+        </w:rPr>
+        <w:t>Mục 3.5.1 dặn ghi nhật ký thu thập mỗi ngày nhưng chưa cho mẫu. Đây là mẫu, dựng từ chính 165 phiếu thô của Ngân hàng X. Mỗi cột là số phiếu nhận trong một ngày, từ 3 tháng 3 đến 17 tháng 3. Hai cột đỏ là hai ngày nhắc lại: ngày 6 tháng 3 nhận 19 phiếu, nhiều nhất cả đợt; ngày 13 tháng 3 nhận 14 phiếu và những ngày sau đó vẫn giữ mức 14, 15 phiếu.</w:t>
+      </w:r>
+    </w:p>
+    <w:p>
+      <w:pPr>
+        <w:spacing w:after="160" w:line="276" w:lineRule="auto"/>
+      </w:pPr>
+      <w:r>
+        <w:rPr>
+          <w:b w:val="0"/>
+        </w:rPr>
+        <w:t>Điểm thầy muốn các em học là cách làm nhật ký. Cột phiếu nhận không gõ tay. Sheet 7 đếm thẳng từ dấu thời gian mà Google Form ghi cho từng phiếu, bằng hàm COUNTIF. Cột phiếu lỗi cũng đếm tự động từ các cột gắn cờ ở sheet 6: phiếu trùng, phiếu bỏ trống từ 8 ô trở lên. Vì vậy tổng cuối cùng tự khớp: mời 200, nhận 165, tỷ lệ phản hồi 82,5%, loại 15, còn 150 phiếu hợp lệ.</w:t>
+      </w:r>
+    </w:p>
+    <w:p>
+      <w:pPr>
+        <w:spacing w:after="160" w:line="276" w:lineRule="auto"/>
+      </w:pPr>
+      <w:r>
+        <w:rPr>
+          <w:b w:val="0"/>
+        </w:rPr>
+        <w:t xml:space="preserve">Nhật ký còn ghi vấn đề và cách xử lý. Ngày 9 tháng 3 là Chủ nhật, quầy nghỉ nên chỉ nhận phiếu trực tuyến. Ngày 12 tháng 3 phát hiện một phiếu gửi hai lần cách nhau 2 phút; không xóa ngay mà để lọc ở mục 3.5.2 theo quy tắc đã đặt trước. </w:t>
+      </w:r>
+      <w:r>
+        <w:rPr>
+          <w:b/>
+        </w:rPr>
+        <w:t>Nhật ký đếm từ dấu thời gian của file dữ liệu thì không thể lệch với con số báo cáo ở mục 3.5.1.</w:t>
+      </w:r>
+    </w:p>
+    <w:p>
+      <w:pPr>
+        <w:spacing w:after="160"/>
+        <w:ind w:left="454"/>
+      </w:pPr>
+      <w:r>
+        <w:rPr>
+          <w:b/>
+          <w:color w:val="CC0000"/>
+        </w:rPr>
+        <w:t xml:space="preserve">Câu chuyện ngoài slide: </w:t>
+      </w:r>
+      <w:r>
+        <w:rPr>
+          <w:i/>
+        </w:rPr>
+        <w:t>Thử hình dung đến ngày thứ mười, nhật ký của một bạn cho thấy chỉ có 60 phiếu trong khi cần 165. Nhờ nhật ký, bạn ấy biết sớm và còn năm ngày để xin thêm một phòng giao dịch. Một bạn khác không ghi nhật ký, đến ngày đóng khảo sát mới tải file về và thấy thiếu 50 phiếu. Lúc đó không còn ngày nào để sửa.</w:t>
+      </w:r>
+    </w:p>
+    <w:p>
+      <w:pPr>
+        <w:keepNext/>
+        <w:spacing w:before="240"/>
+      </w:pPr>
+      <w:r>
+        <w:rPr>
+          <w:b/>
+          <w:color w:val="CC0000"/>
+        </w:rPr>
+        <w:t>(Slide 66: Ba sai lệch không sửa được bằng phân tích: chặn khi thu phiếu, rồi kiểm tra bằng con số sau khi thu)</w:t>
+      </w:r>
+    </w:p>
+    <w:p>
+      <w:pPr>
+        <w:keepNext/>
+        <w:spacing w:after="80"/>
+      </w:pPr>
+      <w:r>
+        <w:rPr>
+          <w:b/>
+          <w:i/>
+          <w:color w:val="595959"/>
+          <w:sz w:val="22"/>
+        </w:rPr>
+        <w:t xml:space="preserve">Đối chiếu sách: </w:t>
+      </w:r>
+      <w:r>
+        <w:rPr>
+          <w:i/>
+          <w:color w:val="595959"/>
+          <w:sz w:val="22"/>
+        </w:rPr>
+        <w:t>Hướng dẫn Chuyên đề và Khóa luận tốt nghiệp, Mục 3.5.1C (bổ sung), Bảng BS12 và BS13; Armstrong và Overton (1977); Podsakoff và cộng sự (2003); Meade và Craig (2012); Kock (2015); file 2b.Chapter_2_and_Chapter_3_Data_Collection_Practice.xlsx (dữ liệu giả định), sheet 8 và 9</w:t>
+      </w:r>
+    </w:p>
+    <w:p>
+      <w:pPr>
+        <w:spacing w:after="160" w:line="276" w:lineRule="auto"/>
+      </w:pPr>
+      <w:r>
+        <w:rPr>
+          <w:b w:val="0"/>
+        </w:rPr>
+        <w:t>Ba sai lệch này là chỗ phân biệt một khóa luận đạt với một sản phẩm có chất lượng thạc sĩ. Dòng một là sai lệch do không phản hồi: người không trả lời có thể khác người trả lời. Armstrong và Overton năm 1977 đề xuất so sánh nhóm trả lời sớm với nhóm trả lời muộn, vì người trả lời muộn thường giống người không trả lời hơn. Với Ngân hàng X, nhóm sớm là 26 phiếu hợp lệ trước lần nhắc thứ nhất; nhóm muộn là 53 phiếu hợp lệ sau lần nhắc thứ hai. Hàm T.TEST cho năm P-value từ 0,082 đến 0,809, đều lớn hơn 0,05.</w:t>
+      </w:r>
+    </w:p>
+    <w:p>
+      <w:pPr>
+        <w:spacing w:after="160" w:line="276" w:lineRule="auto"/>
+      </w:pPr>
+      <w:r>
+        <w:rPr>
+          <w:b w:val="0"/>
+        </w:rPr>
+        <w:t>Dòng hai là trả lời cẩu thả. Meade và Craig năm 2012 khuyến nghị dùng câu chỉ dẫn trực tiếp như "để xác nhận anh/chị đang đọc kỹ, vui lòng chọn mức 2 cho câu này". Sau khi thu, sheet 6 tính độ lệch chuẩn của 19 câu trong mỗi phiếu: bằng 0 nghĩa là chọn cùng một mức cho mọi câu. Ngân hàng X có 0 phiếu như vậy. Dòng ba là sai lệch phương pháp chung, xảy ra khi biến độc lập và biến phụ thuộc cùng do một người trả lời trên cùng một phiếu. Podsakoff và cộng sự năm 2003 tổng hợp biện pháp thủ tục: ẩn danh, nói rõ không có câu trả lời đúng sai, tách phần đo ý định khỏi phần đo các yếu tố. Kiểm định Harman cho nhân tố đầu tiên 32,0% phương sai; Podsakoff lưu ý đây chỉ là bằng chứng yếu.</w:t>
+      </w:r>
+    </w:p>
+    <w:p>
+      <w:pPr>
+        <w:spacing w:after="160" w:line="276" w:lineRule="auto"/>
+      </w:pPr>
+      <w:r>
+        <w:rPr>
+          <w:b w:val="0"/>
+        </w:rPr>
+        <w:t xml:space="preserve">Khung bên phải là điều thầy muốn các em biết đọc. Niềm tin của nhóm muộn thấp hơn nhóm sớm 0,283 điểm, P-value 0,082. Chưa có ý nghĩa thống kê nhưng gần ngưỡng. Các em ghi điều này vào mục hạn chế: người không trả lời có thể tin ngân hàng số ít hơn người đã trả lời. </w:t>
+      </w:r>
+      <w:r>
+        <w:rPr>
+          <w:b/>
+        </w:rPr>
+        <w:t>Chặn sai lệch bằng thiết kế, chứng minh bằng con số và ghi giới hạn còn lại vào mục hạn chế.</w:t>
+      </w:r>
+    </w:p>
+    <w:p>
+      <w:pPr>
+        <w:spacing w:after="160"/>
+        <w:ind w:left="454"/>
+      </w:pPr>
+      <w:r>
+        <w:rPr>
+          <w:b/>
+          <w:color w:val="CC0000"/>
+        </w:rPr>
+        <w:t xml:space="preserve">Câu chuyện ngoài slide: </w:t>
+      </w:r>
+      <w:r>
+        <w:rPr>
+          <w:i/>
+        </w:rPr>
+        <w:t>Thử hình dung một bạn viết "dữ liệu đảm bảo khách quan, không có sai lệch". Phản biện hỏi: "Em kiểm tra bằng cách nào?" Bạn ấy im lặng. Một bạn khác viết ba câu: đã nhắc hai lần, nhóm sớm và nhóm muộn không khác biệt, riêng niềm tin gần ngưỡng nên ghi vào hạn chế. Phản biện gật đầu và chuyển sang câu khác. Một mục hạn chế có con số làm Hội đồng tin hơn một lời cam đoan.</w:t>
+      </w:r>
+    </w:p>
+    <w:p>
+      <w:pPr>
+        <w:keepNext/>
+        <w:spacing w:before="240"/>
+      </w:pPr>
+      <w:r>
+        <w:rPr>
+          <w:b/>
+          <w:color w:val="CC0000"/>
+        </w:rPr>
+        <w:t>(Slide 67: Sáu điểm nâng chất lượng không cần mô hình phức tạp; ba điểm đầu chỉ tốn thêm 2 đến 3 ngày)</w:t>
+      </w:r>
+    </w:p>
+    <w:p>
+      <w:pPr>
+        <w:keepNext/>
+        <w:spacing w:after="80"/>
+      </w:pPr>
+      <w:r>
+        <w:rPr>
+          <w:b/>
+          <w:i/>
+          <w:color w:val="595959"/>
+          <w:sz w:val="22"/>
+        </w:rPr>
+        <w:t xml:space="preserve">Đối chiếu sách: </w:t>
+      </w:r>
+      <w:r>
+        <w:rPr>
+          <w:i/>
+          <w:color w:val="595959"/>
+          <w:sz w:val="22"/>
+        </w:rPr>
+        <w:t>Hướng dẫn Chuyên đề và Khóa luận tốt nghiệp, Mục 2.1.3A đến 3.5.1C (bổ sung); file 2b.Chapter_2_and_Chapter_3_Data_Collection_Practice.xlsx (dữ liệu giả định), sheet 12_NangChuanThacSi (gợi ý của tác giả, không phải tiêu chí chấm chính thức)</w:t>
+      </w:r>
+    </w:p>
+    <w:p>
+      <w:pPr>
+        <w:spacing w:after="160" w:line="276" w:lineRule="auto"/>
+      </w:pPr>
+      <w:r>
+        <w:rPr>
+          <w:b w:val="0"/>
+        </w:rPr>
+        <w:t>Slide cuối của phần bổ sung trả lời câu hỏi: làm ở sức sinh viên thì có ra được sản phẩm có chất lượng thạc sĩ không? Thầy nói rõ: sáu điểm này là gợi ý của tác giả sách, không phải tiêu chí chấm chính thức. Điểm một, khoảng trống có nhật ký tìm kiếm và bảng đếm, như Bảng BS1 và BS2. Điểm hai, kế hoạch mẫu có số cần mời và lịch tiếp xúc, như Bảng BS8 và BS9. Điểm ba, chất lượng phiếu có câu kiểm tra sự chú ý, so sánh nhóm sớm và muộn, kiểm tra sai lệch phương pháp chung, như Bảng BS12 và BS13.</w:t>
+      </w:r>
+    </w:p>
+    <w:p>
+      <w:pPr>
+        <w:spacing w:after="160" w:line="276" w:lineRule="auto"/>
+      </w:pPr>
+      <w:r>
+        <w:rPr>
+          <w:b w:val="0"/>
+        </w:rPr>
+        <w:t>Ba điểm sau tốn công hơn. Điểm bốn, thang đo kế thừa đã công bố rồi phỏng vấn 5 đến 8 người để chỉnh câu chữ, kèm bảng câu gốc và câu đã chỉnh. Điểm năm, thêm phân tích nhân tố khám phá ở mục 3.6.3 khi bảng hỏi có điều chỉnh. Điểm sáu, dùng lời kể từ phỏng vấn để giải thích kết quả bất ngờ, ví dụ vì sao sự dễ sử dụng không có ý nghĩa ở Ngân hàng X.</w:t>
+      </w:r>
+    </w:p>
+    <w:p>
+      <w:pPr>
+        <w:spacing w:after="160" w:line="276" w:lineRule="auto"/>
+      </w:pPr>
+      <w:r>
+        <w:rPr>
+          <w:b w:val="0"/>
+        </w:rPr>
+        <w:t xml:space="preserve">Ba điểm đầu thầy tô đỏ vì chỉ tốn thêm khoảng 2 đến 3 ngày và nằm gọn trong khung tám tuần. Sách cũng dặn ở mục 7 Chương 2: không sao chép mô hình nhiều tầng, SEM hay cỡ mẫu hàng nghìn người của luận án. </w:t>
+      </w:r>
+      <w:r>
+        <w:rPr>
+          <w:b/>
+        </w:rPr>
+        <w:t>Chất lượng thạc sĩ nằm ở bằng chứng cho từng quyết định, không nằm ở số biến hay độ phức tạp của kỹ thuật.</w:t>
+      </w:r>
+    </w:p>
+    <w:p>
+      <w:pPr>
+        <w:spacing w:after="160"/>
+        <w:ind w:left="454"/>
+      </w:pPr>
+      <w:r>
+        <w:rPr>
+          <w:b/>
+          <w:color w:val="CC0000"/>
+        </w:rPr>
+        <w:t xml:space="preserve">Câu chuyện ngoài slide: </w:t>
+      </w:r>
+      <w:r>
+        <w:rPr>
+          <w:i/>
+        </w:rPr>
+        <w:t>Giả sử hai khóa luận cùng dùng hồi quy trên Excel với 150 phiếu. Khóa luận thứ nhất có thêm nhật ký tìm kiếm, lịch nhắc và bảng nhóm sớm muộn. Khóa luận thứ hai thì không. Kỹ thuật giống hệt nhau. Tuy vậy mỗi câu hỏi "vì sao" của Hội đồng thì khóa luận thứ nhất đều trả lời được bằng một bảng.</w:t>
+      </w:r>
+    </w:p>
+    <w:p>
+      <w:pPr>
+        <w:keepNext/>
+        <w:spacing w:before="240"/>
+      </w:pPr>
+      <w:r>
+        <w:rPr>
+          <w:b/>
+          <w:color w:val="CC0000"/>
+        </w:rPr>
+        <w:t>(Slide 68: Quy tắc loại phiếu phải đặt trước khi mở dữ liệu, để quyết định không phụ thuộc kết quả mong muốn)</w:t>
+      </w:r>
+    </w:p>
+    <w:p>
+      <w:pPr>
+        <w:keepNext/>
+        <w:spacing w:after="80"/>
+      </w:pPr>
+      <w:r>
+        <w:rPr>
+          <w:b/>
+          <w:i/>
+          <w:color w:val="595959"/>
+          <w:sz w:val="22"/>
+        </w:rPr>
+        <w:t xml:space="preserve">Đối chiếu sách: </w:t>
+      </w:r>
+      <w:r>
+        <w:rPr>
+          <w:i/>
+          <w:color w:val="595959"/>
+          <w:sz w:val="22"/>
+        </w:rPr>
+        <w:t>Hướng dẫn Chuyên đề và Khóa luận tốt nghiệp, Chương 3, mục 3.5.2 và 3.5.3, Hình 47 và 48; file 2.Chapter_2_and_Chapter_3_Practice.xlsx (dữ liệu giả định), sheet 3_DuLieuSach</w:t>
+      </w:r>
+    </w:p>
+    <w:p>
+      <w:pPr>
+        <w:spacing w:after="160" w:line="276" w:lineRule="auto"/>
+      </w:pPr>
+      <w:r>
+        <w:rPr>
+          <w:b w:val="0"/>
+        </w:rPr>
+        <w:t>Sách nói dữ liệu bẩn cho kết quả sai dù phân tích đúng kỹ thuật. Kiểm soát chất lượng gồm ba việc: kiểm tra trùng lặp, tức một người gửi phiếu hai lần; kiểm tra ô trống; kiểm tra giá trị bất thường, ví dụ số 6 trên thang 1 đến 5.</w:t>
+      </w:r>
+    </w:p>
+    <w:p>
+      <w:pPr>
+        <w:spacing w:after="160" w:line="276" w:lineRule="auto"/>
+      </w:pPr>
+      <w:r>
+        <w:rPr>
+          <w:b w:val="0"/>
+        </w:rPr>
+        <w:t>Trên Excel, sách hướng dẫn ba thao tác. Remove Duplicates phát hiện 5 phiếu trùng hoàn toàn, được gửi cách nhau 1 đến 3 phút. Go To Special rồi Blanks phát hiện các phiếu bỏ trống. Bộ lọc số kiểm tra giá trị ngoài thang. Với Ngân hàng X, quy tắc là phiếu bỏ trống từ 3 câu trở lên thì loại, loại được 10 phiếu. Phiếu chỉ thiếu 1 câu thì giữ lại và điền bằng trung bình của câu đó, làm tròn đến số nguyên; có đúng 2 ô được điền, thuộc câu HI3 và NT3. Các em mở sheet 3_DuLieuSach, di chuột vào các ô có ghi chú sẽ thấy hai ô này.</w:t>
+      </w:r>
+    </w:p>
+    <w:p>
+      <w:pPr>
+        <w:spacing w:after="160" w:line="276" w:lineRule="auto"/>
+      </w:pPr>
+      <w:r>
+        <w:rPr>
+          <w:b w:val="0"/>
+        </w:rPr>
+        <w:t>Điểm then chốt là ngưỡng loại phiếu phải đặt trước khi mở dữ liệu, ghi vào mục 3.5.3 và áp dụng như nhau cho mọi phiếu. Sách giải thích ý nghĩa: quyết định loại phiếu không phụ thuộc vào kết quả mà sinh viên mong muốn. Nếu không làm vậy, việc loại 15 phiếu có thể bị nghi là chọn dữ liệu cho kết quả đẹp hơn.</w:t>
+      </w:r>
+    </w:p>
+    <w:p>
+      <w:pPr>
+        <w:spacing w:after="160" w:line="276" w:lineRule="auto"/>
+      </w:pPr>
+      <w:r>
+        <w:rPr>
+          <w:b w:val="0"/>
+        </w:rPr>
+        <w:t xml:space="preserve">Câu chưa đạt trong sách là: "Những ô trống tôi tự điền cho đủ. Phiếu trùng tôi để nguyên vì cũng là ý kiến khách hàng." Sách gọi thẳng "tự điền" là bịa dữ liệu và vi phạm đạo đức nghiên cứu. </w:t>
+      </w:r>
+      <w:r>
+        <w:rPr>
+          <w:b/>
+        </w:rPr>
+        <w:t>"Tự điền cho đủ" là bịa dữ liệu; giữ phiếu trùng là tính một người hai lần; cả hai đều làm sai kết quả.</w:t>
+      </w:r>
+    </w:p>
+    <w:p>
+      <w:pPr>
+        <w:spacing w:after="160"/>
+        <w:ind w:left="454"/>
+      </w:pPr>
+      <w:r>
+        <w:rPr>
+          <w:b/>
+          <w:color w:val="CC0000"/>
+        </w:rPr>
+        <w:t xml:space="preserve">Câu chuyện ngoài slide: </w:t>
+      </w:r>
+      <w:r>
+        <w:rPr>
+          <w:i/>
+        </w:rPr>
+        <w:t>Thử hình dung một trọng tài thổi phạt đền rồi mới đặt ra luật. Không ai tin kết quả trận đấu. Quy tắc loại phiếu đặt sau khi xem kết quả cũng vậy: dù loại đúng, người đọc vẫn có quyền nghi ngờ. Ghi quy tắc vào file nháp trước khi mở dữ liệu là cách các em tự bảo vệ mình.</w:t>
+      </w:r>
+    </w:p>
+    <w:p>
+      <w:pPr>
+        <w:keepNext/>
+        <w:spacing w:before="240"/>
+      </w:pPr>
+      <w:r>
+        <w:rPr>
+          <w:b/>
+          <w:color w:val="CC0000"/>
+        </w:rPr>
+        <w:t>(Slide 69: Bảy chỉ số mô tả tính bằng hàm Excel có sẵn; Chương 3 chỉ nói sẽ tính gì, con số để dành cho Chương 4)</w:t>
+      </w:r>
+    </w:p>
+    <w:p>
+      <w:pPr>
+        <w:keepNext/>
+        <w:spacing w:after="80"/>
+      </w:pPr>
+      <w:r>
+        <w:rPr>
+          <w:b/>
+          <w:i/>
+          <w:color w:val="595959"/>
+          <w:sz w:val="22"/>
+        </w:rPr>
+        <w:t xml:space="preserve">Đối chiếu sách: </w:t>
+      </w:r>
+      <w:r>
+        <w:rPr>
+          <w:i/>
+          <w:color w:val="595959"/>
+          <w:sz w:val="22"/>
+        </w:rPr>
+        <w:t>Hướng dẫn Chuyên đề và Khóa luận tốt nghiệp, Chương 3, mục 3.6.1, Hình 49 đến 51, Bảng 17; file 2.Chapter_2_and_Chapter_3_Practice.xlsx (dữ liệu giả định), sheet 4_NhanKhauHoc và 5_ThongKeMoTa</w:t>
+      </w:r>
+    </w:p>
+    <w:p>
+      <w:pPr>
+        <w:spacing w:after="160" w:line="276" w:lineRule="auto"/>
+      </w:pPr>
+      <w:r>
+        <w:rPr>
+          <w:b w:val="0"/>
+        </w:rPr>
+        <w:t>Trước khi đi vào từng kỹ thuật, Hình 49 trình bày toàn bộ quy trình phân tích bằng Excel như một chuỗi bước. Bước đầu là thống kê mô tả. Bảng 17 liệt kê bảy chỉ số và hàm Excel tương ứng: COUNT để đếm số quan sát; AVERAGE cho trung bình; MEDIAN cho trung vị; MODE cho yếu vị; STDEV cho độ lệch chuẩn; MIN và MAX để kiểm tra giá trị ngoài thang; COUNTIF để đếm tần số cho thông tin chung như giới tính.</w:t>
+      </w:r>
+    </w:p>
+    <w:p>
+      <w:pPr>
+        <w:spacing w:after="160" w:line="276" w:lineRule="auto"/>
+      </w:pPr>
+      <w:r>
+        <w:rPr>
+          <w:b w:val="0"/>
+        </w:rPr>
+        <w:t>Sách giải thích ngắn gọn từng chỉ số. Trung vị là giá trị nằm giữa khi xếp dữ liệu từ nhỏ đến lớn, ít bị ảnh hưởng bởi giá trị cực đoan. Yếu vị là giá trị xuất hiện nhiều nhất. Độ lệch chuẩn cho biết các câu trả lời phân tán quanh trung bình nhiều hay ít. Ví dụ đạt trong sách viết cho Trường Y: điểm trung bình được diễn giải trên thang 1 đến 5, càng gần 5 càng tích cực và các biến được so sánh để tìm khía cạnh cao nhất, thấp nhất.</w:t>
+      </w:r>
+    </w:p>
+    <w:p>
+      <w:pPr>
+        <w:spacing w:after="160" w:line="276" w:lineRule="auto"/>
+      </w:pPr>
+      <w:r>
+        <w:rPr>
+          <w:b w:val="0"/>
+        </w:rPr>
+        <w:t xml:space="preserve">Ranh giới giữa hai chương ở bên phải là điều sách nhắc nhiều lần: Chương 3 chỉ mô tả kế hoạch, mọi con số kết quả thuộc Chương 4. Câu chưa đạt "Tôi tính trung bình. Trung bình càng cao càng tốt" bị trừ điểm vì chỉ có một chỉ số. </w:t>
+      </w:r>
+      <w:r>
+        <w:rPr>
+          <w:b/>
+        </w:rPr>
+        <w:t>Chỉ có trung bình thì không biết ý kiến tập trung hay phân tán; luôn đọc trung bình cùng độ lệch chuẩn.</w:t>
+      </w:r>
+    </w:p>
+    <w:p>
+      <w:pPr>
+        <w:spacing w:after="160"/>
+        <w:ind w:left="454"/>
+      </w:pPr>
+      <w:r>
+        <w:rPr>
+          <w:b/>
+          <w:color w:val="CC0000"/>
+        </w:rPr>
+        <w:t xml:space="preserve">Câu chuyện ngoài slide: </w:t>
+      </w:r>
+      <w:r>
+        <w:rPr>
+          <w:i/>
+        </w:rPr>
+        <w:t>Thử hình dung hai câu hỏi cùng có trung bình 3,0. Câu thứ nhất, mọi người đều chọn 3. Câu thứ hai, một nửa chọn 1 và một nửa chọn 5. Trung bình giống hệt nhau nhưng câu chuyện hoàn toàn khác: một bên là thờ ơ, một bên là chia rẽ. Độ lệch chuẩn là con số duy nhất phân biệt được hai trường hợp này.</w:t>
+      </w:r>
+    </w:p>
+    <w:p>
+      <w:pPr>
+        <w:keepNext/>
+        <w:spacing w:before="240"/>
+      </w:pPr>
+      <w:r>
+        <w:rPr>
+          <w:b/>
+          <w:color w:val="CC0000"/>
+        </w:rPr>
+        <w:t>(Slide 70: Cronbach Alpha kiểm tra các câu hỏi có "cùng lên cùng xuống" không, trước khi được gộp thành một biến)</w:t>
+      </w:r>
+    </w:p>
+    <w:p>
+      <w:pPr>
+        <w:keepNext/>
+        <w:spacing w:after="80"/>
+      </w:pPr>
+      <w:r>
+        <w:rPr>
+          <w:b/>
+          <w:i/>
+          <w:color w:val="595959"/>
+          <w:sz w:val="22"/>
+        </w:rPr>
+        <w:t xml:space="preserve">Đối chiếu sách: </w:t>
+      </w:r>
+      <w:r>
+        <w:rPr>
+          <w:i/>
+          <w:color w:val="595959"/>
+          <w:sz w:val="22"/>
+        </w:rPr>
+        <w:t>Hướng dẫn Chuyên đề và Khóa luận tốt nghiệp, Chương 3, mục 3.6.2, Bảng 18, Hình 52 và 53; file 2.Chapter_2_and_Chapter_3_Practice.xlsx (dữ liệu giả định), sheet 6_Cronbach</w:t>
+      </w:r>
+    </w:p>
+    <w:p>
+      <w:pPr>
+        <w:spacing w:after="160" w:line="276" w:lineRule="auto"/>
+      </w:pPr>
+      <w:r>
+        <w:rPr>
+          <w:b w:val="0"/>
+        </w:rPr>
+        <w:t>Cronbach Alpha là chỗ nhiều em chạy được nhưng không giải thích được. Sách giải thích bằng cách đời thường. Bốn câu HI1 đến HI4 cùng hỏi về sự hữu ích. Một khách hàng thấy ngân hàng số rất hữu ích sẽ có xu hướng chọn mức cao ở cả bốn câu. Một khách hàng thấy ít hữu ích sẽ chọn mức thấp ở cả bốn câu. Khi phần lớn người trả lời đều như vậy, bốn câu được xem là nhất quán nội tại: chúng cùng đo một thứ. Alpha là con số tóm tắt mức nhất quán đó, từ 0 đến 1.</w:t>
+      </w:r>
+    </w:p>
+    <w:p>
+      <w:pPr>
+        <w:spacing w:after="160" w:line="276" w:lineRule="auto"/>
+      </w:pPr>
+      <w:r>
+        <w:rPr>
+          <w:b w:val="0"/>
+        </w:rPr>
+        <w:t>Vì sao phải kiểm định trước? Vì ở bước sau, bốn câu HI được gộp thành một biến đại diện bằng trung bình. Phép gộp này chỉ có nghĩa khi bốn câu cùng đo một khái niệm. Sách viết rõ chuỗi hậu quả: thang đo không nhất quán thì điểm trung bình không đại diện cho sự hữu ích; hệ số hồi quy của HI không còn cho biết tác động của sự hữu ích và mọi kết luận về H1 mất ý nghĩa.</w:t>
+      </w:r>
+    </w:p>
+    <w:p>
+      <w:pPr>
+        <w:spacing w:after="160" w:line="276" w:lineRule="auto"/>
+      </w:pPr>
+      <w:r>
+        <w:rPr>
+          <w:b w:val="0"/>
+        </w:rPr>
+        <w:t>Các em đọc ba chỉ số cùng nhau. Một là Alpha, chấp nhận từ 0,7, tối ưu từ 0,7 đến 0,9. Hai là tương quan biến tổng hiệu chỉnh, tức tương quan của một câu với tổng các câu còn lại; chữ "hiệu chỉnh" nghĩa là đã bỏ chính câu đó ra để nó không tự tương quan với chính mình; ngưỡng thường dùng là 0,3. Ba là Alpha nếu loại câu; nếu Alpha tăng rõ khi loại, câu đó có thể nên loại.</w:t>
+      </w:r>
+    </w:p>
+    <w:p>
+      <w:pPr>
+        <w:spacing w:after="160" w:line="276" w:lineRule="auto"/>
+      </w:pPr>
+      <w:r>
+        <w:rPr>
+          <w:b w:val="0"/>
+        </w:rPr>
+        <w:t xml:space="preserve">Nhưng sách dặn một điều rất quan trọng: trước khi loại, đọc lại nội dung câu. Nếu câu mang khía cạnh "tiết kiệm chi phí" của định nghĩa sự hữu ích, loại nó làm thang đo mất giá trị nội dung. Hai lỗi hay gặp là tính Alpha cho cả 19 câu cùng lúc thay vì từng thang đo và loại câu chỉ để Alpha đẹp hơn. </w:t>
+      </w:r>
+      <w:r>
+        <w:rPr>
+          <w:b/>
+        </w:rPr>
+        <w:t>Thang đo không nhất quán thì điểm trung bình không đại diện cho khái niệm và mọi kết luận về giả thuyết mất ý nghĩa.</w:t>
+      </w:r>
+    </w:p>
+    <w:p>
+      <w:pPr>
+        <w:spacing w:after="160"/>
+        <w:ind w:left="454"/>
+      </w:pPr>
+      <w:r>
+        <w:rPr>
+          <w:b/>
+          <w:color w:val="CC0000"/>
+        </w:rPr>
+        <w:t xml:space="preserve">Câu chuyện ngoài slide: </w:t>
+      </w:r>
+      <w:r>
+        <w:rPr>
+          <w:i/>
+        </w:rPr>
+        <w:t>Thử hình dung bốn giám khảo cùng chấm một bài hát. Nếu cả bốn đều cho điểm cao với ca sĩ hay và điểm thấp với ca sĩ dở, bốn người đang chấm cùng một thứ. Nếu một giám khảo cho điểm lung tung, có thể họ đang chấm trang phục chứ không phải giọng hát. Alpha đo mức "đồng thanh" của bốn câu hỏi giống như vậy.</w:t>
+      </w:r>
+    </w:p>
+    <w:p>
+      <w:pPr>
+        <w:keepNext/>
+        <w:spacing w:before="240"/>
+      </w:pPr>
+      <w:r>
+        <w:rPr>
+          <w:b/>
+          <w:color w:val="CC0000"/>
+        </w:rPr>
+        <w:t>(Slide 71: Alpha không phải càng cao càng tốt: dưới 0,6 là kém, trên 0,95 có thể là các câu hỏi lặp nhau)</w:t>
+      </w:r>
+    </w:p>
+    <w:p>
+      <w:pPr>
+        <w:keepNext/>
+        <w:spacing w:after="80"/>
+      </w:pPr>
+      <w:r>
+        <w:rPr>
+          <w:b/>
+          <w:i/>
+          <w:color w:val="595959"/>
+          <w:sz w:val="22"/>
+        </w:rPr>
+        <w:t xml:space="preserve">Đối chiếu sách: </w:t>
+      </w:r>
+      <w:r>
+        <w:rPr>
+          <w:i/>
+          <w:color w:val="595959"/>
+          <w:sz w:val="22"/>
+        </w:rPr>
+        <w:t>Hướng dẫn Chuyên đề và Khóa luận tốt nghiệp, Chương 3, mục 3.6.2 và Bảng 18; Hair và cộng sự (2010); Creswell và Creswell (2018, tr. 215)</w:t>
+      </w:r>
+    </w:p>
+    <w:p>
+      <w:pPr>
+        <w:spacing w:after="160" w:line="276" w:lineRule="auto"/>
+      </w:pPr>
+      <w:r>
+        <w:rPr>
+          <w:b w:val="0"/>
+        </w:rPr>
+        <w:t>Slide trước các em đã thấy Alpha đo mức các câu hỏi trong một thang đo "cùng lên cùng xuống", tức cùng đo một khái niệm. Slide này là Bảng 18, cách đọc các mức của Alpha, một bảng thầy rất muốn các em thuộc. Có bốn mức. Dưới 0,6: thang đo kém nhất quán; xem lại từng câu, không dùng nếu không cải thiện được. Từ 0,6 đến dưới 0,7: có thể chấp nhận nhưng phải chỉ ra được một trong hai lý do, là khái niệm còn mới với người trả lời hoặc thang đo mới được xây dựng và ghi lý do đó vào bài. Từ 0,7 đến 0,9: tốt, là khoảng tối ưu. Trên 0,95: không phải tốt hơn.</w:t>
+      </w:r>
+    </w:p>
+    <w:p>
+      <w:pPr>
+        <w:spacing w:after="160" w:line="276" w:lineRule="auto"/>
+      </w:pPr>
+      <w:r>
+        <w:rPr>
+          <w:b w:val="0"/>
+        </w:rPr>
+        <w:t>Mức cuối là điều nhiều em ngạc nhiên. Vì sao Alpha rất cao lại đáng ngờ? Vì có thể các câu hỏi gần như lặp lại cùng một nội dung bằng hai cách nói. Ví dụ "Ngân hàng số giúp tôi giao dịch nhanh" và "Ngân hàng số giúp tôi tiết kiệm thời gian giao dịch" gần như là một câu. Sách dặn đọc lại các câu và bỏ một câu nếu trùng ý. Sách cũng nói thẳng: các nguồn của sách không nêu ngưỡng chung cho mức này, đây là dấu hiệu để đọc lại câu hỏi.</w:t>
+      </w:r>
+    </w:p>
+    <w:p>
+      <w:pPr>
+        <w:spacing w:after="160" w:line="276" w:lineRule="auto"/>
+      </w:pPr>
+      <w:r>
+        <w:rPr>
+          <w:b w:val="0"/>
+        </w:rPr>
+        <w:t xml:space="preserve">Cột nguồn bên phải là thói quen học thuật các em cần có: mỗi ngưỡng có nguồn. Hair và cộng sự năm 2010 nói tối thiểu thường là 0,7 và có thể giảm còn 0,6 trong nghiên cứu khám phá. </w:t>
+      </w:r>
+      <w:r>
+        <w:rPr>
+          <w:b/>
+        </w:rPr>
+        <w:t>Khi α nằm gần ngưỡng: ghi rõ α, ngưỡng đã dùng và nguồn của ngưỡng.</w:t>
+      </w:r>
+    </w:p>
+    <w:p>
+      <w:pPr>
+        <w:spacing w:after="160"/>
+        <w:ind w:left="454"/>
+      </w:pPr>
+      <w:r>
+        <w:rPr>
+          <w:b/>
+          <w:color w:val="CC0000"/>
+        </w:rPr>
+        <w:t xml:space="preserve">Câu chuyện ngoài slide: </w:t>
+      </w:r>
+      <w:r>
+        <w:rPr>
+          <w:i/>
+        </w:rPr>
+        <w:t>Thử hình dung một bạn có Alpha 0,97 và rất vui vì "gần như tuyệt đối". Đọc lại bảng hỏi, bạn ấy thấy bốn câu niềm tin thực ra là một câu viết bốn kiểu: "tôi tin", "tôi tin tưởng", "tôi thấy đáng tin", "tôi có niềm tin". Thang đo này đo rất ổn định một ý duy nhất nhưng không bao quát định nghĩa niềm tin gồm bảo mật, chính xác và giữ cam kết.</w:t>
+      </w:r>
+    </w:p>
+    <w:p>
+      <w:pPr>
+        <w:keepNext/>
+        <w:spacing w:before="240"/>
+      </w:pPr>
+      <w:r>
+        <w:rPr>
+          <w:b/>
+          <w:color w:val="CC0000"/>
+        </w:rPr>
+        <w:t>(Slide 72: EFA là mục tùy chọn; ba câu hỏi giúp các em tự quyết định có làm hay không)</w:t>
+      </w:r>
+    </w:p>
+    <w:p>
+      <w:pPr>
+        <w:keepNext/>
+        <w:spacing w:after="80"/>
+      </w:pPr>
+      <w:r>
+        <w:rPr>
+          <w:b/>
+          <w:i/>
+          <w:color w:val="595959"/>
+          <w:sz w:val="22"/>
+        </w:rPr>
+        <w:t xml:space="preserve">Đối chiếu sách: </w:t>
+      </w:r>
+      <w:r>
+        <w:rPr>
+          <w:i/>
+          <w:color w:val="595959"/>
+          <w:sz w:val="22"/>
+        </w:rPr>
+        <w:t>Hướng dẫn Chuyên đề và Khóa luận tốt nghiệp, Chương 3, mục 3.6.3 (*); Hair và cộng sự (2010)</w:t>
+      </w:r>
+    </w:p>
+    <w:p>
+      <w:pPr>
+        <w:spacing w:after="160" w:line="276" w:lineRule="auto"/>
+      </w:pPr>
+      <w:r>
+        <w:rPr>
+          <w:b w:val="0"/>
+        </w:rPr>
+        <w:t>Phân tích nhân tố khám phá, EFA, là công cụ xem 19 câu hỏi tự nhóm lại thành mấy nhóm dựa trên cách người trả lời chọn đáp án. Người nghiên cứu không báo trước cho phần mềm câu nào thuộc nhóm nào. Nếu bốn câu HI tự nằm chung một nhóm, bốn câu SD tự nằm chung một nhóm khác, thì thang đo có cấu trúc đúng như mô hình dự kiến.</w:t>
+      </w:r>
+    </w:p>
+    <w:p>
+      <w:pPr>
+        <w:spacing w:after="160" w:line="276" w:lineRule="auto"/>
+      </w:pPr>
+      <w:r>
+        <w:rPr>
+          <w:b w:val="0"/>
+        </w:rPr>
+        <w:t>Ở cấp đại học, EFA là mục tùy chọn, đánh dấu sao trong sách. Ba câu hỏi đầu trên slide giúp các em tự quyết. Một: mẫu đề cương của khoa có mục EFA không; có thì làm. Hai: có thang đo nào tự xây, dịch mới hoặc sửa từ ngữ đáng kể không; có thì nên làm, vì chưa có bằng chứng các câu mới nhóm đúng khái niệm. Ba: cỡ mẫu có đạt ít nhất 5 lần số câu hỏi không; không đạt thì không làm, vì kết quả EFA không đáng tin.</w:t>
+      </w:r>
+    </w:p>
+    <w:p>
+      <w:pPr>
+        <w:spacing w:after="160" w:line="276" w:lineRule="auto"/>
+      </w:pPr>
+      <w:r>
+        <w:rPr>
+          <w:b w:val="0"/>
+        </w:rPr>
+        <w:t>Nếu làm, các em dùng phần mềm có chức năng này như SPSS, JASP hoặc R, vì Excel không có sẵn EFA. Bốn tiêu chí đọc kết quả theo Hair và cộng sự năm 2010: KMO từ 0,5 trở lên; kiểm định Bartlett có P-value dưới 0,05; nhân tố giữ lại có eigenvalue lớn hơn 1; hệ số tải của mỗi câu từ 0,5 trở lên. Sách giải thích thêm hai khái niệm: giá trị hội tụ là các câu cùng khái niệm tải mạnh lên một nhân tố; giá trị phân biệt là các câu khác khái niệm không tải chéo.</w:t>
+      </w:r>
+    </w:p>
+    <w:p>
+      <w:pPr>
+        <w:spacing w:after="160" w:line="276" w:lineRule="auto"/>
+      </w:pPr>
+      <w:r>
+        <w:rPr>
+          <w:b w:val="0"/>
+        </w:rPr>
+        <w:t xml:space="preserve">Nếu không làm, các em ghi một câu lý do, ví dụ mọi thang đo kế thừa nguyên văn từ nghiên cứu đã công bố, rồi bỏ mục hoặc ghi "Mục này không áp dụng". </w:t>
+      </w:r>
+      <w:r>
+        <w:rPr>
+          <w:b/>
+        </w:rPr>
+        <w:t>Ghi "làm EFA và CFA bằng Excel" là mô tả sai công cụ; CFA và SEM thuộc cấp sau đại học.</w:t>
+      </w:r>
+    </w:p>
+    <w:p>
+      <w:pPr>
+        <w:spacing w:after="160"/>
+        <w:ind w:left="454"/>
+      </w:pPr>
+      <w:r>
+        <w:rPr>
+          <w:b/>
+          <w:color w:val="CC0000"/>
+        </w:rPr>
+        <w:t xml:space="preserve">Câu chuyện ngoài slide: </w:t>
+      </w:r>
+      <w:r>
+        <w:rPr>
+          <w:i/>
+        </w:rPr>
+        <w:t>Thử hình dung một bạn làm EFA vì "thấy khóa luận khác có", với cỡ mẫu 70 cho 19 câu hỏi. Kết quả trích ra bảy nhân tố lộn xộn, bạn ấy không giải thích được. Câu hỏi thứ ba của sách, cỡ mẫu có đạt 5 lần số câu hỏi không, đã trả lời trước: không đạt thì không làm, vì kết quả không đáng tin.</w:t>
+      </w:r>
+    </w:p>
+    <w:p>
+      <w:pPr>
+        <w:keepNext/>
+        <w:spacing w:before="240"/>
+      </w:pPr>
+      <w:r>
+        <w:rPr>
+          <w:b/>
+          <w:color w:val="CC0000"/>
+        </w:rPr>
+        <w:t>(Slide 73: Hồi quy đa biến kiểm định mỗi giả thuyết qua dấu và P-value của đúng một hệ số)</w:t>
+      </w:r>
+    </w:p>
+    <w:p>
+      <w:pPr>
+        <w:keepNext/>
+        <w:spacing w:after="80"/>
+      </w:pPr>
+      <w:r>
+        <w:rPr>
+          <w:b/>
+          <w:i/>
+          <w:color w:val="595959"/>
+          <w:sz w:val="22"/>
+        </w:rPr>
+        <w:t xml:space="preserve">Đối chiếu sách: </w:t>
+      </w:r>
+      <w:r>
+        <w:rPr>
+          <w:i/>
+          <w:color w:val="595959"/>
+          <w:sz w:val="22"/>
+        </w:rPr>
+        <w:t>Hướng dẫn Chuyên đề và Khóa luận tốt nghiệp, Chương 3, mục 3.6.4, Hình 54 đến 56, Bảng 19 và 20; file 2.Chapter_2_and_Chapter_3_Practice.xlsx (dữ liệu giả định), sheet 7_BienDaiDien đến 9_HoiQuy</w:t>
+      </w:r>
+    </w:p>
+    <w:p>
+      <w:pPr>
+        <w:spacing w:after="160" w:line="276" w:lineRule="auto"/>
+      </w:pPr>
+      <w:r>
+        <w:rPr>
+          <w:b w:val="0"/>
+        </w:rPr>
+        <w:t>Hồi quy cho biết mỗi biến độc lập tác động đến biến phụ thuộc theo chiều nào, mạnh đến mức nào và có ý nghĩa thống kê không. Mô hình Ngân hàng X có bốn biến độc lập nên dùng hồi quy đa biến với phương trình YD bằng β0 cộng β1 nhân HI cộng β2 nhân SD cộng β3 nhân NT cộng β4 nhân XH cộng sai số. Mỗi giả thuyết ứng với một hệ số: H1 được ủng hộ khi β1 dương và P-value nhỏ hơn 0,05.</w:t>
+      </w:r>
+    </w:p>
+    <w:p>
+      <w:pPr>
+        <w:spacing w:after="160" w:line="276" w:lineRule="auto"/>
+      </w:pPr>
+      <w:r>
+        <w:rPr>
+          <w:b w:val="0"/>
+        </w:rPr>
+        <w:t>Trước hồi quy, các em tạo biến đại diện. Sách giải thích vì sao cần: hồi quy cần đúng một con số cho mỗi khái niệm của mỗi người. Một người trả lời HI1 bằng 4, HI2 bằng 5, HI3 bằng 4, HI4 bằng 5 thì điểm sự hữu ích là 4,5. Trên Excel gõ bằng AVERAGE của F2 đến I2 rồi kéo xuống 150 dòng. Dùng trung bình thay cho tổng vì trung bình giữ nguyên thang 1 đến 5: 4,5 nghĩa là giữa "đồng ý" và "hoàn toàn đồng ý". Tổng bốn câu nằm trên thang 4 đến 20, tổng ba câu YD nằm trên thang 3 đến 15, hai thang khác nhau nên khó so sánh.</w:t>
+      </w:r>
+    </w:p>
+    <w:p>
+      <w:pPr>
+        <w:spacing w:after="160" w:line="276" w:lineRule="auto"/>
+      </w:pPr>
+      <w:r>
+        <w:rPr>
+          <w:b w:val="0"/>
+        </w:rPr>
+        <w:t>Hai khái niệm cần hiểu đúng. R bình phương là tỷ lệ biến động của Y được các biến X giải thích; R bình phương luôn tăng khi thêm biến, kể cả biến không liên quan, nên khi so hai mô hình khác số biến thì dùng R bình phương hiệu chỉnh. P-value không phải xác suất giả thuyết đúng. Sách định nghĩa: P-value là xác suất quan sát được kết quả như trong mẫu, hoặc lớn hơn, nếu thực tế không có quan hệ. P-value cũng không cho biết tác động mạnh hay yếu; độ mạnh đọc từ hệ số.</w:t>
+      </w:r>
+    </w:p>
+    <w:p>
+      <w:pPr>
+        <w:spacing w:after="160" w:line="276" w:lineRule="auto"/>
+      </w:pPr>
+      <w:r>
+        <w:rPr>
+          <w:b w:val="0"/>
+        </w:rPr>
+        <w:t xml:space="preserve">Cách chạy: bật Analysis ToolPak một lần; vào Data, Data Analysis, Regression; chọn vùng Y là cột biến phụ thuộc; vùng X là các cột biến độc lập đứng liền nhau; đánh dấu Labels và các ô phần dư. Các giả định được kiểm tra qua phần dư và VIF; sách dùng ngưỡng VIF 10 theo Hair và cộng sự. </w:t>
+      </w:r>
+      <w:r>
+        <w:rPr>
+          <w:b/>
+        </w:rPr>
+        <w:t>Chạy: Data &gt; Data Analysis &gt; Regression; vùng X là các cột biến độc lập đứng liền nhau; đánh dấu Labels và các ô phần dư.</w:t>
+      </w:r>
+    </w:p>
+    <w:p>
+      <w:pPr>
+        <w:spacing w:after="160"/>
+        <w:ind w:left="454"/>
+      </w:pPr>
+      <w:r>
+        <w:rPr>
+          <w:b/>
+          <w:color w:val="CC0000"/>
+        </w:rPr>
+        <w:t xml:space="preserve">Câu chuyện ngoài slide: </w:t>
+      </w:r>
+      <w:r>
+        <w:rPr>
+          <w:i/>
+        </w:rPr>
+        <w:t>Thử hình dung một bạn chọn vùng X gồm các cột HI, SD, rồi một cột trống, rồi NT, XH. ToolPak báo lỗi hoặc cho kết quả sai tên biến. Sách dặn các cột biến độc lập phải đứng liền nhau vì đúng lý do rất đời thường này. Chạy thử trên file thực hành trước khi chạy trên dữ liệu thật là cách phát hiện lỗi thao tác sớm nhất.</w:t>
+      </w:r>
+    </w:p>
+    <w:p>
+      <w:pPr>
+        <w:keepNext/>
+        <w:spacing w:before="240"/>
+      </w:pPr>
+      <w:r>
+        <w:rPr>
+          <w:b/>
+          <w:color w:val="CC0000"/>
+        </w:rPr>
+        <w:t>(Slide 74: Hệ số và P-value chỉ đáng tin khi dữ liệu thỏa bốn giả định và cả bốn đều kiểm tra được ngay trên Excel)</w:t>
+      </w:r>
+    </w:p>
+    <w:p>
+      <w:pPr>
+        <w:keepNext/>
+        <w:spacing w:after="80"/>
+      </w:pPr>
+      <w:r>
+        <w:rPr>
+          <w:b/>
+          <w:i/>
+          <w:color w:val="595959"/>
+          <w:sz w:val="22"/>
+        </w:rPr>
+        <w:t xml:space="preserve">Đối chiếu sách: </w:t>
+      </w:r>
+      <w:r>
+        <w:rPr>
+          <w:i/>
+          <w:color w:val="595959"/>
+          <w:sz w:val="22"/>
+        </w:rPr>
+        <w:t>Hướng dẫn Chuyên đề và Khóa luận tốt nghiệp, Chương 3, mục 3.6.4 và Bảng 20; Hair và cộng sự (2010)</w:t>
+      </w:r>
+    </w:p>
+    <w:p>
+      <w:pPr>
+        <w:spacing w:after="160" w:line="276" w:lineRule="auto"/>
+      </w:pPr>
+      <w:r>
+        <w:rPr>
+          <w:b w:val="0"/>
+        </w:rPr>
+        <w:t>Phần dư là khoảng chênh giữa giá trị Y thật của một người và giá trị Y mà mô hình dự đoán cho người đó. Sách nói phần lớn các giả định của hồi quy được kiểm tra qua phần dư và Bảng 20 liệt kê bốn giả định kèm cách kiểm tra trên Excel.</w:t>
+      </w:r>
+    </w:p>
+    <w:p>
+      <w:pPr>
+        <w:spacing w:after="160" w:line="276" w:lineRule="auto"/>
+      </w:pPr>
+      <w:r>
+        <w:rPr>
+          <w:b w:val="0"/>
+        </w:rPr>
+        <w:t>Thầy đọc từng dòng. Tuyến tính: quan hệ giữa X và Y có dạng đường thẳng; kiểm tra bằng Residual Plots, các điểm phân tán đều quanh đường 0, không tạo hình cong. Phương sai sai số không đổi: mức phân tán của phần dư giống nhau ở mọi mức; nếu phần dư loe rộng dần thành hình phễu thì P-value có thể sai. Phần dư phân phối chuẩn: biểu đồ tần số có dạng hình chuông, vì kiểm định t và F dựa trên giả định này. Không đa cộng tuyến: các biến độc lập không quá giống nhau, nếu không hồi quy không tách được tác động riêng của từng biến.</w:t>
+      </w:r>
+    </w:p>
+    <w:p>
+      <w:pPr>
+        <w:spacing w:after="160" w:line="276" w:lineRule="auto"/>
+      </w:pPr>
+      <w:r>
+        <w:rPr>
+          <w:b w:val="0"/>
+        </w:rPr>
+        <w:t xml:space="preserve">VIF được tính bằng 1 chia cho 1 trừ R bình phương của hồi quy phụ: chạy Regression với một biến độc lập làm Y và các biến độc lập còn lại làm X. Sách dùng ngưỡng 10 theo Hair và cộng sự. Với file thực hành, tương quan giữa các biến độc lập chỉ 0,25 đến 0,35 và VIF từ 1,19 đến 1,24. </w:t>
+      </w:r>
+      <w:r>
+        <w:rPr>
+          <w:b/>
+        </w:rPr>
+        <w:t>VIF trên 10 là đa cộng tuyến nghiêm trọng; VIF từ 5 đến 10 là dấu hiệu để đọc lại hai biến có tương quan cao nhất.</w:t>
+      </w:r>
+    </w:p>
+    <w:p>
+      <w:pPr>
+        <w:spacing w:after="160"/>
+        <w:ind w:left="454"/>
+      </w:pPr>
+      <w:r>
+        <w:rPr>
+          <w:b/>
+          <w:color w:val="CC0000"/>
+        </w:rPr>
+        <w:t xml:space="preserve">Câu chuyện ngoài slide: </w:t>
+      </w:r>
+      <w:r>
+        <w:rPr>
+          <w:i/>
+        </w:rPr>
+        <w:t>Thử hình dung một mô hình có cả "sự hữu ích" và "kỳ vọng hiệu quả" làm hai biến riêng. Hai khái niệm này, như các em thấy ở slide khái niệm, có nội dung gần tương tự. Tương quan giữa chúng lên 0,85, VIF vọt lên và cả hai hệ số đều mất ý nghĩa dù từng biến riêng lẻ tương quan rất mạnh với ý định. Đa cộng tuyến thường không phải lỗi dữ liệu mà là lỗi định nghĩa khái niệm ở Chương 2.</w:t>
+      </w:r>
+    </w:p>
+    <w:p>
+      <w:pPr>
+        <w:keepNext/>
+        <w:spacing w:before="240"/>
+      </w:pPr>
+      <w:r>
+        <w:rPr>
+          <w:b/>
+          <w:color w:val="CC0000"/>
+        </w:rPr>
+        <w:t>(Slide 75: Đo ổn định chưa đủ, phải đo đúng và người tham gia phải được thông tin, tự nguyện, bảo vệ)</w:t>
+      </w:r>
+    </w:p>
+    <w:p>
+      <w:pPr>
+        <w:keepNext/>
+        <w:spacing w:after="80"/>
+      </w:pPr>
+      <w:r>
+        <w:rPr>
+          <w:b/>
+          <w:i/>
+          <w:color w:val="595959"/>
+          <w:sz w:val="22"/>
+        </w:rPr>
+        <w:t xml:space="preserve">Đối chiếu sách: </w:t>
+      </w:r>
+      <w:r>
+        <w:rPr>
+          <w:i/>
+          <w:color w:val="595959"/>
+          <w:sz w:val="22"/>
+        </w:rPr>
+        <w:t>Hướng dẫn Chuyên đề và Khóa luận tốt nghiệp, Chương 3, mục 3.7 và 3.8; Creswell và Creswell (2018, tr. 146 đến 153, 215 đến 216)</w:t>
+      </w:r>
+    </w:p>
+    <w:p>
+      <w:pPr>
+        <w:spacing w:after="160" w:line="276" w:lineRule="auto"/>
+      </w:pPr>
+      <w:r>
+        <w:rPr>
+          <w:b w:val="0"/>
+        </w:rPr>
+        <w:t>Hai mục cuối của Chương 3 cho người đọc biết kết quả đáng tin đến mức nào và người tham gia được bảo vệ ra sao. Sách phân biệt: độ tin cậy trả lời câu hỏi "đo có ổn định không"; giá trị trả lời câu hỏi "đo có đúng cái cần đo không".</w:t>
+      </w:r>
+    </w:p>
+    <w:p>
+      <w:pPr>
+        <w:spacing w:after="160" w:line="276" w:lineRule="auto"/>
+      </w:pPr>
+      <w:r>
+        <w:rPr>
+          <w:b w:val="0"/>
+        </w:rPr>
+        <w:t>Ví dụ trong sách rất dễ nhớ: một cái cân luôn chỉ 2 kg cho mọi vật, dù vật nặng 1 kg hay 10 kg. Cân này rất nhất quán vì lần nào cũng chỉ cùng một số nhưng không đo đúng khối lượng. Ngược lại, muốn đo đúng thì trước hết phải đo ổn định. Vì vậy Cronbach Alpha đạt yêu cầu là điều kiện cần, chưa phải điều kiện đủ. Ba dạng giá trị theo Creswell và Creswell là giá trị nội dung, giá trị dự báo hoặc đồng thời và giá trị cấu trúc. Sách cũng dặn không bao giờ viết "kết quả hoàn toàn chính xác".</w:t>
+      </w:r>
+    </w:p>
+    <w:p>
+      <w:pPr>
+        <w:spacing w:after="160" w:line="276" w:lineRule="auto"/>
+      </w:pPr>
+      <w:r>
+        <w:rPr>
+          <w:b w:val="0"/>
+        </w:rPr>
+        <w:t>Về đạo đức, sách liệt kê sáu nguyên tắc: tự nguyện, đồng ý, bảo mật, ẩn danh, không gây hại, trung thực. Lời mời ở đầu bảng hỏi phải nói người thực hiện là ai, trường nào, mục đích gì, mất khoảng 5 phút và có quyền dừng bất cứ lúc nào. Người tham gia bấm "Tôi đồng ý tham gia" trước khi trả lời. Với Google Form ẩn danh, phiếu đã gửi không tìm lại được để xóa, nên lời mời phải nói rõ có thể dừng trước khi bấm gửi.</w:t>
+      </w:r>
+    </w:p>
+    <w:p>
+      <w:pPr>
+        <w:spacing w:after="160" w:line="276" w:lineRule="auto"/>
+      </w:pPr>
+      <w:r>
+        <w:rPr>
+          <w:b w:val="0"/>
+        </w:rPr>
+        <w:t xml:space="preserve">Với Trường Tiểu học Y, người trả lời là phụ huynh; sinh viên xin phép Ban giám hiệu trước khi phát phiếu và không khảo sát học sinh, vì các em là trẻ vị thành niên. </w:t>
+      </w:r>
+      <w:r>
+        <w:rPr>
+          <w:b/>
+        </w:rPr>
+        <w:t>Mọi kết quả, kể cả giả thuyết không được ủng hộ, đều phải được báo cáo đầy đủ.</w:t>
+      </w:r>
+    </w:p>
+    <w:p>
+      <w:pPr>
+        <w:spacing w:after="160"/>
+        <w:ind w:left="454"/>
+      </w:pPr>
+      <w:r>
+        <w:rPr>
+          <w:b/>
+          <w:color w:val="CC0000"/>
+        </w:rPr>
+        <w:t xml:space="preserve">Câu chuyện ngoài slide: </w:t>
+      </w:r>
+      <w:r>
+        <w:rPr>
+          <w:i/>
+        </w:rPr>
+        <w:t>Thử hình dung bảng hỏi phát cho phụ huynh có dòng "Họ tên" và "Số điện thoại" ở đầu. Phụ huynh e ngại, trả lời toàn mức 4 và 5 để "khỏi phiền". Dữ liệu vừa vi phạm cam kết ẩn danh vừa mất trung thực. Bỏ hai dòng đó đi là cách bảo vệ cả người tham gia lẫn chất lượng dữ liệu.</w:t>
+      </w:r>
+    </w:p>
+    <w:p>
+      <w:pPr>
+        <w:keepNext/>
+        <w:spacing w:before="240"/>
+      </w:pPr>
+      <w:r>
+        <w:rPr>
+          <w:b/>
+          <w:color w:val="CC0000"/>
+        </w:rPr>
+        <w:t>(Slide 76: Mười câu tự chấm, mỗi câu có một cách kiểm tra không dựa vào cảm giác; dưới 8 câu "có" thì sửa trước khi sang Chương 4)</w:t>
+      </w:r>
+    </w:p>
+    <w:p>
+      <w:pPr>
+        <w:keepNext/>
+        <w:spacing w:after="80"/>
+      </w:pPr>
+      <w:r>
+        <w:rPr>
+          <w:b/>
+          <w:i/>
+          <w:color w:val="595959"/>
+          <w:sz w:val="22"/>
+        </w:rPr>
+        <w:t xml:space="preserve">Đối chiếu sách: </w:t>
+      </w:r>
+      <w:r>
+        <w:rPr>
+          <w:i/>
+          <w:color w:val="595959"/>
+          <w:sz w:val="22"/>
+        </w:rPr>
         <w:t>Hướng dẫn Chuyên đề và Khóa luận tốt nghiệp, Chương 3, mục 6 đến 8, Bảng 25 và 26</w:t>
       </w:r>
     </w:p>
@@ -6067,7 +7289,7 @@
           <w:b/>
           <w:color w:val="CC0000"/>
         </w:rPr>
-        <w:t>(Slide 65: Bản đồ đọc sách cho Chương 4: mỗi mục thực hiện đúng một bước đã hứa ở Chương 3)</w:t>
+        <w:t>(Slide 78: Bản đồ đọc sách cho Chương 4: mỗi mục thực hiện đúng một bước đã hứa ở Chương 3)</w:t>
       </w:r>
     </w:p>
     <w:p>
@@ -6161,7 +7383,7 @@
           <w:b/>
           <w:color w:val="CC0000"/>
         </w:rPr>
-        <w:t>(Slide 66: Chương 4 kiểm tra từng lớp; lớp sau chỉ có giá trị khi lớp trước đạt)</w:t>
+        <w:t>(Slide 79: Chương 4 kiểm tra từng lớp; lớp sau chỉ có giá trị khi lớp trước đạt)</w:t>
       </w:r>
     </w:p>
     <w:p>
@@ -6255,7 +7477,7 @@
           <w:b/>
           <w:color w:val="CC0000"/>
         </w:rPr>
-        <w:t>(Slide 67: Một bảng số chưa phải là kết quả; kết quả là đoạn văn đi qua bốn bước Đọc, So sánh, Ý nghĩa, Liên hệ)</w:t>
+        <w:t>(Slide 80: Một bảng số chưa phải là kết quả; kết quả là đoạn văn đi qua bốn bước Đọc, So sánh, Ý nghĩa, Liên hệ)</w:t>
       </w:r>
     </w:p>
     <w:p>
@@ -6349,7 +7571,7 @@
           <w:b/>
           <w:color w:val="CC0000"/>
         </w:rPr>
-        <w:t>(Slide 68: Khách hàng thấy rõ lợi ích nhưng còn dè dặt về an toàn: niềm tin và ảnh hưởng xã hội chỉ nhỉnh hơn mức trung lập)</w:t>
+        <w:t>(Slide 81: Khách hàng thấy rõ lợi ích nhưng còn dè dặt về an toàn: niềm tin và ảnh hưởng xã hội chỉ nhỉnh hơn mức trung lập)</w:t>
       </w:r>
     </w:p>
     <w:p>
@@ -6454,7 +7676,7 @@
           <w:b/>
           <w:color w:val="CC0000"/>
         </w:rPr>
-        <w:t>(Slide 69: Cả chín thang đo của hai đề tài đạt ngưỡng 0,7, nên toàn bộ câu hỏi được giữ lại)</w:t>
+        <w:t>(Slide 82: Cả chín thang đo của hai đề tài đạt ngưỡng 0,7, nên toàn bộ câu hỏi được giữ lại)</w:t>
       </w:r>
     </w:p>
     <w:p>
@@ -6559,7 +7781,7 @@
           <w:b/>
           <w:color w:val="CC0000"/>
         </w:rPr>
-        <w:t>(Slide 70: Cả bốn biến tương quan cùng chiều với ý định sử dụng nhưng tương quan chưa phải là tác động)</w:t>
+        <w:t>(Slide 83: Cả bốn biến tương quan cùng chiều với ý định sử dụng nhưng tương quan chưa phải là tác động)</w:t>
       </w:r>
     </w:p>
     <w:p>
@@ -6664,7 +7886,7 @@
           <w:b/>
           <w:color w:val="CC0000"/>
         </w:rPr>
-        <w:t>(Slide 71: Bốn biến giải thích 53,7% khác biệt về ý định sử dụng; sự hữu ích mạnh nhất, sự dễ sử dụng không có ý nghĩa)</w:t>
+        <w:t>(Slide 84: Bốn biến giải thích 53,7% khác biệt về ý định sử dụng; sự hữu ích mạnh nhất, sự dễ sử dụng không có ý nghĩa)</w:t>
       </w:r>
     </w:p>
     <w:p>
@@ -6769,7 +7991,7 @@
           <w:b/>
           <w:color w:val="CC0000"/>
         </w:rPr>
-        <w:t>(Slide 72: Báo cáo ba loại bằng chứng: P-value nói có ngẫu nhiên hay không, khoảng tin cậy và độ lớn tác động nói mạnh đến đâu)</w:t>
+        <w:t>(Slide 85: Báo cáo ba loại bằng chứng: P-value nói có ngẫu nhiên hay không, khoảng tin cậy và độ lớn tác động nói mạnh đến đâu)</w:t>
       </w:r>
     </w:p>
     <w:p>
@@ -6863,7 +8085,7 @@
           <w:b/>
           <w:color w:val="CC0000"/>
         </w:rPr>
-        <w:t>(Slide 73: Giả thuyết được ủng hộ khi thỏa đồng thời hai điều kiện: đúng dấu dự đoán và P-value nhỏ hơn 0,05)</w:t>
+        <w:t>(Slide 86: Giả thuyết được ủng hộ khi thỏa đồng thời hai điều kiện: đúng dấu dự đoán và P-value nhỏ hơn 0,05)</w:t>
       </w:r>
     </w:p>
     <w:p>
@@ -6968,7 +8190,7 @@
           <w:b/>
           <w:color w:val="CC0000"/>
         </w:rPr>
-        <w:t>(Slide 74: Điểm thái độ nhân viên toàn mẫu cao nhất nhưng 25 phụ huynh nêu chủ đề thái độ chỉ chấm 3,28)</w:t>
+        <w:t>(Slide 87: Điểm thái độ nhân viên toàn mẫu cao nhất nhưng 25 phụ huynh nêu chủ đề thái độ chỉ chấm 3,28)</w:t>
       </w:r>
     </w:p>
     <w:p>
@@ -7073,7 +8295,7 @@
           <w:b/>
           <w:color w:val="CC0000"/>
         </w:rPr>
-        <w:t>(Slide 75: Thảo luận đặt kết quả cạnh lý thuyết gốc và cạnh nghiên cứu trước, rồi giải thích vì sao giống hoặc khác)</w:t>
+        <w:t>(Slide 88: Thảo luận đặt kết quả cạnh lý thuyết gốc và cạnh nghiên cứu trước, rồi giải thích vì sao giống hoặc khác)</w:t>
       </w:r>
     </w:p>
     <w:p>
@@ -7178,7 +8400,7 @@
           <w:b/>
           <w:color w:val="CC0000"/>
         </w:rPr>
-        <w:t>(Slide 76: Đoạn thảo luận mẫu đi theo trình tự: kết quả khớp, kết quả khác, giải thích, củng cố, đóng góp, hướng tiếp theo)</w:t>
+        <w:t>(Slide 89: Đoạn thảo luận mẫu đi theo trình tự: kết quả khớp, kết quả khác, giải thích, củng cố, đóng góp, hướng tiếp theo)</w:t>
       </w:r>
     </w:p>
     <w:p>
@@ -7272,7 +8494,7 @@
           <w:b/>
           <w:color w:val="CC0000"/>
         </w:rPr>
-        <w:t>(Slide 77: H2 không được ủng hộ là phần thảo luận có giá trị nhất nếu được giải thích bằng số liệu và lý thuyết)</w:t>
+        <w:t>(Slide 90: H2 không được ủng hộ là phần thảo luận có giá trị nhất nếu được giải thích bằng số liệu và lý thuyết)</w:t>
       </w:r>
     </w:p>
     <w:p>
@@ -7377,7 +8599,7 @@
           <w:b/>
           <w:color w:val="CC0000"/>
         </w:rPr>
-        <w:t>(Slide 78: Kết quả khác dự đoán không phải lỗi; lỗi chỉ xuất hiện khi giấu kết quả, sửa dữ liệu hoặc thêm bớt biến cho "đẹp")</w:t>
+        <w:t>(Slide 91: Kết quả khác dự đoán không phải lỗi; lỗi chỉ xuất hiện khi giấu kết quả, sửa dữ liệu hoặc thêm bớt biến cho "đẹp")</w:t>
       </w:r>
     </w:p>
     <w:p>
@@ -7482,7 +8704,7 @@
           <w:b/>
           <w:color w:val="CC0000"/>
         </w:rPr>
-        <w:t>(Slide 79: Cả hai loại nghiên cứu đều quay về câu hỏi ở Chương 1; khác nhau ở loại bằng chứng được trình bày)</w:t>
+        <w:t>(Slide 92: Cả hai loại nghiên cứu đều quay về câu hỏi ở Chương 1; khác nhau ở loại bằng chứng được trình bày)</w:t>
       </w:r>
     </w:p>
     <w:p>
@@ -7576,7 +8798,7 @@
           <w:b/>
           <w:color w:val="CC0000"/>
         </w:rPr>
-        <w:t>(Slide 80: Đoạn giới thiệu nói chương sẽ trình bày gì và không nêu kết quả; đoạn kết luận nói giả thuyết nào được trả lời và dẫn sang Chương 5)</w:t>
+        <w:t>(Slide 93: Đoạn giới thiệu nói chương sẽ trình bày gì và không nêu kết quả; đoạn kết luận nói giả thuyết nào được trả lời và dẫn sang Chương 5)</w:t>
       </w:r>
     </w:p>
     <w:p>
@@ -7670,7 +8892,7 @@
           <w:b/>
           <w:color w:val="CC0000"/>
         </w:rPr>
-        <w:t>(Slide 81: Bảy lỗi của Chương 4, trong đó nhầm B với β và kết luận "ủng hộ" khi hệ số ngược dấu là hai lỗi sai về phương pháp)</w:t>
+        <w:t>(Slide 94: Bảy lỗi của Chương 4, trong đó nhầm B với β và kết luận "ủng hộ" khi hệ số ngược dấu là hai lỗi sai về phương pháp)</w:t>
       </w:r>
     </w:p>
     <w:p>
@@ -7805,7 +9027,7 @@
           <w:b/>
           <w:color w:val="CC0000"/>
         </w:rPr>
-        <w:t>(Slide 83: Bản đồ đọc sách cho Chương 5 và Kết luận: không có con số mới, chỉ có câu trả lời và quyết định)</w:t>
+        <w:t>(Slide 96: Bản đồ đọc sách cho Chương 5 và Kết luận: không có con số mới, chỉ có câu trả lời và quyết định)</w:t>
       </w:r>
     </w:p>
     <w:p>
@@ -7893,7 +9115,7 @@
           <w:b/>
           <w:color w:val="CC0000"/>
         </w:rPr>
-        <w:t>(Slide 84: Chương 5 đi từ điều đã biết chắc, đến điều nên làm, đến điều còn chưa biết)</w:t>
+        <w:t>(Slide 97: Chương 5 đi từ điều đã biết chắc, đến điều nên làm, đến điều còn chưa biết)</w:t>
       </w:r>
     </w:p>
     <w:p>
@@ -7987,7 +9209,7 @@
           <w:b/>
           <w:color w:val="CC0000"/>
         </w:rPr>
-        <w:t>(Slide 85: Mỗi câu hỏi ở Chương 1 được chép nguyên văn và trả lời thẳng ngay ở câu đầu tiên)</w:t>
+        <w:t>(Slide 98: Mỗi câu hỏi ở Chương 1 được chép nguyên văn và trả lời thẳng ngay ở câu đầu tiên)</w:t>
       </w:r>
     </w:p>
     <w:p>
@@ -8092,7 +9314,7 @@
           <w:b/>
           <w:color w:val="CC0000"/>
         </w:rPr>
-        <w:t>(Slide 86: Niềm tin quan trọng nhưng bị đánh giá thấp, nên là ưu tiên số một của Ngân hàng X)</w:t>
+        <w:t>(Slide 99: Niềm tin quan trọng nhưng bị đánh giá thấp, nên là ưu tiên số một của Ngân hàng X)</w:t>
       </w:r>
     </w:p>
     <w:p>
@@ -8186,7 +9408,7 @@
           <w:b/>
           <w:color w:val="CC0000"/>
         </w:rPr>
-        <w:t>(Slide 87: Ma trận xếp quy trình hành chính vào ưu tiên thấp nhưng phán đoán có căn cứ kéo nó lên)</w:t>
+        <w:t>(Slide 100: Ma trận xếp quy trình hành chính vào ưu tiên thấp nhưng phán đoán có căn cứ kéo nó lên)</w:t>
       </w:r>
     </w:p>
     <w:p>
@@ -8280,7 +9502,7 @@
           <w:b/>
           <w:color w:val="CC0000"/>
         </w:rPr>
-        <w:t>(Slide 88: Hàm ý đạt có năm phần: kết quả, hàm ý, hành động cụ thể, tác động mong đợi, điều kiện thực hiện)</w:t>
+        <w:t>(Slide 101: Hàm ý đạt có năm phần: kết quả, hàm ý, hành động cụ thể, tác động mong đợi, điều kiện thực hiện)</w:t>
       </w:r>
     </w:p>
     <w:p>
@@ -8385,7 +9607,7 @@
           <w:b/>
           <w:color w:val="CC0000"/>
         </w:rPr>
-        <w:t>(Slide 89: Mỗi hạn chế nêu rõ ảnh hưởng đến cách hiểu kết quả và sinh ra đúng một hướng nghiên cứu tiếp theo)</w:t>
+        <w:t>(Slide 102: Mỗi hạn chế nêu rõ ảnh hưởng đến cách hiểu kết quả và sinh ra đúng một hướng nghiên cứu tiếp theo)</w:t>
       </w:r>
     </w:p>
     <w:p>
@@ -8490,7 +9712,7 @@
           <w:b/>
           <w:color w:val="CC0000"/>
         </w:rPr>
-        <w:t>(Slide 90: Kết luận, đóng góp, hàm ý, kiến nghị và hạn chế trả lời năm câu hỏi khác nhau)</w:t>
+        <w:t>(Slide 103: Kết luận, đóng góp, hàm ý, kiến nghị và hạn chế trả lời năm câu hỏi khác nhau)</w:t>
       </w:r>
     </w:p>
     <w:p>
@@ -8595,7 +9817,7 @@
           <w:b/>
           <w:color w:val="CC0000"/>
         </w:rPr>
-        <w:t>(Slide 91: Tóm tắt là cả khóa luận trong một đoạn sáu phần, có con số chủ chốt, viết sau cùng)</w:t>
+        <w:t>(Slide 104: Tóm tắt là cả khóa luận trong một đoạn sáu phần, có con số chủ chốt, viết sau cùng)</w:t>
       </w:r>
     </w:p>
     <w:p>
@@ -8689,7 +9911,7 @@
           <w:b/>
           <w:color w:val="CC0000"/>
         </w:rPr>
-        <w:t>(Slide 92: Kết luận chung khép vòng trong năm đoạn ngắn: vấn đề, cách làm, phát hiện, đóng góp, hạn chế)</w:t>
+        <w:t>(Slide 105: Kết luận chung khép vòng trong năm đoạn ngắn: vấn đề, cách làm, phát hiện, đóng góp, hạn chế)</w:t>
       </w:r>
     </w:p>
     <w:p>
@@ -8783,7 +10005,7 @@
           <w:b/>
           <w:color w:val="CC0000"/>
         </w:rPr>
-        <w:t>(Slide 93: Năm lỗi của Chương 5 đều có cùng gốc: Chương 5 không thêm được gì so với Chương 4)</w:t>
+        <w:t>(Slide 106: Năm lỗi của Chương 5 đều có cùng gốc: Chương 5 không thêm được gì so với Chương 4)</w:t>
       </w:r>
     </w:p>
     <w:p>
@@ -8912,7 +10134,7 @@
           <w:b/>
           <w:color w:val="CC0000"/>
         </w:rPr>
-        <w:t>(Slide 95: Bản đồ đọc sách cho phần hoàn thiện: bốn chương cuối của sách không tạo kết quả mới nhưng quyết định kết quả có được tin)</w:t>
+        <w:t>(Slide 108: Bản đồ đọc sách cho phần hoàn thiện: bốn chương cuối của sách không tạo kết quả mới nhưng quyết định kết quả có được tin)</w:t>
       </w:r>
     </w:p>
     <w:p>
@@ -9006,7 +10228,7 @@
           <w:b/>
           <w:color w:val="CC0000"/>
         </w:rPr>
-        <w:t>(Slide 96: Trích dẫn và danh mục đi thành cặp; trình bày thống nhất đến từ Styles, không từ chỉnh tay)</w:t>
+        <w:t>(Slide 109: Trích dẫn và danh mục đi thành cặp; trình bày thống nhất đến từ Styles, không từ chỉnh tay)</w:t>
       </w:r>
     </w:p>
     <w:p>
@@ -9100,7 +10322,7 @@
           <w:b/>
           <w:color w:val="CC0000"/>
         </w:rPr>
-        <w:t>(Slide 97: Mỗi loại nguồn có một khuôn mẫu APA 7; danh mục và trích dẫn trong bài phải khớp hai chiều)</w:t>
+        <w:t>(Slide 110: Mỗi loại nguồn có một khuôn mẫu APA 7; danh mục và trích dẫn trong bài phải khớp hai chiều)</w:t>
       </w:r>
     </w:p>
     <w:p>
@@ -9194,7 +10416,7 @@
           <w:b/>
           <w:color w:val="CC0000"/>
         </w:rPr>
-        <w:t>(Slide 98: Phần đầu theo mẫu của trường; định dạng cài một lần bằng Styles; mọi số liệu định dạng phải đối chiếu quy định của trường)</w:t>
+        <w:t>(Slide 111: Phần đầu theo mẫu của trường; định dạng cài một lần bằng Styles; mọi số liệu định dạng phải đối chiếu quy định của trường)</w:t>
       </w:r>
     </w:p>
     <w:p>
@@ -9288,7 +10510,7 @@
           <w:b/>
           <w:color w:val="CC0000"/>
         </w:rPr>
-        <w:t>(Slide 99: Tỷ lệ trùng lặp là con số cần đọc và giải thích; nó không tự chứng minh có hay không có đạo văn)</w:t>
+        <w:t>(Slide 112: Tỷ lệ trùng lặp là con số cần đọc và giải thích; nó không tự chứng minh có hay không có đạo văn)</w:t>
       </w:r>
     </w:p>
     <w:p>
@@ -9382,7 +10604,7 @@
           <w:b/>
           <w:color w:val="CC0000"/>
         </w:rPr>
-        <w:t>(Slide 100: Kiểm tra theo sáu cặp điểm nối, vì lỗi mâu thuẫn nằm ở chỗ nối giữa các chương chứ không nằm trong từng chương)</w:t>
+        <w:t>(Slide 113: Kiểm tra theo sáu cặp điểm nối, vì lỗi mâu thuẫn nằm ở chỗ nối giữa các chương chứ không nằm trong từng chương)</w:t>
       </w:r>
     </w:p>
     <w:p>
@@ -9476,7 +10698,7 @@
           <w:b/>
           <w:color w:val="CC0000"/>
         </w:rPr>
-        <w:t>(Slide 101: Các lỗi nghiêm trọng có thể làm khóa luận không đạt dù phần khác làm tốt; hai lỗi đầu là vi phạm đạo đức)</w:t>
+        <w:t>(Slide 114: Các lỗi nghiêm trọng có thể làm khóa luận không đạt dù phần khác làm tốt; hai lỗi đầu là vi phạm đạo đức)</w:t>
       </w:r>
     </w:p>
     <w:p>
@@ -9570,7 +10792,7 @@
           <w:b/>
           <w:color w:val="CC0000"/>
         </w:rPr>
-        <w:t>(Slide 102: Tiêu đề slide là một câu kết luận, thân slide là bằng chứng: người nghe hiểu tốt hơn và nhớ lâu hơn)</w:t>
+        <w:t>(Slide 115: Tiêu đề slide là một câu kết luận, thân slide là bằng chứng: người nghe hiểu tốt hơn và nhớ lâu hơn)</w:t>
       </w:r>
     </w:p>
     <w:p>
@@ -9675,7 +10897,7 @@
           <w:b/>
           <w:color w:val="CC0000"/>
         </w:rPr>
-        <w:t>(Slide 103: Mười hai phút, mười hai slide: phần lớn thời gian dành cho kết quả, thảo luận và hàm ý)</w:t>
+        <w:t>(Slide 116: Mười hai phút, mười hai slide: phần lớn thời gian dành cho kết quả, thảo luận và hàm ý)</w:t>
       </w:r>
     </w:p>
     <w:p>
@@ -9769,7 +10991,7 @@
           <w:b/>
           <w:color w:val="CC0000"/>
         </w:rPr>
-        <w:t>(Slide 104: Trả lời bằng bốn bước và phân biệt ba loại chất vấn: lựa chọn phương pháp, lỗi thật, điều chưa biết)</w:t>
+        <w:t>(Slide 117: Trả lời bằng bốn bước và phân biệt ba loại chất vấn: lựa chọn phương pháp, lỗi thật, điều chưa biết)</w:t>
       </w:r>
     </w:p>
     <w:p>
@@ -9868,7 +11090,7 @@
           <w:b/>
           <w:color w:val="CC0000"/>
         </w:rPr>
-        <w:t>(Slide 105: Phần lớn câu hỏi của Hội đồng rơi vào năm nhóm và căn cứ trả lời nằm sẵn ở một chương cụ thể)</w:t>
+        <w:t>(Slide 118: Phần lớn câu hỏi của Hội đồng rơi vào năm nhóm và căn cứ trả lời nằm sẵn ở một chương cụ thể)</w:t>
       </w:r>
     </w:p>
     <w:p>
@@ -9962,7 +11184,7 @@
           <w:b/>
           <w:color w:val="CC0000"/>
         </w:rPr>
-        <w:t>(Slide 106: Khóa luận đạt là khóa luận khép vòng: câu hỏi ở trang đầu được trả lời ở trang cuối bằng dữ liệu đáng tin)</w:t>
+        <w:t>(Slide 119: Khóa luận đạt là khóa luận khép vòng: câu hỏi ở trang đầu được trả lời ở trang cuối bằng dữ liệu đáng tin)</w:t>
       </w:r>
     </w:p>
     <w:p>

</xml_diff>

<commit_message>
Viết lại sách hướng dẫn theo lối viết kiểu Nhật và đồng bộ Core Slide 2
- Tái cấu trúc sách: Phần 0 (cách dùng sách, bảy nguyên tắc viết, làm việc với GVHD, kế hoạch tám tuần) và Phần 1 đến Phần 10; gộp Phần mở đầu với Chương 1
- Mỗi mục theo một khuôn: KẾT LUẬN, bảng mục đích và thời gian, năm khối, POINT; kỹ thuật và thực hành đặt ngay sau mục dùng đến
- Vẽ lại 67 sơ đồ và biểu đồ theo lối sách giáo khoa hai màu, thêm hai hình mới; hình và bảng đánh số theo phần
- Thêm mục lục, danh mục hình, danh mục bảng, tài liệu tham khảo của sách
- Đổi toàn bộ dòng đối chiếu sách, số hình, số bảng trong Core Slide 2 và bài nói theo cấu trúc mới

Co-Authored-By: Claude Opus 5.5 <noreply@anthropic.com>
Claude-Session: https://claude.ai/code/session_018fvDs5YVdMu929akP2CKw7
</commit_message>
<xml_diff>
--- a/Core_Slide_2_HD2_bai_noi_chi_tiet.docx
+++ b/Core_Slide_2_HD2_bai_noi_chi_tiet.docx
@@ -68,7 +68,7 @@
           <w:color w:val="595959"/>
           <w:sz w:val="24"/>
         </w:rPr>
-        <w:t>Mọi con số của Ngân hàng X và Trường Tiểu học Y lấy từ ba file Excel thực hành; đây là dữ liệu giả định dùng cho mục đích sư phạm.</w:t>
+        <w:t>Mọi con số của Ngân hàng X và Trường Tiểu học Y lấy từ các file Excel thực hành; đây là dữ liệu giả định dùng cho mục đích sư phạm. Số hình, số bảng và tên mục ghi theo sách đã tái cấu trúc (Phần 0 đến Phần 10; Hình 3-5 là hình thứ năm của Phần 3).</w:t>
       </w:r>
     </w:p>
     <w:p>
@@ -104,7 +104,7 @@
           <w:color w:val="595959"/>
           <w:sz w:val="22"/>
         </w:rPr>
-        <w:t>Nguồn: Hướng dẫn Chuyên đề và Khóa luận tốt nghiệp; ba file Excel thực hành đi kèm</w:t>
+        <w:t>Nguồn: Hướng dẫn Chuyên đề và Khóa luận tốt nghiệp; bốn file Excel thực hành đi kèm</w:t>
       </w:r>
     </w:p>
     <w:p>
@@ -198,7 +198,7 @@
           <w:color w:val="595959"/>
           <w:sz w:val="22"/>
         </w:rPr>
-        <w:t>Hướng dẫn Chuyên đề và Khóa luận tốt nghiệp (Lời nói đầu)</w:t>
+        <w:t>Hướng dẫn Chuyên đề và Khóa luận tốt nghiệp (Phần 0)</w:t>
       </w:r>
     </w:p>
     <w:p>
@@ -286,7 +286,7 @@
           <w:color w:val="595959"/>
           <w:sz w:val="24"/>
         </w:rPr>
-        <w:t>Lời nói đầu; Hình 1, 24; Bảng 1</w:t>
+        <w:t>Phần 0; Hình 0-1, 0-2 và 2-2; Bảng 0-1</w:t>
       </w:r>
     </w:p>
     <w:p>
@@ -427,35 +427,35 @@
         <w:rPr>
           <w:b w:val="0"/>
         </w:rPr>
-        <w:t>Ở cuối Core Slide 1 có hai slide vạch ranh giới giữa hai buổi. Slide 93 có tên "Mười nội dung chuyên sâu chưa học ở Core Slide 1". Slide 94 có tên "Năm kỹ năng thực hành sẽ học ở Core Slide 2". Thầy đọc lại để các em khỏi phải mở file cũ. Mười nội dung là: công thức thống kê; thao tác phần mềm xử lý số liệu; hồi quy; kiểm định độ tin cậy thang đo; thiết kế bảng hỏi chi tiết; cách đọc bài báo khoa học; bảng tra APA theo từng loại tài liệu; quy định trình bày bảng, hình, công thức; mười tiêu chí chấm chi tiết; kế hoạch chi tiết từng tuần trong tám tuần. Năm kỹ năng là: viết đoạn văn học thuật; làm sạch dữ liệu; diễn giải bảng kết quả; tìm kiếm tài liệu; trình bày và bảo vệ. Slide này là bảng đối chiếu: mỗi lời hẹn nằm ở đâu trong sách và được dạy ở phần nào hôm nay. Thầy đọc nhanh từng dòng để các em đánh dấu. Công thức thống kê và kiểm định độ tin cậy nằm ở Chương 3 mục 3.6.2 và Chương 4 mục 4.2.1. Thao tác phần mềm và hồi quy nằm ở Chương 3 mục 3.5 và 3.6.4, kèm hai sheet giải thích công thức và cách đọc hồi quy. Thiết kế bảng hỏi nằm ở mục 3.4.2 và 3.4.3.</w:t>
-      </w:r>
-    </w:p>
-    <w:p>
-      <w:pPr>
-        <w:spacing w:after="160" w:line="276" w:lineRule="auto"/>
-      </w:pPr>
-      <w:r>
-        <w:rPr>
-          <w:b w:val="0"/>
-        </w:rPr>
-        <w:t>Cách đọc bài báo và tìm kiếm tài liệu nằm rải ở ba chỗ: Hình 18 và Hình 19 của Chương 1, mục tổng quan và mục kỹ thuật tổng hợp của Chương 2 và mục học từ luận án tham khảo. Bảng tra APA nằm ở Bảng 7 và chương Tài liệu tham khảo. Viết đoạn văn học thuật nằm ở mục kỹ thuật hành văn của Phần mở đầu và hai đoạn văn mẫu được mổ xẻ từng câu ở Chương 2. Làm sạch dữ liệu và diễn giải bảng kết quả nằm ở Chương 3 và Chương 4. Trình bày và bảo vệ nằm ở chương cuối.</w:t>
-      </w:r>
-    </w:p>
-    <w:p>
-      <w:pPr>
-        <w:spacing w:after="160" w:line="276" w:lineRule="auto"/>
-      </w:pPr>
-      <w:r>
-        <w:rPr>
-          <w:b w:val="0"/>
-        </w:rPr>
-        <w:t xml:space="preserve">Dòng tô hồng là chỗ thầy nói thẳng với các em: sách không có một bảng tiêu chí chấm chi tiết, cũng không có kế hoạch theo từng tuần. Nhưng sách có hai nguyên liệu: dòng "Thế nào là đủ" ở cuối mỗi mục và dòng "Thời gian gợi ý" ở đầu mỗi mục. Vì vậy bốn slide ngay sau đây ghép khung của Core Slide 1 với hai nguyên liệu đó: hai slide kế hoạch từng tuần và hai slide tiêu chí tự kiểm tra chi tiết. </w:t>
-      </w:r>
-      <w:r>
-        <w:rPr>
-          <w:b/>
-        </w:rPr>
-        <w:t>Hai nội dung sách không có bảng riêng: bốn slide ngay sau ghép khung của Core Slide 1 với "Thời gian gợi ý" và "Thế nào là đủ" của sách.</w:t>
+        <w:t>Ở cuối Core Slide 1 có hai slide vạch ranh giới giữa hai buổi. Slide 93 có tên "Mười nội dung chuyên sâu chưa học ở Core Slide 1". Slide 94 có tên "Năm kỹ năng thực hành sẽ học ở Core Slide 2". Thầy đọc lại để các em khỏi phải mở file cũ. Mười nội dung là: công thức thống kê; thao tác phần mềm xử lý số liệu; hồi quy; kiểm định độ tin cậy thang đo; thiết kế bảng hỏi chi tiết; cách đọc bài báo khoa học; bảng tra APA theo từng loại tài liệu; quy định trình bày bảng, hình, công thức; mười tiêu chí chấm chi tiết; kế hoạch chi tiết từng tuần trong tám tuần. Năm kỹ năng là: viết đoạn văn học thuật; làm sạch dữ liệu; diễn giải bảng kết quả; tìm kiếm tài liệu; trình bày và bảo vệ. Slide này là bảng đối chiếu: mỗi lời hẹn nằm ở đâu trong sách và được dạy ở phần nào hôm nay. Thầy đọc nhanh từng dòng để các em đánh dấu. Công thức thống kê và kiểm định độ tin cậy nằm ở Phần 3, Mục 3.6.2 và Phần 4, Mục 4.2.1. Thao tác phần mềm và hồi quy nằm ở Phần 3, Mục 3.5 và Mục 3.6.4, kèm hai sheet giải thích công thức và cách đọc hồi quy. Thiết kế bảng hỏi nằm ở mục 3.4.2 và 3.4.3.</w:t>
+      </w:r>
+    </w:p>
+    <w:p>
+      <w:pPr>
+        <w:spacing w:after="160" w:line="276" w:lineRule="auto"/>
+      </w:pPr>
+      <w:r>
+        <w:rPr>
+          <w:b w:val="0"/>
+        </w:rPr>
+        <w:t>Cách đọc bài báo và tìm kiếm tài liệu nằm rải ở ba chỗ: Hình 1-9 và Hình 1-10 của Chương 1, mục tổng quan và mục kỹ thuật tổng hợp của Chương 2 và mục học từ luận án tham khảo. Bảng tra APA nằm ở Bảng 2-8 và Phần 7. Viết đoạn văn học thuật nằm ở mục kỹ thuật hành văn của Phần mở đầu và hai đoạn văn mẫu được mổ xẻ từng câu ở Chương 2. Làm sạch dữ liệu và diễn giải bảng kết quả nằm ở Chương 3 và Chương 4. Trình bày và bảo vệ nằm ở chương cuối.</w:t>
+      </w:r>
+    </w:p>
+    <w:p>
+      <w:pPr>
+        <w:spacing w:after="160" w:line="276" w:lineRule="auto"/>
+      </w:pPr>
+      <w:r>
+        <w:rPr>
+          <w:b w:val="0"/>
+        </w:rPr>
+        <w:t xml:space="preserve">Dòng tô hồng là chỗ thầy nói thẳng với các em: sách không có một bảng tiêu chí chấm chi tiết, cũng không có kế hoạch theo từng tuần. Nhưng sách có hai nguyên liệu: khối "Tiêu chí hoàn thành" ở cuối mỗi mục và dòng "Thời gian gợi ý" ở đầu mỗi mục. Vì vậy bốn slide ngay sau đây ghép khung của Core Slide 1 với hai nguyên liệu đó: hai slide kế hoạch từng tuần và hai slide tiêu chí tự kiểm tra chi tiết. </w:t>
+      </w:r>
+      <w:r>
+        <w:rPr>
+          <w:b/>
+        </w:rPr>
+        <w:t>Hai nội dung sách không có bảng riêng: bốn slide ngay sau ghép khung của Core Slide 1 với "Thời gian gợi ý" và "Tiêu chí hoàn thành" của sách.</w:t>
       </w:r>
     </w:p>
     <w:p>
@@ -474,7 +474,7 @@
         <w:rPr>
           <w:i/>
         </w:rPr>
-        <w:t>Giả sử có bạn hỏi: "Thầy ơi, sách có bảng chấm điểm không để em làm cho đủ điểm?" Câu trả lời là: bảng chấm do khoa ban hành, sách không thay được. Nhưng nếu em trả lời "có" được cả mười câu ở Bảng 26 và đánh dấu đủ checklist cuối mỗi chương, thì phần lớn tiêu chí chấm em đã tự kiểm tra rồi.</w:t>
+        <w:t>Giả sử có bạn hỏi: "Thầy ơi, sách có bảng chấm điểm không để em làm cho đủ điểm?" Câu trả lời là: bảng chấm do khoa ban hành, sách không thay được. Nhưng nếu em trả lời "có" được cả mười câu ở Bảng 3-27 và đánh dấu đủ checklist cuối mỗi chương, thì phần lớn tiêu chí chấm em đã tự kiểm tra rồi.</w:t>
       </w:r>
     </w:p>
     <w:p>
@@ -532,7 +532,7 @@
         <w:rPr>
           <w:b w:val="0"/>
         </w:rPr>
-        <w:t>Bảng này ghép khung đó với dòng "Thời gian gợi ý" của từng mục trong sách. [Suy luận] Đây là cách ghép của thầy, sách không có bảng theo tuần. Thầy đọc tuần 2 làm ví dụ: việc chính là chốt đề tài và viết mục tiêu, câu hỏi trước, đúng lời khuyên ở mục 2.5 phần mở đầu của sách; phải xong trước là đề tài được giảng viên xác nhận; việc song song là tìm số liệu bối cảnh có nguồn; rủi ro nếu chậm là mọi chương sau không có lõi để bám.</w:t>
+        <w:t>Bảng này ghép khung đó với dòng "Thời gian gợi ý" của từng mục trong sách. [Suy luận] Đây là cách ghép của thầy, sách không có bảng theo tuần. Thầy đọc tuần 2 làm ví dụ: việc chính là chốt đề tài và viết mục tiêu, câu hỏi trước, đúng lời khuyên ở mục C của Phần 1 trong sách; phải xong trước là đề tài được giảng viên xác nhận; việc song song là tìm số liệu bối cảnh có nguồn; rủi ro nếu chậm là mọi chương sau không có lõi để bám.</w:t>
       </w:r>
     </w:p>
     <w:p>
@@ -604,7 +604,7 @@
           <w:color w:val="595959"/>
           <w:sz w:val="22"/>
         </w:rPr>
-        <w:t>Core Slide 1, Phần XIII (Slide 88 đến 91); Hướng dẫn Chuyên đề và Khóa luận tốt nghiệp, dòng "Thời gian gợi ý" của từng mục; Chương 3 mục 3.5.1 (2 đến 3 tuần thu thập)</w:t>
+        <w:t>Core Slide 1, Phần XIII (Slide 88 đến 91); Hướng dẫn Chuyên đề và Khóa luận tốt nghiệp, dòng "Thời gian gợi ý" của từng mục; Phần 3, Mục 3.5.1 (2 đến 3 tuần thu thập)</w:t>
       </w:r>
     </w:p>
     <w:p>
@@ -637,7 +637,7 @@
         <w:rPr>
           <w:b w:val="0"/>
         </w:rPr>
-        <w:t xml:space="preserve">Tuần 8 có ô "■" vì là mốc bản thảo cuối. Việc chính của tuần 8 ngoài Chương 5 là kiểm tra sáu cặp điểm nối ở Bảng 54 của sách, ví dụ con số trong tóm tắt có khớp Chương 4 không. </w:t>
+        <w:t xml:space="preserve">Tuần 8 có ô "■" vì là mốc bản thảo cuối. Việc chính của tuần 8 ngoài Chương 5 là kiểm tra sáu cặp điểm nối ở Bảng 9-1 của sách, ví dụ con số trong tóm tắt có khớp Chương 4 không. </w:t>
       </w:r>
       <w:r>
         <w:rPr>
@@ -681,7 +681,7 @@
           <w:b/>
           <w:color w:val="CC0000"/>
         </w:rPr>
-        <w:t>(Slide 8: Bốn nhóm tiêu chí đầu của Core Slide 1, tách thành tiêu chí nhỏ lấy từ dòng "Thế nào là đủ" của sách)</w:t>
+        <w:t>(Slide 8: Bốn nhóm tiêu chí đầu của Core Slide 1, tách thành tiêu chí nhỏ lấy từ khối "Tiêu chí hoàn thành" của sách)</w:t>
       </w:r>
     </w:p>
     <w:p>
@@ -704,7 +704,7 @@
           <w:color w:val="595959"/>
           <w:sz w:val="22"/>
         </w:rPr>
-        <w:t>Core Slide 1, Phần XI (Slide 76, 80, 81); Hướng dẫn Chuyên đề và Khóa luận tốt nghiệp, mục "Thế nào là đủ" các chương, Bảng 26</w:t>
+        <w:t>Core Slide 1, Phần XI (Slide 76, 80, 81); Hướng dẫn Chuyên đề và Khóa luận tốt nghiệp, khối "Tiêu chí hoàn thành" các chương, Bảng 3-27</w:t>
       </w:r>
     </w:p>
     <w:p>
@@ -726,7 +726,7 @@
         <w:rPr>
           <w:b w:val="0"/>
         </w:rPr>
-        <w:t>Slide này tách bốn nhóm đầu thành tiêu chí nhỏ. Các tiêu chí nhỏ không do thầy tự đặt mà lấy từ dòng "Thế nào là đủ" ở cuối mỗi mục của sách. Ví dụ nhóm 1: câu nêu vấn đề theo khung "Mặc dù, vẫn, Hệ quả là, Hiện chưa rõ" có số liệu có nguồn; đúng một mục tiêu tổng quát và hai đến bốn mục tiêu cụ thể bắt đầu bằng động từ hành động; số câu hỏi bằng số mục tiêu cụ thể. Cột cuối chỉ các em đến slide có ví dụ đạt và chưa đạt tương ứng trong buổi hôm nay.</w:t>
+        <w:t>Slide này tách bốn nhóm đầu thành tiêu chí nhỏ. Các tiêu chí nhỏ không do thầy tự đặt mà lấy từ khối "Tiêu chí hoàn thành" ở cuối mỗi mục của sách. Ví dụ nhóm 1: câu nêu vấn đề theo khung "Mặc dù, vẫn, Hệ quả là, Hiện chưa rõ" có số liệu có nguồn; đúng một mục tiêu tổng quát và hai đến bốn mục tiêu cụ thể bắt đầu bằng động từ hành động; số câu hỏi bằng số mục tiêu cụ thể. Cột cuối chỉ các em đến slide có ví dụ đạt và chưa đạt tương ứng trong buổi hôm nay.</w:t>
       </w:r>
     </w:p>
     <w:p>
@@ -798,7 +798,7 @@
           <w:color w:val="595959"/>
           <w:sz w:val="22"/>
         </w:rPr>
-        <w:t>Core Slide 1, Phần XI (Slide 81); Hướng dẫn Chuyên đề và Khóa luận tốt nghiệp, Chương 3 đến Bảo vệ, mục "Thế nào là đủ"</w:t>
+        <w:t>Core Slide 1, Phần XI (Slide 81); Hướng dẫn Chuyên đề và Khóa luận tốt nghiệp, Phần 3 đến Phần 10, khối "Tiêu chí hoàn thành"</w:t>
       </w:r>
     </w:p>
     <w:p>
@@ -820,7 +820,7 @@
         <w:rPr>
           <w:b w:val="0"/>
         </w:rPr>
-        <w:t>Nhóm 7, format và tiến độ: toàn bài dùng Styles, bảng và hình đánh số tự động, kiểm tra trên bản PDF sẽ nộp và đủ báo cáo tiến độ tám tuần như Phần XII của Core Slide 1. Nhóm 8, khả năng giải thích quyết định: mỗi lựa chọn ở Chương 3 có một câu "được chọn vì" và các em chuẩn bị ít nhất mười câu hỏi dự kiến có câu trả lời và số trang căn cứ, đúng như chương Bảo vệ của sách.</w:t>
+        <w:t>Nhóm 7, format và tiến độ: toàn bài dùng Styles, bảng và hình đánh số tự động, kiểm tra trên bản PDF sẽ nộp và đủ báo cáo tiến độ tám tuần như Phần XII của Core Slide 1. Nhóm 8, khả năng giải thích quyết định: mỗi lựa chọn ở Chương 3 có một câu "được chọn vì" và các em chuẩn bị ít nhất mười câu hỏi dự kiến có câu trả lời và số trang căn cứ, đúng như Phần 10 của sách.</w:t>
       </w:r>
     </w:p>
     <w:p>
@@ -892,40 +892,40 @@
           <w:color w:val="595959"/>
           <w:sz w:val="22"/>
         </w:rPr>
-        <w:t>Hướng dẫn Chuyên đề và Khóa luận tốt nghiệp, Lời nói đầu (Cách đọc và cách dùng sách; Quy ước đánh số)</w:t>
-      </w:r>
-    </w:p>
-    <w:p>
-      <w:pPr>
-        <w:spacing w:after="160" w:line="276" w:lineRule="auto"/>
-      </w:pPr>
-      <w:r>
-        <w:rPr>
-          <w:b w:val="0"/>
-        </w:rPr>
-        <w:t>Trước khi dùng sách, các em cần biết sách được viết theo một khuôn cố định. Lời nói đầu mô tả khuôn này: mỗi mục mở bằng Câu chốt và Thời gian gợi ý; tiếp theo là mục đích, bản chất, cách viết, ví dụ minh họa gồm ví dụ chưa đạt và ví dụ đạt kèm phân tích vì sao, lỗi thường gặp và cách tránh; mục kết thúc bằng "Thế nào là đủ" và "Tóm tắt 1 câu".</w:t>
-      </w:r>
-    </w:p>
-    <w:p>
-      <w:pPr>
-        <w:spacing w:after="160" w:line="276" w:lineRule="auto"/>
-      </w:pPr>
-      <w:r>
-        <w:rPr>
-          <w:b w:val="0"/>
-        </w:rPr>
-        <w:t>Thầy tô đỏ hai thành phần mà thầy muốn các em dùng nhiều nhất. Thành phần thứ tư, ví dụ chưa đạt và đạt, là chỗ các em học nhanh nhất: đặt đoạn mình viết cạnh hai ví dụ, xem nó giống bên nào. Thành phần thứ sáu, "Thế nào là đủ", là tiêu chí để các em biết khi nào dừng viết. Rất nhiều sinh viên viết dài vì không biết thế nào là đủ.</w:t>
-      </w:r>
-    </w:p>
-    <w:p>
-      <w:pPr>
-        <w:spacing w:after="160" w:line="276" w:lineRule="auto"/>
-      </w:pPr>
-      <w:r>
-        <w:rPr>
-          <w:b w:val="0"/>
-        </w:rPr>
-        <w:t xml:space="preserve">Hai quy ước nữa trong lời nói đầu. Một là cách đánh số: hình và bảng của sách đánh số liên tục như Hình 12, Bảng 30; hình và bảng trong ví dụ khóa luận đánh số theo chương như Bảng 4.3. Hai là tên mục trong phần hướng dẫn trùng với số mục trong khóa luận: "Mục 3.3.2. Phương pháp chọn mẫu" hướng dẫn viết đúng mục 3.3.2 của khóa luận. </w:t>
+        <w:t>Hướng dẫn Chuyên đề và Khóa luận tốt nghiệp, Phần 0, mục B (Cách dùng sách; Quy ước đánh số), Hình 0-2</w:t>
+      </w:r>
+    </w:p>
+    <w:p>
+      <w:pPr>
+        <w:spacing w:after="160" w:line="276" w:lineRule="auto"/>
+      </w:pPr>
+      <w:r>
+        <w:rPr>
+          <w:b w:val="0"/>
+        </w:rPr>
+        <w:t>Trước khi dùng sách, các em cần biết sách được viết theo một khuôn cố định, mô tả ở Phần 0. Mỗi mục mở bằng khung KẾT LUẬN và một bảng nhỏ ghi mục đích, thời gian gợi ý, file Excel cần mở. Tiếp theo là năm khối đánh số: một, hiểu đúng trước khi viết; hai, các bước thực hiện; ba, ví dụ chưa đạt và đạt kèm phân tích; bốn, lỗi thường gặp và cách tránh; năm, tiêu chí hoàn thành. Mục kết thúc bằng một câu POINT.</w:t>
+      </w:r>
+    </w:p>
+    <w:p>
+      <w:pPr>
+        <w:spacing w:after="160" w:line="276" w:lineRule="auto"/>
+      </w:pPr>
+      <w:r>
+        <w:rPr>
+          <w:b w:val="0"/>
+        </w:rPr>
+        <w:t>Thầy tô đỏ hai khối mà thầy muốn các em dùng nhiều nhất. Khối ví dụ chưa đạt và đạt là chỗ các em học nhanh nhất: đặt đoạn mình viết cạnh hai ví dụ, xem nó giống bên nào. Khối tiêu chí hoàn thành là danh sách ô vuông để các em biết khi nào dừng viết. Rất nhiều sinh viên viết dài vì không biết thế nào là đủ.</w:t>
+      </w:r>
+    </w:p>
+    <w:p>
+      <w:pPr>
+        <w:spacing w:after="160" w:line="276" w:lineRule="auto"/>
+      </w:pPr>
+      <w:r>
+        <w:rPr>
+          <w:b w:val="0"/>
+        </w:rPr>
+        <w:t xml:space="preserve">Hai quy ước nữa ở Phần 0. Một là cách đánh số: hình và bảng của sách đánh số theo phần, có gạch nối, như Hình 3-5 là hình thứ năm của Phần 3; hình và bảng trong ví dụ khóa luận đánh số theo chương, có dấu chấm, như Bảng 4.3. Hai là tên mục trong phần hướng dẫn trùng với số mục trong khóa luận: "Mục 3.3.2. Phương pháp chọn mẫu" hướng dẫn viết đúng mục 3.3.2 của khóa luận. </w:t>
       </w:r>
       <w:r>
         <w:rPr>
@@ -950,7 +950,7 @@
         <w:rPr>
           <w:i/>
         </w:rPr>
-        <w:t>[Suy luận, gợi ý cách dùng] Thầy khuyên các em làm một việc đơn giản: mỗi khi viết xong một mục, mở đúng mục cùng số trong sách, đọc riêng dòng "Thế nào là đủ" và đánh dấu từng ý. Mười phút tự soát như vậy thường tiết kiệm được một vòng sửa với giảng viên hướng dẫn.</w:t>
+        <w:t>[Suy luận, gợi ý cách dùng] Thầy khuyên các em làm một việc đơn giản: mỗi khi viết xong một mục, mở đúng mục cùng số trong sách, đọc riêng khối "Tiêu chí hoàn thành" và đánh dấu từng ý. Mười phút tự soát như vậy thường tiết kiệm được một vòng sửa với giảng viên hướng dẫn.</w:t>
       </w:r>
     </w:p>
     <w:p>
@@ -963,7 +963,7 @@
           <w:b/>
           <w:color w:val="CC0000"/>
         </w:rPr>
-        <w:t>(Slide 11: Mỗi chương sách mang đúng tên một phần của khóa luận: viết đến phần nào thì mở chương cùng tên)</w:t>
+        <w:t>(Slide 11: Mỗi phần của sách ứng với một phần của khóa luận: viết đến phần nào thì mở phần cùng tên)</w:t>
       </w:r>
     </w:p>
     <w:p>
@@ -986,40 +986,40 @@
           <w:color w:val="595959"/>
           <w:sz w:val="22"/>
         </w:rPr>
-        <w:t>Hướng dẫn Chuyên đề và Khóa luận tốt nghiệp, Lời nói đầu, Hình 1 và Bảng 1</w:t>
-      </w:r>
-    </w:p>
-    <w:p>
-      <w:pPr>
-        <w:spacing w:after="160" w:line="276" w:lineRule="auto"/>
-      </w:pPr>
-      <w:r>
-        <w:rPr>
-          <w:b w:val="0"/>
-        </w:rPr>
-        <w:t>Hình 1 là bản đồ của cuốn sách. Mỗi hàng là một chương, ghi câu hỏi mà chương trả lời, sản phẩm sinh viên hoàn thành và file Excel dùng kèm. Sách nói rõ: sinh viên viết đến phần nào của khóa luận thì mở chương cùng tên trong sách và sản phẩm của chương trước là đầu vào của chương sau.</w:t>
-      </w:r>
-    </w:p>
-    <w:p>
-      <w:pPr>
-        <w:spacing w:after="160" w:line="276" w:lineRule="auto"/>
-      </w:pPr>
-      <w:r>
-        <w:rPr>
-          <w:b w:val="0"/>
-        </w:rPr>
-        <w:t>Các em để ý ba điểm. Thứ nhất, chuỗi sản phẩm: Phần mở đầu và Chương 1 cho ra bộ câu hỏi; Chương 2 cho ra mô hình và giả thuyết; Chương 3 cho ra kế hoạch thu thập và phân tích; Chương 4 cho ra bảng kết quả kiểm định; Chương 5 cho ra câu trả lời và hàm ý. Thứ hai, ba file Excel: file 2 dùng cho Chương 3, hai file 3 dùng cho Chương 4, Chương 5 và phần hoàn thiện. Thứ ba, bốn chương cuối của sách không ứng với chương nào của khóa luận mà hướng dẫn những việc làm sau khi viết xong kết luận.</w:t>
-      </w:r>
-    </w:p>
-    <w:p>
-      <w:pPr>
-        <w:spacing w:after="160" w:line="276" w:lineRule="auto"/>
-      </w:pPr>
-      <w:r>
-        <w:rPr>
-          <w:b/>
-        </w:rPr>
-        <w:t>Mọi con số minh họa trong sách lấy từ ba file Excel đi kèm: sinh viên mở file, làm lại từng bước và đối chiếu với sách.</w:t>
+        <w:t>Hướng dẫn Chuyên đề và Khóa luận tốt nghiệp, Phần 0, mục A, Hình 0-1 và Bảng 0-1</w:t>
+      </w:r>
+    </w:p>
+    <w:p>
+      <w:pPr>
+        <w:spacing w:after="160" w:line="276" w:lineRule="auto"/>
+      </w:pPr>
+      <w:r>
+        <w:rPr>
+          <w:b w:val="0"/>
+        </w:rPr>
+        <w:t>Hình 0-1 là bản đồ của cuốn sách. Mỗi hàng là một phần của sách, ghi câu hỏi mà phần đó trả lời, sản phẩm sinh viên hoàn thành và file Excel dùng kèm. Sách nói rõ: sinh viên viết đến phần nào của khóa luận thì mở phần cùng tên trong sách; sản phẩm của phần trước là đầu vào của phần sau.</w:t>
+      </w:r>
+    </w:p>
+    <w:p>
+      <w:pPr>
+        <w:spacing w:after="160" w:line="276" w:lineRule="auto"/>
+      </w:pPr>
+      <w:r>
+        <w:rPr>
+          <w:b w:val="0"/>
+        </w:rPr>
+        <w:t>Các em để ý ba điểm. Thứ nhất, chuỗi sản phẩm: Phần 1 về phần mở đầu và Chương 1 cho ra bộ câu hỏi; Phần 2 cho ra mô hình và giả thuyết; Phần 3 cho ra kế hoạch thu thập và phân tích; Phần 4 cho ra bảng kết quả kiểm định; Phần 5 cho ra câu trả lời và hàm ý. Thứ hai, bốn file Excel: file 2b dùng cho việc tìm tài liệu và đi khảo sát ở Phần 2 và Phần 3; file 2 dùng cho Phần 3; hai file 3 dùng cho Phần 4, Phần 5 và phần hoàn thiện. Thứ ba, Phần 0 và Phần 7 đến Phần 10 không ứng với chương nào của khóa luận: Phần 0 hướng dẫn cách dùng sách và tư duy viết; bốn phần cuối hướng dẫn những việc làm sau khi viết xong kết luận.</w:t>
+      </w:r>
+    </w:p>
+    <w:p>
+      <w:pPr>
+        <w:spacing w:after="160" w:line="276" w:lineRule="auto"/>
+      </w:pPr>
+      <w:r>
+        <w:rPr>
+          <w:b/>
+        </w:rPr>
+        <w:t>Mọi con số minh họa trong sách lấy từ bốn file Excel đi kèm: sinh viên mở file, làm lại từng bước và đối chiếu với sách.</w:t>
       </w:r>
       <w:r>
         <w:rPr>
@@ -1044,7 +1044,7 @@
         <w:rPr>
           <w:i/>
         </w:rPr>
-        <w:t>Thử hình dung các em đang viết Chương 4 lúc nửa đêm, không nhớ bảng Cronbach cần mấy cột. Các em không cần đọc lại từ đầu sách. Các em mở Hình 1, thấy Chương 4 ứng với chương sách nào, lật đến mục 4.2.1 và Bảng 30 có sẵn năm cột. Bản đồ này là để tra, không phải để đọc một lần rồi bỏ.</w:t>
+        <w:t>Thử hình dung các em đang viết Chương 4 lúc nửa đêm, không nhớ bảng Cronbach cần mấy cột. Các em không cần đọc lại từ đầu sách. Các em mở Hình 0-1, thấy Chương 4 ứng với Phần 4 của sách, lật đến Mục 4.2.1 và Bảng 4-4 có sẵn năm cột. Bản đồ này là để tra, không phải để đọc một lần rồi bỏ.</w:t>
       </w:r>
     </w:p>
     <w:p>
@@ -1080,18 +1080,18 @@
           <w:color w:val="595959"/>
           <w:sz w:val="22"/>
         </w:rPr>
-        <w:t>Hướng dẫn Chuyên đề và Khóa luận tốt nghiệp (Lời nói đầu); mục Kiểm tra trước khi nộp</w:t>
-      </w:r>
-    </w:p>
-    <w:p>
-      <w:pPr>
-        <w:spacing w:after="160" w:line="276" w:lineRule="auto"/>
-      </w:pPr>
-      <w:r>
-        <w:rPr>
-          <w:b w:val="0"/>
-        </w:rPr>
-        <w:t>Trong lời nói đầu, sách nêu một nguyên tắc xuyên suốt. Thầy gọi nó là ba chữ "khớp". Thứ nhất, mọi kết quả ở Chương 4 khớp với giả thuyết ở Chương 2. Thứ hai, mọi kết luận ở Chương 5 khớp với câu hỏi nghiên cứu ở Chương 1. Thứ ba, mọi con số trong bài khớp với file dữ liệu.</w:t>
+        <w:t>Hướng dẫn Chuyên đề và Khóa luận tốt nghiệp (Phần 0); Phần 9</w:t>
+      </w:r>
+    </w:p>
+    <w:p>
+      <w:pPr>
+        <w:spacing w:after="160" w:line="276" w:lineRule="auto"/>
+      </w:pPr>
+      <w:r>
+        <w:rPr>
+          <w:b w:val="0"/>
+        </w:rPr>
+        <w:t>Ở Phần 0, sách nêu một nguyên tắc xuyên suốt. Thầy gọi nó là ba chữ "khớp". Thứ nhất, mọi kết quả ở Chương 4 khớp với giả thuyết ở Chương 2. Thứ hai, mọi kết luận ở Chương 5 khớp với câu hỏi nghiên cứu ở Chương 1. Thứ ba, mọi con số trong bài khớp với file dữ liệu.</w:t>
       </w:r>
     </w:p>
     <w:p>
@@ -1174,7 +1174,7 @@
           <w:color w:val="595959"/>
           <w:sz w:val="22"/>
         </w:rPr>
-        <w:t>Hướng dẫn Chuyên đề và Khóa luận tốt nghiệp, Hình 24 và phần mở đầu Chương 4</w:t>
+        <w:t>Hướng dẫn Chuyên đề và Khóa luận tốt nghiệp, Hình 2-2 và phần mở đầu của Phần 4</w:t>
       </w:r>
     </w:p>
     <w:p>
@@ -1274,7 +1274,7 @@
           <w:color w:val="595959"/>
           <w:sz w:val="22"/>
         </w:rPr>
-        <w:t>Hướng dẫn Chuyên đề và Khóa luận tốt nghiệp (Lời nói đầu); Bảng 1</w:t>
+        <w:t>Hướng dẫn Chuyên đề và Khóa luận tốt nghiệp (Phần 0); Bảng 0-1</w:t>
       </w:r>
     </w:p>
     <w:p>
@@ -1307,7 +1307,7 @@
         <w:rPr>
           <w:b w:val="0"/>
         </w:rPr>
-        <w:t xml:space="preserve">Ba file Excel đi kèm được chia theo chương: file 2 dùng cho Chương 2 và Chương 3; hai file 3 dùng cho Chương 4 và Chương 5 của từng đề tài. Sách nói rõ đây là ví dụ sư phạm. Chỗ nào cần điền thông tin thật thì ghi trong ngoặc vuông. Các tên như Nguyễn Văn A, Trần Thị B là tên giả định và sách dặn không được đưa vào khóa luận. </w:t>
+        <w:t xml:space="preserve">Bốn file Excel đi kèm được chia theo chương: file 2 dùng cho Chương 2 và Chương 3; hai file 3 dùng cho Chương 4 và Chương 5 của từng đề tài. Sách nói rõ đây là ví dụ sư phạm. Chỗ nào cần điền thông tin thật thì ghi trong ngoặc vuông. Các tên như Nguyễn Văn A, Trần Thị B là tên giả định và sách dặn không được đưa vào khóa luận. </w:t>
       </w:r>
       <w:r>
         <w:rPr>
@@ -1367,7 +1367,7 @@
           <w:color w:val="595959"/>
           <w:sz w:val="24"/>
         </w:rPr>
-        <w:t>Phần mở đầu (mục 1 đến 7) và Chương 1 (mục 1 đến 7); Hình 2 đến 22; Bảng 2, 3</w:t>
+        <w:t>Phần 1 (mục A đến G); Hình 0-4 và 1-1 đến 1-20; Bảng 1-10 và 1-11</w:t>
       </w:r>
     </w:p>
     <w:p>
@@ -1403,7 +1403,7 @@
           <w:color w:val="595959"/>
           <w:sz w:val="22"/>
         </w:rPr>
-        <w:t>Hướng dẫn Chuyên đề và Khóa luận tốt nghiệp, Phần mở đầu và Chương 1</w:t>
+        <w:t>Hướng dẫn Chuyên đề và Khóa luận tốt nghiệp, Phần 1</w:t>
       </w:r>
     </w:p>
     <w:p>
@@ -1497,7 +1497,7 @@
           <w:color w:val="595959"/>
           <w:sz w:val="22"/>
         </w:rPr>
-        <w:t>Hướng dẫn Chuyên đề và Khóa luận tốt nghiệp, Phần mở đầu, mục 1.2 đến 1.4 và Hình 2</w:t>
+        <w:t>Hướng dẫn Chuyên đề và Khóa luận tốt nghiệp, Phần 1, mục B và Hình 1-3</w:t>
       </w:r>
     </w:p>
     <w:p>
@@ -1530,7 +1530,7 @@
         <w:rPr>
           <w:b w:val="0"/>
         </w:rPr>
-        <w:t xml:space="preserve">Bên phải là Hình 2 trong sách: bảy mục của phần mở đầu và câu hỏi mà mỗi mục trả lời. Khung nét đứt là mục ý nghĩa khoa học và thực tiễn, mục bổ sung tùy khoa. Sáu ý còn lại là bắt buộc. </w:t>
+        <w:t xml:space="preserve">Bên phải là Hình 1-3 trong sách: bảy mục của phần mở đầu và câu hỏi mà mỗi mục trả lời. Khung nét đứt là mục ý nghĩa khoa học và thực tiễn, mục bổ sung tùy khoa. Sáu ý còn lại là bắt buộc. </w:t>
       </w:r>
       <w:r>
         <w:rPr>
@@ -1591,7 +1591,7 @@
           <w:color w:val="595959"/>
           <w:sz w:val="22"/>
         </w:rPr>
-        <w:t>Hướng dẫn Chuyên đề và Khóa luận tốt nghiệp, Phần mở đầu, mục 2.3 đến 2.5</w:t>
+        <w:t>Hướng dẫn Chuyên đề và Khóa luận tốt nghiệp, Phần 1, mục C</w:t>
       </w:r>
     </w:p>
     <w:p>
@@ -1685,7 +1685,7 @@
           <w:color w:val="595959"/>
           <w:sz w:val="22"/>
         </w:rPr>
-        <w:t>Hướng dẫn Chuyên đề và Khóa luận tốt nghiệp, Phần mở đầu, mục 2.4 và Hình 4; Chương 1 mục 2 (Kết nối giữa các mục)</w:t>
+        <w:t>Hướng dẫn Chuyên đề và Khóa luận tốt nghiệp, Phần 1, mục C (Sáu mối nối để tự kiểm tra) và Hình 1-5</w:t>
       </w:r>
     </w:p>
     <w:p>
@@ -1779,7 +1779,7 @@
           <w:color w:val="595959"/>
           <w:sz w:val="22"/>
         </w:rPr>
-        <w:t>Hướng dẫn Chuyên đề và Khóa luận tốt nghiệp, Phần mở đầu, mục 3.1, Hình 5 và Hình 6; Creswell và Creswell (2018, tr. 164)</w:t>
+        <w:t>Hướng dẫn Chuyên đề và Khóa luận tốt nghiệp, Phần 1, Mục 1.1, Hình 1-7 và Hình 1-8; Creswell và Creswell (2018, tr. 164)</w:t>
       </w:r>
     </w:p>
     <w:p>
@@ -1884,7 +1884,7 @@
           <w:color w:val="595959"/>
           <w:sz w:val="22"/>
         </w:rPr>
-        <w:t>Hướng dẫn Chuyên đề và Khóa luận tốt nghiệp, Phần mở đầu, mục 3.1</w:t>
+        <w:t>Hướng dẫn Chuyên đề và Khóa luận tốt nghiệp, Phần 1, Mục 1.1</w:t>
       </w:r>
     </w:p>
     <w:p>
@@ -1989,7 +1989,7 @@
           <w:color w:val="595959"/>
           <w:sz w:val="22"/>
         </w:rPr>
-        <w:t>Hướng dẫn Chuyên đề và Khóa luận tốt nghiệp, Phần mở đầu, mục 3.2 và 3.3; Creswell và Creswell (2018, tr. 184)</w:t>
+        <w:t>Hướng dẫn Chuyên đề và Khóa luận tốt nghiệp, Phần 1, Mục 1.2 và Mục 1.3; Creswell và Creswell (2018, tr. 184)</w:t>
       </w:r>
     </w:p>
     <w:p>
@@ -2094,7 +2094,7 @@
           <w:color w:val="595959"/>
           <w:sz w:val="22"/>
         </w:rPr>
-        <w:t>Hướng dẫn Chuyên đề và Khóa luận tốt nghiệp, Phần mở đầu, mục 3.4 và Hình 10</w:t>
+        <w:t>Hướng dẫn Chuyên đề và Khóa luận tốt nghiệp, Phần 1, Mục 1.4 và Hình 1-14</w:t>
       </w:r>
     </w:p>
     <w:p>
@@ -2116,7 +2116,7 @@
         <w:rPr>
           <w:b w:val="0"/>
         </w:rPr>
-        <w:t>Hình 10 đặt ba khái niệm vào cùng một sơ đồ. Thầy nhắc lại bốn điều phải có. Một là một câu về đối tượng nghiên cứu. Hai là một câu về đối tượng khảo sát kèm điều kiện chọn, ví dụ từ 18 tuổi trở lên, có tài khoản tại Ngân hàng X và chưa kích hoạt ứng dụng. Ba là đủ ba chiều phạm vi: nội dung, không gian, thời gian. Bốn là ít nhất một điều nghiên cứu không xem xét.</w:t>
+        <w:t>Hình 1-14 đặt ba khái niệm vào cùng một sơ đồ. Thầy nhắc lại bốn điều phải có. Một là một câu về đối tượng nghiên cứu. Hai là một câu về đối tượng khảo sát kèm điều kiện chọn, ví dụ từ 18 tuổi trở lên, có tài khoản tại Ngân hàng X và chưa kích hoạt ứng dụng. Ba là đủ ba chiều phạm vi: nội dung, không gian, thời gian. Bốn là ít nhất một điều nghiên cứu không xem xét.</w:t>
       </w:r>
     </w:p>
     <w:p>
@@ -2188,7 +2188,7 @@
           <w:color w:val="595959"/>
           <w:sz w:val="22"/>
         </w:rPr>
-        <w:t>Hướng dẫn Chuyên đề và Khóa luận tốt nghiệp, Phần mở đầu, mục 3.5 đến 3.7</w:t>
+        <w:t>Hướng dẫn Chuyên đề và Khóa luận tốt nghiệp, Phần 1, Mục 1.5 đến Mục 1.7</w:t>
       </w:r>
     </w:p>
     <w:p>
@@ -2293,7 +2293,7 @@
           <w:color w:val="595959"/>
           <w:sz w:val="22"/>
         </w:rPr>
-        <w:t>Hướng dẫn Chuyên đề và Khóa luận tốt nghiệp, Chương 1, mục 1.2, 1.3, 3 và Hình 16</w:t>
+        <w:t>Hướng dẫn Chuyên đề và Khóa luận tốt nghiệp, Phần 1, mục B và mục D, Hình 1-1</w:t>
       </w:r>
     </w:p>
     <w:p>
@@ -2337,7 +2337,7 @@
         <w:rPr>
           <w:b w:val="0"/>
         </w:rPr>
-        <w:t xml:space="preserve">Hình 16 bên trái cho thấy câu hỏi ở Chương 1 chạy qua cả năm chương rồi quay về Chương 5. </w:t>
+        <w:t xml:space="preserve">Hình 1-1 bên trái cho thấy câu hỏi ở Chương 1 chạy qua cả năm chương rồi quay về Chương 5. </w:t>
       </w:r>
       <w:r>
         <w:rPr>
@@ -2398,7 +2398,7 @@
           <w:color w:val="595959"/>
           <w:sz w:val="22"/>
         </w:rPr>
-        <w:t>Hướng dẫn Chuyên đề và Khóa luận tốt nghiệp, Chương 1, mục 3 (Mục 1.1), Hình 18 và 19, Bảng 3; Creswell và Creswell (2018, tr. 76, 169)</w:t>
+        <w:t>Hướng dẫn Chuyên đề và Khóa luận tốt nghiệp, Phần 1, Mục 1.1, Hình 1-9 và 1-10, Bảng 1-11; Creswell và Creswell (2018, tr. 76, 169)</w:t>
       </w:r>
     </w:p>
     <w:p>
@@ -2420,18 +2420,18 @@
         <w:rPr>
           <w:b w:val="0"/>
         </w:rPr>
-        <w:t>Hình bên trái là tam giác ngược, Hình 19 của sách, phỏng theo Creswell và Creswell. Nó giải quyết một tình huống rất hay gặp: các em tìm mãi không thấy nghiên cứu nào đúng đề tài của mình. Cách xử lý là mở rộng dần phạm vi tìm kiếm lên các tầng rộng hơn, ví dụ từ "ngân hàng số tại Ngân hàng X" lên "ngân hàng số tại Việt Nam", rồi "chấp nhận công nghệ tài chính", rồi mới kết luận rằng cần nghiên cứu nhóm đối tượng cụ thể hơn.</w:t>
-      </w:r>
-    </w:p>
-    <w:p>
-      <w:pPr>
-        <w:spacing w:after="160" w:line="276" w:lineRule="auto"/>
-      </w:pPr>
-      <w:r>
-        <w:rPr>
-          <w:b w:val="0"/>
-        </w:rPr>
-        <w:t xml:space="preserve">Bảng 3 trong sách ghi lỗi thứ hai của Chương 1 là biến mục 1.1.3 thành tổng quan tài liệu dài, hậu quả là Chương 1 lấn sang nhiệm vụ của Chương 2 và hai chương lặp nhau. </w:t>
+        <w:t>Hình bên trái là tam giác ngược, Hình 1-10 của sách, phỏng theo Creswell và Creswell. Nó giải quyết một tình huống rất hay gặp: các em tìm mãi không thấy nghiên cứu nào đúng đề tài của mình. Cách xử lý là mở rộng dần phạm vi tìm kiếm lên các tầng rộng hơn, ví dụ từ "ngân hàng số tại Ngân hàng X" lên "ngân hàng số tại Việt Nam", rồi "chấp nhận công nghệ tài chính", rồi mới kết luận rằng cần nghiên cứu nhóm đối tượng cụ thể hơn.</w:t>
+      </w:r>
+    </w:p>
+    <w:p>
+      <w:pPr>
+        <w:spacing w:after="160" w:line="276" w:lineRule="auto"/>
+      </w:pPr>
+      <w:r>
+        <w:rPr>
+          <w:b w:val="0"/>
+        </w:rPr>
+        <w:t xml:space="preserve">Bảng 1-11 trong sách ghi lỗi thứ hai của Chương 1 là biến mục 1.1.3 thành tổng quan tài liệu dài, hậu quả là Chương 1 lấn sang nhiệm vụ của Chương 2 và hai chương lặp nhau. </w:t>
       </w:r>
       <w:r>
         <w:rPr>
@@ -2492,18 +2492,18 @@
           <w:color w:val="595959"/>
           <w:sz w:val="22"/>
         </w:rPr>
-        <w:t>Hướng dẫn Chuyên đề và Khóa luận tốt nghiệp, Chương 1, mục 4, mục 5 và Hình 22</w:t>
-      </w:r>
-    </w:p>
-    <w:p>
-      <w:pPr>
-        <w:spacing w:after="160" w:line="276" w:lineRule="auto"/>
-      </w:pPr>
-      <w:r>
-        <w:rPr>
-          <w:b w:val="0"/>
-        </w:rPr>
-        <w:t>Sách không chỉ dạy từng mục riêng lẻ mà còn đưa một Chương 1 trọn vẹn cho đề tài Ngân hàng X, đánh số từ đoạn 1 đến đoạn 18 để phân tích. Hình 22 đặt bản phần mở đầu ngắn cạnh bản Chương 1 đầy đủ để các em thấy cùng một nội dung được mở rộng ra sao.</w:t>
+        <w:t>Hướng dẫn Chuyên đề và Khóa luận tốt nghiệp, Phần 1, mục D (đoạn giới thiệu, chuyển tiếp, kết luận chương), mục E (Ví dụ 2) và Hình 1-20</w:t>
+      </w:r>
+    </w:p>
+    <w:p>
+      <w:pPr>
+        <w:spacing w:after="160" w:line="276" w:lineRule="auto"/>
+      </w:pPr>
+      <w:r>
+        <w:rPr>
+          <w:b w:val="0"/>
+        </w:rPr>
+        <w:t>Sách không chỉ dạy từng mục riêng lẻ mà còn đưa một Chương 1 trọn vẹn cho đề tài Ngân hàng X, đánh số từ đoạn 1 đến đoạn 18 để phân tích. Hình 1-20 đặt bản phần mở đầu ngắn cạnh bản Chương 1 đầy đủ để các em thấy cùng một nội dung được mở rộng ra sao.</w:t>
       </w:r>
     </w:p>
     <w:p>
@@ -2586,7 +2586,7 @@
           <w:color w:val="595959"/>
           <w:sz w:val="22"/>
         </w:rPr>
-        <w:t>Hướng dẫn Chuyên đề và Khóa luận tốt nghiệp, Phần mở đầu, mục 4.1 đến 4.4; Creswell và Creswell (2018, tr. 139)</w:t>
+        <w:t>Hướng dẫn Chuyên đề và Khóa luận tốt nghiệp, Phần 0 mục C; Phần 1, mục D (Trích dẫn); Creswell và Creswell (2018, tr. 139)</w:t>
       </w:r>
     </w:p>
     <w:p>
@@ -2680,18 +2680,18 @@
           <w:color w:val="595959"/>
           <w:sz w:val="22"/>
         </w:rPr>
-        <w:t>Hướng dẫn Chuyên đề và Khóa luận tốt nghiệp, Phần mở đầu, mục 6 và 7, Bảng 2; Hướng dẫn Chuyên đề và Khóa luận tốt nghiệp, Chương 1, mục 6 và 7, Bảng 3</w:t>
-      </w:r>
-    </w:p>
-    <w:p>
-      <w:pPr>
-        <w:spacing w:after="160" w:line="276" w:lineRule="auto"/>
-      </w:pPr>
-      <w:r>
-        <w:rPr>
-          <w:b w:val="0"/>
-        </w:rPr>
-        <w:t>Slide này gom Bảng 2 và Bảng 3 của sách, mỗi bảng bảy lỗi, thầy lọc ra bảy dòng tiêu biểu nhất. Cột giữa là hậu quả và cột cuối là cách khắc phục, chỉ về đúng mục hướng dẫn.</w:t>
+        <w:t>Hướng dẫn Chuyên đề và Khóa luận tốt nghiệp, Phần 1, mục F, Bảng 1-10; Hướng dẫn Chuyên đề và Khóa luận tốt nghiệp, Phần 1, mục F, Bảng 1-11</w:t>
+      </w:r>
+    </w:p>
+    <w:p>
+      <w:pPr>
+        <w:spacing w:after="160" w:line="276" w:lineRule="auto"/>
+      </w:pPr>
+      <w:r>
+        <w:rPr>
+          <w:b w:val="0"/>
+        </w:rPr>
+        <w:t>Slide này gom Bảng 1-10 và Bảng 1-11 của sách, mỗi bảng bảy lỗi, thầy lọc ra bảy dòng tiêu biểu nhất. Cột giữa là hậu quả và cột cuối là cách khắc phục, chỉ về đúng mục hướng dẫn.</w:t>
       </w:r>
     </w:p>
     <w:p>
@@ -2713,7 +2713,7 @@
         <w:rPr>
           <w:b w:val="0"/>
         </w:rPr>
-        <w:t xml:space="preserve">Cuối mỗi chương sách có checklist. Phần mở đầu có 14 câu hỏi, từ "có đủ các mục theo quy định của khoa không" đến "đã không nêu kết quả nghiên cứu chưa". Chương 1 có 13 câu, từ "có đoạn giới thiệu chương không" đến "kết luận chương có câu dẫn sang Chương 2 không". </w:t>
+        <w:t xml:space="preserve">Cuối mỗi phần của sách có checklist. Checklist của phần mở đầu có 14 câu hỏi, từ "có đủ các mục theo quy định của khoa không" đến "đã không nêu kết quả nghiên cứu chưa". Chương 1 có 13 câu, từ "có đoạn giới thiệu chương không" đến "kết luận chương có câu dẫn sang Chương 2 không". </w:t>
       </w:r>
       <w:r>
         <w:rPr>
@@ -2773,7 +2773,7 @@
           <w:color w:val="595959"/>
           <w:sz w:val="24"/>
         </w:rPr>
-        <w:t>Chương 2 (mục 1 đến 10, Mục 2.1.3A bổ sung); Hình 23 đến 34; Bảng 4 đến 9, BS1 đến BS3</w:t>
+        <w:t>Phần 2 (mục A đến G, Thực hành 2.1.3A); Hình 2-1 đến 2-12; Bảng 2-1 đến 2-9</w:t>
       </w:r>
     </w:p>
     <w:p>
@@ -2809,7 +2809,7 @@
           <w:color w:val="595959"/>
           <w:sz w:val="22"/>
         </w:rPr>
-        <w:t>Hướng dẫn Chuyên đề và Khóa luận tốt nghiệp, Chương 2</w:t>
+        <w:t>Hướng dẫn Chuyên đề và Khóa luận tốt nghiệp, Phần 2</w:t>
       </w:r>
     </w:p>
     <w:p>
@@ -2831,7 +2831,7 @@
         <w:rPr>
           <w:b w:val="0"/>
         </w:rPr>
-        <w:t>Cột hình và bảng cho các em biết mở chỗ nào khi kẹt. Kẹt ở tổng quan thì mở Hình 31, Hình 32 và Bảng 8. Kẹt ở mô hình thì mở Hình 27 đến 30 và Hình 33. Kẹt ở giả thuyết thì mở Hình 34 và Bảng 5. Mục 7 về học từ luận án tham khảo và quy tắc APA chỉ cần một buổi đọc có ghi chép.</w:t>
+        <w:t>Cột hình và bảng cho các em biết mở chỗ nào khi kẹt. Kẹt ở tổng quan thì mở Hình 2-5, Hình 2-6 và Bảng 8. Kẹt ở mô hình thì mở Hình 2-7 đến 2-9 và 2-11 và Hình 33. Kẹt ở giả thuyết thì mở Hình 2-12 và Bảng 5. Mục 7 về học từ luận án tham khảo và quy tắc APA chỉ cần một buổi đọc có ghi chép.</w:t>
       </w:r>
     </w:p>
     <w:p>
@@ -2897,7 +2897,7 @@
           <w:color w:val="595959"/>
           <w:sz w:val="22"/>
         </w:rPr>
-        <w:t>Hướng dẫn Chuyên đề và Khóa luận tốt nghiệp, Chương 2, mục 1 và 2, Hình 25</w:t>
+        <w:t>Hướng dẫn Chuyên đề và Khóa luận tốt nghiệp, Phần 2, mục B và C, Hình 2-3</w:t>
       </w:r>
     </w:p>
     <w:p>
@@ -2997,7 +2997,7 @@
           <w:color w:val="595959"/>
           <w:sz w:val="22"/>
         </w:rPr>
-        <w:t>Hướng dẫn Chuyên đề và Khóa luận tốt nghiệp, Chương 2, mục 2.1.1</w:t>
+        <w:t>Hướng dẫn Chuyên đề và Khóa luận tốt nghiệp, Phần 2, Mục 2.1.1</w:t>
       </w:r>
     </w:p>
     <w:p>
@@ -3066,7 +3066,7 @@
         <w:rPr>
           <w:i/>
         </w:rPr>
-        <w:t>Thử hình dung định nghĩa niềm tin là "khách hàng tin ngân hàng". Đến Chương 3, bạn ấy không biết viết câu hỏi nào ngoài "Tôi tin ngân hàng". Định nghĩa trong Bảng 4 của sách có ba ý: bảo mật thông tin, xử lý giao dịch chính xác, giữ cam kết. Ba ý đó là ba câu hỏi viết sẵn.</w:t>
+        <w:t>Thử hình dung định nghĩa niềm tin là "khách hàng tin ngân hàng". Đến Chương 3, bạn ấy không biết viết câu hỏi nào ngoài "Tôi tin ngân hàng". Định nghĩa trong Bảng 2-1 của sách có ba ý: bảo mật thông tin, xử lý giao dịch chính xác, giữ cam kết. Ba ý đó là ba câu hỏi viết sẵn.</w:t>
       </w:r>
     </w:p>
     <w:p>
@@ -3102,7 +3102,7 @@
           <w:color w:val="595959"/>
           <w:sz w:val="22"/>
         </w:rPr>
-        <w:t>Hướng dẫn Chuyên đề và Khóa luận tốt nghiệp, Chương 2, mục 2.1.2, mục 4 và Hình 31</w:t>
+        <w:t>Hướng dẫn Chuyên đề và Khóa luận tốt nghiệp, Phần 2, Mục 2.1.2, Kỹ thuật dùng cho Mục 2.1.2 và Hình 2-5</w:t>
       </w:r>
     </w:p>
     <w:p>
@@ -3207,18 +3207,18 @@
           <w:color w:val="595959"/>
           <w:sz w:val="22"/>
         </w:rPr>
-        <w:t>Hướng dẫn Chuyên đề và Khóa luận tốt nghiệp, Chương 2, mục 8 và Bảng 8</w:t>
-      </w:r>
-    </w:p>
-    <w:p>
-      <w:pPr>
-        <w:spacing w:after="160" w:line="276" w:lineRule="auto"/>
-      </w:pPr>
-      <w:r>
-        <w:rPr>
-          <w:b w:val="0"/>
-        </w:rPr>
-        <w:t>Mục 8 của Chương 2 làm một việc mà thầy rất thích: mổ xẻ từng câu của một đoạn tổng quan mẫu. Đoạn văn có bảy câu về ý định sử dụng ngân hàng số và Bảng 8 ghi nhiệm vụ của từng câu.</w:t>
+        <w:t>Hướng dẫn Chuyên đề và Khóa luận tốt nghiệp, Phần 2, phần Đọc kỹ một đoạn tổng quan mẫu và Bảng 2-2</w:t>
+      </w:r>
+    </w:p>
+    <w:p>
+      <w:pPr>
+        <w:spacing w:after="160" w:line="276" w:lineRule="auto"/>
+      </w:pPr>
+      <w:r>
+        <w:rPr>
+          <w:b w:val="0"/>
+        </w:rPr>
+        <w:t>Mục 8 của Chương 2 làm một việc mà thầy rất thích: mổ xẻ từng câu của một đoạn tổng quan mẫu. Đoạn văn có bảy câu về ý định sử dụng ngân hàng số và Bảng 2-2 ghi nhiệm vụ của từng câu.</w:t>
       </w:r>
     </w:p>
     <w:p>
@@ -3265,7 +3265,7 @@
         <w:rPr>
           <w:i/>
         </w:rPr>
-        <w:t>[Gợi ý bài tập tại lớp] Thầy đề nghị các em lấy một đoạn tổng quan mình đã viết, kẻ ba cột như Bảng 8, ghi nhiệm vụ của từng câu. Câu nào không điền được nhiệm vụ thì hoặc là câu thừa, hoặc là câu đang liệt kê. Bài tập này mất mười phút nhưng các em sẽ thấy ngay đoạn văn của mình đang tổng hợp hay đang kể.</w:t>
+        <w:t>[Gợi ý bài tập tại lớp] Thầy đề nghị các em lấy một đoạn tổng quan mình đã viết, kẻ ba cột như Bảng 2-2, ghi nhiệm vụ của từng câu. Câu nào không điền được nhiệm vụ thì hoặc là câu thừa, hoặc là câu đang liệt kê. Bài tập này mất mười phút nhưng các em sẽ thấy ngay đoạn văn của mình đang tổng hợp hay đang kể.</w:t>
       </w:r>
     </w:p>
     <w:p>
@@ -3301,18 +3301,18 @@
           <w:color w:val="595959"/>
           <w:sz w:val="22"/>
         </w:rPr>
-        <w:t>Hướng dẫn Chuyên đề và Khóa luận tốt nghiệp, Chương 2, mục 4, Hình 26 và Hình 32; Creswell và Creswell (2018, tr. 76)</w:t>
-      </w:r>
-    </w:p>
-    <w:p>
-      <w:pPr>
-        <w:spacing w:after="160" w:line="276" w:lineRule="auto"/>
-      </w:pPr>
-      <w:r>
-        <w:rPr>
-          <w:b w:val="0"/>
-        </w:rPr>
-        <w:t>Để tổng hợp được, các em cần một công cụ ghi chép khi đọc. Sách giới thiệu ma trận tổng hợp tài liệu trên Excel, như Hình 32 trên slide.</w:t>
+        <w:t>Hướng dẫn Chuyên đề và Khóa luận tốt nghiệp, Phần 2, Kỹ thuật dùng cho Mục 2.1.2, Hình 2-4 và Hình 2-6; Creswell và Creswell (2018, tr. 76)</w:t>
+      </w:r>
+    </w:p>
+    <w:p>
+      <w:pPr>
+        <w:spacing w:after="160" w:line="276" w:lineRule="auto"/>
+      </w:pPr>
+      <w:r>
+        <w:rPr>
+          <w:b w:val="0"/>
+        </w:rPr>
+        <w:t>Để tổng hợp được, các em cần một công cụ ghi chép khi đọc. Sách giới thiệu ma trận tổng hợp tài liệu trên Excel, như Hình 2-6 trên slide.</w:t>
       </w:r>
     </w:p>
     <w:p>
@@ -3406,7 +3406,7 @@
           <w:color w:val="595959"/>
           <w:sz w:val="22"/>
         </w:rPr>
-        <w:t>Hướng dẫn Chuyên đề và Khóa luận tốt nghiệp, Chương 2, mục 2.1.3</w:t>
+        <w:t>Hướng dẫn Chuyên đề và Khóa luận tốt nghiệp, Phần 2, Mục 2.1.3</w:t>
       </w:r>
     </w:p>
     <w:p>
@@ -3511,18 +3511,18 @@
           <w:color w:val="595959"/>
           <w:sz w:val="22"/>
         </w:rPr>
-        <w:t>Hướng dẫn Chuyên đề và Khóa luận tốt nghiệp, Mục 2.1.3A (bổ sung) và Bảng BS1; Webster và Watson (2002); Wohlin (2014); file 2b.Chapter_2_and_Chapter_3_Data_Collection_Practice.xlsx (dữ liệu giả định), sheet 1_NhatKyTimTaiLieu</w:t>
-      </w:r>
-    </w:p>
-    <w:p>
-      <w:pPr>
-        <w:spacing w:after="160" w:line="276" w:lineRule="auto"/>
-      </w:pPr>
-      <w:r>
-        <w:rPr>
-          <w:b w:val="0"/>
-        </w:rPr>
-        <w:t>Các em nhớ mục 2.1.3 về khoảng trống nghiên cứu: sách dặn giới hạn câu khoảng trống bằng cụm "trong các tài liệu mà tác giả tiếp cận được". Câu hỏi là: tiếp cận bằng cách nào? Phần bổ sung 2.1.3A trả lời bằng năm bước trên slide. Bước một, tách câu hỏi nghiên cứu thành ba khối từ khóa: khái niệm, lý thuyết, bối cảnh. Bước hai, ghép chuỗi tìm kiếm: chữ OR nối các từ đồng nghĩa trong một khối, chữ AND nối các khối với nhau. Bước ba, tìm ở ít nhất hai nguồn.</w:t>
+        <w:t>Hướng dẫn Chuyên đề và Khóa luận tốt nghiệp, Thực hành 2.1.3A và Bảng 2-3; Webster và Watson (2002); Wohlin (2014); file 2b.Chapter_2_and_Chapter_3_Data_Collection_Practice.xlsx (dữ liệu giả định), sheet 1_NhatKyTimTaiLieu</w:t>
+      </w:r>
+    </w:p>
+    <w:p>
+      <w:pPr>
+        <w:spacing w:after="160" w:line="276" w:lineRule="auto"/>
+      </w:pPr>
+      <w:r>
+        <w:rPr>
+          <w:b w:val="0"/>
+        </w:rPr>
+        <w:t>Các em nhớ mục 2.1.3 về khoảng trống nghiên cứu: sách dặn giới hạn câu khoảng trống bằng cụm "trong các tài liệu mà tác giả tiếp cận được". Câu hỏi là: tiếp cận bằng cách nào? Phần Thực hành 2.1.3A trả lời bằng năm bước trên slide. Bước một, tách câu hỏi nghiên cứu thành ba khối từ khóa: khái niệm, lý thuyết, bối cảnh. Bước hai, ghép chuỗi tìm kiếm: chữ OR nối các từ đồng nghĩa trong một khối, chữ AND nối các khối với nhau. Bước ba, tìm ở ít nhất hai nguồn.</w:t>
       </w:r>
     </w:p>
     <w:p>
@@ -3544,7 +3544,7 @@
         <w:rPr>
           <w:b w:val="0"/>
         </w:rPr>
-        <w:t xml:space="preserve">Bước năm là nhật ký. Với Ngân hàng X, Bảng BS1 ghi sáu lần tìm qua ba vòng: xem tổng cộng 620 bản ghi, giữ 63 bài sau khi đọc tên và tóm tắt, giữ 21 bài sau khi đọc toàn văn. Vòng ba không thêm bài nào nên dừng. Vì sao phải ghi? Vì con số này biến lời hứa "tác giả đã tìm kỹ" thành bằng chứng. </w:t>
+        <w:t xml:space="preserve">Bước năm là nhật ký. Với Ngân hàng X, Bảng 2-3 ghi sáu lần tìm qua ba vòng: xem tổng cộng 620 bản ghi, giữ 63 bài sau khi đọc tên và tóm tắt, giữ 21 bài sau khi đọc toàn văn. Vòng ba không thêm bài nào nên dừng. Vì sao phải ghi? Vì con số này biến lời hứa "tác giả đã tìm kỹ" thành bằng chứng. </w:t>
       </w:r>
       <w:r>
         <w:rPr>
@@ -3605,18 +3605,18 @@
           <w:color w:val="595959"/>
           <w:sz w:val="22"/>
         </w:rPr>
-        <w:t>Hướng dẫn Chuyên đề và Khóa luận tốt nghiệp, Mục 2.1.3A (bổ sung), Bảng BS2 và BS3; Whetten (1989); Sandberg và Alvesson (2011); Müller-Bloch và Kranz (2015); file 2b.Chapter_2_and_Chapter_3_Data_Collection_Practice.xlsx (dữ liệu giả định), sheet 2 và 12</w:t>
-      </w:r>
-    </w:p>
-    <w:p>
-      <w:pPr>
-        <w:spacing w:after="160" w:line="276" w:lineRule="auto"/>
-      </w:pPr>
-      <w:r>
-        <w:rPr>
-          <w:b w:val="0"/>
-        </w:rPr>
-        <w:t>Câu hỏi thầy nhận nhiều nhất là: "Thưa thầy, đề tài em có điểm mới không?" Slide này trả lời bằng con số. Bước đầu là nhập 21 bài vào ma trận tổng hợp của mục 2.1.2, mỗi biến một cột ghi 1 hoặc 0, rồi đếm bằng hàm COUNTIFS. Khung bên phải là Bảng BS2: 8 bài đã xét đủ ba biến sự hữu ích, niềm tin và ảnh hưởng xã hội; chỉ 1 trong 8 bài đó khảo sát ngoài thành phố lớn; 0 bài khảo sát tại Ngân hàng X.</w:t>
+        <w:t>Hướng dẫn Chuyên đề và Khóa luận tốt nghiệp, Thực hành 2.1.3A, Bảng 2-4 và 2-5; Whetten (1989); Sandberg và Alvesson (2011); Müller-Bloch và Kranz (2015); file 2b.Chapter_2_and_Chapter_3_Data_Collection_Practice.xlsx (dữ liệu giả định), sheet 2 và 12</w:t>
+      </w:r>
+    </w:p>
+    <w:p>
+      <w:pPr>
+        <w:spacing w:after="160" w:line="276" w:lineRule="auto"/>
+      </w:pPr>
+      <w:r>
+        <w:rPr>
+          <w:b w:val="0"/>
+        </w:rPr>
+        <w:t>Câu hỏi thầy nhận nhiều nhất là: "Thưa thầy, đề tài em có điểm mới không?" Slide này trả lời bằng con số. Bước đầu là nhập 21 bài vào ma trận tổng hợp của mục 2.1.2, mỗi biến một cột ghi 1 hoặc 0, rồi đếm bằng hàm COUNTIFS. Khung bên phải là Bảng 2-4: 8 bài đã xét đủ ba biến sự hữu ích, niềm tin và ảnh hưởng xã hội; chỉ 1 trong 8 bài đó khảo sát ngoài thành phố lớn; 0 bài khảo sát tại Ngân hàng X.</w:t>
       </w:r>
     </w:p>
     <w:p>
@@ -3699,7 +3699,7 @@
           <w:color w:val="595959"/>
           <w:sz w:val="22"/>
         </w:rPr>
-        <w:t>Hướng dẫn Chuyên đề và Khóa luận tốt nghiệp, Chương 2, mục 2.2.1 và Hình 27</w:t>
+        <w:t>Hướng dẫn Chuyên đề và Khóa luận tốt nghiệp, Phần 2, Mục 2.2.1 và Hình 2-7</w:t>
       </w:r>
     </w:p>
     <w:p>
@@ -3721,7 +3721,7 @@
         <w:rPr>
           <w:b w:val="0"/>
         </w:rPr>
-        <w:t>Sơ đồ này vẽ lại Hình 27 trong sách. Bốn biến của Ngân hàng X đến từ ba lý thuyết. Sự hữu ích và sự dễ sử dụng đến từ Mô hình chấp nhận công nghệ TAM của Davis năm 1989: hai niềm tin của người dùng quyết định việc chấp nhận một công nghệ. Niềm tin đến từ lý thuyết cam kết và niềm tin của Morgan và Hunt năm 1994. Ảnh hưởng xã hội đến từ khái niệm chuẩn chủ quan trong Thuyết hành vi có kế hoạch của Ajzen năm 1991. Với Trường Tiểu học Y, lý thuyết nền là SERVQUAL của Parasuraman và cộng sự năm 1988.</w:t>
+        <w:t>Sơ đồ này vẽ lại Hình 2-7 trong sách. Bốn biến của Ngân hàng X đến từ ba lý thuyết. Sự hữu ích và sự dễ sử dụng đến từ Mô hình chấp nhận công nghệ TAM của Davis năm 1989: hai niềm tin của người dùng quyết định việc chấp nhận một công nghệ. Niềm tin đến từ lý thuyết cam kết và niềm tin của Morgan và Hunt năm 1994. Ảnh hưởng xã hội đến từ khái niệm chuẩn chủ quan trong Thuyết hành vi có kế hoạch của Ajzen năm 1991. Với Trường Tiểu học Y, lý thuyết nền là SERVQUAL của Parasuraman và cộng sự năm 1988.</w:t>
       </w:r>
     </w:p>
     <w:p>
@@ -3804,18 +3804,18 @@
           <w:color w:val="595959"/>
           <w:sz w:val="22"/>
         </w:rPr>
-        <w:t>Hướng dẫn Chuyên đề và Khóa luận tốt nghiệp, Chương 2, mục 2.2.2, mục 5, Hình 28; Creswell và Creswell (2018, tr. 97 đến 98)</w:t>
-      </w:r>
-    </w:p>
-    <w:p>
-      <w:pPr>
-        <w:spacing w:after="160" w:line="276" w:lineRule="auto"/>
-      </w:pPr>
-      <w:r>
-        <w:rPr>
-          <w:b w:val="0"/>
-        </w:rPr>
-        <w:t>Mô hình nghiên cứu là sơ đồ thể hiện quan hệ giữa các biến và mỗi mũi tên là một giả thuyết cần kiểm định. Hình 28 là mô hình đề xuất của Ngân hàng X: bốn biến độc lập bên trái, ý định sử dụng bên phải, bốn mũi tên mang mã H1 đến H4.</w:t>
+        <w:t>Hướng dẫn Chuyên đề và Khóa luận tốt nghiệp, Phần 2, Mục 2.2.2, Kỹ thuật dùng cho Mục 2.2.2, Hình 2-8; Creswell và Creswell (2018, tr. 97 đến 98)</w:t>
+      </w:r>
+    </w:p>
+    <w:p>
+      <w:pPr>
+        <w:spacing w:after="160" w:line="276" w:lineRule="auto"/>
+      </w:pPr>
+      <w:r>
+        <w:rPr>
+          <w:b w:val="0"/>
+        </w:rPr>
+        <w:t>Mô hình nghiên cứu là sơ đồ thể hiện quan hệ giữa các biến và mỗi mũi tên là một giả thuyết cần kiểm định. Hình 2-8 là mô hình đề xuất của Ngân hàng X: bốn biến độc lập bên trái, ý định sử dụng bên phải, bốn mũi tên mang mã H1 đến H4.</w:t>
       </w:r>
     </w:p>
     <w:p>
@@ -3909,7 +3909,7 @@
           <w:color w:val="595959"/>
           <w:sz w:val="22"/>
         </w:rPr>
-        <w:t>Hướng dẫn Chuyên đề và Khóa luận tốt nghiệp, Chương 2, mục 2.2.3, 2.3.2, Hình 30 và Bảng 5; Creswell và Creswell (2018, tr. 93 đến 94)</w:t>
+        <w:t>Hướng dẫn Chuyên đề và Khóa luận tốt nghiệp, Phần 2, Mục 2.2.3, Mục 2.3.2, Hình 2-11 và Bảng 2-6; Creswell và Creswell (2018, tr. 93 đến 94)</w:t>
       </w:r>
     </w:p>
     <w:p>
@@ -3931,18 +3931,18 @@
         <w:rPr>
           <w:b w:val="0"/>
         </w:rPr>
-        <w:t>Hình 30 trong sách vẽ bốn loại biến theo Creswell và Creswell: biến độc lập tác động đến kết quả; biến phụ thuộc là kết quả chịu tác động; biến trung gian đứng giữa; biến điều tiết làm thay đổi độ mạnh hoặc chiều của một quan hệ. Ở cấp đại học, sách khuyên chỉ dùng biến độc lập và phụ thuộc.</w:t>
-      </w:r>
-    </w:p>
-    <w:p>
-      <w:pPr>
-        <w:spacing w:after="160" w:line="276" w:lineRule="auto"/>
-      </w:pPr>
-      <w:r>
-        <w:rPr>
-          <w:b w:val="0"/>
-        </w:rPr>
-        <w:t xml:space="preserve">Bảng bên trái là Bảng 5, bảng tổng hợp giả thuyết có năm cột: số thứ tự, mã, nội dung, chiều kỳ vọng và nguồn. Sách dặn lập bảng sau cùng bằng cách sao chép nguyên văn từng câu giả thuyết, rồi đặt mô hình và bảng cạnh nhau để đếm. </w:t>
+        <w:t>Hình 2-11 trong sách vẽ bốn loại biến theo Creswell và Creswell: biến độc lập tác động đến kết quả; biến phụ thuộc là kết quả chịu tác động; biến trung gian đứng giữa; biến điều tiết làm thay đổi độ mạnh hoặc chiều của một quan hệ. Ở cấp đại học, sách khuyên chỉ dùng biến độc lập và phụ thuộc.</w:t>
+      </w:r>
+    </w:p>
+    <w:p>
+      <w:pPr>
+        <w:spacing w:after="160" w:line="276" w:lineRule="auto"/>
+      </w:pPr>
+      <w:r>
+        <w:rPr>
+          <w:b w:val="0"/>
+        </w:rPr>
+        <w:t xml:space="preserve">Bảng bên trái là Bảng 2-6, bảng tổng hợp giả thuyết có năm cột: số thứ tự, mã, nội dung, chiều kỳ vọng và nguồn. Sách dặn lập bảng sau cùng bằng cách sao chép nguyên văn từng câu giả thuyết, rồi đặt mô hình và bảng cạnh nhau để đếm. </w:t>
       </w:r>
       <w:r>
         <w:rPr>
@@ -4003,7 +4003,7 @@
           <w:color w:val="595959"/>
           <w:sz w:val="22"/>
         </w:rPr>
-        <w:t>Hướng dẫn Chuyên đề và Khóa luận tốt nghiệp, Chương 2, mục 2.3.1, mục 6 và Hình 34</w:t>
+        <w:t>Hướng dẫn Chuyên đề và Khóa luận tốt nghiệp, Phần 2, Mục 2.3.1, Kỹ thuật dùng cho Mục 2.3.1 và Hình 2-12</w:t>
       </w:r>
     </w:p>
     <w:p>
@@ -4108,7 +4108,7 @@
           <w:color w:val="595959"/>
           <w:sz w:val="22"/>
         </w:rPr>
-        <w:t>Hướng dẫn Chuyên đề và Khóa luận tốt nghiệp, Chương 2, mục 7, Bảng 6 và 7</w:t>
+        <w:t>Hướng dẫn Chuyên đề và Khóa luận tốt nghiệp, Phần 2, mục E, Bảng 2-7 và 2-8</w:t>
       </w:r>
     </w:p>
     <w:p>
@@ -4141,7 +4141,7 @@
         <w:rPr>
           <w:b w:val="0"/>
         </w:rPr>
-        <w:t xml:space="preserve">Bên phải là Bảng 7, quy tắc trích dẫn trong bài theo APA viết bằng tiếng Việt. Có hai dạng: dạng tường thuật đặt tên tác giả trong câu, như "Davis (1989) cho rằng..."; dạng trong ngoặc đặt tên và năm cuối câu. Thứ tự các nguồn trong ngoặc và việc dùng "và cộng sự" hay "et al." do khoa quy định, các em dùng thống nhất một cách. </w:t>
+        <w:t xml:space="preserve">Bên phải là Bảng 2-8, quy tắc trích dẫn trong bài theo APA viết bằng tiếng Việt. Có hai dạng: dạng tường thuật đặt tên tác giả trong câu, như "Davis (1989) cho rằng..."; dạng trong ngoặc đặt tên và năm cuối câu. Thứ tự các nguồn trong ngoặc và việc dùng "và cộng sự" hay "et al." do khoa quy định, các em dùng thống nhất một cách. </w:t>
       </w:r>
       <w:r>
         <w:rPr>
@@ -4202,18 +4202,18 @@
           <w:color w:val="595959"/>
           <w:sz w:val="22"/>
         </w:rPr>
-        <w:t>Hướng dẫn Chuyên đề và Khóa luận tốt nghiệp, Chương 2, mục 9 và 10, Bảng 9; phần "Điều cần nhớ"</w:t>
-      </w:r>
-    </w:p>
-    <w:p>
-      <w:pPr>
-        <w:spacing w:after="160" w:line="276" w:lineRule="auto"/>
-      </w:pPr>
-      <w:r>
-        <w:rPr>
-          <w:b w:val="0"/>
-        </w:rPr>
-        <w:t>Kết thúc Chương 2 là Bảng 9, bốn lỗi phổ biến nhất, mỗi lỗi chỉ về một mục trong chương. Liệt kê nghiên cứu mà không tổng hợp thì quay lại mục 4. Không trích dẫn hoặc trích dẫn không nhất quán thì quay lại mục 7. Mô hình quá phức tạp thì quay lại mục 5. Giả thuyết không có chiều thì quay lại mục 6.</w:t>
+        <w:t>Hướng dẫn Chuyên đề và Khóa luận tốt nghiệp, Phần 2, mục F, Bảng 2-9; khung POINT cuối phần</w:t>
+      </w:r>
+    </w:p>
+    <w:p>
+      <w:pPr>
+        <w:spacing w:after="160" w:line="276" w:lineRule="auto"/>
+      </w:pPr>
+      <w:r>
+        <w:rPr>
+          <w:b w:val="0"/>
+        </w:rPr>
+        <w:t>Kết thúc Chương 2 là Bảng 2-9, bốn lỗi phổ biến nhất, mỗi lỗi chỉ về một mục trong chương. Liệt kê nghiên cứu mà không tổng hợp thì quay lại mục 4. Không trích dẫn hoặc trích dẫn không nhất quán thì quay lại mục 7. Mô hình quá phức tạp thì quay lại mục 5. Giả thuyết không có chiều thì quay lại mục 6.</w:t>
       </w:r>
     </w:p>
     <w:p>
@@ -4260,7 +4260,7 @@
         <w:rPr>
           <w:i/>
         </w:rPr>
-        <w:t>Thử hình dung một bạn tự tin Chương 2 đã xong vì dài 25 trang. Bạn ấy tô đậm chủ ngữ từng câu theo gợi ý ở Bảng 26 và thấy hai phần ba chủ ngữ là tên tác giả. Chương dài nhưng đang liệt kê. Độ dài không phải là thước đo của Chương 2; khoảng trống được chứng minh và mô hình có lý thuyết gốc mới là thước đo.</w:t>
+        <w:t>Thử hình dung một bạn tự tin Chương 2 đã xong vì dài 25 trang. Bạn ấy tô đậm chủ ngữ từng câu theo gợi ý ở Bảng 3-27 và thấy hai phần ba chủ ngữ là tên tác giả. Chương dài nhưng đang liệt kê. Độ dài không phải là thước đo của Chương 2; khoảng trống được chứng minh và mô hình có lý thuyết gốc mới là thước đo.</w:t>
       </w:r>
     </w:p>
     <w:p>
@@ -4295,7 +4295,7 @@
           <w:color w:val="595959"/>
           <w:sz w:val="24"/>
         </w:rPr>
-        <w:t>Chương 3 (mục 1 đến 8, Mục 3.4.1A, 3.5.1A đến 3.5.1C bổ sung); Hình 35 đến 57; Bảng 10 đến 26, BS4 đến BS13; file 2 và 2b</w:t>
+        <w:t>Phần 3 (mục A đến G, Thực hành 3.4.1A, 3.5.1A đến 3.5.1C); Hình 3-1 đến 3-23; Bảng 3-1 đến 3-27; file 2 và 2b</w:t>
       </w:r>
     </w:p>
     <w:p>
@@ -4331,7 +4331,7 @@
           <w:color w:val="595959"/>
           <w:sz w:val="22"/>
         </w:rPr>
-        <w:t>Hướng dẫn Chuyên đề và Khóa luận tốt nghiệp, Chương 3; file 2.Chapter_2_and_Chapter_3_Practice.xlsx</w:t>
+        <w:t>Hướng dẫn Chuyên đề và Khóa luận tốt nghiệp, Phần 3; file 2.Chapter_2_and_Chapter_3_Practice.xlsx</w:t>
       </w:r>
     </w:p>
     <w:p>
@@ -4419,7 +4419,7 @@
           <w:color w:val="595959"/>
           <w:sz w:val="22"/>
         </w:rPr>
-        <w:t>Hướng dẫn Chuyên đề và Khóa luận tốt nghiệp, Chương 3, mục 1 và Bảng 10</w:t>
+        <w:t>Hướng dẫn Chuyên đề và Khóa luận tốt nghiệp, Phần 3, mục B và Bảng 3-1</w:t>
       </w:r>
     </w:p>
     <w:p>
@@ -4441,7 +4441,7 @@
         <w:rPr>
           <w:b w:val="0"/>
         </w:rPr>
-        <w:t>Bảng này là sợi chỉ nối Chương 2, Chương 3 và Chương 4, vẽ lại Bảng 10 trong sách. Mỗi biến trong mô hình trở thành một nhóm câu hỏi: sự hữu ích thành HI1 đến HI4, ý định sử dụng thành YD1 đến YD3. Các câu hỏi của một biến được gộp thành một biến đại diện bằng trung bình. Và mỗi giả thuyết trở thành một hệ số hồi quy ở Chương 4.</w:t>
+        <w:t>Bảng này là sợi chỉ nối Chương 2, Chương 3 và Chương 4, vẽ lại Bảng 3-1 trong sách. Mỗi biến trong mô hình trở thành một nhóm câu hỏi: sự hữu ích thành HI1 đến HI4, ý định sử dụng thành YD1 đến YD3. Các câu hỏi của một biến được gộp thành một biến đại diện bằng trung bình. Và mỗi giả thuyết trở thành một hệ số hồi quy ở Chương 4.</w:t>
       </w:r>
     </w:p>
     <w:p>
@@ -4488,7 +4488,7 @@
         <w:rPr>
           <w:i/>
         </w:rPr>
-        <w:t>Thử hình dung bảng hỏi có câu "Anh chị có hài lòng với phí dịch vụ không?" trong khi mô hình không có biến phí. Câu này tốn thời gian người trả lời, không vào biến đại diện nào, không vào hồi quy. Theo quy tắc thứ hai của sách, đó là câu thừa. Lập Bảng 10 trước khi soạn bảng hỏi là cách loại câu thừa từ đầu.</w:t>
+        <w:t>Thử hình dung bảng hỏi có câu "Anh chị có hài lòng với phí dịch vụ không?" trong khi mô hình không có biến phí. Câu này tốn thời gian người trả lời, không vào biến đại diện nào, không vào hồi quy. Theo quy tắc thứ hai của sách, đó là câu thừa. Lập Bảng 3-1 trước khi soạn bảng hỏi là cách loại câu thừa từ đầu.</w:t>
       </w:r>
     </w:p>
     <w:p>
@@ -4524,18 +4524,18 @@
           <w:color w:val="595959"/>
           <w:sz w:val="22"/>
         </w:rPr>
-        <w:t>Hướng dẫn Chuyên đề và Khóa luận tốt nghiệp, Chương 3, mục 3.1.1 và 3.1.2, Bảng 11; Creswell và Creswell (2018, tr. 43 đến 44); Trần Phước (n.d., tr. 10 đến 17)</w:t>
-      </w:r>
-    </w:p>
-    <w:p>
-      <w:pPr>
-        <w:spacing w:after="160" w:line="276" w:lineRule="auto"/>
-      </w:pPr>
-      <w:r>
-        <w:rPr>
-          <w:b w:val="0"/>
-        </w:rPr>
-        <w:t>Mục đầu tiên của Chương 3 là triết lý nghiên cứu, sách gọi là lăng kính mà người nghiên cứu dùng để nhìn vấn đề. Creswell và Creswell gọi khái niệm này là thế giới quan và mô tả bốn loại: hậu thực chứng, kiến tạo, chuyển đổi và thực dụng. Nhiều giáo trình khác dùng ba tên: thực chứng, diễn giải và thực dụng. Bảng 11 trong sách đối chiếu hai cách gọi để các em không bị lẫn.</w:t>
+        <w:t>Hướng dẫn Chuyên đề và Khóa luận tốt nghiệp, Phần 3, Mục 3.1.1 và Mục 3.1.2, Bảng 3-2; Creswell và Creswell (2018, tr. 43 đến 44); Trần Phước (n.d., tr. 10 đến 17)</w:t>
+      </w:r>
+    </w:p>
+    <w:p>
+      <w:pPr>
+        <w:spacing w:after="160" w:line="276" w:lineRule="auto"/>
+      </w:pPr>
+      <w:r>
+        <w:rPr>
+          <w:b w:val="0"/>
+        </w:rPr>
+        <w:t>Mục đầu tiên của Chương 3 là triết lý nghiên cứu, sách gọi là lăng kính mà người nghiên cứu dùng để nhìn vấn đề. Creswell và Creswell gọi khái niệm này là thế giới quan và mô tả bốn loại: hậu thực chứng, kiến tạo, chuyển đổi và thực dụng. Nhiều giáo trình khác dùng ba tên: thực chứng, diễn giải và thực dụng. Bảng 3-2 trong sách đối chiếu hai cách gọi để các em không bị lẫn.</w:t>
       </w:r>
     </w:p>
     <w:p>
@@ -4629,29 +4629,29 @@
           <w:color w:val="595959"/>
           <w:sz w:val="22"/>
         </w:rPr>
-        <w:t>Hướng dẫn Chuyên đề và Khóa luận tốt nghiệp, Chương 3, mục 5, Bảng 23, 24 và Hình 57; Trần Phước (n.d., tr. 26 đến 55); Creswell và Creswell (2018, tr. 193)</w:t>
-      </w:r>
-    </w:p>
-    <w:p>
-      <w:pPr>
-        <w:spacing w:after="160" w:line="276" w:lineRule="auto"/>
-      </w:pPr>
-      <w:r>
-        <w:rPr>
-          <w:b w:val="0"/>
-        </w:rPr>
-        <w:t>Sách chủ yếu hướng dẫn nghiên cứu định lượng nhưng mục 5 của Chương 3 dành cho các em chọn định tính. Trần Phước tóm lại bằng một hình ảnh: nghiên cứu định lượng giống như cân đo, đong đếm để xem bao nhiêu; nghiên cứu định tính giống như lắng nghe câu chuyện, quan sát đời sống để hiểu tại sao và như thế nào.</w:t>
-      </w:r>
-    </w:p>
-    <w:p>
-      <w:pPr>
-        <w:spacing w:after="160" w:line="276" w:lineRule="auto"/>
-      </w:pPr>
-      <w:r>
-        <w:rPr>
-          <w:b w:val="0"/>
-        </w:rPr>
-        <w:t>Bảng 24 là năm thiết kế định tính và cỡ mẫu thường gặp: tường thuật, một hoặc hai cá nhân; hiện tượng học, 3 đến 10 người; lý thuyết nền, khoảng 20 đến 30 người; dân tộc học, một nhóm chia sẻ văn hóa; nghiên cứu tình huống, khoảng 4 đến 5 trường hợp. Với Trường Y, nếu câu hỏi là "phụ huynh trải nghiệm việc làm thủ tục như thế nào" thì thiết kế gần nhất là hiện tượng học, cỡ mẫu khởi điểm 3 đến 10 phụ huynh.</w:t>
+        <w:t>Hướng dẫn Chuyên đề và Khóa luận tốt nghiệp, Phần 3, Kỹ thuật dùng cho Mục 3.1.2, Bảng 3-3 và 3-4 và Hình 3-4; Trần Phước (n.d., tr. 26 đến 55); Creswell và Creswell (2018, tr. 193)</w:t>
+      </w:r>
+    </w:p>
+    <w:p>
+      <w:pPr>
+        <w:spacing w:after="160" w:line="276" w:lineRule="auto"/>
+      </w:pPr>
+      <w:r>
+        <w:rPr>
+          <w:b w:val="0"/>
+        </w:rPr>
+        <w:t>Sách chủ yếu hướng dẫn nghiên cứu định lượng nhưng Kỹ thuật dùng cho Mục 3.1.2 của Phần 3 dành cho các em chọn định tính. Trần Phước tóm lại bằng một hình ảnh: nghiên cứu định lượng giống như cân đo, đong đếm để xem bao nhiêu; nghiên cứu định tính giống như lắng nghe câu chuyện, quan sát đời sống để hiểu tại sao và như thế nào.</w:t>
+      </w:r>
+    </w:p>
+    <w:p>
+      <w:pPr>
+        <w:spacing w:after="160" w:line="276" w:lineRule="auto"/>
+      </w:pPr>
+      <w:r>
+        <w:rPr>
+          <w:b w:val="0"/>
+        </w:rPr>
+        <w:t>Bảng 3-4 là năm thiết kế định tính và cỡ mẫu thường gặp: tường thuật, một hoặc hai cá nhân; hiện tượng học, 3 đến 10 người; lý thuyết nền, khoảng 20 đến 30 người; dân tộc học, một nhóm chia sẻ văn hóa; nghiên cứu tình huống, khoảng 4 đến 5 trường hợp. Với Trường Y, nếu câu hỏi là "phụ huynh trải nghiệm việc làm thủ tục như thế nào" thì thiết kế gần nhất là hiện tượng học, cỡ mẫu khởi điểm 3 đến 10 phụ huynh.</w:t>
       </w:r>
     </w:p>
     <w:p>
@@ -4723,7 +4723,7 @@
           <w:color w:val="595959"/>
           <w:sz w:val="22"/>
         </w:rPr>
-        <w:t>Hướng dẫn Chuyên đề và Khóa luận tốt nghiệp, mục 5 Chương 3, Hình 57 và Mục 3.5.1B (bổ sung); Trần Phước (n.d., tr. 43 đến 55); Kallio và cộng sự (2016)</w:t>
+        <w:t>Hướng dẫn Chuyên đề và Khóa luận tốt nghiệp, Phần 3, Kỹ thuật dùng cho Mục 3.1.2, Hình 3-4 và Thực hành 3.5.1B; Trần Phước (n.d., tr. 43 đến 55); Kallio và cộng sự (2016)</w:t>
       </w:r>
     </w:p>
     <w:p>
@@ -4817,18 +4817,18 @@
           <w:color w:val="595959"/>
           <w:sz w:val="22"/>
         </w:rPr>
-        <w:t>Hướng dẫn Chuyên đề và Khóa luận tốt nghiệp, mục 5 Chương 3 và Mục 3.5.1B (bổ sung), Bảng BS11; Hennink và Kaiser (2022); Charmaz (2006, dẫn theo Trần Phước, n.d., tr. 44); file 2b.Chapter_2_and_Chapter_3_Data_Collection_Practice.xlsx (dữ liệu giả định), sheet 10 và 11</w:t>
-      </w:r>
-    </w:p>
-    <w:p>
-      <w:pPr>
-        <w:spacing w:after="160" w:line="276" w:lineRule="auto"/>
-      </w:pPr>
-      <w:r>
-        <w:rPr>
-          <w:b w:val="0"/>
-        </w:rPr>
-        <w:t>Sách đã có quy tắc thực hành ở mục 5 của Chương 3: khi hai đến ba buổi liên tiếp không thêm chủ đề mới, dữ liệu đã gần bão hòa. Bão hòa, theo Charmaz mà Trần Phước dẫn, là lúc thu thêm dữ liệu không còn tạo ra hiểu biết mới. Biểu đồ này cho thấy cách biến quy tắc đó thành con số, với 10 buổi phỏng vấn phụ huynh Trường Y. Mỗi cột là số mã mới xuất hiện lần đầu ở buổi đó.</w:t>
+        <w:t>Hướng dẫn Chuyên đề và Khóa luận tốt nghiệp, Phần 3, Kỹ thuật dùng cho Mục 3.1.2 và Thực hành 3.5.1B, Bảng 3-16; Hennink và Kaiser (2022); Charmaz (2006, dẫn theo Trần Phước, n.d., tr. 44); file 2b.Chapter_2_and_Chapter_3_Data_Collection_Practice.xlsx (dữ liệu giả định), sheet 10 và 11</w:t>
+      </w:r>
+    </w:p>
+    <w:p>
+      <w:pPr>
+        <w:spacing w:after="160" w:line="276" w:lineRule="auto"/>
+      </w:pPr>
+      <w:r>
+        <w:rPr>
+          <w:b w:val="0"/>
+        </w:rPr>
+        <w:t>Sách đã có quy tắc thực hành ở Kỹ thuật dùng cho Mục 3.1.2 của Phần 3: khi hai đến ba buổi liên tiếp không thêm chủ đề mới, dữ liệu đã gần bão hòa. Bão hòa, theo Charmaz mà Trần Phước dẫn, là lúc thu thêm dữ liệu không còn tạo ra hiểu biết mới. Biểu đồ này cho thấy cách biến quy tắc đó thành con số, với 10 buổi phỏng vấn phụ huynh Trường Y. Mỗi cột là số mã mới xuất hiện lần đầu ở buổi đó.</w:t>
       </w:r>
     </w:p>
     <w:p>
@@ -4911,7 +4911,7 @@
           <w:color w:val="595959"/>
           <w:sz w:val="22"/>
         </w:rPr>
-        <w:t>Hướng dẫn Chuyên đề và Khóa luận tốt nghiệp, Chương 3, mục 3.2.1 và 3.2.2, Hình 38; Creswell và Creswell (2018, tr. 49, 208, 216)</w:t>
+        <w:t>Hướng dẫn Chuyên đề và Khóa luận tốt nghiệp, Phần 3, Mục 3.2.1 và Mục 3.2.2, Hình 3-5; Creswell và Creswell (2018, tr. 49, 208, 216)</w:t>
       </w:r>
     </w:p>
     <w:p>
@@ -5016,7 +5016,7 @@
           <w:color w:val="595959"/>
           <w:sz w:val="22"/>
         </w:rPr>
-        <w:t>Hướng dẫn Chuyên đề và Khóa luận tốt nghiệp, Chương 3, mục 3.3.1 và 3.3.2, Hình 39 và 40; Creswell và Creswell (2018, tr. 211 đến 212)</w:t>
+        <w:t>Hướng dẫn Chuyên đề và Khóa luận tốt nghiệp, Phần 3, Mục 3.3.1 và Mục 3.3.2, Hình 3-6 và 3-7; Creswell và Creswell (2018, tr. 211 đến 212)</w:t>
       </w:r>
     </w:p>
     <w:p>
@@ -5121,7 +5121,7 @@
           <w:color w:val="595959"/>
           <w:sz w:val="22"/>
         </w:rPr>
-        <w:t>Hướng dẫn Chuyên đề và Khóa luận tốt nghiệp, Chương 3, mục 3.3.3 và Bảng 12; Hair và cộng sự (2010); Green (1991)</w:t>
+        <w:t>Hướng dẫn Chuyên đề và Khóa luận tốt nghiệp, Phần 3, Mục 3.3.3 và Bảng 3-5; Hair và cộng sự (2010); Green (1991)</w:t>
       </w:r>
     </w:p>
     <w:p>
@@ -5226,7 +5226,7 @@
           <w:color w:val="595959"/>
           <w:sz w:val="22"/>
         </w:rPr>
-        <w:t>Hướng dẫn Chuyên đề và Khóa luận tốt nghiệp, Chương 3, mục 3.4.1</w:t>
+        <w:t>Hướng dẫn Chuyên đề và Khóa luận tốt nghiệp, Phần 3, Mục 3.4.1</w:t>
       </w:r>
     </w:p>
     <w:p>
@@ -5320,7 +5320,7 @@
           <w:color w:val="595959"/>
           <w:sz w:val="22"/>
         </w:rPr>
-        <w:t>Hướng dẫn Chuyên đề và Khóa luận tốt nghiệp, mục 3.4.1 và Mục 3.4.1A (bổ sung), Bảng BS4; Hox và Boeije (2005); Johnston (2014); file 2b.Chapter_2_and_Chapter_3_Data_Collection_Practice.xlsx (dữ liệu giả định), sheet 3_SoCapThuCap</w:t>
+        <w:t>Hướng dẫn Chuyên đề và Khóa luận tốt nghiệp, Phần 3, Mục 3.4.1 và Thực hành 3.4.1A, Bảng 3-6; Hox và Boeije (2005); Johnston (2014); file 2b.Chapter_2_and_Chapter_3_Data_Collection_Practice.xlsx (dữ liệu giả định), sheet 3_SoCapThuCap</w:t>
       </w:r>
     </w:p>
     <w:p>
@@ -5414,7 +5414,7 @@
           <w:color w:val="595959"/>
           <w:sz w:val="22"/>
         </w:rPr>
-        <w:t>Hướng dẫn Chuyên đề và Khóa luận tốt nghiệp, Mục 3.4.1A (bổ sung), Bảng BS5; Hulland, Baumgartner và Smith (2018); Trần Phước (n.d., tr. 43); file 2b.Chapter_2_and_Chapter_3_Data_Collection_Practice.xlsx (dữ liệu giả định), sheet 3_SoCapThuCap</w:t>
+        <w:t>Hướng dẫn Chuyên đề và Khóa luận tốt nghiệp, Thực hành 3.4.1A, Bảng 3-7; Hulland, Baumgartner và Smith (2018); Trần Phước (n.d., tr. 43); file 2b.Chapter_2_and_Chapter_3_Data_Collection_Practice.xlsx (dữ liệu giả định), sheet 3_SoCapThuCap</w:t>
       </w:r>
     </w:p>
     <w:p>
@@ -5508,7 +5508,7 @@
           <w:color w:val="595959"/>
           <w:sz w:val="22"/>
         </w:rPr>
-        <w:t>Hướng dẫn Chuyên đề và Khóa luận tốt nghiệp, Mục 3.4.1A (bổ sung), Bảng BS6; Trần Phước (n.d., tr. 49); Johnston (2014); file 2b.Chapter_2_and_Chapter_3_Data_Collection_Practice.xlsx (dữ liệu giả định), sheet 3_SoCapThuCap</w:t>
+        <w:t>Hướng dẫn Chuyên đề và Khóa luận tốt nghiệp, Thực hành 3.4.1A, Bảng 3-8; Trần Phước (n.d., tr. 49); Johnston (2014); file 2b.Chapter_2_and_Chapter_3_Data_Collection_Practice.xlsx (dữ liệu giả định), sheet 3_SoCapThuCap</w:t>
       </w:r>
     </w:p>
     <w:p>
@@ -5602,7 +5602,7 @@
           <w:color w:val="595959"/>
           <w:sz w:val="22"/>
         </w:rPr>
-        <w:t>Hướng dẫn Chuyên đề và Khóa luận tốt nghiệp, Chương 3, mục 3.4.2 và 3.4.3; file 2.Chapter_2_and_Chapter_3_Practice.xlsx (dữ liệu giả định), sheet 1_BangMa</w:t>
+        <w:t>Hướng dẫn Chuyên đề và Khóa luận tốt nghiệp, Phần 3, Mục 3.4.2 và Mục 3.4.3; file 2.Chapter_2_and_Chapter_3_Practice.xlsx (dữ liệu giả định), sheet 1_BangMa</w:t>
       </w:r>
     </w:p>
     <w:p>
@@ -5707,7 +5707,7 @@
           <w:color w:val="595959"/>
           <w:sz w:val="22"/>
         </w:rPr>
-        <w:t>Hướng dẫn Chuyên đề và Khóa luận tốt nghiệp, Chương 3, mục 3.5.1, Hình 45 và 46; file 2.Chapter_2_and_Chapter_3_Practice.xlsx (dữ liệu giả định), sheet 2_DuLieuTho và 3_DuLieuSach</w:t>
+        <w:t>Hướng dẫn Chuyên đề và Khóa luận tốt nghiệp, Phần 3, Mục 3.5.1, Hình 3-12 và 3-13; file 2.Chapter_2_and_Chapter_3_Practice.xlsx (dữ liệu giả định), sheet 2_DuLieuTho và 3_DuLieuSach</w:t>
       </w:r>
     </w:p>
     <w:p>
@@ -5812,7 +5812,7 @@
           <w:color w:val="595959"/>
           <w:sz w:val="22"/>
         </w:rPr>
-        <w:t>Hướng dẫn Chuyên đề và Khóa luận tốt nghiệp, Mục 3.5.1A (bổ sung), Bảng BS7; Dillman, Smyth và Christian (2014); Edwards và cộng sự (2009); file 2b.Chapter_2_and_Chapter_3_Data_Collection_Practice.xlsx (dữ liệu giả định), sheet 4 đến 7</w:t>
+        <w:t>Hướng dẫn Chuyên đề và Khóa luận tốt nghiệp, Thực hành 3.5.1A, Bảng 3-12; Dillman, Smyth và Christian (2014); Edwards và cộng sự (2009); file 2b.Chapter_2_and_Chapter_3_Data_Collection_Practice.xlsx (dữ liệu giả định), sheet 4 đến 7</w:t>
       </w:r>
     </w:p>
     <w:p>
@@ -5906,18 +5906,18 @@
           <w:color w:val="595959"/>
           <w:sz w:val="22"/>
         </w:rPr>
-        <w:t>Hướng dẫn Chuyên đề và Khóa luận tốt nghiệp, Bảng 12, Mục 3.5.1A (bổ sung) và Bảng BS8; Baruch và Holtom (2008); file 2b.Chapter_2_and_Chapter_3_Data_Collection_Practice.xlsx (dữ liệu giả định), sheet 4_KeHoachMau</w:t>
-      </w:r>
-    </w:p>
-    <w:p>
-      <w:pPr>
-        <w:spacing w:after="160" w:line="276" w:lineRule="auto"/>
-      </w:pPr>
-      <w:r>
-        <w:rPr>
-          <w:b w:val="0"/>
-        </w:rPr>
-        <w:t>Bảng 12 của sách tính cỡ mẫu tối thiểu là 95, lấy số lớn hơn giữa 5 lần 19 câu hỏi và 50 cộng 8 lần 4 biến độc lập, rồi chọn mục tiêu 150 phiếu hợp lệ. Câu hỏi tiếp theo là phải mời bao nhiêu người. Công thức rất đơn giản: lấy 150 chia cho tỷ lệ phản hồi dự kiến nhân tỷ lệ phiếu hợp lệ dự kiến. Nếu dự kiến 80% người được mời trả lời và 94% phiếu hợp lệ thì cần mời khoảng 200 người. Ngân hàng X đã mời đúng 200.</w:t>
+        <w:t>Hướng dẫn Chuyên đề và Khóa luận tốt nghiệp, Bảng 3-5, Thực hành 3.5.1A và Bảng 3-13; Baruch và Holtom (2008); file 2b.Chapter_2_and_Chapter_3_Data_Collection_Practice.xlsx (dữ liệu giả định), sheet 4_KeHoachMau</w:t>
+      </w:r>
+    </w:p>
+    <w:p>
+      <w:pPr>
+        <w:spacing w:after="160" w:line="276" w:lineRule="auto"/>
+      </w:pPr>
+      <w:r>
+        <w:rPr>
+          <w:b w:val="0"/>
+        </w:rPr>
+        <w:t>Bảng 3-5 của sách tính cỡ mẫu tối thiểu là 95, lấy số lớn hơn giữa 5 lần 19 câu hỏi và 50 cộng 8 lần 4 biến độc lập, rồi chọn mục tiêu 150 phiếu hợp lệ. Câu hỏi tiếp theo là phải mời bao nhiêu người. Công thức rất đơn giản: lấy 150 chia cho tỷ lệ phản hồi dự kiến nhân tỷ lệ phiếu hợp lệ dự kiến. Nếu dự kiến 80% người được mời trả lời và 94% phiếu hợp lệ thì cần mời khoảng 200 người. Ngân hàng X đã mời đúng 200.</w:t>
       </w:r>
     </w:p>
     <w:p>
@@ -6000,7 +6000,7 @@
           <w:color w:val="595959"/>
           <w:sz w:val="22"/>
         </w:rPr>
-        <w:t>Hướng dẫn Chuyên đề và Khóa luận tốt nghiệp, mục 3.8 và Mục 3.5.1A (bổ sung); Dillman, Smyth và Christian (2014)</w:t>
+        <w:t>Hướng dẫn Chuyên đề và Khóa luận tốt nghiệp, Phần 3, Mục 3.8 và Thực hành 3.5.1A; Dillman, Smyth và Christian (2014)</w:t>
       </w:r>
     </w:p>
     <w:p>
@@ -6094,7 +6094,7 @@
           <w:color w:val="595959"/>
           <w:sz w:val="22"/>
         </w:rPr>
-        <w:t>Hướng dẫn Chuyên đề và Khóa luận tốt nghiệp, mục 3.5.1 và Mục 3.5.1A (bổ sung), Bảng BS9 và BS10; file 2b.Chapter_2_and_Chapter_3_Data_Collection_Practice.xlsx (dữ liệu giả định), sheet 5, 6 và 7</w:t>
+        <w:t>Hướng dẫn Chuyên đề và Khóa luận tốt nghiệp, Phần 3, Mục 3.5.1 và Thực hành 3.5.1A, Bảng 3-14 và 3-15; file 2b.Chapter_2_and_Chapter_3_Data_Collection_Practice.xlsx (dữ liệu giả định), sheet 5, 6 và 7</w:t>
       </w:r>
     </w:p>
     <w:p>
@@ -6188,7 +6188,7 @@
           <w:color w:val="595959"/>
           <w:sz w:val="22"/>
         </w:rPr>
-        <w:t>Hướng dẫn Chuyên đề và Khóa luận tốt nghiệp, Mục 3.5.1C (bổ sung), Bảng BS12 và BS13; Armstrong và Overton (1977); Podsakoff và cộng sự (2003); Meade và Craig (2012); Kock (2015); file 2b.Chapter_2_and_Chapter_3_Data_Collection_Practice.xlsx (dữ liệu giả định), sheet 8 và 9</w:t>
+        <w:t>Hướng dẫn Chuyên đề và Khóa luận tốt nghiệp, Thực hành 3.5.1C, Bảng 3-17 và 3-18; Armstrong và Overton (1977); Podsakoff và cộng sự (2003); Meade và Craig (2012); Kock (2015); file 2b.Chapter_2_and_Chapter_3_Data_Collection_Practice.xlsx (dữ liệu giả định), sheet 8 và 9</w:t>
       </w:r>
     </w:p>
     <w:p>
@@ -6282,18 +6282,18 @@
           <w:color w:val="595959"/>
           <w:sz w:val="22"/>
         </w:rPr>
-        <w:t>Hướng dẫn Chuyên đề và Khóa luận tốt nghiệp, Mục 2.1.3A đến 3.5.1C (bổ sung); file 2b.Chapter_2_and_Chapter_3_Data_Collection_Practice.xlsx (dữ liệu giả định), sheet 12_NangChuanThacSi (gợi ý của tác giả, không phải tiêu chí chấm chính thức)</w:t>
-      </w:r>
-    </w:p>
-    <w:p>
-      <w:pPr>
-        <w:spacing w:after="160" w:line="276" w:lineRule="auto"/>
-      </w:pPr>
-      <w:r>
-        <w:rPr>
-          <w:b w:val="0"/>
-        </w:rPr>
-        <w:t>Slide cuối của phần bổ sung trả lời câu hỏi: làm ở sức sinh viên thì có ra được sản phẩm có chất lượng thạc sĩ không? Thầy nói rõ: sáu điểm này là gợi ý của tác giả sách, không phải tiêu chí chấm chính thức. Điểm một, khoảng trống có nhật ký tìm kiếm và bảng đếm, như Bảng BS1 và BS2. Điểm hai, kế hoạch mẫu có số cần mời và lịch tiếp xúc, như Bảng BS8 và BS9. Điểm ba, chất lượng phiếu có câu kiểm tra sự chú ý, so sánh nhóm sớm và muộn, kiểm tra sai lệch phương pháp chung, như Bảng BS12 và BS13.</w:t>
+        <w:t>Hướng dẫn Chuyên đề và Khóa luận tốt nghiệp, Thực hành 2.1.3A đến 3.5.1C; file 2b.Chapter_2_and_Chapter_3_Data_Collection_Practice.xlsx (dữ liệu giả định), sheet 12_NangChuanThacSi (gợi ý của tác giả, không phải tiêu chí chấm chính thức)</w:t>
+      </w:r>
+    </w:p>
+    <w:p>
+      <w:pPr>
+        <w:spacing w:after="160" w:line="276" w:lineRule="auto"/>
+      </w:pPr>
+      <w:r>
+        <w:rPr>
+          <w:b w:val="0"/>
+        </w:rPr>
+        <w:t>Slide cuối của phần bổ sung trả lời câu hỏi: làm ở sức sinh viên thì có ra được sản phẩm có chất lượng thạc sĩ không? Thầy nói rõ: sáu điểm này là gợi ý của tác giả sách, không phải tiêu chí chấm chính thức. Điểm một, khoảng trống có nhật ký tìm kiếm và bảng đếm, như Bảng 2-3 và Bảng 2-4. Điểm hai, kế hoạch mẫu có số cần mời và lịch tiếp xúc, như Bảng 3-13 và Bảng 3-14. Điểm ba, chất lượng phiếu có câu kiểm tra sự chú ý, so sánh nhóm sớm và muộn, kiểm tra sai lệch phương pháp chung, như Bảng 3-17 và Bảng 3-18.</w:t>
       </w:r>
     </w:p>
     <w:p>
@@ -6315,7 +6315,7 @@
         <w:rPr>
           <w:b w:val="0"/>
         </w:rPr>
-        <w:t xml:space="preserve">Ba điểm đầu thầy tô đỏ vì chỉ tốn thêm khoảng 2 đến 3 ngày và nằm gọn trong khung tám tuần. Sách cũng dặn ở mục 7 Chương 2: không sao chép mô hình nhiều tầng, SEM hay cỡ mẫu hàng nghìn người của luận án. </w:t>
+        <w:t xml:space="preserve">Ba điểm đầu thầy tô đỏ vì chỉ tốn thêm khoảng 2 đến 3 ngày và nằm gọn trong khung tám tuần. Sách cũng dặn ở mục E của Phần 2: không sao chép mô hình nhiều tầng, SEM hay cỡ mẫu hàng nghìn người của luận án. </w:t>
       </w:r>
       <w:r>
         <w:rPr>
@@ -6376,7 +6376,7 @@
           <w:color w:val="595959"/>
           <w:sz w:val="22"/>
         </w:rPr>
-        <w:t>Hướng dẫn Chuyên đề và Khóa luận tốt nghiệp, Chương 3, mục 3.5.2 và 3.5.3, Hình 47 và 48; file 2.Chapter_2_and_Chapter_3_Practice.xlsx (dữ liệu giả định), sheet 3_DuLieuSach</w:t>
+        <w:t>Hướng dẫn Chuyên đề và Khóa luận tốt nghiệp, Phần 3, Mục 3.5.2 và Mục 3.5.3, Hình 3-14 và 3-15; file 2.Chapter_2_and_Chapter_3_Practice.xlsx (dữ liệu giả định), sheet 3_DuLieuSach</w:t>
       </w:r>
     </w:p>
     <w:p>
@@ -6481,18 +6481,18 @@
           <w:color w:val="595959"/>
           <w:sz w:val="22"/>
         </w:rPr>
-        <w:t>Hướng dẫn Chuyên đề và Khóa luận tốt nghiệp, Chương 3, mục 3.6.1, Hình 49 đến 51, Bảng 17; file 2.Chapter_2_and_Chapter_3_Practice.xlsx (dữ liệu giả định), sheet 4_NhanKhauHoc và 5_ThongKeMoTa</w:t>
-      </w:r>
-    </w:p>
-    <w:p>
-      <w:pPr>
-        <w:spacing w:after="160" w:line="276" w:lineRule="auto"/>
-      </w:pPr>
-      <w:r>
-        <w:rPr>
-          <w:b w:val="0"/>
-        </w:rPr>
-        <w:t>Trước khi đi vào từng kỹ thuật, Hình 49 trình bày toàn bộ quy trình phân tích bằng Excel như một chuỗi bước. Bước đầu là thống kê mô tả. Bảng 17 liệt kê bảy chỉ số và hàm Excel tương ứng: COUNT để đếm số quan sát; AVERAGE cho trung bình; MEDIAN cho trung vị; MODE cho yếu vị; STDEV cho độ lệch chuẩn; MIN và MAX để kiểm tra giá trị ngoài thang; COUNTIF để đếm tần số cho thông tin chung như giới tính.</w:t>
+        <w:t>Hướng dẫn Chuyên đề và Khóa luận tốt nghiệp, Phần 3, Mục 3.6.1, Hình 3-16 đến 3-18, Bảng 3-20; file 2.Chapter_2_and_Chapter_3_Practice.xlsx (dữ liệu giả định), sheet 4_NhanKhauHoc và 5_ThongKeMoTa</w:t>
+      </w:r>
+    </w:p>
+    <w:p>
+      <w:pPr>
+        <w:spacing w:after="160" w:line="276" w:lineRule="auto"/>
+      </w:pPr>
+      <w:r>
+        <w:rPr>
+          <w:b w:val="0"/>
+        </w:rPr>
+        <w:t>Trước khi đi vào từng kỹ thuật, Hình 3-16 trình bày toàn bộ quy trình phân tích bằng Excel như một chuỗi bước. Bước đầu là thống kê mô tả. Bảng 3-20 liệt kê bảy chỉ số và hàm Excel tương ứng: COUNT để đếm số quan sát; AVERAGE cho trung bình; MEDIAN cho trung vị; MODE cho yếu vị; STDEV cho độ lệch chuẩn; MIN và MAX để kiểm tra giá trị ngoài thang; COUNTIF để đếm tần số cho thông tin chung như giới tính.</w:t>
       </w:r>
     </w:p>
     <w:p>
@@ -6575,7 +6575,7 @@
           <w:color w:val="595959"/>
           <w:sz w:val="22"/>
         </w:rPr>
-        <w:t>Hướng dẫn Chuyên đề và Khóa luận tốt nghiệp, Chương 3, mục 3.6.2, Bảng 18, Hình 52 và 53; file 2.Chapter_2_and_Chapter_3_Practice.xlsx (dữ liệu giả định), sheet 6_Cronbach</w:t>
+        <w:t>Hướng dẫn Chuyên đề và Khóa luận tốt nghiệp, Phần 3, Mục 3.6.2, Bảng 3-21, Hình 3-19 và 3-20; file 2.Chapter_2_and_Chapter_3_Practice.xlsx (dữ liệu giả định), sheet 6_Cronbach</w:t>
       </w:r>
     </w:p>
     <w:p>
@@ -6680,18 +6680,18 @@
           <w:color w:val="595959"/>
           <w:sz w:val="22"/>
         </w:rPr>
-        <w:t>Hướng dẫn Chuyên đề và Khóa luận tốt nghiệp, Chương 3, mục 3.6.2 và Bảng 18; Hair và cộng sự (2010); Creswell và Creswell (2018, tr. 215)</w:t>
-      </w:r>
-    </w:p>
-    <w:p>
-      <w:pPr>
-        <w:spacing w:after="160" w:line="276" w:lineRule="auto"/>
-      </w:pPr>
-      <w:r>
-        <w:rPr>
-          <w:b w:val="0"/>
-        </w:rPr>
-        <w:t>Slide trước các em đã thấy Alpha đo mức các câu hỏi trong một thang đo "cùng lên cùng xuống", tức cùng đo một khái niệm. Slide này là Bảng 18, cách đọc các mức của Alpha, một bảng thầy rất muốn các em thuộc. Có bốn mức. Dưới 0,6: thang đo kém nhất quán; xem lại từng câu, không dùng nếu không cải thiện được. Từ 0,6 đến dưới 0,7: có thể chấp nhận nhưng phải chỉ ra được một trong hai lý do, là khái niệm còn mới với người trả lời hoặc thang đo mới được xây dựng và ghi lý do đó vào bài. Từ 0,7 đến 0,9: tốt, là khoảng tối ưu. Trên 0,95: không phải tốt hơn.</w:t>
+        <w:t>Hướng dẫn Chuyên đề và Khóa luận tốt nghiệp, Phần 3, Mục 3.6.2 và Bảng 3-21; Hair và cộng sự (2010); Creswell và Creswell (2018, tr. 215)</w:t>
+      </w:r>
+    </w:p>
+    <w:p>
+      <w:pPr>
+        <w:spacing w:after="160" w:line="276" w:lineRule="auto"/>
+      </w:pPr>
+      <w:r>
+        <w:rPr>
+          <w:b w:val="0"/>
+        </w:rPr>
+        <w:t>Slide trước các em đã thấy Alpha đo mức các câu hỏi trong một thang đo "cùng lên cùng xuống", tức cùng đo một khái niệm. Slide này là Bảng 3-21, cách đọc các mức của Alpha, một bảng thầy rất muốn các em thuộc. Có bốn mức. Dưới 0,6: thang đo kém nhất quán; xem lại từng câu, không dùng nếu không cải thiện được. Từ 0,6 đến dưới 0,7: có thể chấp nhận nhưng phải chỉ ra được một trong hai lý do, là khái niệm còn mới với người trả lời hoặc thang đo mới được xây dựng và ghi lý do đó vào bài. Từ 0,7 đến 0,9: tốt, là khoảng tối ưu. Trên 0,95: không phải tốt hơn.</w:t>
       </w:r>
     </w:p>
     <w:p>
@@ -6774,7 +6774,7 @@
           <w:color w:val="595959"/>
           <w:sz w:val="22"/>
         </w:rPr>
-        <w:t>Hướng dẫn Chuyên đề và Khóa luận tốt nghiệp, Chương 3, mục 3.6.3 (*); Hair và cộng sự (2010)</w:t>
+        <w:t>Hướng dẫn Chuyên đề và Khóa luận tốt nghiệp, Phần 3, Mục 3.6.3 (*); Hair và cộng sự (2010)</w:t>
       </w:r>
     </w:p>
     <w:p>
@@ -6879,7 +6879,7 @@
           <w:color w:val="595959"/>
           <w:sz w:val="22"/>
         </w:rPr>
-        <w:t>Hướng dẫn Chuyên đề và Khóa luận tốt nghiệp, Chương 3, mục 3.6.4, Hình 54 đến 56, Bảng 19 và 20; file 2.Chapter_2_and_Chapter_3_Practice.xlsx (dữ liệu giả định), sheet 7_BienDaiDien đến 9_HoiQuy</w:t>
+        <w:t>Hướng dẫn Chuyên đề và Khóa luận tốt nghiệp, Phần 3, Mục 3.6.4, Hình 3-21 đến 3-23, Bảng 3-22 và 3-23; file 2.Chapter_2_and_Chapter_3_Practice.xlsx (dữ liệu giả định), sheet 7_BienDaiDien đến 9_HoiQuy</w:t>
       </w:r>
     </w:p>
     <w:p>
@@ -6984,18 +6984,18 @@
           <w:color w:val="595959"/>
           <w:sz w:val="22"/>
         </w:rPr>
-        <w:t>Hướng dẫn Chuyên đề và Khóa luận tốt nghiệp, Chương 3, mục 3.6.4 và Bảng 20; Hair và cộng sự (2010)</w:t>
-      </w:r>
-    </w:p>
-    <w:p>
-      <w:pPr>
-        <w:spacing w:after="160" w:line="276" w:lineRule="auto"/>
-      </w:pPr>
-      <w:r>
-        <w:rPr>
-          <w:b w:val="0"/>
-        </w:rPr>
-        <w:t>Phần dư là khoảng chênh giữa giá trị Y thật của một người và giá trị Y mà mô hình dự đoán cho người đó. Sách nói phần lớn các giả định của hồi quy được kiểm tra qua phần dư và Bảng 20 liệt kê bốn giả định kèm cách kiểm tra trên Excel.</w:t>
+        <w:t>Hướng dẫn Chuyên đề và Khóa luận tốt nghiệp, Phần 3, Mục 3.6.4 và Bảng 3-23; Hair và cộng sự (2010)</w:t>
+      </w:r>
+    </w:p>
+    <w:p>
+      <w:pPr>
+        <w:spacing w:after="160" w:line="276" w:lineRule="auto"/>
+      </w:pPr>
+      <w:r>
+        <w:rPr>
+          <w:b w:val="0"/>
+        </w:rPr>
+        <w:t>Phần dư là khoảng chênh giữa giá trị Y thật của một người và giá trị Y mà mô hình dự đoán cho người đó. Sách nói phần lớn các giả định của hồi quy được kiểm tra qua phần dư và Bảng 3-23 liệt kê bốn giả định kèm cách kiểm tra trên Excel.</w:t>
       </w:r>
     </w:p>
     <w:p>
@@ -7078,7 +7078,7 @@
           <w:color w:val="595959"/>
           <w:sz w:val="22"/>
         </w:rPr>
-        <w:t>Hướng dẫn Chuyên đề và Khóa luận tốt nghiệp, Chương 3, mục 3.7 và 3.8; Creswell và Creswell (2018, tr. 146 đến 153, 215 đến 216)</w:t>
+        <w:t>Hướng dẫn Chuyên đề và Khóa luận tốt nghiệp, Phần 3, Mục 3.7 và Mục 3.8; Creswell và Creswell (2018, tr. 146 đến 153, 215 đến 216)</w:t>
       </w:r>
     </w:p>
     <w:p>
@@ -7183,18 +7183,18 @@
           <w:color w:val="595959"/>
           <w:sz w:val="22"/>
         </w:rPr>
-        <w:t>Hướng dẫn Chuyên đề và Khóa luận tốt nghiệp, Chương 3, mục 6 đến 8, Bảng 25 và 26</w:t>
-      </w:r>
-    </w:p>
-    <w:p>
-      <w:pPr>
-        <w:spacing w:after="160" w:line="276" w:lineRule="auto"/>
-      </w:pPr>
-      <w:r>
-        <w:rPr>
-          <w:b w:val="0"/>
-        </w:rPr>
-        <w:t>Bảng 26 là công cụ tự chấm mà thầy đã nhắc ở đầu buổi, khi đối chiếu những gì Core Slide 1 đã hẹn: đây là công cụ gần nhất với tiêu chí chấm có trong sách. Điều đặc biệt là mỗi câu hỏi đi kèm một cách kiểm tra cụ thể, để câu trả lời không dựa vào cảm giác. Ví dụ câu 1, đoạn văn gom nhóm hay liệt kê: tô đậm chủ ngữ của từng câu, nếu phần lớn là tên tác giả thì đang liệt kê. Câu 5, mô hình có đơn giản không: đếm biến độc lập, phải từ 3 đến 5 và đếm số mũi tên với số giả thuyết, phải bằng nhau. Câu 9, quy trình thu thập: đủ bốn con số mời, thu về, loại, hợp lệ.</w:t>
+        <w:t>Hướng dẫn Chuyên đề và Khóa luận tốt nghiệp, Phần 3, mục F (lỗi thường gặp, tự chấm, checklist), Bảng 3-26 và 3-27</w:t>
+      </w:r>
+    </w:p>
+    <w:p>
+      <w:pPr>
+        <w:spacing w:after="160" w:line="276" w:lineRule="auto"/>
+      </w:pPr>
+      <w:r>
+        <w:rPr>
+          <w:b w:val="0"/>
+        </w:rPr>
+        <w:t>Bảng 3-27 là công cụ tự chấm mà thầy đã nhắc ở đầu buổi, khi đối chiếu những gì Core Slide 1 đã hẹn: đây là công cụ gần nhất với tiêu chí chấm có trong sách. Điều đặc biệt là mỗi câu hỏi đi kèm một cách kiểm tra cụ thể, để câu trả lời không dựa vào cảm giác. Ví dụ câu 1, đoạn văn gom nhóm hay liệt kê: tô đậm chủ ngữ của từng câu, nếu phần lớn là tên tác giả thì đang liệt kê. Câu 5, mô hình có đơn giản không: đếm biến độc lập, phải từ 3 đến 5 và đếm số mũi tên với số giả thuyết, phải bằng nhau. Câu 9, quy trình thu thập: đủ bốn con số mời, thu về, loại, hợp lệ.</w:t>
       </w:r>
     </w:p>
     <w:p>
@@ -7216,7 +7216,7 @@
         <w:rPr>
           <w:b w:val="0"/>
         </w:rPr>
-        <w:t xml:space="preserve">Bảng 25 đi kèm liệt kê sáu lỗi của Chương 3, trong đó lỗi số 1 là mô tả phương pháp chọn mẫu sai với cách làm thật, hậu quả là người chấm nghi ngờ tính trung thực. </w:t>
+        <w:t xml:space="preserve">Bảng 3-26 đi kèm liệt kê sáu lỗi của Chương 3, trong đó lỗi số 1 là mô tả phương pháp chọn mẫu sai với cách làm thật, hậu quả là người chấm nghi ngờ tính trung thực. </w:t>
       </w:r>
       <w:r>
         <w:rPr>
@@ -7241,7 +7241,7 @@
         <w:rPr>
           <w:i/>
         </w:rPr>
-        <w:t>[Gợi ý tổ chức lớp] Thầy đề nghị các em làm Bảng 26 theo cặp: đổi bản thảo cho nhau, mỗi người chấm bài của bạn. Người viết thường tự chấm "có" vì biết mình định viết gì; người đọc chỉ thấy những gì thực sự có trên trang giấy. Khoảng cách giữa hai điểm số chính là chỗ cần sửa.</w:t>
+        <w:t>[Gợi ý tổ chức lớp] Thầy đề nghị các em làm Bảng 3-27 theo cặp: đổi bản thảo cho nhau, mỗi người chấm bài của bạn. Người viết thường tự chấm "có" vì biết mình định viết gì; người đọc chỉ thấy những gì thực sự có trên trang giấy. Khoảng cách giữa hai điểm số chính là chỗ cần sửa.</w:t>
       </w:r>
     </w:p>
     <w:p>
@@ -7276,7 +7276,7 @@
           <w:color w:val="595959"/>
           <w:sz w:val="24"/>
         </w:rPr>
-        <w:t>Chương 4 (mục 1 đến 9); Hình 58 đến 78; Bảng 27 đến 42; hai file 3.Chapter_4_and_Chapter_5</w:t>
+        <w:t>Phần 4 (mục A đến H); Hình 4-1 đến 4-21; Bảng 4-1 đến 4-16; hai file 3.Chapter_4_and_Chapter_5</w:t>
       </w:r>
     </w:p>
     <w:p>
@@ -7312,7 +7312,7 @@
           <w:color w:val="595959"/>
           <w:sz w:val="22"/>
         </w:rPr>
-        <w:t>Hướng dẫn Chuyên đề và Khóa luận tốt nghiệp, Chương 4; hai file 3.Chapter_4_and_Chapter_5_Practice</w:t>
+        <w:t>Hướng dẫn Chuyên đề và Khóa luận tốt nghiệp, Phần 4; hai file 3.Chapter_4_and_Chapter_5_Practice</w:t>
       </w:r>
     </w:p>
     <w:p>
@@ -7406,7 +7406,7 @@
           <w:color w:val="595959"/>
           <w:sz w:val="22"/>
         </w:rPr>
-        <w:t>Hướng dẫn Chuyên đề và Khóa luận tốt nghiệp, Chương 4, mục 1 và 2, Hình 59</w:t>
+        <w:t>Hướng dẫn Chuyên đề và Khóa luận tốt nghiệp, Phần 4, mục B và C, Hình 4-2</w:t>
       </w:r>
     </w:p>
     <w:p>
@@ -7500,7 +7500,7 @@
           <w:color w:val="595959"/>
           <w:sz w:val="22"/>
         </w:rPr>
-        <w:t>Hướng dẫn Chuyên đề và Khóa luận tốt nghiệp, Chương 4, mục 3 và Hình 60; file 3.Chapter_4_and_Chapter_5_Practice_NH_X.xlsx (dữ liệu giả định), sheet 4_NhanKhauHoc</w:t>
+        <w:t>Hướng dẫn Chuyên đề và Khóa luận tốt nghiệp, Phần 4, mục D và Hình 4-3; file 3.Chapter_4_and_Chapter_5_Practice_NH_X.xlsx (dữ liệu giả định), sheet 4_NhanKhauHoc</w:t>
       </w:r>
     </w:p>
     <w:p>
@@ -7558,7 +7558,7 @@
         <w:rPr>
           <w:i/>
         </w:rPr>
-        <w:t>[Gợi ý bài tập tại lớp] Cho các em Bảng 28 và đúng năm phút. Yêu cầu viết một đoạn không được lặp lại quá hai con số có sẵn trong bảng nhưng phải có ít nhất một con số các em tự tính ra như 62,0% hay 80,0%. Bài tập này buộc các em chuyển từ đọc lại sang diễn giải.</w:t>
+        <w:t>[Gợi ý bài tập tại lớp] Cho các em Bảng 4-2 và đúng năm phút. Yêu cầu viết một đoạn không được lặp lại quá hai con số có sẵn trong bảng nhưng phải có ít nhất một con số các em tự tính ra như 62,0% hay 80,0%. Bài tập này buộc các em chuyển từ đọc lại sang diễn giải.</w:t>
       </w:r>
     </w:p>
     <w:p>
@@ -7594,18 +7594,18 @@
           <w:color w:val="595959"/>
           <w:sz w:val="22"/>
         </w:rPr>
-        <w:t>Hướng dẫn Chuyên đề và Khóa luận tốt nghiệp, Chương 4, mục 4.1.2, Bảng 29 và Hình 62; file 3.Chapter_4_and_Chapter_5_Practice_NH_X.xlsx (dữ liệu giả định), sheet 5_ThongKeMoTa và 11_BieuDo</w:t>
-      </w:r>
-    </w:p>
-    <w:p>
-      <w:pPr>
-        <w:spacing w:after="160" w:line="276" w:lineRule="auto"/>
-      </w:pPr>
-      <w:r>
-        <w:rPr>
-          <w:b w:val="0"/>
-        </w:rPr>
-        <w:t>Biểu đồ này vẽ lại Hình 62 trong sách, số liệu lấy từ sheet 11_BieuDo. Thầy đọc theo bốn bước. Đọc: sự hữu ích cao nhất, 3,88; niềm tin 3,41 và ảnh hưởng xã hội 3,36 thấp nhất. So sánh: cả năm biến đều trên mức trung lập 3,0 nhưng niềm tin và ảnh hưởng xã hội chỉ nhỉnh hơn một chút. Độ lệch chuẩn từ 0,67 đến 0,75 cho biết mức phân tán tương đương.</w:t>
+        <w:t>Hướng dẫn Chuyên đề và Khóa luận tốt nghiệp, Phần 4, Mục 4.1.2, Bảng 4-3 và Hình 4-5; file 3.Chapter_4_and_Chapter_5_Practice_NH_X.xlsx (dữ liệu giả định), sheet 5_ThongKeMoTa và 11_BieuDo</w:t>
+      </w:r>
+    </w:p>
+    <w:p>
+      <w:pPr>
+        <w:spacing w:after="160" w:line="276" w:lineRule="auto"/>
+      </w:pPr>
+      <w:r>
+        <w:rPr>
+          <w:b w:val="0"/>
+        </w:rPr>
+        <w:t>Biểu đồ này vẽ lại Hình 4-5 trong sách, số liệu lấy từ sheet 11_BieuDo. Thầy đọc theo bốn bước. Đọc: sự hữu ích cao nhất, 3,88; niềm tin 3,41 và ảnh hưởng xã hội 3,36 thấp nhất. So sánh: cả năm biến đều trên mức trung lập 3,0 nhưng niềm tin và ảnh hưởng xã hội chỉ nhỉnh hơn một chút. Độ lệch chuẩn từ 0,67 đến 0,75 cho biết mức phân tán tương đương.</w:t>
       </w:r>
     </w:p>
     <w:p>
@@ -7699,7 +7699,7 @@
           <w:color w:val="595959"/>
           <w:sz w:val="22"/>
         </w:rPr>
-        <w:t>Hướng dẫn Chuyên đề và Khóa luận tốt nghiệp, Chương 4, mục 4.2.1, Bảng 30 và 31; file 3.Chapter_4_and_Chapter_5_Practice_NH_X.xlsx (dữ liệu giả định); file 3.Chapter_4_and_Chapter_5_Practice_Truong_Y.xlsx (dữ liệu giả định), sheet 6_Cronbach</w:t>
+        <w:t>Hướng dẫn Chuyên đề và Khóa luận tốt nghiệp, Phần 4, Mục 4.2.1, Bảng 4-4 và 4-5; file 3.Chapter_4_and_Chapter_5_Practice_NH_X.xlsx (dữ liệu giả định); file 3.Chapter_4_and_Chapter_5_Practice_Truong_Y.xlsx (dữ liệu giả định), sheet 6_Cronbach</w:t>
       </w:r>
     </w:p>
     <w:p>
@@ -7804,7 +7804,7 @@
           <w:color w:val="595959"/>
           <w:sz w:val="22"/>
         </w:rPr>
-        <w:t>Hướng dẫn Chuyên đề và Khóa luận tốt nghiệp, Chương 4, mục 4.3 và Bảng 32; file 3.Chapter_4_and_Chapter_5_Practice_NH_X.xlsx (dữ liệu giả định), sheet 8_TuongQuan</w:t>
+        <w:t>Hướng dẫn Chuyên đề và Khóa luận tốt nghiệp, Phần 4, Mục 4.3 và Bảng 4-6; file 3.Chapter_4_and_Chapter_5_Practice_NH_X.xlsx (dữ liệu giả định), sheet 8_TuongQuan</w:t>
       </w:r>
     </w:p>
     <w:p>
@@ -7909,7 +7909,7 @@
           <w:color w:val="595959"/>
           <w:sz w:val="22"/>
         </w:rPr>
-        <w:t>Hướng dẫn Chuyên đề và Khóa luận tốt nghiệp, Chương 4, mục 4.4.1, Bảng 33, Hình 65 đến 69; file 3.Chapter_4_and_Chapter_5_Practice_NH_X.xlsx (dữ liệu giả định), sheet 9_HoiQuy và 10_PhanDu</w:t>
+        <w:t>Hướng dẫn Chuyên đề và Khóa luận tốt nghiệp, Phần 4, Mục 4.4.1, Bảng 4-7, Hình 4-8 đến 4-12; file 3.Chapter_4_and_Chapter_5_Practice_NH_X.xlsx (dữ liệu giả định), sheet 9_HoiQuy và 10_PhanDu</w:t>
       </w:r>
     </w:p>
     <w:p>
@@ -8014,18 +8014,18 @@
           <w:color w:val="595959"/>
           <w:sz w:val="22"/>
         </w:rPr>
-        <w:t>Hướng dẫn Chuyên đề và Khóa luận tốt nghiệp, Chương 4, mục 4.4.1, Hình 68 và Bảng 42; Creswell và Creswell (2018, tr. 220); file 3.Chapter_4_and_Chapter_5_Practice_NH_X.xlsx (dữ liệu giả định), sheet 9_HoiQuy</w:t>
-      </w:r>
-    </w:p>
-    <w:p>
-      <w:pPr>
-        <w:spacing w:after="160" w:line="276" w:lineRule="auto"/>
-      </w:pPr>
-      <w:r>
-        <w:rPr>
-          <w:b w:val="0"/>
-        </w:rPr>
-        <w:t>Creswell và Creswell khuyên báo cáo ba loại bằng chứng, như Hình 68: kiểm định ý nghĩa thống kê, khoảng tin cậy và độ lớn tác động. Sách giải thích vì sao phải có đủ ba: P-value chỉ cho biết kết quả có khó xảy ra do ngẫu nhiên hay không, không cho biết tác động mạnh hay yếu.</w:t>
+        <w:t>Hướng dẫn Chuyên đề và Khóa luận tốt nghiệp, Phần 4, Mục 4.4.1, Hình 4-11 và Bảng 4-16; Creswell và Creswell (2018, tr. 220); file 3.Chapter_4_and_Chapter_5_Practice_NH_X.xlsx (dữ liệu giả định), sheet 9_HoiQuy</w:t>
+      </w:r>
+    </w:p>
+    <w:p>
+      <w:pPr>
+        <w:spacing w:after="160" w:line="276" w:lineRule="auto"/>
+      </w:pPr>
+      <w:r>
+        <w:rPr>
+          <w:b w:val="0"/>
+        </w:rPr>
+        <w:t>Creswell và Creswell khuyên báo cáo ba loại bằng chứng, như Hình 4-11: kiểm định ý nghĩa thống kê, khoảng tin cậy và độ lớn tác động. Sách giải thích vì sao phải có đủ ba: P-value chỉ cho biết kết quả có khó xảy ra do ngẫu nhiên hay không, không cho biết tác động mạnh hay yếu.</w:t>
       </w:r>
     </w:p>
     <w:p>
@@ -8047,7 +8047,7 @@
         <w:rPr>
           <w:b w:val="0"/>
         </w:rPr>
-        <w:t xml:space="preserve">Độ lớn tác động được đọc từ β và R bình phương. Sách cảnh báo: một hệ số rất nhỏ vẫn có thể có P-value nhỏ khi mẫu lớn, nên luôn đọc P-value cùng độ lớn của hệ số. Bảng 42 ghi lỗi số 5 của Chương 4 đúng là điều này. </w:t>
+        <w:t xml:space="preserve">Độ lớn tác động được đọc từ β và R bình phương. Sách cảnh báo: một hệ số rất nhỏ vẫn có thể có P-value nhỏ khi mẫu lớn, nên luôn đọc P-value cùng độ lớn của hệ số. Bảng 4-16 ghi lỗi số 5 của Chương 4 đúng là điều này. </w:t>
       </w:r>
       <w:r>
         <w:rPr>
@@ -8108,18 +8108,18 @@
           <w:color w:val="595959"/>
           <w:sz w:val="22"/>
         </w:rPr>
-        <w:t>Hướng dẫn Chuyên đề và Khóa luận tốt nghiệp, Chương 4, mục 4.4.2, Hình 70, Bảng 34 và 35; file 3.Chapter_4_and_Chapter_5_Practice_NH_X.xlsx (dữ liệu giả định); file 3.Chapter_4_and_Chapter_5_Practice_Truong_Y.xlsx (dữ liệu giả định), sheet 9_HoiQuy</w:t>
-      </w:r>
-    </w:p>
-    <w:p>
-      <w:pPr>
-        <w:spacing w:after="160" w:line="276" w:lineRule="auto"/>
-      </w:pPr>
-      <w:r>
-        <w:rPr>
-          <w:b w:val="0"/>
-        </w:rPr>
-        <w:t>Sau hồi quy, mỗi giả thuyết ở Chương 2 phải có một kết luận rõ ràng. Sách vẽ tiêu chí này thành cây quyết định ở Hình 70 với hai điều kiện: hệ số cùng dấu với dự đoán và P-value nhỏ hơn 0,05. Chỉ khi thỏa đồng thời cả hai mới kết luận được ủng hộ.</w:t>
+        <w:t>Hướng dẫn Chuyên đề và Khóa luận tốt nghiệp, Phần 4, Mục 4.4.2, Hình 4-13, Bảng 4-8 và 4-9; file 3.Chapter_4_and_Chapter_5_Practice_NH_X.xlsx (dữ liệu giả định); file 3.Chapter_4_and_Chapter_5_Practice_Truong_Y.xlsx (dữ liệu giả định), sheet 9_HoiQuy</w:t>
+      </w:r>
+    </w:p>
+    <w:p>
+      <w:pPr>
+        <w:spacing w:after="160" w:line="276" w:lineRule="auto"/>
+      </w:pPr>
+      <w:r>
+        <w:rPr>
+          <w:b w:val="0"/>
+        </w:rPr>
+        <w:t>Sau hồi quy, mỗi giả thuyết ở Chương 2 phải có một kết luận rõ ràng. Sách vẽ tiêu chí này thành cây quyết định ở Hình 4-13 với hai điều kiện: hệ số cùng dấu với dự đoán và P-value nhỏ hơn 0,05. Chỉ khi thỏa đồng thời cả hai mới kết luận được ủng hộ.</w:t>
       </w:r>
     </w:p>
     <w:p>
@@ -8213,7 +8213,7 @@
           <w:color w:val="595959"/>
           <w:sz w:val="22"/>
         </w:rPr>
-        <w:t>Hướng dẫn Chuyên đề và Khóa luận tốt nghiệp, Chương 4, mục 4.4.3 (*), Bảng 36 đến 38, Hình 71 và 72; Trần Phước (n.d., tr. 57 đến 71); file 3.Chapter_4_and_Chapter_5_Practice_Truong_Y.xlsx (dữ liệu giả định), sheet 12_CauHoiMo</w:t>
+        <w:t>Hướng dẫn Chuyên đề và Khóa luận tốt nghiệp, Phần 4, Mục 4.4.3 (*), Bảng 4-10 đến 4-12, Hình 4-14 và 4-15; Trần Phước (n.d., tr. 57 đến 71); file 3.Chapter_4_and_Chapter_5_Practice_Truong_Y.xlsx (dữ liệu giả định), sheet 12_CauHoiMo</w:t>
       </w:r>
     </w:p>
     <w:p>
@@ -8318,7 +8318,7 @@
           <w:color w:val="595959"/>
           <w:sz w:val="22"/>
         </w:rPr>
-        <w:t>Hướng dẫn Chuyên đề và Khóa luận tốt nghiệp, Chương 4, mục 4.5.1, 4.5.2, mục 6 và Bảng 40; Creswell và Creswell (2018, tr. 220 đến 221)</w:t>
+        <w:t>Hướng dẫn Chuyên đề và Khóa luận tốt nghiệp, Phần 4, Mục 4.5.1, Mục 4.5.2, Kỹ thuật dùng cho Mục 4.5.2 và Bảng 4-13; Creswell và Creswell (2018, tr. 220 đến 221)</w:t>
       </w:r>
     </w:p>
     <w:p>
@@ -8423,7 +8423,7 @@
           <w:color w:val="595959"/>
           <w:sz w:val="22"/>
         </w:rPr>
-        <w:t>Hướng dẫn Chuyên đề và Khóa luận tốt nghiệp, Chương 4, mục 5 và Bảng 39</w:t>
+        <w:t>Hướng dẫn Chuyên đề và Khóa luận tốt nghiệp, Phần 4, phần Đọc kỹ một đoạn thảo luận mẫu và Bảng 4-14</w:t>
       </w:r>
     </w:p>
     <w:p>
@@ -8517,18 +8517,18 @@
           <w:color w:val="595959"/>
           <w:sz w:val="22"/>
         </w:rPr>
-        <w:t>Hướng dẫn Chuyên đề và Khóa luận tốt nghiệp, Chương 4, mục 4.5.3, Hình 74; file 3.Chapter_4_and_Chapter_5_Practice_NH_X.xlsx (dữ liệu giả định), sheet 12_TinhHuong</w:t>
-      </w:r>
-    </w:p>
-    <w:p>
-      <w:pPr>
-        <w:spacing w:after="160" w:line="276" w:lineRule="auto"/>
-      </w:pPr>
-      <w:r>
-        <w:rPr>
-          <w:b w:val="0"/>
-        </w:rPr>
-        <w:t>Sách có một câu thầy rất muốn các em nhớ: một kết quả không như dự đoán không phải là thất bại; đó thường là phần có giá trị nhất của thảo luận nếu được giải thích có căn cứ. Hình 74 đưa ra năm hướng giải thích: đặc điểm mẫu; bối cảnh; quan hệ gián tiếp; đo lường; thống kê. Các em chỉ viết hướng nào có bằng chứng trong dữ liệu hoặc tài liệu.</w:t>
+        <w:t>Hướng dẫn Chuyên đề và Khóa luận tốt nghiệp, Phần 4, Mục 4.5.3, Hình 4-17; file 3.Chapter_4_and_Chapter_5_Practice_NH_X.xlsx (dữ liệu giả định), sheet 12_TinhHuong</w:t>
+      </w:r>
+    </w:p>
+    <w:p>
+      <w:pPr>
+        <w:spacing w:after="160" w:line="276" w:lineRule="auto"/>
+      </w:pPr>
+      <w:r>
+        <w:rPr>
+          <w:b w:val="0"/>
+        </w:rPr>
+        <w:t>Sách có một câu thầy rất muốn các em nhớ: một kết quả không như dự đoán không phải là thất bại; đó thường là phần có giá trị nhất của thảo luận nếu được giải thích có căn cứ. Hình 4-17 đưa ra năm hướng giải thích: đặc điểm mẫu; bối cảnh; quan hệ gián tiếp; đo lường; thống kê. Các em chỉ viết hướng nào có bằng chứng trong dữ liệu hoặc tài liệu.</w:t>
       </w:r>
     </w:p>
     <w:p>
@@ -8622,7 +8622,7 @@
           <w:color w:val="595959"/>
           <w:sz w:val="22"/>
         </w:rPr>
-        <w:t>Hướng dẫn Chuyên đề và Khóa luận tốt nghiệp, Chương 4, mục "Ba tình huống khó", Hình 75 đến 77; file 3.Chapter_4_and_Chapter_5_Practice_NH_X.xlsx (dữ liệu giả định), sheet 12_TinhHuong</w:t>
+        <w:t>Hướng dẫn Chuyên đề và Khóa luận tốt nghiệp, Phần 4, Mục 4.5.3 (Ba tình huống khó khi đọc kết quả hồi quy), Hình 4-18 đến 4-20; file 3.Chapter_4_and_Chapter_5_Practice_NH_X.xlsx (dữ liệu giả định), sheet 12_TinhHuong</w:t>
       </w:r>
     </w:p>
     <w:p>
@@ -8727,7 +8727,7 @@
           <w:color w:val="595959"/>
           <w:sz w:val="22"/>
         </w:rPr>
-        <w:t>Hướng dẫn Chuyên đề và Khóa luận tốt nghiệp, Chương 4, mục 7 và Bảng 41; Trần Phước (n.d., tr. 58, 69 đến 71)</w:t>
+        <w:t>Hướng dẫn Chuyên đề và Khóa luận tốt nghiệp, Phần 4, mục F và Bảng 4-15; Trần Phước (n.d., tr. 58, 69 đến 71)</w:t>
       </w:r>
     </w:p>
     <w:p>
@@ -8821,18 +8821,18 @@
           <w:color w:val="595959"/>
           <w:sz w:val="22"/>
         </w:rPr>
-        <w:t>Hướng dẫn Chuyên đề và Khóa luận tốt nghiệp, Chương 4, mục "Giới thiệu chương và kết luận chương", Hình 78</w:t>
-      </w:r>
-    </w:p>
-    <w:p>
-      <w:pPr>
-        <w:spacing w:after="160" w:line="276" w:lineRule="auto"/>
-      </w:pPr>
-      <w:r>
-        <w:rPr>
-          <w:b w:val="0"/>
-        </w:rPr>
-        <w:t>Hình 78 ghi nhiệm vụ của từng câu trong đoạn giới thiệu và đoạn kết luận chương. Sách có hai lời dặn rất thực tế: viết đoạn giới thiệu sau khi đã viết xong chương, khi các mục đã cố định và thứ tự các mục trong đoạn giới thiệu phải khớp với mục lục. Đoạn giới thiệu không nêu kết quả.</w:t>
+        <w:t>Hướng dẫn Chuyên đề và Khóa luận tốt nghiệp, Phần 4, mục "Đoạn giới thiệu chương và đoạn kết luận chương", Hình 4-21</w:t>
+      </w:r>
+    </w:p>
+    <w:p>
+      <w:pPr>
+        <w:spacing w:after="160" w:line="276" w:lineRule="auto"/>
+      </w:pPr>
+      <w:r>
+        <w:rPr>
+          <w:b w:val="0"/>
+        </w:rPr>
+        <w:t>Hình 4-21 ghi nhiệm vụ của từng câu trong đoạn giới thiệu và đoạn kết luận chương. Sách có hai lời dặn rất thực tế: viết đoạn giới thiệu sau khi đã viết xong chương, khi các mục đã cố định và thứ tự các mục trong đoạn giới thiệu phải khớp với mục lục. Đoạn giới thiệu không nêu kết quả.</w:t>
       </w:r>
     </w:p>
     <w:p>
@@ -8915,29 +8915,29 @@
           <w:color w:val="595959"/>
           <w:sz w:val="22"/>
         </w:rPr>
-        <w:t>Hướng dẫn Chuyên đề và Khóa luận tốt nghiệp, Chương 4, mục 8 và 9, Bảng 42; phần "Điều cần nhớ"</w:t>
-      </w:r>
-    </w:p>
-    <w:p>
-      <w:pPr>
-        <w:spacing w:after="160" w:line="276" w:lineRule="auto"/>
-      </w:pPr>
-      <w:r>
-        <w:rPr>
-          <w:b w:val="0"/>
-        </w:rPr>
-        <w:t>Bảng 42 tổng hợp bảy lỗi phổ biến nhất của Chương 4. Sách dặn đọc bảng này hai lần: trước khi viết để biết cần tránh gì và sau khi viết để soát bản thảo.</w:t>
-      </w:r>
-    </w:p>
-    <w:p>
-      <w:pPr>
-        <w:spacing w:after="160" w:line="276" w:lineRule="auto"/>
-      </w:pPr>
-      <w:r>
-        <w:rPr>
-          <w:b w:val="0"/>
-        </w:rPr>
-        <w:t>Hai dòng tô hồng là hai lỗi sai về phương pháp. Lỗi số 2, nhầm B với β: B cho biết Y thay đổi bao nhiêu điểm khi X tăng 1 điểm, còn β dùng để so sánh các biến; viết "HI tăng 1 điểm thì YD tăng 0,394 điểm" là dùng nhầm β. Bảng 57 của sách còn ghi đúng lỗi này thành một góp ý mẫu: đoạn diễn giải ghi β của HI là 0,443 trong khi bảng ghi 0,394. Lỗi số 3, kết luận "được ủng hộ" khi hệ số ngược dấu: một giả thuyết dự đoán cùng chiều mà hệ số âm có ý nghĩa thì giả thuyết không được ủng hộ, dù P-value rất nhỏ.</w:t>
+        <w:t>Hướng dẫn Chuyên đề và Khóa luận tốt nghiệp, Phần 4, mục G, Bảng 4-16; khung POINT cuối phần</w:t>
+      </w:r>
+    </w:p>
+    <w:p>
+      <w:pPr>
+        <w:spacing w:after="160" w:line="276" w:lineRule="auto"/>
+      </w:pPr>
+      <w:r>
+        <w:rPr>
+          <w:b w:val="0"/>
+        </w:rPr>
+        <w:t>Bảng 4-16 tổng hợp bảy lỗi phổ biến nhất của Chương 4. Sách dặn đọc bảng này hai lần: trước khi viết để biết cần tránh gì và sau khi viết để soát bản thảo.</w:t>
+      </w:r>
+    </w:p>
+    <w:p>
+      <w:pPr>
+        <w:spacing w:after="160" w:line="276" w:lineRule="auto"/>
+      </w:pPr>
+      <w:r>
+        <w:rPr>
+          <w:b w:val="0"/>
+        </w:rPr>
+        <w:t>Hai dòng tô hồng là hai lỗi sai về phương pháp. Lỗi số 2, nhầm B với β: B cho biết Y thay đổi bao nhiêu điểm khi X tăng 1 điểm, còn β dùng để so sánh các biến; viết "HI tăng 1 điểm thì YD tăng 0,394 điểm" là dùng nhầm β. Bảng 9-4 của sách còn ghi đúng lỗi này thành một góp ý mẫu: đoạn diễn giải ghi β của HI là 0,443 trong khi bảng ghi 0,394. Lỗi số 3, kết luận "được ủng hộ" khi hệ số ngược dấu: một giả thuyết dự đoán cùng chiều mà hệ số âm có ý nghĩa thì giả thuyết không được ủng hộ, dù P-value rất nhỏ.</w:t>
       </w:r>
     </w:p>
     <w:p>
@@ -8960,7 +8960,7 @@
         <w:rPr>
           <w:b w:val="0"/>
         </w:rPr>
-        <w:t xml:space="preserve"> Đây là câu chốt ở phần "Điều cần nhớ" của Chương 4.</w:t>
+        <w:t xml:space="preserve"> Đây là câu chốt ở khung POINT cuối Phần 4.</w:t>
       </w:r>
     </w:p>
     <w:p>
@@ -8979,7 +8979,7 @@
         <w:rPr>
           <w:i/>
         </w:rPr>
-        <w:t>Thử hình dung một đề tài dự đoán "chi phí có tác động ngược chiều" nhưng hồi quy cho hệ số dương 0,21 với P-value 0,002. Bạn ấy vui vì "có ý nghĩa" và ghi "được ủng hộ". Hội đồng chỉ cần hỏi "dấu dự đoán là gì?" là cả phần kết luận sụp. Cây quyết định hai điều kiện ở Hình 70 tồn tại chính để chặn tình huống này.</w:t>
+        <w:t>Thử hình dung một đề tài dự đoán "chi phí có tác động ngược chiều" nhưng hồi quy cho hệ số dương 0,21 với P-value 0,002. Bạn ấy vui vì "có ý nghĩa" và ghi "được ủng hộ". Hội đồng chỉ cần hỏi "dấu dự đoán là gì?" là cả phần kết luận sụp. Cây quyết định hai điều kiện ở Hình 4-13 tồn tại chính để chặn tình huống này.</w:t>
       </w:r>
     </w:p>
     <w:p>
@@ -9014,7 +9014,7 @@
           <w:color w:val="595959"/>
           <w:sz w:val="24"/>
         </w:rPr>
-        <w:t>Chương 5 (mục 1 đến 6) và chương Kết luận; Hình 79 đến 86; Bảng 43 đến 47</w:t>
+        <w:t>Phần 5 (mục A đến G) và Phần 6; Hình 5-1 đến 5-7 và 6-1; Bảng 5-1 đến 5-5</w:t>
       </w:r>
     </w:p>
     <w:p>
@@ -9050,7 +9050,7 @@
           <w:color w:val="595959"/>
           <w:sz w:val="22"/>
         </w:rPr>
-        <w:t>Hướng dẫn Chuyên đề và Khóa luận tốt nghiệp, Chương 5 và chương Kết luận</w:t>
+        <w:t>Hướng dẫn Chuyên đề và Khóa luận tốt nghiệp, Phần 5 và Phần 6</w:t>
       </w:r>
     </w:p>
     <w:p>
@@ -9138,7 +9138,7 @@
           <w:color w:val="595959"/>
           <w:sz w:val="22"/>
         </w:rPr>
-        <w:t>Hướng dẫn Chuyên đề và Khóa luận tốt nghiệp, Chương 5, mục 1 và 2, Hình 79</w:t>
+        <w:t>Hướng dẫn Chuyên đề và Khóa luận tốt nghiệp, Phần 5, mục B và C, Hình 5-1</w:t>
       </w:r>
     </w:p>
     <w:p>
@@ -9232,7 +9232,7 @@
           <w:color w:val="595959"/>
           <w:sz w:val="22"/>
         </w:rPr>
-        <w:t>Hướng dẫn Chuyên đề và Khóa luận tốt nghiệp, Chương 5, mục 5.1.1 và 5.1.2, Hình 80; file 3.Chapter_4_and_Chapter_5_Practice_NH_X.xlsx (dữ liệu giả định)</w:t>
+        <w:t>Hướng dẫn Chuyên đề và Khóa luận tốt nghiệp, Phần 5, Mục 5.1.1 và Mục 5.1.2, Hình 5-2; file 3.Chapter_4_and_Chapter_5_Practice_NH_X.xlsx (dữ liệu giả định)</w:t>
       </w:r>
     </w:p>
     <w:p>
@@ -9337,7 +9337,7 @@
           <w:color w:val="595959"/>
           <w:sz w:val="22"/>
         </w:rPr>
-        <w:t>Hướng dẫn Chuyên đề và Khóa luận tốt nghiệp, Chương 5, mục 5.2.1, Bảng 43 và Hình 81; Martilla và James (1977); file 3.Chapter_4_and_Chapter_5_Practice_NH_X.xlsx (dữ liệu giả định), sheet 11_BieuDo</w:t>
+        <w:t>Hướng dẫn Chuyên đề và Khóa luận tốt nghiệp, Phần 5, Mục 5.2.1, Bảng 5-2 và Hình 5-3; Martilla và James (1977); file 3.Chapter_4_and_Chapter_5_Practice_NH_X.xlsx (dữ liệu giả định), sheet 11_BieuDo</w:t>
       </w:r>
     </w:p>
     <w:p>
@@ -9431,7 +9431,7 @@
           <w:color w:val="595959"/>
           <w:sz w:val="22"/>
         </w:rPr>
-        <w:t>Hướng dẫn Chuyên đề và Khóa luận tốt nghiệp, Chương 5, mục 5.2.1 và Hình 82; file 3.Chapter_4_and_Chapter_5_Practice_Truong_Y.xlsx (dữ liệu giả định), sheet 11_BieuDo và 12_CauHoiMo</w:t>
+        <w:t>Hướng dẫn Chuyên đề và Khóa luận tốt nghiệp, Phần 5, Mục 5.2.1 và Hình 5-4; file 3.Chapter_4_and_Chapter_5_Practice_Truong_Y.xlsx (dữ liệu giả định), sheet 11_BieuDo và 12_CauHoiMo</w:t>
       </w:r>
     </w:p>
     <w:p>
@@ -9525,7 +9525,7 @@
           <w:color w:val="595959"/>
           <w:sz w:val="22"/>
         </w:rPr>
-        <w:t>Hướng dẫn Chuyên đề và Khóa luận tốt nghiệp, Chương 5, mục 5.2.1 và 5.2.2</w:t>
+        <w:t>Hướng dẫn Chuyên đề và Khóa luận tốt nghiệp, Phần 5, Mục 5.2.1 và Mục 5.2.2</w:t>
       </w:r>
     </w:p>
     <w:p>
@@ -9630,7 +9630,7 @@
           <w:color w:val="595959"/>
           <w:sz w:val="22"/>
         </w:rPr>
-        <w:t>Hướng dẫn Chuyên đề và Khóa luận tốt nghiệp, Chương 5, mục 5.3.1 và 5.3.2, Bảng 44 và Hình 85</w:t>
+        <w:t>Hướng dẫn Chuyên đề và Khóa luận tốt nghiệp, Phần 5, Mục 5.3.1 và Mục 5.3.2, Bảng 5-3 và Hình 5-7</w:t>
       </w:r>
     </w:p>
     <w:p>
@@ -9735,7 +9735,7 @@
           <w:color w:val="595959"/>
           <w:sz w:val="22"/>
         </w:rPr>
-        <w:t>Hướng dẫn Chuyên đề và Khóa luận tốt nghiệp, Chương 5, mục 4, Bảng 45 và 46; mục "Tóm tắt khóa luận"</w:t>
+        <w:t>Hướng dẫn Chuyên đề và Khóa luận tốt nghiệp, Phần 5, mục D, Bảng 5-1 và 5-4; mục "Tóm tắt khóa luận"</w:t>
       </w:r>
     </w:p>
     <w:p>
@@ -9840,18 +9840,18 @@
           <w:color w:val="595959"/>
           <w:sz w:val="22"/>
         </w:rPr>
-        <w:t>Hướng dẫn Chuyên đề và Khóa luận tốt nghiệp, Chương 5, mục "Tóm tắt khóa luận" và Bảng 45; Creswell và Creswell (2018, tr. 75 đến 76)</w:t>
-      </w:r>
-    </w:p>
-    <w:p>
-      <w:pPr>
-        <w:spacing w:after="160" w:line="276" w:lineRule="auto"/>
-      </w:pPr>
-      <w:r>
-        <w:rPr>
-          <w:b w:val="0"/>
-        </w:rPr>
-        <w:t>Tóm tắt, abstract, là cả khóa luận trong một đoạn văn. Sách nói đây là đoạn người đọc đọc đầu tiên, nhiều khi là đoạn duy nhất. Bảng 45 chia tóm tắt thành sáu phần, mỗi phần trả lời một câu hỏi và lấy nội dung từ một chương. Thầy nhắc lại: bối cảnh một câu, vấn đề là gì; mục tiêu một câu; phương pháp một đến hai câu gồm lý thuyết nền, mẫu, cách phân tích; kết quả chính hai đến ba câu có con số chủ chốt; hàm ý một câu; giới hạn một câu.</w:t>
+        <w:t>Hướng dẫn Chuyên đề và Khóa luận tốt nghiệp, Phần 5, mục "Tóm tắt khóa luận" và Bảng 5-4; Creswell và Creswell (2018, tr. 75 đến 76)</w:t>
+      </w:r>
+    </w:p>
+    <w:p>
+      <w:pPr>
+        <w:spacing w:after="160" w:line="276" w:lineRule="auto"/>
+      </w:pPr>
+      <w:r>
+        <w:rPr>
+          <w:b w:val="0"/>
+        </w:rPr>
+        <w:t>Tóm tắt, abstract, là cả khóa luận trong một đoạn văn. Sách nói đây là đoạn người đọc đọc đầu tiên, nhiều khi là đoạn duy nhất. Bảng 5-4 chia tóm tắt thành sáu phần, mỗi phần trả lời một câu hỏi và lấy nội dung từ một chương. Thầy nhắc lại: bối cảnh một câu, vấn đề là gì; mục tiêu một câu; phương pháp một đến hai câu gồm lý thuyết nền, mẫu, cách phân tích; kết quả chính hai đến ba câu có con số chủ chốt; hàm ý một câu; giới hạn một câu.</w:t>
       </w:r>
     </w:p>
     <w:p>
@@ -9934,18 +9934,18 @@
           <w:color w:val="595959"/>
           <w:sz w:val="22"/>
         </w:rPr>
-        <w:t>Hướng dẫn Chuyên đề và Khóa luận tốt nghiệp, chương Kết luận và Hình 86</w:t>
-      </w:r>
-    </w:p>
-    <w:p>
-      <w:pPr>
-        <w:spacing w:after="160" w:line="276" w:lineRule="auto"/>
-      </w:pPr>
-      <w:r>
-        <w:rPr>
-          <w:b w:val="0"/>
-        </w:rPr>
-        <w:t>Không phải trường nào cũng yêu cầu phần kết luận chung riêng. Nếu không yêu cầu, đoạn kết luận Chương 5 làm nhiệm vụ này. Nếu có yêu cầu, kết luận chung dài 1 đến 2 trang, còn đoạn kết luận Chương 5 chỉ cần 2 đến 3 câu để tránh trùng lặp. Hình 86 cho thấy mỗi đoạn của kết luận chung lấy nội dung từ chương nào.</w:t>
+        <w:t>Hướng dẫn Chuyên đề và Khóa luận tốt nghiệp, Phần 6 và Hình 6-1</w:t>
+      </w:r>
+    </w:p>
+    <w:p>
+      <w:pPr>
+        <w:spacing w:after="160" w:line="276" w:lineRule="auto"/>
+      </w:pPr>
+      <w:r>
+        <w:rPr>
+          <w:b w:val="0"/>
+        </w:rPr>
+        <w:t>Không phải trường nào cũng yêu cầu phần kết luận chung riêng. Nếu không yêu cầu, đoạn kết luận Chương 5 làm nhiệm vụ này. Nếu có yêu cầu, kết luận chung dài 1 đến 2 trang, còn đoạn kết luận Chương 5 chỉ cần 2 đến 3 câu để tránh trùng lặp. Hình 6-1 cho thấy mỗi đoạn của kết luận chung lấy nội dung từ chương nào.</w:t>
       </w:r>
     </w:p>
     <w:p>
@@ -9973,7 +9973,7 @@
         <w:rPr>
           <w:b/>
         </w:rPr>
-        <w:t>Viết kết luận chung từ bảng tổng hợp giả thuyết (Bảng 35), không viết từ trí nhớ.</w:t>
+        <w:t>Viết kết luận chung từ bảng tổng hợp giả thuyết (Bảng 4-9), không viết từ trí nhớ.</w:t>
       </w:r>
     </w:p>
     <w:p>
@@ -10028,18 +10028,18 @@
           <w:color w:val="595959"/>
           <w:sz w:val="22"/>
         </w:rPr>
-        <w:t>Hướng dẫn Chuyên đề và Khóa luận tốt nghiệp, Chương 5, mục 5, 6, Bảng 47 và phần "Điều cần nhớ"</w:t>
-      </w:r>
-    </w:p>
-    <w:p>
-      <w:pPr>
-        <w:spacing w:after="160" w:line="276" w:lineRule="auto"/>
-      </w:pPr>
-      <w:r>
-        <w:rPr>
-          <w:b w:val="0"/>
-        </w:rPr>
-        <w:t>Bảng 47 tổng hợp năm lỗi của Chương 5. Thầy đọc từng lỗi kèm mục khắc phục: tóm tắt lặp lại Chương 4, sửa ở mục 5.1.1; không trả lời câu hỏi nghiên cứu, sửa ở 5.1.2; hàm ý chung chung, sửa ở 5.2.1; không nêu hạn chế hoặc hạn chế không có hệ quả, sửa ở 5.3.1; hướng tiếp theo không gắn hạn chế và dùng từ phóng đại, sửa ở 5.3.2.</w:t>
+        <w:t>Hướng dẫn Chuyên đề và Khóa luận tốt nghiệp, Phần 5, mục F, Bảng 5-5 và khung POINT cuối phần</w:t>
+      </w:r>
+    </w:p>
+    <w:p>
+      <w:pPr>
+        <w:spacing w:after="160" w:line="276" w:lineRule="auto"/>
+      </w:pPr>
+      <w:r>
+        <w:rPr>
+          <w:b w:val="0"/>
+        </w:rPr>
+        <w:t>Bảng 5-5 tổng hợp năm lỗi của Chương 5. Thầy đọc từng lỗi kèm mục khắc phục: tóm tắt lặp lại Chương 4, sửa ở mục 5.1.1; không trả lời câu hỏi nghiên cứu, sửa ở 5.1.2; hàm ý chung chung, sửa ở 5.2.1; không nêu hạn chế hoặc hạn chế không có hệ quả, sửa ở 5.3.1; hướng tiếp theo không gắn hạn chế và dùng từ phóng đại, sửa ở 5.3.2.</w:t>
       </w:r>
     </w:p>
     <w:p>
@@ -10061,7 +10061,7 @@
         <w:rPr>
           <w:b w:val="0"/>
         </w:rPr>
-        <w:t xml:space="preserve">Phần "Điều cần nhớ" của Chương 5 kết bằng câu mà thầy đã dùng làm câu chốt cuối buổi. </w:t>
+        <w:t xml:space="preserve">Phần khung POINT cuối Phần 5 kết bằng câu mà thầy đã dùng làm câu chốt cuối buổi. </w:t>
       </w:r>
       <w:r>
         <w:rPr>
@@ -10121,7 +10121,7 @@
           <w:color w:val="595959"/>
           <w:sz w:val="24"/>
         </w:rPr>
-        <w:t>Chương TLTK và phụ lục, Trình bày, Kiểm tra trước khi nộp, Bảo vệ; Hình 87 đến 89; Bảng 48 đến 59</w:t>
+        <w:t>Phần 7 đến Phần 10; Hình 8-1, 10-1 và 10-2; Bảng 7-1 đến 7-4, 8-1, 8-2, 9-1 đến 9-4, 10-1 và 10-2</w:t>
       </w:r>
     </w:p>
     <w:p>
@@ -10134,7 +10134,7 @@
           <w:b/>
           <w:color w:val="CC0000"/>
         </w:rPr>
-        <w:t>(Slide 108: Bản đồ đọc sách cho phần hoàn thiện: bốn chương cuối của sách không tạo kết quả mới nhưng quyết định kết quả có được tin)</w:t>
+        <w:t>(Slide 108: Bản đồ đọc sách cho phần hoàn thiện: Phần 7 đến Phần 10 của sách không tạo kết quả mới nhưng quyết định kết quả có được tin)</w:t>
       </w:r>
     </w:p>
     <w:p>
@@ -10157,7 +10157,7 @@
           <w:color w:val="595959"/>
           <w:sz w:val="22"/>
         </w:rPr>
-        <w:t>Hướng dẫn Chuyên đề và Khóa luận tốt nghiệp, bốn chương cuối</w:t>
+        <w:t>Hướng dẫn Chuyên đề và Khóa luận tốt nghiệp, Phần 7 đến Phần 10</w:t>
       </w:r>
     </w:p>
     <w:p>
@@ -10251,7 +10251,7 @@
           <w:color w:val="595959"/>
           <w:sz w:val="22"/>
         </w:rPr>
-        <w:t>Hướng dẫn Chuyên đề và Khóa luận tốt nghiệp, chương Tài liệu tham khảo và phụ lục; chương Trình bày khóa luận; Hình 87</w:t>
+        <w:t>Hướng dẫn Chuyên đề và Khóa luận tốt nghiệp, Phần 7; Phần 8; Hình 8-1</w:t>
       </w:r>
     </w:p>
     <w:p>
@@ -10345,7 +10345,7 @@
           <w:color w:val="595959"/>
           <w:sz w:val="22"/>
         </w:rPr>
-        <w:t>Hướng dẫn Chuyên đề và Khóa luận tốt nghiệp, chương Tài liệu tham khảo và phụ lục, Bảng 48 đến 50; Purdue OWL; University of Auckland</w:t>
+        <w:t>Hướng dẫn Chuyên đề và Khóa luận tốt nghiệp, Phần 7, Bảng 7-1 đến 7-3; Purdue OWL; University of Auckland</w:t>
       </w:r>
     </w:p>
     <w:p>
@@ -10367,7 +10367,7 @@
         <w:rPr>
           <w:b w:val="0"/>
         </w:rPr>
-        <w:t>Dòng cuối là tình huống rất hay gặp: các em không đọc được bài gốc mà chỉ đọc qua một tài liệu khác. Trong bài ghi "Davis, 1989, được trích dẫn trong" tác giả mà các em đã đọc; danh mục chỉ ghi nguồn các em thật sự đọc. Bảng 49 cũng nhắc: trích nguyên văn bắt buộc có số trang, diễn giải lại thì số trang không bắt buộc nhưng được khuyến khích; nhiều nguồn cùng lúc xếp theo chữ cái của họ tác giả.</w:t>
+        <w:t>Dòng cuối là tình huống rất hay gặp: các em không đọc được bài gốc mà chỉ đọc qua một tài liệu khác. Trong bài ghi "Davis, 1989, được trích dẫn trong" tác giả mà các em đã đọc; danh mục chỉ ghi nguồn các em thật sự đọc. Bảng 7-2 cũng nhắc: trích nguyên văn bắt buộc có số trang, diễn giải lại thì số trang không bắt buộc nhưng được khuyến khích; nhiều nguồn cùng lúc xếp theo chữ cái của họ tác giả.</w:t>
       </w:r>
     </w:p>
     <w:p>
@@ -10439,40 +10439,40 @@
           <w:color w:val="595959"/>
           <w:sz w:val="22"/>
         </w:rPr>
-        <w:t>Hướng dẫn Chuyên đề và Khóa luận tốt nghiệp, chương Trình bày khóa luận, mục 1 đến 3, Bảng 52 và 53; Creswell và Creswell (2018, tr. 153)</w:t>
-      </w:r>
-    </w:p>
-    <w:p>
-      <w:pPr>
-        <w:spacing w:after="160" w:line="276" w:lineRule="auto"/>
-      </w:pPr>
-      <w:r>
-        <w:rPr>
-          <w:b w:val="0"/>
-        </w:rPr>
-        <w:t>Chương trình bày có ba mục. Mục 1 là các phần đầu: bìa, lời cam đoan, lời cảm ơn, tóm tắt nếu có, mục lục, danh mục từ viết tắt, danh mục bảng và hình. Bảng 52 ghi nhiệm vụ và lưu ý của từng phần. Lời cam đoan chưa đạt là "Em xin cam đoan đây là khóa luận của em"; lời cam đoan đạt nêu đủ ba cam kết: khóa luận do tôi thực hiện dưới sự hướng dẫn của giảng viên, số liệu thu thập và xử lý trung thực, nội dung tham khảo trích dẫn đầy đủ. Sách ghi chú: lời cam đoan là văn bản cá nhân nên dùng ngôi "tôi", phần nội dung khóa luận vẫn dùng văn phong khách quan.</w:t>
-      </w:r>
-    </w:p>
-    <w:p>
-      <w:pPr>
-        <w:spacing w:after="160" w:line="276" w:lineRule="auto"/>
-      </w:pPr>
-      <w:r>
-        <w:rPr>
-          <w:b w:val="0"/>
-        </w:rPr>
-        <w:t>Mục 2 là định dạng chung, Bảng 53 ở bên trái. Sách nói lỗi định dạng thường xuất hiện vì mỗi chương viết ở một thời điểm, trong một file khác nhau. Cách chữa là Styles: cài Normal và Heading 1, 2, 3 một lần trong file chính, rồi gộp các chương bằng Paste Special, Unformatted Text để văn bản nhận Style của file chính.</w:t>
-      </w:r>
-    </w:p>
-    <w:p>
-      <w:pPr>
-        <w:spacing w:after="160" w:line="276" w:lineRule="auto"/>
-      </w:pPr>
-      <w:r>
-        <w:rPr>
-          <w:b w:val="0"/>
-        </w:rPr>
-        <w:t xml:space="preserve">Mục 3 là đánh số: bảng và hình theo chương như Bảng 2.1, Hình 2.1; tên bảng phía trên, tên hình phía dưới; dùng Insert Caption và Cross-reference; trước khi nộp nhấn Ctrl A rồi F9. Sách nhắc: các thông số trong Bảng 53 là ví dụ để bắt đầu, không phải quy định chung. </w:t>
+        <w:t>Hướng dẫn Chuyên đề và Khóa luận tốt nghiệp, Phần 8, mục A, B và C, Bảng 8-1 và 8-2; Creswell và Creswell (2018, tr. 153)</w:t>
+      </w:r>
+    </w:p>
+    <w:p>
+      <w:pPr>
+        <w:spacing w:after="160" w:line="276" w:lineRule="auto"/>
+      </w:pPr>
+      <w:r>
+        <w:rPr>
+          <w:b w:val="0"/>
+        </w:rPr>
+        <w:t>Chương trình bày có ba mục. Mục 1 là các phần đầu: bìa, lời cam đoan, lời cảm ơn, tóm tắt nếu có, mục lục, danh mục từ viết tắt, danh mục bảng và hình. Bảng 8-1 ghi nhiệm vụ và lưu ý của từng phần. Lời cam đoan chưa đạt là "Em xin cam đoan đây là khóa luận của em"; lời cam đoan đạt nêu đủ ba cam kết: khóa luận do tôi thực hiện dưới sự hướng dẫn của giảng viên, số liệu thu thập và xử lý trung thực, nội dung tham khảo trích dẫn đầy đủ. Sách ghi chú: lời cam đoan là văn bản cá nhân nên dùng ngôi "tôi", phần nội dung khóa luận vẫn dùng văn phong khách quan.</w:t>
+      </w:r>
+    </w:p>
+    <w:p>
+      <w:pPr>
+        <w:spacing w:after="160" w:line="276" w:lineRule="auto"/>
+      </w:pPr>
+      <w:r>
+        <w:rPr>
+          <w:b w:val="0"/>
+        </w:rPr>
+        <w:t>Mục 2 là định dạng chung, Bảng 8-2 ở bên trái. Sách nói lỗi định dạng thường xuất hiện vì mỗi chương viết ở một thời điểm, trong một file khác nhau. Cách chữa là Styles: cài Normal và Heading 1, 2, 3 một lần trong file chính, rồi gộp các chương bằng Paste Special, Unformatted Text để văn bản nhận Style của file chính.</w:t>
+      </w:r>
+    </w:p>
+    <w:p>
+      <w:pPr>
+        <w:spacing w:after="160" w:line="276" w:lineRule="auto"/>
+      </w:pPr>
+      <w:r>
+        <w:rPr>
+          <w:b w:val="0"/>
+        </w:rPr>
+        <w:t xml:space="preserve">Mục 3 là đánh số: bảng và hình theo chương như Bảng 2.1, Hình 2.1; tên bảng phía trên, tên hình phía dưới; dùng Insert Caption và Cross-reference; trước khi nộp nhấn Ctrl A rồi F9. Sách nhắc: các thông số trong Bảng 8-2 là ví dụ để bắt đầu, không phải quy định chung. </w:t>
       </w:r>
       <w:r>
         <w:rPr>
@@ -10533,18 +10533,18 @@
           <w:color w:val="595959"/>
           <w:sz w:val="22"/>
         </w:rPr>
-        <w:t>Hướng dẫn Chuyên đề và Khóa luận tốt nghiệp, chương Kiểm tra trước khi nộp, Bảng 54 đến 57; Turnitin (n.d.); Creswell và Creswell (2018, tr. 153)</w:t>
-      </w:r>
-    </w:p>
-    <w:p>
-      <w:pPr>
-        <w:spacing w:after="160" w:line="276" w:lineRule="auto"/>
-      </w:pPr>
-      <w:r>
-        <w:rPr>
-          <w:b w:val="0"/>
-        </w:rPr>
-        <w:t>Chương kiểm tra trước khi nộp có ba việc chính. Việc thứ nhất là kiểm tra sự liên kết. Sách nói đọc lại từ đầu đến cuối dễ bỏ sót lỗi vì người viết quen với văn bản của mình; cách hiệu quả hơn là kiểm tra theo từng cặp điểm nối, sáu cặp trong Bảng 54 và dò từng con số trong bài với file Excel bằng chức năng Find. Ví dụ đạt trong sách: sinh viên dành một ngày, phát hiện tóm tắt còn ghi R bình phương của bản nháp cũ, sửa lại, rồi nhờ bạn đọc Chương 1 và Chương 5 xem câu hỏi và câu trả lời có khớp không.</w:t>
+        <w:t>Hướng dẫn Chuyên đề và Khóa luận tốt nghiệp, Phần 9, Bảng 9-1 đến 9-4; Turnitin (n.d.); Creswell và Creswell (2018, tr. 153)</w:t>
+      </w:r>
+    </w:p>
+    <w:p>
+      <w:pPr>
+        <w:spacing w:after="160" w:line="276" w:lineRule="auto"/>
+      </w:pPr>
+      <w:r>
+        <w:rPr>
+          <w:b w:val="0"/>
+        </w:rPr>
+        <w:t>Chương kiểm tra trước khi nộp có ba việc chính. Việc thứ nhất là kiểm tra sự liên kết. Sách nói đọc lại từ đầu đến cuối dễ bỏ sót lỗi vì người viết quen với văn bản của mình; cách hiệu quả hơn là kiểm tra theo từng cặp điểm nối, sáu cặp trong Bảng 9-1 và dò từng con số trong bài với file Excel bằng chức năng Find. Ví dụ đạt trong sách: sinh viên dành một ngày, phát hiện tóm tắt còn ghi R bình phương của bản nháp cũ, sửa lại, rồi nhờ bạn đọc Chương 1 và Chương 5 xem câu hỏi và câu trả lời có khớp không.</w:t>
       </w:r>
     </w:p>
     <w:p>
@@ -10627,18 +10627,18 @@
           <w:color w:val="595959"/>
           <w:sz w:val="22"/>
         </w:rPr>
-        <w:t>Hướng dẫn Chuyên đề và Khóa luận tốt nghiệp, chương Kiểm tra trước khi nộp, mục 1 và Bảng 54</w:t>
-      </w:r>
-    </w:p>
-    <w:p>
-      <w:pPr>
-        <w:spacing w:after="160" w:line="276" w:lineRule="auto"/>
-      </w:pPr>
-      <w:r>
-        <w:rPr>
-          <w:b w:val="0"/>
-        </w:rPr>
-        <w:t>Đây là Bảng 54, sáu cặp điểm nối mà sách yêu cầu đối chiếu trước khi nộp. Đầu buổi thầy nói về ba chữ "khớp": mọi kết quả ở Chương 4 khớp giả thuyết ở Chương 2; mọi kết luận ở Chương 5 khớp câu hỏi ở Chương 1; mọi con số khớp file dữ liệu. Sáu cặp này là phiên bản chi tiết của ba chữ đó. Cặp một: câu hỏi ở Chương 1 và mục 5.1, mỗi câu hỏi có đúng một câu trả lời. Cặp hai: giả thuyết ở Chương 2 và bảng tổng hợp ở Chương 4, giống từng chữ. Cặp ba: kế hoạch ở Chương 3 và kết quả ở Chương 4, mọi bước đã hứa đều có kết quả. Cặp bốn: con số trong bài và file Excel. Cặp năm: tóm tắt, kết luận chung và Chương 4. Cặp sáu: trích dẫn và danh mục, khớp hai chiều.</w:t>
+        <w:t>Hướng dẫn Chuyên đề và Khóa luận tốt nghiệp, Phần 9, mục A và Bảng 9-1</w:t>
+      </w:r>
+    </w:p>
+    <w:p>
+      <w:pPr>
+        <w:spacing w:after="160" w:line="276" w:lineRule="auto"/>
+      </w:pPr>
+      <w:r>
+        <w:rPr>
+          <w:b w:val="0"/>
+        </w:rPr>
+        <w:t>Đây là Bảng 9-1, sáu cặp điểm nối mà sách yêu cầu đối chiếu trước khi nộp. Đầu buổi thầy nói về ba chữ "khớp": mọi kết quả ở Chương 4 khớp giả thuyết ở Chương 2; mọi kết luận ở Chương 5 khớp câu hỏi ở Chương 1; mọi con số khớp file dữ liệu. Sáu cặp này là phiên bản chi tiết của ba chữ đó. Cặp một: câu hỏi ở Chương 1 và mục 5.1, mỗi câu hỏi có đúng một câu trả lời. Cặp hai: giả thuyết ở Chương 2 và bảng tổng hợp ở Chương 4, giống từng chữ. Cặp ba: kế hoạch ở Chương 3 và kết quả ở Chương 4, mọi bước đã hứa đều có kết quả. Cặp bốn: con số trong bài và file Excel. Cặp năm: tóm tắt, kết luận chung và Chương 4. Cặp sáu: trích dẫn và danh mục, khớp hai chiều.</w:t>
       </w:r>
     </w:p>
     <w:p>
@@ -10666,7 +10666,7 @@
         <w:rPr>
           <w:b/>
         </w:rPr>
-        <w:t>In Bảng 54, kiểm tra từng cặp và đánh dấu; với cặp con số, mở file Excel và dò từng số bằng chức năng Find.</w:t>
+        <w:t>In Bảng 9-1, kiểm tra từng cặp và đánh dấu; với cặp con số, mở file Excel và dò từng số bằng chức năng Find.</w:t>
       </w:r>
     </w:p>
     <w:p>
@@ -10721,18 +10721,18 @@
           <w:color w:val="595959"/>
           <w:sz w:val="22"/>
         </w:rPr>
-        <w:t>Hướng dẫn Chuyên đề và Khóa luận tốt nghiệp, chương Kiểm tra trước khi nộp, mục 4 và 5, Bảng 55 đến 57</w:t>
-      </w:r>
-    </w:p>
-    <w:p>
-      <w:pPr>
-        <w:spacing w:after="160" w:line="276" w:lineRule="auto"/>
-      </w:pPr>
-      <w:r>
-        <w:rPr>
-          <w:b w:val="0"/>
-        </w:rPr>
-        <w:t>Sách phân biệt hai loại lỗi. Lỗi thường gặp ở cuối mỗi chương làm bài viết yếu đi. Lỗi nghiêm trọng ở Bảng 55 và 56 có thể làm khóa luận bị đánh giá không đạt dù các phần khác làm tốt. Bảng này thầy lọc bảy lỗi tiêu biểu từ mười tám lỗi của hai bảng.</w:t>
+        <w:t>Hướng dẫn Chuyên đề và Khóa luận tốt nghiệp, Phần 9, mục D và E, Bảng 9-2 đến 9-4</w:t>
+      </w:r>
+    </w:p>
+    <w:p>
+      <w:pPr>
+        <w:spacing w:after="160" w:line="276" w:lineRule="auto"/>
+      </w:pPr>
+      <w:r>
+        <w:rPr>
+          <w:b w:val="0"/>
+        </w:rPr>
+        <w:t>Sách phân biệt hai loại lỗi. Lỗi thường gặp ở cuối mỗi chương làm bài viết yếu đi. Lỗi nghiêm trọng ở Bảng 9-2 và 9-3 có thể làm khóa luận bị đánh giá không đạt dù các phần khác làm tốt. Bảng này thầy lọc bảy lỗi tiêu biểu từ mười tám lỗi của hai bảng.</w:t>
       </w:r>
     </w:p>
     <w:p>
@@ -10754,7 +10754,7 @@
         <w:rPr>
           <w:b w:val="0"/>
         </w:rPr>
-        <w:t xml:space="preserve">Mục 5 hướng dẫn sửa bài sau góp ý theo năm bước: đọc hết góp ý trước khi sửa; phân loại thành nội dung, kỹ thuật, hình thức; lập bảng theo dõi như Bảng 57 và sửa nội dung trước, hình thức sau cùng; với mỗi góp ý, tìm mọi vị trí liên quan bằng Find; đọc lại toàn bộ và gửi kèm bảng theo dõi. Khi không đồng ý với một góp ý, các em không bỏ qua mà ghi lý do và căn cứ. </w:t>
+        <w:t xml:space="preserve">Mục 5 hướng dẫn sửa bài sau góp ý theo năm bước: đọc hết góp ý trước khi sửa; phân loại thành nội dung, kỹ thuật, hình thức; lập bảng theo dõi như Bảng 9-4 và sửa nội dung trước, hình thức sau cùng; với mỗi góp ý, tìm mọi vị trí liên quan bằng Find; đọc lại toàn bộ và gửi kèm bảng theo dõi. Khi không đồng ý với một góp ý, các em không bỏ qua mà ghi lý do và căn cứ. </w:t>
       </w:r>
       <w:r>
         <w:rPr>
@@ -10815,7 +10815,7 @@
           <w:color w:val="595959"/>
           <w:sz w:val="22"/>
         </w:rPr>
-        <w:t>Hướng dẫn Chuyên đề và Khóa luận tốt nghiệp, chương Bảo vệ trước Hội đồng, mục 1, Hình 88 và Bảng 58; Garner và Alley (2013)</w:t>
+        <w:t>Hướng dẫn Chuyên đề và Khóa luận tốt nghiệp, Phần 10, mục A, Hình 10-1 và Bảng 10-1; Garner và Alley (2013)</w:t>
       </w:r>
     </w:p>
     <w:p>
@@ -10837,7 +10837,7 @@
         <w:rPr>
           <w:b w:val="0"/>
         </w:rPr>
-        <w:t>Sách dẫn nghiên cứu của Garner và Alley năm 2013 so sánh hai kiểu slide. Kiểu "khẳng định và bằng chứng", tiêu đề là một câu khẳng định và thân slide là hình minh họa, giúp người nghe hiểu tốt hơn và nhớ lâu hơn kiểu tiêu đề chủ đề kèm danh sách gạch đầu dòng. Hình 88 so sánh hai kiểu với cùng số liệu. Chính bộ slide các em đang xem hôm nay cũng làm theo nguyên tắc này: tiêu đề mỗi slide là một câu kết luận.</w:t>
+        <w:t>Sách dẫn nghiên cứu của Garner và Alley năm 2013 so sánh hai kiểu slide. Kiểu "khẳng định và bằng chứng", tiêu đề là một câu khẳng định và thân slide là hình minh họa, giúp người nghe hiểu tốt hơn và nhớ lâu hơn kiểu tiêu đề chủ đề kèm danh sách gạch đầu dòng. Hình 10-1 so sánh hai kiểu với cùng số liệu. Chính bộ slide các em đang xem hôm nay cũng làm theo nguyên tắc này: tiêu đề mỗi slide là một câu kết luận.</w:t>
       </w:r>
     </w:p>
     <w:p>
@@ -10920,18 +10920,18 @@
           <w:color w:val="595959"/>
           <w:sz w:val="22"/>
         </w:rPr>
-        <w:t>Hướng dẫn Chuyên đề và Khóa luận tốt nghiệp, chương Bảo vệ trước Hội đồng, mục 1 và Bảng 58</w:t>
-      </w:r>
-    </w:p>
-    <w:p>
-      <w:pPr>
-        <w:spacing w:after="160" w:line="276" w:lineRule="auto"/>
-      </w:pPr>
-      <w:r>
-        <w:rPr>
-          <w:b w:val="0"/>
-        </w:rPr>
-        <w:t>Bảng 58 là dàn ý slide gợi ý cho 12 phút trình bày của đề tài Ngân hàng X, thầy gom lại thành bảy dòng. Slide 1 tên đề tài nửa phút. Slide 2 và 3 là vấn đề có số liệu có nguồn, mục tiêu và ba câu hỏi, mỗi slide một phút. Slide 4 và 5 là mô hình với bốn giả thuyết và phương pháp. Slide 6 là thang đo đạt độ tin cậy. Slide 7 và 8 là kết quả hồi quy và kiểm định giả thuyết, hai phút rưỡi. Slide 9 là vì sao H2 không được ủng hộ, slide 10 là ma trận ưu tiên. Slide 11 là hạn chế, slide 12 là kết luận trả lời ba câu hỏi.</w:t>
+        <w:t>Hướng dẫn Chuyên đề và Khóa luận tốt nghiệp, Phần 10, mục A và Bảng 10-1</w:t>
+      </w:r>
+    </w:p>
+    <w:p>
+      <w:pPr>
+        <w:spacing w:after="160" w:line="276" w:lineRule="auto"/>
+      </w:pPr>
+      <w:r>
+        <w:rPr>
+          <w:b w:val="0"/>
+        </w:rPr>
+        <w:t>Bảng 10-1 là dàn ý slide gợi ý cho 12 phút trình bày của đề tài Ngân hàng X, thầy gom lại thành bảy dòng. Slide 1 tên đề tài nửa phút. Slide 2 và 3 là vấn đề có số liệu có nguồn, mục tiêu và ba câu hỏi, mỗi slide một phút. Slide 4 và 5 là mô hình với bốn giả thuyết và phương pháp. Slide 6 là thang đo đạt độ tin cậy. Slide 7 và 8 là kết quả hồi quy và kiểm định giả thuyết, hai phút rưỡi. Slide 9 là vì sao H2 không được ủng hộ, slide 10 là ma trận ưu tiên. Slide 11 là hạn chế, slide 12 là kết luận trả lời ba câu hỏi.</w:t>
       </w:r>
     </w:p>
     <w:p>
@@ -10978,7 +10978,7 @@
         <w:rPr>
           <w:i/>
         </w:rPr>
-        <w:t>Thử hình dung một bạn dùng sáu phút đầu để nói về lịch sử ngân hàng số và mô hình TAM. Đến slide kết quả thì chỉ còn hai phút và Hội đồng ra hiệu dừng. Phần mà bạn ấy làm vất vả nhất, hồi quy và thảo luận, được trình bày vội vàng nhất. Bấm giờ khi tập nói theo đúng Bảng 58 là cách tránh tình huống này.</w:t>
+        <w:t>Thử hình dung một bạn dùng sáu phút đầu để nói về lịch sử ngân hàng số và mô hình TAM. Đến slide kết quả thì chỉ còn hai phút và Hội đồng ra hiệu dừng. Phần mà bạn ấy làm vất vả nhất, hồi quy và thảo luận, được trình bày vội vàng nhất. Bấm giờ khi tập nói theo đúng Bảng 10-1 là cách tránh tình huống này.</w:t>
       </w:r>
     </w:p>
     <w:p>
@@ -11014,7 +11014,7 @@
           <w:color w:val="595959"/>
           <w:sz w:val="22"/>
         </w:rPr>
-        <w:t>Hướng dẫn Chuyên đề và Khóa luận tốt nghiệp, chương Bảo vệ trước Hội đồng, mục 2 và 3, Hình 89; Cortazzi và Jin (2021, tr. 6 đến 15)</w:t>
+        <w:t>Hướng dẫn Chuyên đề và Khóa luận tốt nghiệp, Phần 10, mục B và C, Hình 10-2; Cortazzi và Jin (2021, tr. 6 đến 15)</w:t>
       </w:r>
     </w:p>
     <w:p>
@@ -11036,7 +11036,7 @@
         <w:rPr>
           <w:b w:val="0"/>
         </w:rPr>
-        <w:t>Hình 89 là bốn bước: xác nhận câu hỏi, trả lời trực tiếp, đưa căn cứ, nêu giới hạn khi cần. Sách so sánh hai câu trả lời cho câu hỏi về H2. Câu chưa đạt: "Dạ, H2 không được ủng hộ là do khách hàng trẻ đã quen dùng điện thoại nên họ không quan tâm đến việc dễ dùng nữa ạ." Câu này đưa lời giải thích như sự thật, trong khi khóa luận không kiểm định vai trò của tuổi. Câu đạt nêu B bằng 0,067, p bằng 0,310, hai cách giải thích ở mục 4.5.3 với con số 80,0%, UTAUT, r bằng 0,348 và p bằng 0,003, rồi nói rõ khóa luận chưa kiểm định vai trò trung gian và đã đề xuất ở mục 5.3.2.</w:t>
+        <w:t>Hình 10-2 là bốn bước: xác nhận câu hỏi, trả lời trực tiếp, đưa căn cứ, nêu giới hạn khi cần. Sách so sánh hai câu trả lời cho câu hỏi về H2. Câu chưa đạt: "Dạ, H2 không được ủng hộ là do khách hàng trẻ đã quen dùng điện thoại nên họ không quan tâm đến việc dễ dùng nữa ạ." Câu này đưa lời giải thích như sự thật, trong khi khóa luận không kiểm định vai trò của tuổi. Câu đạt nêu B bằng 0,067, p bằng 0,310, hai cách giải thích ở mục 4.5.3 với con số 80,0%, UTAUT, r bằng 0,348 và p bằng 0,003, rồi nói rõ khóa luận chưa kiểm định vai trò trung gian và đã đề xuất ở mục 5.3.2.</w:t>
       </w:r>
     </w:p>
     <w:p>
@@ -11113,18 +11113,18 @@
           <w:color w:val="595959"/>
           <w:sz w:val="22"/>
         </w:rPr>
-        <w:t>Hướng dẫn Chuyên đề và Khóa luận tốt nghiệp, chương Bảo vệ trước Hội đồng, mục 2 và Bảng 59; Cortazzi và Jin (2021, tr. 11 đến 15)</w:t>
-      </w:r>
-    </w:p>
-    <w:p>
-      <w:pPr>
-        <w:spacing w:after="160" w:line="276" w:lineRule="auto"/>
-      </w:pPr>
-      <w:r>
-        <w:rPr>
-          <w:b w:val="0"/>
-        </w:rPr>
-        <w:t>Bảng 59 chuyển năm nhóm câu hỏi của Cortazzi và Jin thành câu hỏi cụ thể cho khóa luận và chỉ nơi tìm căn cứ. Nhóm đề tài và ý nghĩa: vì sao chọn đề tài, căn cứ ở lý do chọn đề tài Chương 1. Nhóm lý thuyết và mô hình: vì sao chọn bốn yếu tố, vì sao không có chi phí, căn cứ ở bảng giả thuyết và khoảng trống Chương 2. Nhóm phương pháp: vì sao mẫu thuận tiện, vì sao 150 người, vì sao Excel, căn cứ ở Chương 3. Nhóm kết quả: vì sao H2 không được ủng hộ, B và β khác nhau thế nào, căn cứ ở mục 4.4 và 4.5.3. Nhóm đóng góp: ngân hàng nên làm gì trước, dùng cho ngân hàng khác được không, căn cứ ở ma trận ưu tiên và phần hạn chế.</w:t>
+        <w:t>Hướng dẫn Chuyên đề và Khóa luận tốt nghiệp, Phần 10, mục B và Bảng 10-2; Cortazzi và Jin (2021, tr. 11 đến 15)</w:t>
+      </w:r>
+    </w:p>
+    <w:p>
+      <w:pPr>
+        <w:spacing w:after="160" w:line="276" w:lineRule="auto"/>
+      </w:pPr>
+      <w:r>
+        <w:rPr>
+          <w:b w:val="0"/>
+        </w:rPr>
+        <w:t>Bảng 10-2 chuyển năm nhóm câu hỏi của Cortazzi và Jin thành câu hỏi cụ thể cho khóa luận và chỉ nơi tìm căn cứ. Nhóm đề tài và ý nghĩa: vì sao chọn đề tài, căn cứ ở lý do chọn đề tài Chương 1. Nhóm lý thuyết và mô hình: vì sao chọn bốn yếu tố, vì sao không có chi phí, căn cứ ở bảng giả thuyết và khoảng trống Chương 2. Nhóm phương pháp: vì sao mẫu thuận tiện, vì sao 150 người, vì sao Excel, căn cứ ở Chương 3. Nhóm kết quả: vì sao H2 không được ủng hộ, B và β khác nhau thế nào, căn cứ ở mục 4.4 và 4.5.3. Nhóm đóng góp: ngân hàng nên làm gì trước, dùng cho ngân hàng khác được không, căn cứ ở ma trận ưu tiên và phần hạn chế.</w:t>
       </w:r>
     </w:p>
     <w:p>
@@ -11207,7 +11207,7 @@
           <w:color w:val="595959"/>
           <w:sz w:val="22"/>
         </w:rPr>
-        <w:t>Hướng dẫn Chuyên đề và Khóa luận tốt nghiệp, Lời kết và mục "Điều cần nhớ" của Chương 5</w:t>
+        <w:t>Hướng dẫn Chuyên đề và Khóa luận tốt nghiệp, Lời kết và khung POINT cuối Phần 5</w:t>
       </w:r>
     </w:p>
     <w:p>
@@ -11229,18 +11229,18 @@
         <w:rPr>
           <w:b w:val="0"/>
         </w:rPr>
-        <w:t>Ở mục 7 của Chương 2, sách đã dặn không sao chép từ luận án tiến sĩ ba thứ: mô hình nhiều tầng với hàng chục biến, các kỹ thuật như SEM, CFA, Bootstrap và cỡ mẫu hàng nghìn người. Một khóa luận đại học chỉ cần khoảng 150 phiếu hợp lệ và các kỹ thuật chạy được trên Excel. Trong phần "Điều cần nhớ" của Chương 5, sách chốt lại bằng một câu mà thầy muốn các em mang về.</w:t>
-      </w:r>
-    </w:p>
-    <w:p>
-      <w:pPr>
-        <w:spacing w:after="160" w:line="276" w:lineRule="auto"/>
-      </w:pPr>
-      <w:r>
-        <w:rPr>
-          <w:b w:val="0"/>
-        </w:rPr>
-        <w:t xml:space="preserve">Việc tiếp theo của các em là mở ba file Excel, làm lại từng sheet song song với sách, rồi đánh dấu các checklist ở cuối mỗi chương trước khi nộp. </w:t>
+        <w:t>Ở mục E của Phần 2, sách đã dặn không sao chép từ luận án tiến sĩ ba thứ: mô hình nhiều tầng với hàng chục biến, các kỹ thuật như SEM, CFA, Bootstrap và cỡ mẫu hàng nghìn người. Một khóa luận đại học chỉ cần khoảng 150 phiếu hợp lệ và các kỹ thuật chạy được trên Excel. Trong khung POINT cuối Phần 5, sách chốt lại bằng một câu mà thầy muốn các em mang về.</w:t>
+      </w:r>
+    </w:p>
+    <w:p>
+      <w:pPr>
+        <w:spacing w:after="160" w:line="276" w:lineRule="auto"/>
+      </w:pPr>
+      <w:r>
+        <w:rPr>
+          <w:b w:val="0"/>
+        </w:rPr>
+        <w:t xml:space="preserve">Việc tiếp theo của các em là mở bốn file Excel, làm lại từng sheet song song với sách, rồi đánh dấu các checklist ở cuối mỗi chương trước khi nộp. </w:t>
       </w:r>
       <w:r>
         <w:rPr>

</xml_diff>